<commit_message>
Add Desired Outcomes, Evidence and Uncertainty
</commit_message>
<xml_diff>
--- a/report/Analysis Dossier.docx
+++ b/report/Analysis Dossier.docx
@@ -123,6 +123,14 @@
     </w:p>
     <w:sdt>
       <w:sdtPr>
+        <w:rPr>
+          <w:rFonts w:asciiTheme="minorHAnsi" w:eastAsiaTheme="minorHAnsi" w:hAnsiTheme="minorHAnsi" w:cstheme="minorBidi"/>
+          <w:color w:val="auto"/>
+          <w:kern w:val="2"/>
+          <w:sz w:val="24"/>
+          <w:szCs w:val="24"/>
+          <w14:ligatures w14:val="standardContextual"/>
+        </w:rPr>
         <w:id w:val="-1443145689"/>
         <w:docPartObj>
           <w:docPartGallery w:val="Table of Contents"/>
@@ -131,15 +139,9 @@
       </w:sdtPr>
       <w:sdtEndPr>
         <w:rPr>
-          <w:rFonts w:asciiTheme="minorHAnsi" w:eastAsiaTheme="minorHAnsi" w:hAnsiTheme="minorHAnsi" w:cstheme="minorBidi"/>
           <w:b/>
           <w:bCs/>
           <w:noProof/>
-          <w:color w:val="auto"/>
-          <w:kern w:val="2"/>
-          <w:sz w:val="24"/>
-          <w:szCs w:val="24"/>
-          <w14:ligatures w14:val="standardContextual"/>
         </w:rPr>
       </w:sdtEndPr>
       <w:sdtContent>
@@ -176,7 +178,7 @@
           <w:r>
             <w:fldChar w:fldCharType="separate"/>
           </w:r>
-          <w:hyperlink w:anchor="_Toc242297316" w:history="1">
+          <w:hyperlink w:anchor="_Toc242386951" w:history="1">
             <w:r>
               <w:rPr>
                 <w:rStyle w:val="Hyperlink"/>
@@ -221,7 +223,7 @@
                 <w:noProof/>
                 <w:webHidden/>
               </w:rPr>
-              <w:instrText xml:space="preserve"> PAGEREF _Toc242297316 \h </w:instrText>
+              <w:instrText xml:space="preserve"> PAGEREF _Toc242386951 \h </w:instrText>
             </w:r>
             <w:r>
               <w:rPr>
@@ -267,7 +269,7 @@
               <w14:ligatures w14:val="standardContextual"/>
             </w:rPr>
           </w:pPr>
-          <w:hyperlink w:anchor="_Toc242297317" w:history="1">
+          <w:hyperlink w:anchor="_Toc242386952" w:history="1">
             <w:r>
               <w:rPr>
                 <w:rStyle w:val="Hyperlink"/>
@@ -294,7 +296,7 @@
                 <w:noProof/>
                 <w:webHidden/>
               </w:rPr>
-              <w:instrText xml:space="preserve"> PAGEREF _Toc242297317 \h </w:instrText>
+              <w:instrText xml:space="preserve"> PAGEREF _Toc242386952 \h </w:instrText>
             </w:r>
             <w:r>
               <w:rPr>
@@ -340,14 +342,14 @@
               <w14:ligatures w14:val="standardContextual"/>
             </w:rPr>
           </w:pPr>
-          <w:hyperlink w:anchor="_Toc242297318" w:history="1">
+          <w:hyperlink w:anchor="_Toc242386953" w:history="1">
             <w:r>
               <w:rPr>
                 <w:rStyle w:val="Hyperlink"/>
                 <w:rFonts w:ascii="Times New Roman" w:hAnsi="Times New Roman"/>
                 <w:noProof/>
               </w:rPr>
-              <w:t>1.2 Current Problems and Conquences</w:t>
+              <w:t>1.2 Current Problems and Consequences</w:t>
             </w:r>
             <w:r>
               <w:rPr>
@@ -368,7 +370,7 @@
                 <w:noProof/>
                 <w:webHidden/>
               </w:rPr>
-              <w:instrText xml:space="preserve"> PAGEREF _Toc242297318 \h </w:instrText>
+              <w:instrText xml:space="preserve"> PAGEREF _Toc242386953 \h </w:instrText>
             </w:r>
             <w:r>
               <w:rPr>
@@ -389,6 +391,152 @@
                 <w:webHidden/>
               </w:rPr>
               <w:t>3</w:t>
+            </w:r>
+            <w:r>
+              <w:rPr>
+                <w:noProof/>
+                <w:webHidden/>
+              </w:rPr>
+              <w:fldChar w:fldCharType="end"/>
+            </w:r>
+          </w:hyperlink>
+        </w:p>
+        <w:p>
+          <w:pPr>
+            <w:pStyle w:val="TOC2"/>
+            <w:tabs>
+              <w:tab w:val="right" w:leader="dot" w:pos="9350"/>
+            </w:tabs>
+            <w:rPr>
+              <w:rFonts w:cstheme="minorBidi"/>
+              <w:noProof/>
+              <w:kern w:val="2"/>
+              <w:sz w:val="24"/>
+              <w:szCs w:val="24"/>
+              <w14:ligatures w14:val="standardContextual"/>
+            </w:rPr>
+          </w:pPr>
+          <w:hyperlink w:anchor="_Toc242386954" w:history="1">
+            <w:r>
+              <w:rPr>
+                <w:rStyle w:val="Hyperlink"/>
+                <w:noProof/>
+              </w:rPr>
+              <w:t>1.3 Desired Outcomes</w:t>
+            </w:r>
+            <w:r>
+              <w:rPr>
+                <w:noProof/>
+                <w:webHidden/>
+              </w:rPr>
+              <w:tab/>
+            </w:r>
+            <w:r>
+              <w:rPr>
+                <w:noProof/>
+                <w:webHidden/>
+              </w:rPr>
+              <w:fldChar w:fldCharType="begin"/>
+            </w:r>
+            <w:r>
+              <w:rPr>
+                <w:noProof/>
+                <w:webHidden/>
+              </w:rPr>
+              <w:instrText xml:space="preserve"> PAGEREF _Toc242386954 \h </w:instrText>
+            </w:r>
+            <w:r>
+              <w:rPr>
+                <w:noProof/>
+                <w:webHidden/>
+              </w:rPr>
+            </w:r>
+            <w:r>
+              <w:rPr>
+                <w:noProof/>
+                <w:webHidden/>
+              </w:rPr>
+              <w:fldChar w:fldCharType="separate"/>
+            </w:r>
+            <w:r>
+              <w:rPr>
+                <w:noProof/>
+                <w:webHidden/>
+              </w:rPr>
+              <w:t>4</w:t>
+            </w:r>
+            <w:r>
+              <w:rPr>
+                <w:noProof/>
+                <w:webHidden/>
+              </w:rPr>
+              <w:fldChar w:fldCharType="end"/>
+            </w:r>
+          </w:hyperlink>
+        </w:p>
+        <w:p>
+          <w:pPr>
+            <w:pStyle w:val="TOC2"/>
+            <w:tabs>
+              <w:tab w:val="right" w:leader="dot" w:pos="9350"/>
+            </w:tabs>
+            <w:rPr>
+              <w:rFonts w:cstheme="minorBidi"/>
+              <w:noProof/>
+              <w:kern w:val="2"/>
+              <w:sz w:val="24"/>
+              <w:szCs w:val="24"/>
+              <w14:ligatures w14:val="standardContextual"/>
+            </w:rPr>
+          </w:pPr>
+          <w:hyperlink w:anchor="_Toc242386955" w:history="1">
+            <w:r>
+              <w:rPr>
+                <w:rStyle w:val="Hyperlink"/>
+                <w:noProof/>
+              </w:rPr>
+              <w:t>1.4 Evidence and Uncertainty</w:t>
+            </w:r>
+            <w:r>
+              <w:rPr>
+                <w:noProof/>
+                <w:webHidden/>
+              </w:rPr>
+              <w:tab/>
+            </w:r>
+            <w:r>
+              <w:rPr>
+                <w:noProof/>
+                <w:webHidden/>
+              </w:rPr>
+              <w:fldChar w:fldCharType="begin"/>
+            </w:r>
+            <w:r>
+              <w:rPr>
+                <w:noProof/>
+                <w:webHidden/>
+              </w:rPr>
+              <w:instrText xml:space="preserve"> PAGEREF _Toc242386955 \h </w:instrText>
+            </w:r>
+            <w:r>
+              <w:rPr>
+                <w:noProof/>
+                <w:webHidden/>
+              </w:rPr>
+            </w:r>
+            <w:r>
+              <w:rPr>
+                <w:noProof/>
+                <w:webHidden/>
+              </w:rPr>
+              <w:fldChar w:fldCharType="separate"/>
+            </w:r>
+            <w:r>
+              <w:rPr>
+                <w:noProof/>
+                <w:webHidden/>
+              </w:rPr>
+              <w:t>4</w:t>
             </w:r>
             <w:r>
               <w:rPr>
@@ -439,7 +587,7 @@
           <w:szCs w:val="32"/>
         </w:rPr>
       </w:pPr>
-      <w:bookmarkStart w:id="0" w:name="_Toc242297316"/>
+      <w:bookmarkStart w:id="0" w:name="_Toc242386951"/>
       <w:r>
         <w:rPr>
           <w:color w:val="auto"/>
@@ -461,7 +609,7 @@
           <w:szCs w:val="28"/>
         </w:rPr>
       </w:pPr>
-      <w:bookmarkStart w:id="1" w:name="_Toc242297317"/>
+      <w:bookmarkStart w:id="1" w:name="_Toc242386952"/>
       <w:r>
         <w:rPr>
           <w:color w:val="auto"/>
@@ -514,6 +662,7 @@
           <w:szCs w:val="28"/>
         </w:rPr>
         <w:br/>
+        <w:t>Orders, recipes, ingredient stock, production records, and labels are maintained across spreadsheets and paper records.</w:t>
       </w:r>
       <w:r>
         <w:rPr>
@@ -521,22 +670,7 @@
           <w:sz w:val="28"/>
           <w:szCs w:val="28"/>
         </w:rPr>
-        <w:t>Orders, recipes, ingredient stock, production records, and labels are maintained across spreadsheets and paper records.</w:t>
-      </w:r>
-      <w:r>
-        <w:rPr>
-          <w:rFonts w:ascii="Times New Roman" w:hAnsi="Times New Roman" w:cs="Times New Roman"/>
-          <w:sz w:val="28"/>
-          <w:szCs w:val="28"/>
-        </w:rPr>
         <w:br/>
-      </w:r>
-      <w:r>
-        <w:rPr>
-          <w:rFonts w:ascii="Times New Roman" w:hAnsi="Times New Roman" w:cs="Times New Roman"/>
-          <w:sz w:val="28"/>
-          <w:szCs w:val="28"/>
-        </w:rPr>
         <w:t>Staff require stronger control over recipe versions, allergen information, ingredient batches, planned production, and released products.</w:t>
       </w:r>
     </w:p>
@@ -556,7 +690,7 @@
           <w:szCs w:val="28"/>
         </w:rPr>
       </w:pPr>
-      <w:bookmarkStart w:id="2" w:name="_Toc242297318"/>
+      <w:bookmarkStart w:id="2" w:name="_Toc242386953"/>
       <w:r>
         <w:rPr>
           <w:rFonts w:ascii="Times New Roman" w:hAnsi="Times New Roman" w:cs="Times New Roman"/>
@@ -636,6 +770,303 @@
         <w:t>Several customer orders may receive units from the same batch, while one order may contain units from several batches, but this relationship is not consistently recorded.</w:t>
       </w:r>
     </w:p>
+    <w:tbl>
+      <w:tblPr>
+        <w:tblStyle w:val="TableGrid"/>
+        <w:tblW w:w="0" w:type="auto"/>
+        <w:tblLook w:val="04A0" w:firstRow="1" w:lastRow="0" w:firstColumn="1" w:lastColumn="0" w:noHBand="0" w:noVBand="1"/>
+      </w:tblPr>
+      <w:tblGrid>
+        <w:gridCol w:w="535"/>
+        <w:gridCol w:w="2790"/>
+        <w:gridCol w:w="6025"/>
+      </w:tblGrid>
+      <w:tr>
+        <w:tc>
+          <w:tcPr>
+            <w:tcW w:w="535" w:type="dxa"/>
+          </w:tcPr>
+          <w:p>
+            <w:pPr>
+              <w:spacing w:line="360" w:lineRule="auto"/>
+              <w:rPr>
+                <w:rFonts w:ascii="Times New Roman" w:hAnsi="Times New Roman" w:cs="Times New Roman"/>
+                <w:sz w:val="28"/>
+                <w:szCs w:val="28"/>
+              </w:rPr>
+            </w:pPr>
+            <w:r>
+              <w:rPr>
+                <w:rFonts w:ascii="Times New Roman" w:hAnsi="Times New Roman" w:cs="Times New Roman"/>
+                <w:sz w:val="28"/>
+                <w:szCs w:val="28"/>
+              </w:rPr>
+              <w:t>ID</w:t>
+            </w:r>
+          </w:p>
+        </w:tc>
+        <w:tc>
+          <w:tcPr>
+            <w:tcW w:w="2790" w:type="dxa"/>
+          </w:tcPr>
+          <w:p>
+            <w:pPr>
+              <w:spacing w:line="360" w:lineRule="auto"/>
+              <w:rPr>
+                <w:rFonts w:ascii="Times New Roman" w:hAnsi="Times New Roman" w:cs="Times New Roman"/>
+                <w:sz w:val="28"/>
+                <w:szCs w:val="28"/>
+              </w:rPr>
+            </w:pPr>
+            <w:r>
+              <w:rPr>
+                <w:rFonts w:ascii="Times New Roman" w:hAnsi="Times New Roman" w:cs="Times New Roman"/>
+                <w:sz w:val="28"/>
+                <w:szCs w:val="28"/>
+              </w:rPr>
+              <w:t>Current Problem</w:t>
+            </w:r>
+          </w:p>
+        </w:tc>
+        <w:tc>
+          <w:tcPr>
+            <w:tcW w:w="6025" w:type="dxa"/>
+          </w:tcPr>
+          <w:p>
+            <w:pPr>
+              <w:spacing w:line="360" w:lineRule="auto"/>
+              <w:rPr>
+                <w:rFonts w:ascii="Times New Roman" w:hAnsi="Times New Roman" w:cs="Times New Roman"/>
+                <w:sz w:val="28"/>
+                <w:szCs w:val="28"/>
+              </w:rPr>
+            </w:pPr>
+            <w:r>
+              <w:rPr>
+                <w:rFonts w:ascii="Times New Roman" w:hAnsi="Times New Roman" w:cs="Times New Roman"/>
+                <w:sz w:val="28"/>
+                <w:szCs w:val="28"/>
+              </w:rPr>
+              <w:t>Consequence</w:t>
+            </w:r>
+          </w:p>
+        </w:tc>
+      </w:tr>
+      <w:tr>
+        <w:tc>
+          <w:tcPr>
+            <w:tcW w:w="535" w:type="dxa"/>
+          </w:tcPr>
+          <w:p>
+            <w:pPr>
+              <w:spacing w:line="360" w:lineRule="auto"/>
+              <w:rPr>
+                <w:rFonts w:ascii="Times New Roman" w:hAnsi="Times New Roman" w:cs="Times New Roman"/>
+                <w:sz w:val="28"/>
+                <w:szCs w:val="28"/>
+              </w:rPr>
+            </w:pPr>
+            <w:r>
+              <w:rPr>
+                <w:rFonts w:ascii="Times New Roman" w:hAnsi="Times New Roman" w:cs="Times New Roman"/>
+                <w:sz w:val="28"/>
+                <w:szCs w:val="28"/>
+              </w:rPr>
+              <w:t>P1</w:t>
+            </w:r>
+          </w:p>
+        </w:tc>
+        <w:tc>
+          <w:tcPr>
+            <w:tcW w:w="2790" w:type="dxa"/>
+          </w:tcPr>
+          <w:p>
+            <w:pPr>
+              <w:spacing w:line="360" w:lineRule="auto"/>
+              <w:rPr>
+                <w:rFonts w:ascii="Times New Roman" w:hAnsi="Times New Roman" w:cs="Times New Roman"/>
+                <w:sz w:val="28"/>
+                <w:szCs w:val="28"/>
+              </w:rPr>
+            </w:pPr>
+            <w:r>
+              <w:rPr>
+                <w:rFonts w:ascii="Times New Roman" w:hAnsi="Times New Roman" w:cs="Times New Roman"/>
+                <w:sz w:val="28"/>
+                <w:szCs w:val="28"/>
+              </w:rPr>
+              <w:t>Paper recipe changes are not always reflected in the master recipe</w:t>
+            </w:r>
+          </w:p>
+        </w:tc>
+        <w:tc>
+          <w:tcPr>
+            <w:tcW w:w="6025" w:type="dxa"/>
+          </w:tcPr>
+          <w:p>
+            <w:pPr>
+              <w:spacing w:line="360" w:lineRule="auto"/>
+              <w:rPr>
+                <w:rFonts w:ascii="Times New Roman" w:hAnsi="Times New Roman" w:cs="Times New Roman"/>
+                <w:sz w:val="28"/>
+                <w:szCs w:val="28"/>
+              </w:rPr>
+            </w:pPr>
+            <w:r>
+              <w:rPr>
+                <w:rFonts w:ascii="Times New Roman" w:hAnsi="Times New Roman" w:cs="Times New Roman"/>
+                <w:sz w:val="28"/>
+                <w:szCs w:val="28"/>
+              </w:rPr>
+              <w:t>This can make it difficult to determine which approved recipe version was used for a specific production batch and may affect the accuracy of labels, allergen information, cost and expected yield</w:t>
+            </w:r>
+          </w:p>
+        </w:tc>
+      </w:tr>
+      <w:tr>
+        <w:tc>
+          <w:tcPr>
+            <w:tcW w:w="535" w:type="dxa"/>
+          </w:tcPr>
+          <w:p>
+            <w:pPr>
+              <w:spacing w:line="360" w:lineRule="auto"/>
+              <w:rPr>
+                <w:rFonts w:ascii="Times New Roman" w:hAnsi="Times New Roman" w:cs="Times New Roman"/>
+                <w:sz w:val="28"/>
+                <w:szCs w:val="28"/>
+              </w:rPr>
+            </w:pPr>
+            <w:r>
+              <w:rPr>
+                <w:rFonts w:ascii="Times New Roman" w:hAnsi="Times New Roman" w:cs="Times New Roman"/>
+                <w:sz w:val="28"/>
+                <w:szCs w:val="28"/>
+              </w:rPr>
+              <w:lastRenderedPageBreak/>
+              <w:t>P2</w:t>
+            </w:r>
+          </w:p>
+        </w:tc>
+        <w:tc>
+          <w:tcPr>
+            <w:tcW w:w="2790" w:type="dxa"/>
+          </w:tcPr>
+          <w:p>
+            <w:pPr>
+              <w:spacing w:line="360" w:lineRule="auto"/>
+              <w:rPr>
+                <w:rFonts w:ascii="Times New Roman" w:hAnsi="Times New Roman" w:cs="Times New Roman"/>
+                <w:sz w:val="28"/>
+                <w:szCs w:val="28"/>
+              </w:rPr>
+            </w:pPr>
+            <w:r>
+              <w:rPr>
+                <w:rFonts w:ascii="Times New Roman" w:hAnsi="Times New Roman" w:cs="Times New Roman"/>
+                <w:sz w:val="28"/>
+                <w:szCs w:val="28"/>
+              </w:rPr>
+              <w:t>Opened ingredients and substitutions are not always recorded promptly</w:t>
+            </w:r>
+          </w:p>
+        </w:tc>
+        <w:tc>
+          <w:tcPr>
+            <w:tcW w:w="6025" w:type="dxa"/>
+          </w:tcPr>
+          <w:p>
+            <w:pPr>
+              <w:spacing w:line="360" w:lineRule="auto"/>
+              <w:rPr>
+                <w:rFonts w:ascii="Times New Roman" w:hAnsi="Times New Roman" w:cs="Times New Roman"/>
+                <w:sz w:val="28"/>
+                <w:szCs w:val="28"/>
+              </w:rPr>
+            </w:pPr>
+            <w:r>
+              <w:rPr>
+                <w:rFonts w:ascii="Times New Roman" w:hAnsi="Times New Roman" w:cs="Times New Roman"/>
+                <w:sz w:val="28"/>
+                <w:szCs w:val="28"/>
+              </w:rPr>
+              <w:t>Ingredient availability records may not accurately reflect the stock available for planned production, making production planning more difficult</w:t>
+            </w:r>
+          </w:p>
+        </w:tc>
+      </w:tr>
+      <w:tr>
+        <w:tc>
+          <w:tcPr>
+            <w:tcW w:w="535" w:type="dxa"/>
+          </w:tcPr>
+          <w:p>
+            <w:pPr>
+              <w:spacing w:line="360" w:lineRule="auto"/>
+              <w:rPr>
+                <w:rFonts w:ascii="Times New Roman" w:hAnsi="Times New Roman" w:cs="Times New Roman"/>
+                <w:sz w:val="28"/>
+                <w:szCs w:val="28"/>
+              </w:rPr>
+            </w:pPr>
+            <w:r>
+              <w:rPr>
+                <w:rFonts w:ascii="Times New Roman" w:hAnsi="Times New Roman" w:cs="Times New Roman"/>
+                <w:sz w:val="28"/>
+                <w:szCs w:val="28"/>
+              </w:rPr>
+              <w:t>P3</w:t>
+            </w:r>
+          </w:p>
+        </w:tc>
+        <w:tc>
+          <w:tcPr>
+            <w:tcW w:w="2790" w:type="dxa"/>
+          </w:tcPr>
+          <w:p>
+            <w:pPr>
+              <w:spacing w:line="360" w:lineRule="auto"/>
+              <w:rPr>
+                <w:rFonts w:ascii="Times New Roman" w:hAnsi="Times New Roman" w:cs="Times New Roman"/>
+                <w:sz w:val="28"/>
+                <w:szCs w:val="28"/>
+              </w:rPr>
+            </w:pPr>
+            <w:r>
+              <w:rPr>
+                <w:rFonts w:ascii="Times New Roman" w:hAnsi="Times New Roman" w:cs="Times New Roman"/>
+                <w:sz w:val="28"/>
+                <w:szCs w:val="28"/>
+              </w:rPr>
+              <w:t>The relationship between production batches and customer orders is not consistently recorded</w:t>
+            </w:r>
+          </w:p>
+        </w:tc>
+        <w:tc>
+          <w:tcPr>
+            <w:tcW w:w="6025" w:type="dxa"/>
+          </w:tcPr>
+          <w:p>
+            <w:pPr>
+              <w:spacing w:line="360" w:lineRule="auto"/>
+              <w:rPr>
+                <w:rFonts w:ascii="Times New Roman" w:hAnsi="Times New Roman" w:cs="Times New Roman"/>
+                <w:sz w:val="28"/>
+                <w:szCs w:val="28"/>
+              </w:rPr>
+            </w:pPr>
+            <w:r>
+              <w:rPr>
+                <w:rFonts w:ascii="Times New Roman" w:hAnsi="Times New Roman" w:cs="Times New Roman"/>
+                <w:sz w:val="28"/>
+                <w:szCs w:val="28"/>
+              </w:rPr>
+              <w:t>When error is identified, tracing affected production batches, packaged units and customer orders can be slow, particularly when production has been split</w:t>
+            </w:r>
+          </w:p>
+        </w:tc>
+      </w:tr>
+    </w:tbl>
     <w:p>
       <w:pPr>
         <w:spacing w:line="360" w:lineRule="auto"/>
@@ -646,6 +1077,329 @@
         </w:rPr>
       </w:pPr>
     </w:p>
+    <w:p>
+      <w:pPr>
+        <w:pStyle w:val="Heading2"/>
+        <w:rPr>
+          <w:color w:val="auto"/>
+          <w:sz w:val="28"/>
+          <w:szCs w:val="28"/>
+        </w:rPr>
+      </w:pPr>
+      <w:bookmarkStart w:id="3" w:name="_Toc242386954"/>
+      <w:r>
+        <w:rPr>
+          <w:color w:val="auto"/>
+          <w:sz w:val="28"/>
+          <w:szCs w:val="28"/>
+        </w:rPr>
+        <w:t>1.3 Desired Outcomes</w:t>
+      </w:r>
+      <w:bookmarkEnd w:id="3"/>
+    </w:p>
+    <w:tbl>
+      <w:tblPr>
+        <w:tblStyle w:val="TableGrid"/>
+        <w:tblW w:w="0" w:type="auto"/>
+        <w:tblLook w:val="04A0" w:firstRow="1" w:lastRow="0" w:firstColumn="1" w:lastColumn="0" w:noHBand="0" w:noVBand="1"/>
+      </w:tblPr>
+      <w:tblGrid>
+        <w:gridCol w:w="715"/>
+        <w:gridCol w:w="2520"/>
+        <w:gridCol w:w="6115"/>
+      </w:tblGrid>
+      <w:tr>
+        <w:tc>
+          <w:tcPr>
+            <w:tcW w:w="715" w:type="dxa"/>
+          </w:tcPr>
+          <w:p>
+            <w:r>
+              <w:t>ID</w:t>
+            </w:r>
+          </w:p>
+        </w:tc>
+        <w:tc>
+          <w:tcPr>
+            <w:tcW w:w="2520" w:type="dxa"/>
+          </w:tcPr>
+          <w:p>
+            <w:r>
+              <w:t>Related Problem</w:t>
+            </w:r>
+          </w:p>
+        </w:tc>
+        <w:tc>
+          <w:tcPr>
+            <w:tcW w:w="6115" w:type="dxa"/>
+          </w:tcPr>
+          <w:p>
+            <w:r>
+              <w:t>Desired Outcome</w:t>
+            </w:r>
+          </w:p>
+        </w:tc>
+      </w:tr>
+      <w:tr>
+        <w:tc>
+          <w:tcPr>
+            <w:tcW w:w="715" w:type="dxa"/>
+          </w:tcPr>
+          <w:p>
+            <w:r>
+              <w:t>DO1</w:t>
+            </w:r>
+          </w:p>
+        </w:tc>
+        <w:tc>
+          <w:tcPr>
+            <w:tcW w:w="2520" w:type="dxa"/>
+          </w:tcPr>
+          <w:p>
+            <w:r>
+              <w:t>P1 – Recipe version records</w:t>
+            </w:r>
+          </w:p>
+        </w:tc>
+        <w:tc>
+          <w:tcPr>
+            <w:tcW w:w="6115" w:type="dxa"/>
+          </w:tcPr>
+          <w:p>
+            <w:r>
+              <w:t>Improve the reliability and consistency of recipe version records used for production</w:t>
+            </w:r>
+          </w:p>
+        </w:tc>
+      </w:tr>
+      <w:tr>
+        <w:tc>
+          <w:tcPr>
+            <w:tcW w:w="715" w:type="dxa"/>
+          </w:tcPr>
+          <w:p>
+            <w:r>
+              <w:t>DO2</w:t>
+            </w:r>
+          </w:p>
+        </w:tc>
+        <w:tc>
+          <w:tcPr>
+            <w:tcW w:w="2520" w:type="dxa"/>
+          </w:tcPr>
+          <w:p>
+            <w:r>
+              <w:t>P2 – Ingredient availability records</w:t>
+            </w:r>
+          </w:p>
+        </w:tc>
+        <w:tc>
+          <w:tcPr>
+            <w:tcW w:w="6115" w:type="dxa"/>
+          </w:tcPr>
+          <w:p>
+            <w:r>
+              <w:t xml:space="preserve">Improve </w:t>
+            </w:r>
+            <w:r>
+              <w:t>the accuracy and timeliness of ingredient availability information for production planning</w:t>
+            </w:r>
+          </w:p>
+        </w:tc>
+      </w:tr>
+      <w:tr>
+        <w:tc>
+          <w:tcPr>
+            <w:tcW w:w="715" w:type="dxa"/>
+          </w:tcPr>
+          <w:p>
+            <w:r>
+              <w:t>DO3</w:t>
+            </w:r>
+          </w:p>
+        </w:tc>
+        <w:tc>
+          <w:tcPr>
+            <w:tcW w:w="2520" w:type="dxa"/>
+          </w:tcPr>
+          <w:p>
+            <w:r>
+              <w:t>P3 – Batch / order traceability</w:t>
+            </w:r>
+          </w:p>
+        </w:tc>
+        <w:tc>
+          <w:tcPr>
+            <w:tcW w:w="6115" w:type="dxa"/>
+          </w:tcPr>
+          <w:p>
+            <w:r>
+              <w:t xml:space="preserve">Ensure reliable </w:t>
+            </w:r>
+            <w:r>
+              <w:t>traceability between production batches and customer orders</w:t>
+            </w:r>
+          </w:p>
+        </w:tc>
+      </w:tr>
+    </w:tbl>
+    <w:p/>
+    <w:p>
+      <w:pPr>
+        <w:pStyle w:val="Heading2"/>
+        <w:rPr>
+          <w:color w:val="auto"/>
+          <w:sz w:val="28"/>
+          <w:szCs w:val="28"/>
+        </w:rPr>
+      </w:pPr>
+      <w:bookmarkStart w:id="4" w:name="_Toc242386955"/>
+      <w:r>
+        <w:rPr>
+          <w:color w:val="auto"/>
+          <w:sz w:val="28"/>
+          <w:szCs w:val="28"/>
+        </w:rPr>
+        <w:t>1.4 Evidence and Uncertainty</w:t>
+      </w:r>
+      <w:bookmarkEnd w:id="4"/>
+    </w:p>
+    <w:tbl>
+      <w:tblPr>
+        <w:tblStyle w:val="TableGrid"/>
+        <w:tblW w:w="0" w:type="auto"/>
+        <w:tblLook w:val="04A0" w:firstRow="1" w:lastRow="0" w:firstColumn="1" w:lastColumn="0" w:noHBand="0" w:noVBand="1"/>
+      </w:tblPr>
+      <w:tblGrid>
+        <w:gridCol w:w="641"/>
+        <w:gridCol w:w="3944"/>
+        <w:gridCol w:w="2448"/>
+        <w:gridCol w:w="2317"/>
+      </w:tblGrid>
+      <w:tr>
+        <w:tc>
+          <w:tcPr>
+            <w:tcW w:w="641" w:type="dxa"/>
+          </w:tcPr>
+          <w:p>
+            <w:r>
+              <w:t>ID</w:t>
+            </w:r>
+          </w:p>
+        </w:tc>
+        <w:tc>
+          <w:tcPr>
+            <w:tcW w:w="3944" w:type="dxa"/>
+          </w:tcPr>
+          <w:p>
+            <w:r>
+              <w:t>Evidence from Scenario</w:t>
+            </w:r>
+          </w:p>
+        </w:tc>
+        <w:tc>
+          <w:tcPr>
+            <w:tcW w:w="2448" w:type="dxa"/>
+          </w:tcPr>
+          <w:p>
+            <w:r>
+              <w:t>Related Area</w:t>
+            </w:r>
+          </w:p>
+        </w:tc>
+        <w:tc>
+          <w:tcPr>
+            <w:tcW w:w="2317" w:type="dxa"/>
+          </w:tcPr>
+          <w:p>
+            <w:r>
+              <w:t>Uncertainty / Question</w:t>
+            </w:r>
+          </w:p>
+        </w:tc>
+      </w:tr>
+      <w:tr>
+        <w:tc>
+          <w:tcPr>
+            <w:tcW w:w="641" w:type="dxa"/>
+          </w:tcPr>
+          <w:p>
+            <w:r>
+              <w:t>EU1</w:t>
+            </w:r>
+          </w:p>
+        </w:tc>
+        <w:tc>
+          <w:tcPr>
+            <w:tcW w:w="3944" w:type="dxa"/>
+          </w:tcPr>
+          <w:p>
+            <w:r>
+              <w:t>Staff sometimes annotate paper recipe without updating the master recipe</w:t>
+            </w:r>
+          </w:p>
+        </w:tc>
+        <w:tc>
+          <w:tcPr>
+            <w:tcW w:w="2448" w:type="dxa"/>
+          </w:tcPr>
+          <w:p>
+            <w:r>
+              <w:t>Recipe management</w:t>
+            </w:r>
+          </w:p>
+        </w:tc>
+        <w:tc>
+          <w:tcPr>
+            <w:tcW w:w="2317" w:type="dxa"/>
+          </w:tcPr>
+          <w:p>
+            <w:r>
+              <w:t xml:space="preserve">Who is </w:t>
+            </w:r>
+            <w:proofErr w:type="spellStart"/>
+            <w:r>
+              <w:t>authorised</w:t>
+            </w:r>
+            <w:proofErr w:type="spellEnd"/>
+            <w:r>
+              <w:t xml:space="preserve"> to approve a new recipe version?</w:t>
+            </w:r>
+          </w:p>
+        </w:tc>
+      </w:tr>
+      <w:tr>
+        <w:tc>
+          <w:tcPr>
+            <w:tcW w:w="641" w:type="dxa"/>
+          </w:tcPr>
+          <w:p>
+            <w:r>
+              <w:t>EU2</w:t>
+            </w:r>
+          </w:p>
+        </w:tc>
+        <w:tc>
+          <w:tcPr>
+            <w:tcW w:w="3944" w:type="dxa"/>
+          </w:tcPr>
+          <w:p/>
+        </w:tc>
+        <w:tc>
+          <w:tcPr>
+            <w:tcW w:w="2448" w:type="dxa"/>
+          </w:tcPr>
+          <w:p/>
+        </w:tc>
+        <w:tc>
+          <w:tcPr>
+            <w:tcW w:w="2317" w:type="dxa"/>
+          </w:tcPr>
+          <w:p/>
+        </w:tc>
+      </w:tr>
+    </w:tbl>
+    <w:p/>
     <w:sectPr>
       <w:headerReference w:type="default" r:id="rId8"/>
       <w:footerReference w:type="default" r:id="rId9"/>
@@ -1552,7 +2306,6 @@
   <w:style w:type="character" w:default="1" w:styleId="DefaultParagraphFont">
     <w:name w:val="Default Paragraph Font"/>
     <w:uiPriority w:val="1"/>
-    <w:semiHidden/>
     <w:unhideWhenUsed/>
   </w:style>
   <w:style w:type="table" w:default="1" w:styleId="TableNormal">
@@ -1997,6 +2750,25 @@
       <w:color w:val="467886" w:themeColor="hyperlink"/>
       <w:u w:val="single"/>
     </w:rPr>
+  </w:style>
+  <w:style w:type="table" w:styleId="TableGrid">
+    <w:name w:val="Table Grid"/>
+    <w:basedOn w:val="TableNormal"/>
+    <w:uiPriority w:val="39"/>
+    <w:rsid w:val="00893B91"/>
+    <w:pPr>
+      <w:spacing w:after="0" w:line="240" w:lineRule="auto"/>
+    </w:pPr>
+    <w:tblPr>
+      <w:tblBorders>
+        <w:top w:val="single" w:sz="4" w:space="0" w:color="auto"/>
+        <w:left w:val="single" w:sz="4" w:space="0" w:color="auto"/>
+        <w:bottom w:val="single" w:sz="4" w:space="0" w:color="auto"/>
+        <w:right w:val="single" w:sz="4" w:space="0" w:color="auto"/>
+        <w:insideH w:val="single" w:sz="4" w:space="0" w:color="auto"/>
+        <w:insideV w:val="single" w:sz="4" w:space="0" w:color="auto"/>
+      </w:tblBorders>
+    </w:tblPr>
   </w:style>
 </w:styles>
 </file>

</xml_diff>

<commit_message>
Add purpose, scope, system boundary
</commit_message>
<xml_diff>
--- a/report/Analysis Dossier.docx
+++ b/report/Analysis Dossier.docx
@@ -4,6 +4,7 @@
   <w:body>
     <w:p>
       <w:pPr>
+        <w:spacing w:line="360" w:lineRule="auto"/>
         <w:rPr>
           <w:rFonts w:ascii="Times New Roman" w:hAnsi="Times New Roman" w:cs="Times New Roman"/>
         </w:rPr>
@@ -11,6 +12,7 @@
     </w:p>
     <w:p>
       <w:pPr>
+        <w:spacing w:line="360" w:lineRule="auto"/>
         <w:jc w:val="center"/>
         <w:rPr>
           <w:rFonts w:ascii="Times New Roman" w:hAnsi="Times New Roman" w:cs="Times New Roman"/>
@@ -29,6 +31,7 @@
     </w:p>
     <w:p>
       <w:pPr>
+        <w:spacing w:line="360" w:lineRule="auto"/>
         <w:jc w:val="center"/>
         <w:rPr>
           <w:rFonts w:ascii="Times New Roman" w:hAnsi="Times New Roman" w:cs="Times New Roman"/>
@@ -39,6 +42,7 @@
     </w:p>
     <w:p>
       <w:pPr>
+        <w:spacing w:line="360" w:lineRule="auto"/>
         <w:jc w:val="center"/>
         <w:rPr>
           <w:rFonts w:ascii="Times New Roman" w:hAnsi="Times New Roman" w:cs="Times New Roman"/>
@@ -49,6 +53,7 @@
     </w:p>
     <w:p>
       <w:pPr>
+        <w:spacing w:line="360" w:lineRule="auto"/>
         <w:jc w:val="center"/>
         <w:rPr>
           <w:rFonts w:ascii="Times New Roman" w:hAnsi="Times New Roman" w:cs="Times New Roman"/>
@@ -67,6 +72,7 @@
     </w:p>
     <w:p>
       <w:pPr>
+        <w:spacing w:line="360" w:lineRule="auto"/>
         <w:jc w:val="center"/>
         <w:rPr>
           <w:rFonts w:ascii="Times New Roman" w:hAnsi="Times New Roman" w:cs="Times New Roman"/>
@@ -75,6 +81,7 @@
     </w:p>
     <w:p>
       <w:pPr>
+        <w:spacing w:line="360" w:lineRule="auto"/>
         <w:jc w:val="center"/>
         <w:rPr>
           <w:rFonts w:ascii="Times New Roman" w:hAnsi="Times New Roman" w:cs="Times New Roman"/>
@@ -96,6 +103,7 @@
     </w:p>
     <w:p>
       <w:pPr>
+        <w:spacing w:line="360" w:lineRule="auto"/>
         <w:jc w:val="center"/>
         <w:rPr>
           <w:rFonts w:ascii="Times New Roman" w:hAnsi="Times New Roman" w:cs="Times New Roman"/>
@@ -110,6 +118,7 @@
     </w:p>
     <w:p>
       <w:pPr>
+        <w:spacing w:line="360" w:lineRule="auto"/>
         <w:rPr>
           <w:rFonts w:ascii="Times New Roman" w:hAnsi="Times New Roman" w:cs="Times New Roman"/>
         </w:rPr>
@@ -124,7 +133,7 @@
     <w:sdt>
       <w:sdtPr>
         <w:rPr>
-          <w:rFonts w:asciiTheme="minorHAnsi" w:eastAsiaTheme="minorHAnsi" w:hAnsiTheme="minorHAnsi" w:cstheme="minorBidi"/>
+          <w:rFonts w:ascii="Times New Roman" w:eastAsiaTheme="minorHAnsi" w:hAnsi="Times New Roman" w:cs="Times New Roman"/>
           <w:color w:val="auto"/>
           <w:kern w:val="2"/>
           <w:sz w:val="24"/>
@@ -148,8 +157,19 @@
         <w:p>
           <w:pPr>
             <w:pStyle w:val="TOCHeading"/>
+            <w:spacing w:line="360" w:lineRule="auto"/>
+            <w:rPr>
+              <w:rFonts w:ascii="Times New Roman" w:hAnsi="Times New Roman" w:cs="Times New Roman"/>
+              <w:sz w:val="24"/>
+              <w:szCs w:val="24"/>
+            </w:rPr>
           </w:pPr>
           <w:r>
+            <w:rPr>
+              <w:rFonts w:ascii="Times New Roman" w:hAnsi="Times New Roman" w:cs="Times New Roman"/>
+              <w:sz w:val="24"/>
+              <w:szCs w:val="24"/>
+            </w:rPr>
             <w:t>Table of Contents</w:t>
           </w:r>
         </w:p>
@@ -160,6 +180,7 @@
               <w:tab w:val="left" w:pos="440"/>
               <w:tab w:val="right" w:leader="dot" w:pos="9350"/>
             </w:tabs>
+            <w:spacing w:line="360" w:lineRule="auto"/>
             <w:rPr>
               <w:rFonts w:cstheme="minorBidi"/>
               <w:noProof/>
@@ -170,19 +191,37 @@
             </w:rPr>
           </w:pPr>
           <w:r>
+            <w:rPr>
+              <w:rFonts w:ascii="Times New Roman" w:hAnsi="Times New Roman"/>
+              <w:sz w:val="24"/>
+              <w:szCs w:val="24"/>
+            </w:rPr>
             <w:fldChar w:fldCharType="begin"/>
           </w:r>
           <w:r>
+            <w:rPr>
+              <w:rFonts w:ascii="Times New Roman" w:hAnsi="Times New Roman"/>
+              <w:sz w:val="24"/>
+              <w:szCs w:val="24"/>
+            </w:rPr>
             <w:instrText xml:space="preserve"> TOC \o "1-3" \h \z \u </w:instrText>
           </w:r>
           <w:r>
+            <w:rPr>
+              <w:rFonts w:ascii="Times New Roman" w:hAnsi="Times New Roman"/>
+              <w:sz w:val="24"/>
+              <w:szCs w:val="24"/>
+            </w:rPr>
             <w:fldChar w:fldCharType="separate"/>
           </w:r>
-          <w:hyperlink w:anchor="_Toc242386951" w:history="1">
+          <w:hyperlink w:anchor="_Toc242467204" w:history="1">
             <w:r>
               <w:rPr>
                 <w:rStyle w:val="Hyperlink"/>
-                <w:noProof/>
+                <w:rFonts w:ascii="Times New Roman" w:hAnsi="Times New Roman"/>
+                <w:noProof/>
+                <w:sz w:val="24"/>
+                <w:szCs w:val="24"/>
               </w:rPr>
               <w:t>1.</w:t>
             </w:r>
@@ -200,7 +239,10 @@
             <w:r>
               <w:rPr>
                 <w:rStyle w:val="Hyperlink"/>
-                <w:noProof/>
+                <w:rFonts w:ascii="Times New Roman" w:hAnsi="Times New Roman"/>
+                <w:noProof/>
+                <w:sz w:val="24"/>
+                <w:szCs w:val="24"/>
               </w:rPr>
               <w:t>Scenario Interpretation</w:t>
             </w:r>
@@ -208,6 +250,8 @@
               <w:rPr>
                 <w:noProof/>
                 <w:webHidden/>
+                <w:sz w:val="24"/>
+                <w:szCs w:val="24"/>
               </w:rPr>
               <w:tab/>
             </w:r>
@@ -215,6 +259,8 @@
               <w:rPr>
                 <w:noProof/>
                 <w:webHidden/>
+                <w:sz w:val="24"/>
+                <w:szCs w:val="24"/>
               </w:rPr>
               <w:fldChar w:fldCharType="begin"/>
             </w:r>
@@ -222,19 +268,25 @@
               <w:rPr>
                 <w:noProof/>
                 <w:webHidden/>
-              </w:rPr>
-              <w:instrText xml:space="preserve"> PAGEREF _Toc242386951 \h </w:instrText>
-            </w:r>
-            <w:r>
-              <w:rPr>
-                <w:noProof/>
-                <w:webHidden/>
-              </w:rPr>
-            </w:r>
-            <w:r>
-              <w:rPr>
-                <w:noProof/>
-                <w:webHidden/>
+                <w:sz w:val="24"/>
+                <w:szCs w:val="24"/>
+              </w:rPr>
+              <w:instrText xml:space="preserve"> PAGEREF _Toc242467204 \h </w:instrText>
+            </w:r>
+            <w:r>
+              <w:rPr>
+                <w:noProof/>
+                <w:webHidden/>
+                <w:sz w:val="24"/>
+                <w:szCs w:val="24"/>
+              </w:rPr>
+            </w:r>
+            <w:r>
+              <w:rPr>
+                <w:noProof/>
+                <w:webHidden/>
+                <w:sz w:val="24"/>
+                <w:szCs w:val="24"/>
               </w:rPr>
               <w:fldChar w:fldCharType="separate"/>
             </w:r>
@@ -242,6 +294,8 @@
               <w:rPr>
                 <w:noProof/>
                 <w:webHidden/>
+                <w:sz w:val="24"/>
+                <w:szCs w:val="24"/>
               </w:rPr>
               <w:t>3</w:t>
             </w:r>
@@ -249,6 +303,8 @@
               <w:rPr>
                 <w:noProof/>
                 <w:webHidden/>
+                <w:sz w:val="24"/>
+                <w:szCs w:val="24"/>
               </w:rPr>
               <w:fldChar w:fldCharType="end"/>
             </w:r>
@@ -260,6 +316,7 @@
             <w:tabs>
               <w:tab w:val="right" w:leader="dot" w:pos="9350"/>
             </w:tabs>
+            <w:spacing w:line="360" w:lineRule="auto"/>
             <w:rPr>
               <w:rFonts w:cstheme="minorBidi"/>
               <w:noProof/>
@@ -269,11 +326,14 @@
               <w14:ligatures w14:val="standardContextual"/>
             </w:rPr>
           </w:pPr>
-          <w:hyperlink w:anchor="_Toc242386952" w:history="1">
+          <w:hyperlink w:anchor="_Toc242467205" w:history="1">
             <w:r>
               <w:rPr>
                 <w:rStyle w:val="Hyperlink"/>
-                <w:noProof/>
+                <w:rFonts w:ascii="Times New Roman" w:hAnsi="Times New Roman"/>
+                <w:noProof/>
+                <w:sz w:val="24"/>
+                <w:szCs w:val="24"/>
               </w:rPr>
               <w:t>1.1 Organisation and Current Process</w:t>
             </w:r>
@@ -281,6 +341,8 @@
               <w:rPr>
                 <w:noProof/>
                 <w:webHidden/>
+                <w:sz w:val="24"/>
+                <w:szCs w:val="24"/>
               </w:rPr>
               <w:tab/>
             </w:r>
@@ -288,6 +350,8 @@
               <w:rPr>
                 <w:noProof/>
                 <w:webHidden/>
+                <w:sz w:val="24"/>
+                <w:szCs w:val="24"/>
               </w:rPr>
               <w:fldChar w:fldCharType="begin"/>
             </w:r>
@@ -295,19 +359,25 @@
               <w:rPr>
                 <w:noProof/>
                 <w:webHidden/>
-              </w:rPr>
-              <w:instrText xml:space="preserve"> PAGEREF _Toc242386952 \h </w:instrText>
-            </w:r>
-            <w:r>
-              <w:rPr>
-                <w:noProof/>
-                <w:webHidden/>
-              </w:rPr>
-            </w:r>
-            <w:r>
-              <w:rPr>
-                <w:noProof/>
-                <w:webHidden/>
+                <w:sz w:val="24"/>
+                <w:szCs w:val="24"/>
+              </w:rPr>
+              <w:instrText xml:space="preserve"> PAGEREF _Toc242467205 \h </w:instrText>
+            </w:r>
+            <w:r>
+              <w:rPr>
+                <w:noProof/>
+                <w:webHidden/>
+                <w:sz w:val="24"/>
+                <w:szCs w:val="24"/>
+              </w:rPr>
+            </w:r>
+            <w:r>
+              <w:rPr>
+                <w:noProof/>
+                <w:webHidden/>
+                <w:sz w:val="24"/>
+                <w:szCs w:val="24"/>
               </w:rPr>
               <w:fldChar w:fldCharType="separate"/>
             </w:r>
@@ -315,6 +385,8 @@
               <w:rPr>
                 <w:noProof/>
                 <w:webHidden/>
+                <w:sz w:val="24"/>
+                <w:szCs w:val="24"/>
               </w:rPr>
               <w:t>3</w:t>
             </w:r>
@@ -322,6 +394,8 @@
               <w:rPr>
                 <w:noProof/>
                 <w:webHidden/>
+                <w:sz w:val="24"/>
+                <w:szCs w:val="24"/>
               </w:rPr>
               <w:fldChar w:fldCharType="end"/>
             </w:r>
@@ -333,6 +407,7 @@
             <w:tabs>
               <w:tab w:val="right" w:leader="dot" w:pos="9350"/>
             </w:tabs>
+            <w:spacing w:line="360" w:lineRule="auto"/>
             <w:rPr>
               <w:rFonts w:cstheme="minorBidi"/>
               <w:noProof/>
@@ -342,12 +417,14 @@
               <w14:ligatures w14:val="standardContextual"/>
             </w:rPr>
           </w:pPr>
-          <w:hyperlink w:anchor="_Toc242386953" w:history="1">
+          <w:hyperlink w:anchor="_Toc242467206" w:history="1">
             <w:r>
               <w:rPr>
                 <w:rStyle w:val="Hyperlink"/>
                 <w:rFonts w:ascii="Times New Roman" w:hAnsi="Times New Roman"/>
                 <w:noProof/>
+                <w:sz w:val="24"/>
+                <w:szCs w:val="24"/>
               </w:rPr>
               <w:t>1.2 Current Problems and Consequences</w:t>
             </w:r>
@@ -355,6 +432,8 @@
               <w:rPr>
                 <w:noProof/>
                 <w:webHidden/>
+                <w:sz w:val="24"/>
+                <w:szCs w:val="24"/>
               </w:rPr>
               <w:tab/>
             </w:r>
@@ -362,6 +441,8 @@
               <w:rPr>
                 <w:noProof/>
                 <w:webHidden/>
+                <w:sz w:val="24"/>
+                <w:szCs w:val="24"/>
               </w:rPr>
               <w:fldChar w:fldCharType="begin"/>
             </w:r>
@@ -369,19 +450,25 @@
               <w:rPr>
                 <w:noProof/>
                 <w:webHidden/>
-              </w:rPr>
-              <w:instrText xml:space="preserve"> PAGEREF _Toc242386953 \h </w:instrText>
-            </w:r>
-            <w:r>
-              <w:rPr>
-                <w:noProof/>
-                <w:webHidden/>
-              </w:rPr>
-            </w:r>
-            <w:r>
-              <w:rPr>
-                <w:noProof/>
-                <w:webHidden/>
+                <w:sz w:val="24"/>
+                <w:szCs w:val="24"/>
+              </w:rPr>
+              <w:instrText xml:space="preserve"> PAGEREF _Toc242467206 \h </w:instrText>
+            </w:r>
+            <w:r>
+              <w:rPr>
+                <w:noProof/>
+                <w:webHidden/>
+                <w:sz w:val="24"/>
+                <w:szCs w:val="24"/>
+              </w:rPr>
+            </w:r>
+            <w:r>
+              <w:rPr>
+                <w:noProof/>
+                <w:webHidden/>
+                <w:sz w:val="24"/>
+                <w:szCs w:val="24"/>
               </w:rPr>
               <w:fldChar w:fldCharType="separate"/>
             </w:r>
@@ -389,6 +476,8 @@
               <w:rPr>
                 <w:noProof/>
                 <w:webHidden/>
+                <w:sz w:val="24"/>
+                <w:szCs w:val="24"/>
               </w:rPr>
               <w:t>3</w:t>
             </w:r>
@@ -396,6 +485,8 @@
               <w:rPr>
                 <w:noProof/>
                 <w:webHidden/>
+                <w:sz w:val="24"/>
+                <w:szCs w:val="24"/>
               </w:rPr>
               <w:fldChar w:fldCharType="end"/>
             </w:r>
@@ -407,6 +498,7 @@
             <w:tabs>
               <w:tab w:val="right" w:leader="dot" w:pos="9350"/>
             </w:tabs>
+            <w:spacing w:line="360" w:lineRule="auto"/>
             <w:rPr>
               <w:rFonts w:cstheme="minorBidi"/>
               <w:noProof/>
@@ -416,11 +508,14 @@
               <w14:ligatures w14:val="standardContextual"/>
             </w:rPr>
           </w:pPr>
-          <w:hyperlink w:anchor="_Toc242386954" w:history="1">
+          <w:hyperlink w:anchor="_Toc242467207" w:history="1">
             <w:r>
               <w:rPr>
                 <w:rStyle w:val="Hyperlink"/>
-                <w:noProof/>
+                <w:rFonts w:ascii="Times New Roman" w:hAnsi="Times New Roman"/>
+                <w:noProof/>
+                <w:sz w:val="24"/>
+                <w:szCs w:val="24"/>
               </w:rPr>
               <w:t>1.3 Desired Outcomes</w:t>
             </w:r>
@@ -428,6 +523,8 @@
               <w:rPr>
                 <w:noProof/>
                 <w:webHidden/>
+                <w:sz w:val="24"/>
+                <w:szCs w:val="24"/>
               </w:rPr>
               <w:tab/>
             </w:r>
@@ -435,6 +532,8 @@
               <w:rPr>
                 <w:noProof/>
                 <w:webHidden/>
+                <w:sz w:val="24"/>
+                <w:szCs w:val="24"/>
               </w:rPr>
               <w:fldChar w:fldCharType="begin"/>
             </w:r>
@@ -442,19 +541,25 @@
               <w:rPr>
                 <w:noProof/>
                 <w:webHidden/>
-              </w:rPr>
-              <w:instrText xml:space="preserve"> PAGEREF _Toc242386954 \h </w:instrText>
-            </w:r>
-            <w:r>
-              <w:rPr>
-                <w:noProof/>
-                <w:webHidden/>
-              </w:rPr>
-            </w:r>
-            <w:r>
-              <w:rPr>
-                <w:noProof/>
-                <w:webHidden/>
+                <w:sz w:val="24"/>
+                <w:szCs w:val="24"/>
+              </w:rPr>
+              <w:instrText xml:space="preserve"> PAGEREF _Toc242467207 \h </w:instrText>
+            </w:r>
+            <w:r>
+              <w:rPr>
+                <w:noProof/>
+                <w:webHidden/>
+                <w:sz w:val="24"/>
+                <w:szCs w:val="24"/>
+              </w:rPr>
+            </w:r>
+            <w:r>
+              <w:rPr>
+                <w:noProof/>
+                <w:webHidden/>
+                <w:sz w:val="24"/>
+                <w:szCs w:val="24"/>
               </w:rPr>
               <w:fldChar w:fldCharType="separate"/>
             </w:r>
@@ -462,6 +567,8 @@
               <w:rPr>
                 <w:noProof/>
                 <w:webHidden/>
+                <w:sz w:val="24"/>
+                <w:szCs w:val="24"/>
               </w:rPr>
               <w:t>4</w:t>
             </w:r>
@@ -469,6 +576,8 @@
               <w:rPr>
                 <w:noProof/>
                 <w:webHidden/>
+                <w:sz w:val="24"/>
+                <w:szCs w:val="24"/>
               </w:rPr>
               <w:fldChar w:fldCharType="end"/>
             </w:r>
@@ -480,6 +589,7 @@
             <w:tabs>
               <w:tab w:val="right" w:leader="dot" w:pos="9350"/>
             </w:tabs>
+            <w:spacing w:line="360" w:lineRule="auto"/>
             <w:rPr>
               <w:rFonts w:cstheme="minorBidi"/>
               <w:noProof/>
@@ -489,11 +599,14 @@
               <w14:ligatures w14:val="standardContextual"/>
             </w:rPr>
           </w:pPr>
-          <w:hyperlink w:anchor="_Toc242386955" w:history="1">
+          <w:hyperlink w:anchor="_Toc242467208" w:history="1">
             <w:r>
               <w:rPr>
                 <w:rStyle w:val="Hyperlink"/>
-                <w:noProof/>
+                <w:rFonts w:ascii="Times New Roman" w:hAnsi="Times New Roman"/>
+                <w:noProof/>
+                <w:sz w:val="24"/>
+                <w:szCs w:val="24"/>
               </w:rPr>
               <w:t>1.4 Evidence and Uncertainty</w:t>
             </w:r>
@@ -501,6 +614,8 @@
               <w:rPr>
                 <w:noProof/>
                 <w:webHidden/>
+                <w:sz w:val="24"/>
+                <w:szCs w:val="24"/>
               </w:rPr>
               <w:tab/>
             </w:r>
@@ -508,6 +623,8 @@
               <w:rPr>
                 <w:noProof/>
                 <w:webHidden/>
+                <w:sz w:val="24"/>
+                <w:szCs w:val="24"/>
               </w:rPr>
               <w:fldChar w:fldCharType="begin"/>
             </w:r>
@@ -515,19 +632,25 @@
               <w:rPr>
                 <w:noProof/>
                 <w:webHidden/>
-              </w:rPr>
-              <w:instrText xml:space="preserve"> PAGEREF _Toc242386955 \h </w:instrText>
-            </w:r>
-            <w:r>
-              <w:rPr>
-                <w:noProof/>
-                <w:webHidden/>
-              </w:rPr>
-            </w:r>
-            <w:r>
-              <w:rPr>
-                <w:noProof/>
-                <w:webHidden/>
+                <w:sz w:val="24"/>
+                <w:szCs w:val="24"/>
+              </w:rPr>
+              <w:instrText xml:space="preserve"> PAGEREF _Toc242467208 \h </w:instrText>
+            </w:r>
+            <w:r>
+              <w:rPr>
+                <w:noProof/>
+                <w:webHidden/>
+                <w:sz w:val="24"/>
+                <w:szCs w:val="24"/>
+              </w:rPr>
+            </w:r>
+            <w:r>
+              <w:rPr>
+                <w:noProof/>
+                <w:webHidden/>
+                <w:sz w:val="24"/>
+                <w:szCs w:val="24"/>
               </w:rPr>
               <w:fldChar w:fldCharType="separate"/>
             </w:r>
@@ -535,6 +658,8 @@
               <w:rPr>
                 <w:noProof/>
                 <w:webHidden/>
+                <w:sz w:val="24"/>
+                <w:szCs w:val="24"/>
               </w:rPr>
               <w:t>4</w:t>
             </w:r>
@@ -542,14 +667,773 @@
               <w:rPr>
                 <w:noProof/>
                 <w:webHidden/>
+                <w:sz w:val="24"/>
+                <w:szCs w:val="24"/>
               </w:rPr>
               <w:fldChar w:fldCharType="end"/>
             </w:r>
           </w:hyperlink>
         </w:p>
         <w:p>
+          <w:pPr>
+            <w:pStyle w:val="TOC1"/>
+            <w:tabs>
+              <w:tab w:val="left" w:pos="440"/>
+              <w:tab w:val="right" w:leader="dot" w:pos="9350"/>
+            </w:tabs>
+            <w:spacing w:line="360" w:lineRule="auto"/>
+            <w:rPr>
+              <w:rFonts w:cstheme="minorBidi"/>
+              <w:noProof/>
+              <w:kern w:val="2"/>
+              <w:sz w:val="24"/>
+              <w:szCs w:val="24"/>
+              <w14:ligatures w14:val="standardContextual"/>
+            </w:rPr>
+          </w:pPr>
+          <w:hyperlink w:anchor="_Toc242467209" w:history="1">
+            <w:r>
+              <w:rPr>
+                <w:rStyle w:val="Hyperlink"/>
+                <w:rFonts w:ascii="Times New Roman" w:hAnsi="Times New Roman"/>
+                <w:noProof/>
+                <w:sz w:val="24"/>
+                <w:szCs w:val="24"/>
+              </w:rPr>
+              <w:t>2.</w:t>
+            </w:r>
+            <w:r>
+              <w:rPr>
+                <w:rFonts w:cstheme="minorBidi"/>
+                <w:noProof/>
+                <w:kern w:val="2"/>
+                <w:sz w:val="24"/>
+                <w:szCs w:val="24"/>
+                <w14:ligatures w14:val="standardContextual"/>
+              </w:rPr>
+              <w:tab/>
+            </w:r>
+            <w:r>
+              <w:rPr>
+                <w:rStyle w:val="Hyperlink"/>
+                <w:rFonts w:ascii="Times New Roman" w:hAnsi="Times New Roman"/>
+                <w:noProof/>
+                <w:sz w:val="24"/>
+                <w:szCs w:val="24"/>
+              </w:rPr>
+              <w:t>Purpose, Scope and Boundary</w:t>
+            </w:r>
+            <w:r>
+              <w:rPr>
+                <w:noProof/>
+                <w:webHidden/>
+                <w:sz w:val="24"/>
+                <w:szCs w:val="24"/>
+              </w:rPr>
+              <w:tab/>
+            </w:r>
+            <w:r>
+              <w:rPr>
+                <w:noProof/>
+                <w:webHidden/>
+                <w:sz w:val="24"/>
+                <w:szCs w:val="24"/>
+              </w:rPr>
+              <w:fldChar w:fldCharType="begin"/>
+            </w:r>
+            <w:r>
+              <w:rPr>
+                <w:noProof/>
+                <w:webHidden/>
+                <w:sz w:val="24"/>
+                <w:szCs w:val="24"/>
+              </w:rPr>
+              <w:instrText xml:space="preserve"> PAGEREF _Toc242467209 \h </w:instrText>
+            </w:r>
+            <w:r>
+              <w:rPr>
+                <w:noProof/>
+                <w:webHidden/>
+                <w:sz w:val="24"/>
+                <w:szCs w:val="24"/>
+              </w:rPr>
+            </w:r>
+            <w:r>
+              <w:rPr>
+                <w:noProof/>
+                <w:webHidden/>
+                <w:sz w:val="24"/>
+                <w:szCs w:val="24"/>
+              </w:rPr>
+              <w:fldChar w:fldCharType="separate"/>
+            </w:r>
+            <w:r>
+              <w:rPr>
+                <w:noProof/>
+                <w:webHidden/>
+                <w:sz w:val="24"/>
+                <w:szCs w:val="24"/>
+              </w:rPr>
+              <w:t>5</w:t>
+            </w:r>
+            <w:r>
+              <w:rPr>
+                <w:noProof/>
+                <w:webHidden/>
+                <w:sz w:val="24"/>
+                <w:szCs w:val="24"/>
+              </w:rPr>
+              <w:fldChar w:fldCharType="end"/>
+            </w:r>
+          </w:hyperlink>
+        </w:p>
+        <w:p>
+          <w:pPr>
+            <w:pStyle w:val="TOC2"/>
+            <w:tabs>
+              <w:tab w:val="right" w:leader="dot" w:pos="9350"/>
+            </w:tabs>
+            <w:spacing w:line="360" w:lineRule="auto"/>
+            <w:rPr>
+              <w:rFonts w:cstheme="minorBidi"/>
+              <w:noProof/>
+              <w:kern w:val="2"/>
+              <w:sz w:val="24"/>
+              <w:szCs w:val="24"/>
+              <w14:ligatures w14:val="standardContextual"/>
+            </w:rPr>
+          </w:pPr>
+          <w:hyperlink w:anchor="_Toc242467210" w:history="1">
+            <w:r>
+              <w:rPr>
+                <w:rStyle w:val="Hyperlink"/>
+                <w:rFonts w:ascii="Times New Roman" w:hAnsi="Times New Roman"/>
+                <w:noProof/>
+                <w:sz w:val="24"/>
+                <w:szCs w:val="24"/>
+              </w:rPr>
+              <w:t>2.1 Purpose</w:t>
+            </w:r>
+            <w:r>
+              <w:rPr>
+                <w:noProof/>
+                <w:webHidden/>
+                <w:sz w:val="24"/>
+                <w:szCs w:val="24"/>
+              </w:rPr>
+              <w:tab/>
+            </w:r>
+            <w:r>
+              <w:rPr>
+                <w:noProof/>
+                <w:webHidden/>
+                <w:sz w:val="24"/>
+                <w:szCs w:val="24"/>
+              </w:rPr>
+              <w:fldChar w:fldCharType="begin"/>
+            </w:r>
+            <w:r>
+              <w:rPr>
+                <w:noProof/>
+                <w:webHidden/>
+                <w:sz w:val="24"/>
+                <w:szCs w:val="24"/>
+              </w:rPr>
+              <w:instrText xml:space="preserve"> PAGEREF _Toc242467210 \h </w:instrText>
+            </w:r>
+            <w:r>
+              <w:rPr>
+                <w:noProof/>
+                <w:webHidden/>
+                <w:sz w:val="24"/>
+                <w:szCs w:val="24"/>
+              </w:rPr>
+            </w:r>
+            <w:r>
+              <w:rPr>
+                <w:noProof/>
+                <w:webHidden/>
+                <w:sz w:val="24"/>
+                <w:szCs w:val="24"/>
+              </w:rPr>
+              <w:fldChar w:fldCharType="separate"/>
+            </w:r>
+            <w:r>
+              <w:rPr>
+                <w:noProof/>
+                <w:webHidden/>
+                <w:sz w:val="24"/>
+                <w:szCs w:val="24"/>
+              </w:rPr>
+              <w:t>5</w:t>
+            </w:r>
+            <w:r>
+              <w:rPr>
+                <w:noProof/>
+                <w:webHidden/>
+                <w:sz w:val="24"/>
+                <w:szCs w:val="24"/>
+              </w:rPr>
+              <w:fldChar w:fldCharType="end"/>
+            </w:r>
+          </w:hyperlink>
+        </w:p>
+        <w:p>
+          <w:pPr>
+            <w:pStyle w:val="TOC2"/>
+            <w:tabs>
+              <w:tab w:val="right" w:leader="dot" w:pos="9350"/>
+            </w:tabs>
+            <w:spacing w:line="360" w:lineRule="auto"/>
+            <w:rPr>
+              <w:rFonts w:cstheme="minorBidi"/>
+              <w:noProof/>
+              <w:kern w:val="2"/>
+              <w:sz w:val="24"/>
+              <w:szCs w:val="24"/>
+              <w14:ligatures w14:val="standardContextual"/>
+            </w:rPr>
+          </w:pPr>
+          <w:hyperlink w:anchor="_Toc242467211" w:history="1">
+            <w:r>
+              <w:rPr>
+                <w:rStyle w:val="Hyperlink"/>
+                <w:rFonts w:ascii="Times New Roman" w:hAnsi="Times New Roman"/>
+                <w:noProof/>
+                <w:sz w:val="24"/>
+                <w:szCs w:val="24"/>
+              </w:rPr>
+              <w:t>2.2 Scope and Boundary: In Scope / Out of Scope</w:t>
+            </w:r>
+            <w:r>
+              <w:rPr>
+                <w:noProof/>
+                <w:webHidden/>
+                <w:sz w:val="24"/>
+                <w:szCs w:val="24"/>
+              </w:rPr>
+              <w:tab/>
+            </w:r>
+            <w:r>
+              <w:rPr>
+                <w:noProof/>
+                <w:webHidden/>
+                <w:sz w:val="24"/>
+                <w:szCs w:val="24"/>
+              </w:rPr>
+              <w:fldChar w:fldCharType="begin"/>
+            </w:r>
+            <w:r>
+              <w:rPr>
+                <w:noProof/>
+                <w:webHidden/>
+                <w:sz w:val="24"/>
+                <w:szCs w:val="24"/>
+              </w:rPr>
+              <w:instrText xml:space="preserve"> PAGEREF _Toc242467211 \h </w:instrText>
+            </w:r>
+            <w:r>
+              <w:rPr>
+                <w:noProof/>
+                <w:webHidden/>
+                <w:sz w:val="24"/>
+                <w:szCs w:val="24"/>
+              </w:rPr>
+            </w:r>
+            <w:r>
+              <w:rPr>
+                <w:noProof/>
+                <w:webHidden/>
+                <w:sz w:val="24"/>
+                <w:szCs w:val="24"/>
+              </w:rPr>
+              <w:fldChar w:fldCharType="separate"/>
+            </w:r>
+            <w:r>
+              <w:rPr>
+                <w:noProof/>
+                <w:webHidden/>
+                <w:sz w:val="24"/>
+                <w:szCs w:val="24"/>
+              </w:rPr>
+              <w:t>5</w:t>
+            </w:r>
+            <w:r>
+              <w:rPr>
+                <w:noProof/>
+                <w:webHidden/>
+                <w:sz w:val="24"/>
+                <w:szCs w:val="24"/>
+              </w:rPr>
+              <w:fldChar w:fldCharType="end"/>
+            </w:r>
+          </w:hyperlink>
+        </w:p>
+        <w:p>
+          <w:pPr>
+            <w:pStyle w:val="TOC2"/>
+            <w:tabs>
+              <w:tab w:val="right" w:leader="dot" w:pos="9350"/>
+            </w:tabs>
+            <w:spacing w:line="360" w:lineRule="auto"/>
+            <w:rPr>
+              <w:rFonts w:cstheme="minorBidi"/>
+              <w:noProof/>
+              <w:kern w:val="2"/>
+              <w:sz w:val="24"/>
+              <w:szCs w:val="24"/>
+              <w14:ligatures w14:val="standardContextual"/>
+            </w:rPr>
+          </w:pPr>
+          <w:hyperlink w:anchor="_Toc242467212" w:history="1">
+            <w:r>
+              <w:rPr>
+                <w:rStyle w:val="Hyperlink"/>
+                <w:rFonts w:ascii="Times New Roman" w:hAnsi="Times New Roman"/>
+                <w:noProof/>
+                <w:sz w:val="24"/>
+                <w:szCs w:val="24"/>
+              </w:rPr>
+              <w:t>2.2.1 In Scope</w:t>
+            </w:r>
+            <w:r>
+              <w:rPr>
+                <w:noProof/>
+                <w:webHidden/>
+                <w:sz w:val="24"/>
+                <w:szCs w:val="24"/>
+              </w:rPr>
+              <w:tab/>
+            </w:r>
+            <w:r>
+              <w:rPr>
+                <w:noProof/>
+                <w:webHidden/>
+                <w:sz w:val="24"/>
+                <w:szCs w:val="24"/>
+              </w:rPr>
+              <w:fldChar w:fldCharType="begin"/>
+            </w:r>
+            <w:r>
+              <w:rPr>
+                <w:noProof/>
+                <w:webHidden/>
+                <w:sz w:val="24"/>
+                <w:szCs w:val="24"/>
+              </w:rPr>
+              <w:instrText xml:space="preserve"> PAGEREF _Toc242467212 \h </w:instrText>
+            </w:r>
+            <w:r>
+              <w:rPr>
+                <w:noProof/>
+                <w:webHidden/>
+                <w:sz w:val="24"/>
+                <w:szCs w:val="24"/>
+              </w:rPr>
+            </w:r>
+            <w:r>
+              <w:rPr>
+                <w:noProof/>
+                <w:webHidden/>
+                <w:sz w:val="24"/>
+                <w:szCs w:val="24"/>
+              </w:rPr>
+              <w:fldChar w:fldCharType="separate"/>
+            </w:r>
+            <w:r>
+              <w:rPr>
+                <w:noProof/>
+                <w:webHidden/>
+                <w:sz w:val="24"/>
+                <w:szCs w:val="24"/>
+              </w:rPr>
+              <w:t>5</w:t>
+            </w:r>
+            <w:r>
+              <w:rPr>
+                <w:noProof/>
+                <w:webHidden/>
+                <w:sz w:val="24"/>
+                <w:szCs w:val="24"/>
+              </w:rPr>
+              <w:fldChar w:fldCharType="end"/>
+            </w:r>
+          </w:hyperlink>
+        </w:p>
+        <w:p>
+          <w:pPr>
+            <w:pStyle w:val="TOC2"/>
+            <w:tabs>
+              <w:tab w:val="right" w:leader="dot" w:pos="9350"/>
+            </w:tabs>
+            <w:spacing w:line="360" w:lineRule="auto"/>
+            <w:rPr>
+              <w:rFonts w:cstheme="minorBidi"/>
+              <w:noProof/>
+              <w:kern w:val="2"/>
+              <w:sz w:val="24"/>
+              <w:szCs w:val="24"/>
+              <w14:ligatures w14:val="standardContextual"/>
+            </w:rPr>
+          </w:pPr>
+          <w:hyperlink w:anchor="_Toc242467213" w:history="1">
+            <w:r>
+              <w:rPr>
+                <w:rStyle w:val="Hyperlink"/>
+                <w:rFonts w:ascii="Times New Roman" w:hAnsi="Times New Roman"/>
+                <w:noProof/>
+                <w:sz w:val="24"/>
+                <w:szCs w:val="24"/>
+              </w:rPr>
+              <w:t>2.2.2 Out of Scope</w:t>
+            </w:r>
+            <w:r>
+              <w:rPr>
+                <w:noProof/>
+                <w:webHidden/>
+                <w:sz w:val="24"/>
+                <w:szCs w:val="24"/>
+              </w:rPr>
+              <w:tab/>
+            </w:r>
+            <w:r>
+              <w:rPr>
+                <w:noProof/>
+                <w:webHidden/>
+                <w:sz w:val="24"/>
+                <w:szCs w:val="24"/>
+              </w:rPr>
+              <w:fldChar w:fldCharType="begin"/>
+            </w:r>
+            <w:r>
+              <w:rPr>
+                <w:noProof/>
+                <w:webHidden/>
+                <w:sz w:val="24"/>
+                <w:szCs w:val="24"/>
+              </w:rPr>
+              <w:instrText xml:space="preserve"> PAGEREF _Toc242467213 \h </w:instrText>
+            </w:r>
+            <w:r>
+              <w:rPr>
+                <w:noProof/>
+                <w:webHidden/>
+                <w:sz w:val="24"/>
+                <w:szCs w:val="24"/>
+              </w:rPr>
+            </w:r>
+            <w:r>
+              <w:rPr>
+                <w:noProof/>
+                <w:webHidden/>
+                <w:sz w:val="24"/>
+                <w:szCs w:val="24"/>
+              </w:rPr>
+              <w:fldChar w:fldCharType="separate"/>
+            </w:r>
+            <w:r>
+              <w:rPr>
+                <w:noProof/>
+                <w:webHidden/>
+                <w:sz w:val="24"/>
+                <w:szCs w:val="24"/>
+              </w:rPr>
+              <w:t>6</w:t>
+            </w:r>
+            <w:r>
+              <w:rPr>
+                <w:noProof/>
+                <w:webHidden/>
+                <w:sz w:val="24"/>
+                <w:szCs w:val="24"/>
+              </w:rPr>
+              <w:fldChar w:fldCharType="end"/>
+            </w:r>
+          </w:hyperlink>
+        </w:p>
+        <w:p>
+          <w:pPr>
+            <w:pStyle w:val="TOC2"/>
+            <w:tabs>
+              <w:tab w:val="right" w:leader="dot" w:pos="9350"/>
+            </w:tabs>
+            <w:spacing w:line="360" w:lineRule="auto"/>
+            <w:rPr>
+              <w:rFonts w:cstheme="minorBidi"/>
+              <w:noProof/>
+              <w:kern w:val="2"/>
+              <w:sz w:val="24"/>
+              <w:szCs w:val="24"/>
+              <w14:ligatures w14:val="standardContextual"/>
+            </w:rPr>
+          </w:pPr>
+          <w:hyperlink w:anchor="_Toc242467214" w:history="1">
+            <w:r>
+              <w:rPr>
+                <w:rStyle w:val="Hyperlink"/>
+                <w:rFonts w:ascii="Times New Roman" w:hAnsi="Times New Roman"/>
+                <w:noProof/>
+                <w:sz w:val="24"/>
+                <w:szCs w:val="24"/>
+              </w:rPr>
+              <w:t>2.3 Dependencies, Assumptions and Constraints</w:t>
+            </w:r>
+            <w:r>
+              <w:rPr>
+                <w:noProof/>
+                <w:webHidden/>
+                <w:sz w:val="24"/>
+                <w:szCs w:val="24"/>
+              </w:rPr>
+              <w:tab/>
+            </w:r>
+            <w:r>
+              <w:rPr>
+                <w:noProof/>
+                <w:webHidden/>
+                <w:sz w:val="24"/>
+                <w:szCs w:val="24"/>
+              </w:rPr>
+              <w:fldChar w:fldCharType="begin"/>
+            </w:r>
+            <w:r>
+              <w:rPr>
+                <w:noProof/>
+                <w:webHidden/>
+                <w:sz w:val="24"/>
+                <w:szCs w:val="24"/>
+              </w:rPr>
+              <w:instrText xml:space="preserve"> PAGEREF _Toc242467214 \h </w:instrText>
+            </w:r>
+            <w:r>
+              <w:rPr>
+                <w:noProof/>
+                <w:webHidden/>
+                <w:sz w:val="24"/>
+                <w:szCs w:val="24"/>
+              </w:rPr>
+            </w:r>
+            <w:r>
+              <w:rPr>
+                <w:noProof/>
+                <w:webHidden/>
+                <w:sz w:val="24"/>
+                <w:szCs w:val="24"/>
+              </w:rPr>
+              <w:fldChar w:fldCharType="separate"/>
+            </w:r>
+            <w:r>
+              <w:rPr>
+                <w:noProof/>
+                <w:webHidden/>
+                <w:sz w:val="24"/>
+                <w:szCs w:val="24"/>
+              </w:rPr>
+              <w:t>6</w:t>
+            </w:r>
+            <w:r>
+              <w:rPr>
+                <w:noProof/>
+                <w:webHidden/>
+                <w:sz w:val="24"/>
+                <w:szCs w:val="24"/>
+              </w:rPr>
+              <w:fldChar w:fldCharType="end"/>
+            </w:r>
+          </w:hyperlink>
+        </w:p>
+        <w:p>
+          <w:pPr>
+            <w:pStyle w:val="TOC2"/>
+            <w:tabs>
+              <w:tab w:val="right" w:leader="dot" w:pos="9350"/>
+            </w:tabs>
+            <w:spacing w:line="360" w:lineRule="auto"/>
+            <w:rPr>
+              <w:rFonts w:cstheme="minorBidi"/>
+              <w:noProof/>
+              <w:kern w:val="2"/>
+              <w:sz w:val="24"/>
+              <w:szCs w:val="24"/>
+              <w14:ligatures w14:val="standardContextual"/>
+            </w:rPr>
+          </w:pPr>
+          <w:hyperlink w:anchor="_Toc242467215" w:history="1">
+            <w:r>
+              <w:rPr>
+                <w:rStyle w:val="Hyperlink"/>
+                <w:rFonts w:ascii="Times New Roman" w:hAnsi="Times New Roman"/>
+                <w:noProof/>
+                <w:sz w:val="24"/>
+                <w:szCs w:val="24"/>
+              </w:rPr>
+              <w:t>2.3.1 Constraints</w:t>
+            </w:r>
+            <w:r>
+              <w:rPr>
+                <w:noProof/>
+                <w:webHidden/>
+                <w:sz w:val="24"/>
+                <w:szCs w:val="24"/>
+              </w:rPr>
+              <w:tab/>
+            </w:r>
+            <w:r>
+              <w:rPr>
+                <w:noProof/>
+                <w:webHidden/>
+                <w:sz w:val="24"/>
+                <w:szCs w:val="24"/>
+              </w:rPr>
+              <w:fldChar w:fldCharType="begin"/>
+            </w:r>
+            <w:r>
+              <w:rPr>
+                <w:noProof/>
+                <w:webHidden/>
+                <w:sz w:val="24"/>
+                <w:szCs w:val="24"/>
+              </w:rPr>
+              <w:instrText xml:space="preserve"> PAGEREF _Toc242467215 \h </w:instrText>
+            </w:r>
+            <w:r>
+              <w:rPr>
+                <w:noProof/>
+                <w:webHidden/>
+                <w:sz w:val="24"/>
+                <w:szCs w:val="24"/>
+              </w:rPr>
+            </w:r>
+            <w:r>
+              <w:rPr>
+                <w:noProof/>
+                <w:webHidden/>
+                <w:sz w:val="24"/>
+                <w:szCs w:val="24"/>
+              </w:rPr>
+              <w:fldChar w:fldCharType="separate"/>
+            </w:r>
+            <w:r>
+              <w:rPr>
+                <w:noProof/>
+                <w:webHidden/>
+                <w:sz w:val="24"/>
+                <w:szCs w:val="24"/>
+              </w:rPr>
+              <w:t>6</w:t>
+            </w:r>
+            <w:r>
+              <w:rPr>
+                <w:noProof/>
+                <w:webHidden/>
+                <w:sz w:val="24"/>
+                <w:szCs w:val="24"/>
+              </w:rPr>
+              <w:fldChar w:fldCharType="end"/>
+            </w:r>
+          </w:hyperlink>
+        </w:p>
+        <w:p>
+          <w:pPr>
+            <w:pStyle w:val="TOC2"/>
+            <w:tabs>
+              <w:tab w:val="right" w:leader="dot" w:pos="9350"/>
+            </w:tabs>
+            <w:spacing w:line="360" w:lineRule="auto"/>
+            <w:rPr>
+              <w:rFonts w:cstheme="minorBidi"/>
+              <w:noProof/>
+              <w:kern w:val="2"/>
+              <w:sz w:val="24"/>
+              <w:szCs w:val="24"/>
+              <w14:ligatures w14:val="standardContextual"/>
+            </w:rPr>
+          </w:pPr>
+          <w:hyperlink w:anchor="_Toc242467216" w:history="1">
+            <w:r>
+              <w:rPr>
+                <w:rStyle w:val="Hyperlink"/>
+                <w:rFonts w:ascii="Times New Roman" w:hAnsi="Times New Roman"/>
+                <w:noProof/>
+                <w:sz w:val="24"/>
+                <w:szCs w:val="24"/>
+              </w:rPr>
+              <w:t>2.3.2 Dependencies</w:t>
+            </w:r>
+            <w:r>
+              <w:rPr>
+                <w:noProof/>
+                <w:webHidden/>
+                <w:sz w:val="24"/>
+                <w:szCs w:val="24"/>
+              </w:rPr>
+              <w:tab/>
+            </w:r>
+            <w:r>
+              <w:rPr>
+                <w:noProof/>
+                <w:webHidden/>
+                <w:sz w:val="24"/>
+                <w:szCs w:val="24"/>
+              </w:rPr>
+              <w:fldChar w:fldCharType="begin"/>
+            </w:r>
+            <w:r>
+              <w:rPr>
+                <w:noProof/>
+                <w:webHidden/>
+                <w:sz w:val="24"/>
+                <w:szCs w:val="24"/>
+              </w:rPr>
+              <w:instrText xml:space="preserve"> PAGEREF _Toc242467216 \h </w:instrText>
+            </w:r>
+            <w:r>
+              <w:rPr>
+                <w:noProof/>
+                <w:webHidden/>
+                <w:sz w:val="24"/>
+                <w:szCs w:val="24"/>
+              </w:rPr>
+            </w:r>
+            <w:r>
+              <w:rPr>
+                <w:noProof/>
+                <w:webHidden/>
+                <w:sz w:val="24"/>
+                <w:szCs w:val="24"/>
+              </w:rPr>
+              <w:fldChar w:fldCharType="separate"/>
+            </w:r>
+            <w:r>
+              <w:rPr>
+                <w:noProof/>
+                <w:webHidden/>
+                <w:sz w:val="24"/>
+                <w:szCs w:val="24"/>
+              </w:rPr>
+              <w:t>7</w:t>
+            </w:r>
+            <w:r>
+              <w:rPr>
+                <w:noProof/>
+                <w:webHidden/>
+                <w:sz w:val="24"/>
+                <w:szCs w:val="24"/>
+              </w:rPr>
+              <w:fldChar w:fldCharType="end"/>
+            </w:r>
+          </w:hyperlink>
+        </w:p>
+        <w:p>
+          <w:pPr>
+            <w:spacing w:line="360" w:lineRule="auto"/>
+            <w:rPr>
+              <w:rFonts w:ascii="Times New Roman" w:hAnsi="Times New Roman" w:cs="Times New Roman"/>
+            </w:rPr>
+          </w:pPr>
           <w:r>
             <w:rPr>
+              <w:rFonts w:ascii="Times New Roman" w:hAnsi="Times New Roman" w:cs="Times New Roman"/>
               <w:b/>
               <w:bCs/>
               <w:noProof/>
@@ -561,6 +1445,7 @@
     </w:sdt>
     <w:p>
       <w:pPr>
+        <w:spacing w:line="360" w:lineRule="auto"/>
         <w:rPr>
           <w:rFonts w:ascii="Times New Roman" w:hAnsi="Times New Roman" w:cs="Times New Roman"/>
         </w:rPr>
@@ -582,17 +1467,19 @@
         <w:spacing w:line="360" w:lineRule="auto"/>
         <w:ind w:left="0"/>
         <w:rPr>
+          <w:rFonts w:ascii="Times New Roman" w:hAnsi="Times New Roman" w:cs="Times New Roman"/>
           <w:color w:val="auto"/>
-          <w:sz w:val="32"/>
-          <w:szCs w:val="32"/>
+          <w:sz w:val="28"/>
+          <w:szCs w:val="28"/>
         </w:rPr>
       </w:pPr>
-      <w:bookmarkStart w:id="0" w:name="_Toc242386951"/>
+      <w:bookmarkStart w:id="0" w:name="_Toc242467204"/>
       <w:r>
         <w:rPr>
+          <w:rFonts w:ascii="Times New Roman" w:hAnsi="Times New Roman" w:cs="Times New Roman"/>
           <w:color w:val="auto"/>
-          <w:sz w:val="32"/>
-          <w:szCs w:val="32"/>
+          <w:sz w:val="28"/>
+          <w:szCs w:val="28"/>
         </w:rPr>
         <w:lastRenderedPageBreak/>
         <w:t>Scenario Interpretation</w:t>
@@ -604,37 +1491,39 @@
         <w:pStyle w:val="Heading2"/>
         <w:spacing w:line="360" w:lineRule="auto"/>
         <w:rPr>
+          <w:rFonts w:ascii="Times New Roman" w:hAnsi="Times New Roman" w:cs="Times New Roman"/>
+          <w:color w:val="auto"/>
+          <w:sz w:val="24"/>
+          <w:szCs w:val="24"/>
+        </w:rPr>
+      </w:pPr>
+      <w:bookmarkStart w:id="1" w:name="_Toc242467205"/>
+      <w:r>
+        <w:rPr>
+          <w:rFonts w:ascii="Times New Roman" w:hAnsi="Times New Roman" w:cs="Times New Roman"/>
+          <w:color w:val="auto"/>
+          <w:sz w:val="24"/>
+          <w:szCs w:val="24"/>
+        </w:rPr>
+        <w:t>1.1</w:t>
+      </w:r>
+      <w:r>
+        <w:rPr>
+          <w:rFonts w:ascii="Times New Roman" w:hAnsi="Times New Roman" w:cs="Times New Roman"/>
           <w:color w:val="auto"/>
           <w:sz w:val="28"/>
           <w:szCs w:val="28"/>
         </w:rPr>
-      </w:pPr>
-      <w:bookmarkStart w:id="1" w:name="_Toc242386952"/>
+        <w:t xml:space="preserve"> </w:t>
+      </w:r>
       <w:r>
         <w:rPr>
+          <w:rFonts w:ascii="Times New Roman" w:hAnsi="Times New Roman" w:cs="Times New Roman"/>
           <w:color w:val="auto"/>
-          <w:sz w:val="28"/>
-          <w:szCs w:val="28"/>
+          <w:sz w:val="24"/>
+          <w:szCs w:val="24"/>
         </w:rPr>
-        <w:t xml:space="preserve">1.1 </w:t>
-      </w:r>
-      <w:proofErr w:type="spellStart"/>
-      <w:r>
-        <w:rPr>
-          <w:color w:val="auto"/>
-          <w:sz w:val="28"/>
-          <w:szCs w:val="28"/>
-        </w:rPr>
-        <w:t>Organisation</w:t>
-      </w:r>
-      <w:proofErr w:type="spellEnd"/>
-      <w:r>
-        <w:rPr>
-          <w:color w:val="auto"/>
-          <w:sz w:val="28"/>
-          <w:szCs w:val="28"/>
-        </w:rPr>
-        <w:t xml:space="preserve"> and Current Process</w:t>
+        <w:t>Organisation and Current Process</w:t>
       </w:r>
       <w:bookmarkEnd w:id="1"/>
     </w:p>
@@ -643,23 +1532,17 @@
         <w:spacing w:line="360" w:lineRule="auto"/>
         <w:rPr>
           <w:rFonts w:ascii="Times New Roman" w:hAnsi="Times New Roman" w:cs="Times New Roman"/>
-          <w:sz w:val="28"/>
-          <w:szCs w:val="28"/>
         </w:rPr>
       </w:pPr>
       <w:r>
         <w:rPr>
           <w:rFonts w:ascii="Times New Roman" w:hAnsi="Times New Roman" w:cs="Times New Roman"/>
-          <w:sz w:val="28"/>
-          <w:szCs w:val="28"/>
         </w:rPr>
         <w:t>Kerry Kitchen Collective produces preserves, sauces, baked goods and seasonal gift products in small batches for shops, markets and direct customers.</w:t>
       </w:r>
       <w:r>
         <w:rPr>
           <w:rFonts w:ascii="Times New Roman" w:hAnsi="Times New Roman" w:cs="Times New Roman"/>
-          <w:sz w:val="28"/>
-          <w:szCs w:val="28"/>
         </w:rPr>
         <w:br/>
         <w:t>Orders, recipes, ingredient stock, production records, and labels are maintained across spreadsheets and paper records.</w:t>
@@ -667,17 +1550,10 @@
       <w:r>
         <w:rPr>
           <w:rFonts w:ascii="Times New Roman" w:hAnsi="Times New Roman" w:cs="Times New Roman"/>
-          <w:sz w:val="28"/>
-          <w:szCs w:val="28"/>
         </w:rPr>
         <w:br/>
         <w:t>Staff require stronger control over recipe versions, allergen information, ingredient batches, planned production, and released products.</w:t>
       </w:r>
-    </w:p>
-    <w:p>
-      <w:pPr>
-        <w:spacing w:line="360" w:lineRule="auto"/>
-      </w:pPr>
     </w:p>
     <w:p>
       <w:pPr>
@@ -686,37 +1562,19 @@
         <w:rPr>
           <w:rFonts w:ascii="Times New Roman" w:hAnsi="Times New Roman" w:cs="Times New Roman"/>
           <w:color w:val="auto"/>
-          <w:sz w:val="28"/>
-          <w:szCs w:val="28"/>
+          <w:sz w:val="24"/>
+          <w:szCs w:val="24"/>
         </w:rPr>
       </w:pPr>
-      <w:bookmarkStart w:id="2" w:name="_Toc242386953"/>
+      <w:bookmarkStart w:id="2" w:name="_Toc242467206"/>
       <w:r>
         <w:rPr>
           <w:rFonts w:ascii="Times New Roman" w:hAnsi="Times New Roman" w:cs="Times New Roman"/>
           <w:color w:val="auto"/>
-          <w:sz w:val="28"/>
-          <w:szCs w:val="28"/>
+          <w:sz w:val="24"/>
+          <w:szCs w:val="24"/>
         </w:rPr>
-        <w:t>1.2 Current Problems and Con</w:t>
-      </w:r>
-      <w:r>
-        <w:rPr>
-          <w:rFonts w:ascii="Times New Roman" w:hAnsi="Times New Roman" w:cs="Times New Roman"/>
-          <w:color w:val="auto"/>
-          <w:sz w:val="28"/>
-          <w:szCs w:val="28"/>
-        </w:rPr>
-        <w:t>se</w:t>
-      </w:r>
-      <w:r>
-        <w:rPr>
-          <w:rFonts w:ascii="Times New Roman" w:hAnsi="Times New Roman" w:cs="Times New Roman"/>
-          <w:color w:val="auto"/>
-          <w:sz w:val="28"/>
-          <w:szCs w:val="28"/>
-        </w:rPr>
-        <w:t>quences</w:t>
+        <w:t>1.2 Current Problems and Consequences</w:t>
       </w:r>
       <w:bookmarkEnd w:id="2"/>
     </w:p>
@@ -725,48 +1583,26 @@
         <w:spacing w:line="360" w:lineRule="auto"/>
         <w:rPr>
           <w:rFonts w:ascii="Times New Roman" w:hAnsi="Times New Roman" w:cs="Times New Roman"/>
-          <w:sz w:val="28"/>
-          <w:szCs w:val="28"/>
         </w:rPr>
       </w:pPr>
       <w:r>
         <w:rPr>
           <w:rFonts w:ascii="Times New Roman" w:hAnsi="Times New Roman" w:cs="Times New Roman"/>
-          <w:sz w:val="28"/>
-          <w:szCs w:val="28"/>
         </w:rPr>
         <w:t>Employees sometimes make handwritten notes on paper recipes without updating the master record.</w:t>
       </w:r>
       <w:r>
         <w:rPr>
           <w:rFonts w:ascii="Times New Roman" w:hAnsi="Times New Roman" w:cs="Times New Roman"/>
-          <w:sz w:val="28"/>
-          <w:szCs w:val="28"/>
         </w:rPr>
         <w:br/>
-      </w:r>
-      <w:r>
-        <w:rPr>
-          <w:rFonts w:ascii="Times New Roman" w:hAnsi="Times New Roman" w:cs="Times New Roman"/>
-          <w:sz w:val="28"/>
-          <w:szCs w:val="28"/>
-        </w:rPr>
         <w:t>Opened ingredients and substitutions are not always reflected promptly.</w:t>
       </w:r>
       <w:r>
         <w:rPr>
           <w:rFonts w:ascii="Times New Roman" w:hAnsi="Times New Roman" w:cs="Times New Roman"/>
-          <w:sz w:val="28"/>
-          <w:szCs w:val="28"/>
         </w:rPr>
         <w:br/>
-      </w:r>
-      <w:r>
-        <w:rPr>
-          <w:rFonts w:ascii="Times New Roman" w:hAnsi="Times New Roman" w:cs="Times New Roman"/>
-          <w:sz w:val="28"/>
-          <w:szCs w:val="28"/>
-        </w:rPr>
         <w:t>Several customer orders may receive units from the same batch, while one order may contain units from several batches, but this relationship is not consistently recorded.</w:t>
       </w:r>
     </w:p>
@@ -791,15 +1627,11 @@
               <w:spacing w:line="360" w:lineRule="auto"/>
               <w:rPr>
                 <w:rFonts w:ascii="Times New Roman" w:hAnsi="Times New Roman" w:cs="Times New Roman"/>
-                <w:sz w:val="28"/>
-                <w:szCs w:val="28"/>
-              </w:rPr>
-            </w:pPr>
-            <w:r>
-              <w:rPr>
-                <w:rFonts w:ascii="Times New Roman" w:hAnsi="Times New Roman" w:cs="Times New Roman"/>
-                <w:sz w:val="28"/>
-                <w:szCs w:val="28"/>
+              </w:rPr>
+            </w:pPr>
+            <w:r>
+              <w:rPr>
+                <w:rFonts w:ascii="Times New Roman" w:hAnsi="Times New Roman" w:cs="Times New Roman"/>
               </w:rPr>
               <w:t>ID</w:t>
             </w:r>
@@ -814,15 +1646,11 @@
               <w:spacing w:line="360" w:lineRule="auto"/>
               <w:rPr>
                 <w:rFonts w:ascii="Times New Roman" w:hAnsi="Times New Roman" w:cs="Times New Roman"/>
-                <w:sz w:val="28"/>
-                <w:szCs w:val="28"/>
-              </w:rPr>
-            </w:pPr>
-            <w:r>
-              <w:rPr>
-                <w:rFonts w:ascii="Times New Roman" w:hAnsi="Times New Roman" w:cs="Times New Roman"/>
-                <w:sz w:val="28"/>
-                <w:szCs w:val="28"/>
+              </w:rPr>
+            </w:pPr>
+            <w:r>
+              <w:rPr>
+                <w:rFonts w:ascii="Times New Roman" w:hAnsi="Times New Roman" w:cs="Times New Roman"/>
               </w:rPr>
               <w:t>Current Problem</w:t>
             </w:r>
@@ -837,15 +1665,11 @@
               <w:spacing w:line="360" w:lineRule="auto"/>
               <w:rPr>
                 <w:rFonts w:ascii="Times New Roman" w:hAnsi="Times New Roman" w:cs="Times New Roman"/>
-                <w:sz w:val="28"/>
-                <w:szCs w:val="28"/>
-              </w:rPr>
-            </w:pPr>
-            <w:r>
-              <w:rPr>
-                <w:rFonts w:ascii="Times New Roman" w:hAnsi="Times New Roman" w:cs="Times New Roman"/>
-                <w:sz w:val="28"/>
-                <w:szCs w:val="28"/>
+              </w:rPr>
+            </w:pPr>
+            <w:r>
+              <w:rPr>
+                <w:rFonts w:ascii="Times New Roman" w:hAnsi="Times New Roman" w:cs="Times New Roman"/>
               </w:rPr>
               <w:t>Consequence</w:t>
             </w:r>
@@ -862,15 +1686,11 @@
               <w:spacing w:line="360" w:lineRule="auto"/>
               <w:rPr>
                 <w:rFonts w:ascii="Times New Roman" w:hAnsi="Times New Roman" w:cs="Times New Roman"/>
-                <w:sz w:val="28"/>
-                <w:szCs w:val="28"/>
-              </w:rPr>
-            </w:pPr>
-            <w:r>
-              <w:rPr>
-                <w:rFonts w:ascii="Times New Roman" w:hAnsi="Times New Roman" w:cs="Times New Roman"/>
-                <w:sz w:val="28"/>
-                <w:szCs w:val="28"/>
+              </w:rPr>
+            </w:pPr>
+            <w:r>
+              <w:rPr>
+                <w:rFonts w:ascii="Times New Roman" w:hAnsi="Times New Roman" w:cs="Times New Roman"/>
               </w:rPr>
               <w:t>P1</w:t>
             </w:r>
@@ -885,15 +1705,11 @@
               <w:spacing w:line="360" w:lineRule="auto"/>
               <w:rPr>
                 <w:rFonts w:ascii="Times New Roman" w:hAnsi="Times New Roman" w:cs="Times New Roman"/>
-                <w:sz w:val="28"/>
-                <w:szCs w:val="28"/>
-              </w:rPr>
-            </w:pPr>
-            <w:r>
-              <w:rPr>
-                <w:rFonts w:ascii="Times New Roman" w:hAnsi="Times New Roman" w:cs="Times New Roman"/>
-                <w:sz w:val="28"/>
-                <w:szCs w:val="28"/>
+              </w:rPr>
+            </w:pPr>
+            <w:r>
+              <w:rPr>
+                <w:rFonts w:ascii="Times New Roman" w:hAnsi="Times New Roman" w:cs="Times New Roman"/>
               </w:rPr>
               <w:t>Paper recipe changes are not always reflected in the master recipe</w:t>
             </w:r>
@@ -908,15 +1724,11 @@
               <w:spacing w:line="360" w:lineRule="auto"/>
               <w:rPr>
                 <w:rFonts w:ascii="Times New Roman" w:hAnsi="Times New Roman" w:cs="Times New Roman"/>
-                <w:sz w:val="28"/>
-                <w:szCs w:val="28"/>
-              </w:rPr>
-            </w:pPr>
-            <w:r>
-              <w:rPr>
-                <w:rFonts w:ascii="Times New Roman" w:hAnsi="Times New Roman" w:cs="Times New Roman"/>
-                <w:sz w:val="28"/>
-                <w:szCs w:val="28"/>
+              </w:rPr>
+            </w:pPr>
+            <w:r>
+              <w:rPr>
+                <w:rFonts w:ascii="Times New Roman" w:hAnsi="Times New Roman" w:cs="Times New Roman"/>
               </w:rPr>
               <w:t>This can make it difficult to determine which approved recipe version was used for a specific production batch and may affect the accuracy of labels, allergen information, cost and expected yield</w:t>
             </w:r>
@@ -933,17 +1745,12 @@
               <w:spacing w:line="360" w:lineRule="auto"/>
               <w:rPr>
                 <w:rFonts w:ascii="Times New Roman" w:hAnsi="Times New Roman" w:cs="Times New Roman"/>
-                <w:sz w:val="28"/>
-                <w:szCs w:val="28"/>
-              </w:rPr>
-            </w:pPr>
-            <w:r>
-              <w:rPr>
-                <w:rFonts w:ascii="Times New Roman" w:hAnsi="Times New Roman" w:cs="Times New Roman"/>
-                <w:sz w:val="28"/>
-                <w:szCs w:val="28"/>
-              </w:rPr>
-              <w:lastRenderedPageBreak/>
+              </w:rPr>
+            </w:pPr>
+            <w:r>
+              <w:rPr>
+                <w:rFonts w:ascii="Times New Roman" w:hAnsi="Times New Roman" w:cs="Times New Roman"/>
+              </w:rPr>
               <w:t>P2</w:t>
             </w:r>
           </w:p>
@@ -957,17 +1764,19 @@
               <w:spacing w:line="360" w:lineRule="auto"/>
               <w:rPr>
                 <w:rFonts w:ascii="Times New Roman" w:hAnsi="Times New Roman" w:cs="Times New Roman"/>
-                <w:sz w:val="28"/>
-                <w:szCs w:val="28"/>
-              </w:rPr>
-            </w:pPr>
-            <w:r>
-              <w:rPr>
-                <w:rFonts w:ascii="Times New Roman" w:hAnsi="Times New Roman" w:cs="Times New Roman"/>
-                <w:sz w:val="28"/>
-                <w:szCs w:val="28"/>
-              </w:rPr>
-              <w:t>Opened ingredients and substitutions are not always recorded promptly</w:t>
+              </w:rPr>
+            </w:pPr>
+            <w:r>
+              <w:rPr>
+                <w:rFonts w:ascii="Times New Roman" w:hAnsi="Times New Roman" w:cs="Times New Roman"/>
+              </w:rPr>
+              <w:t>Opened ingredients and substitutions are not always recor</w:t>
+            </w:r>
+            <w:r>
+              <w:rPr>
+                <w:rFonts w:ascii="Times New Roman" w:hAnsi="Times New Roman" w:cs="Times New Roman"/>
+              </w:rPr>
+              <w:t>ded promptly</w:t>
             </w:r>
           </w:p>
         </w:tc>
@@ -980,15 +1789,11 @@
               <w:spacing w:line="360" w:lineRule="auto"/>
               <w:rPr>
                 <w:rFonts w:ascii="Times New Roman" w:hAnsi="Times New Roman" w:cs="Times New Roman"/>
-                <w:sz w:val="28"/>
-                <w:szCs w:val="28"/>
-              </w:rPr>
-            </w:pPr>
-            <w:r>
-              <w:rPr>
-                <w:rFonts w:ascii="Times New Roman" w:hAnsi="Times New Roman" w:cs="Times New Roman"/>
-                <w:sz w:val="28"/>
-                <w:szCs w:val="28"/>
+              </w:rPr>
+            </w:pPr>
+            <w:r>
+              <w:rPr>
+                <w:rFonts w:ascii="Times New Roman" w:hAnsi="Times New Roman" w:cs="Times New Roman"/>
               </w:rPr>
               <w:t>Ingredient availability records may not accurately reflect the stock available for planned production, making production planning more difficult</w:t>
             </w:r>
@@ -1005,15 +1810,11 @@
               <w:spacing w:line="360" w:lineRule="auto"/>
               <w:rPr>
                 <w:rFonts w:ascii="Times New Roman" w:hAnsi="Times New Roman" w:cs="Times New Roman"/>
-                <w:sz w:val="28"/>
-                <w:szCs w:val="28"/>
-              </w:rPr>
-            </w:pPr>
-            <w:r>
-              <w:rPr>
-                <w:rFonts w:ascii="Times New Roman" w:hAnsi="Times New Roman" w:cs="Times New Roman"/>
-                <w:sz w:val="28"/>
-                <w:szCs w:val="28"/>
+              </w:rPr>
+            </w:pPr>
+            <w:r>
+              <w:rPr>
+                <w:rFonts w:ascii="Times New Roman" w:hAnsi="Times New Roman" w:cs="Times New Roman"/>
               </w:rPr>
               <w:t>P3</w:t>
             </w:r>
@@ -1028,15 +1829,11 @@
               <w:spacing w:line="360" w:lineRule="auto"/>
               <w:rPr>
                 <w:rFonts w:ascii="Times New Roman" w:hAnsi="Times New Roman" w:cs="Times New Roman"/>
-                <w:sz w:val="28"/>
-                <w:szCs w:val="28"/>
-              </w:rPr>
-            </w:pPr>
-            <w:r>
-              <w:rPr>
-                <w:rFonts w:ascii="Times New Roman" w:hAnsi="Times New Roman" w:cs="Times New Roman"/>
-                <w:sz w:val="28"/>
-                <w:szCs w:val="28"/>
+              </w:rPr>
+            </w:pPr>
+            <w:r>
+              <w:rPr>
+                <w:rFonts w:ascii="Times New Roman" w:hAnsi="Times New Roman" w:cs="Times New Roman"/>
               </w:rPr>
               <w:t>The relationship between production batches and customer orders is not consistently recorded</w:t>
             </w:r>
@@ -1051,15 +1848,11 @@
               <w:spacing w:line="360" w:lineRule="auto"/>
               <w:rPr>
                 <w:rFonts w:ascii="Times New Roman" w:hAnsi="Times New Roman" w:cs="Times New Roman"/>
-                <w:sz w:val="28"/>
-                <w:szCs w:val="28"/>
-              </w:rPr>
-            </w:pPr>
-            <w:r>
-              <w:rPr>
-                <w:rFonts w:ascii="Times New Roman" w:hAnsi="Times New Roman" w:cs="Times New Roman"/>
-                <w:sz w:val="28"/>
-                <w:szCs w:val="28"/>
+              </w:rPr>
+            </w:pPr>
+            <w:r>
+              <w:rPr>
+                <w:rFonts w:ascii="Times New Roman" w:hAnsi="Times New Roman" w:cs="Times New Roman"/>
               </w:rPr>
               <w:t>When error is identified, tracing affected production batches, packaged units and customer orders can be slow, particularly when production has been split</w:t>
             </w:r>
@@ -1072,27 +1865,29 @@
         <w:spacing w:line="360" w:lineRule="auto"/>
         <w:rPr>
           <w:rFonts w:ascii="Times New Roman" w:hAnsi="Times New Roman" w:cs="Times New Roman"/>
-          <w:sz w:val="28"/>
-          <w:szCs w:val="28"/>
         </w:rPr>
       </w:pPr>
     </w:p>
     <w:p>
       <w:pPr>
         <w:pStyle w:val="Heading2"/>
+        <w:spacing w:line="360" w:lineRule="auto"/>
         <w:rPr>
+          <w:rFonts w:ascii="Times New Roman" w:hAnsi="Times New Roman" w:cs="Times New Roman"/>
           <w:color w:val="auto"/>
-          <w:sz w:val="28"/>
-          <w:szCs w:val="28"/>
+          <w:sz w:val="24"/>
+          <w:szCs w:val="24"/>
         </w:rPr>
       </w:pPr>
-      <w:bookmarkStart w:id="3" w:name="_Toc242386954"/>
+      <w:bookmarkStart w:id="3" w:name="_Toc242467207"/>
       <w:r>
         <w:rPr>
+          <w:rFonts w:ascii="Times New Roman" w:hAnsi="Times New Roman" w:cs="Times New Roman"/>
           <w:color w:val="auto"/>
-          <w:sz w:val="28"/>
-          <w:szCs w:val="28"/>
+          <w:sz w:val="24"/>
+          <w:szCs w:val="24"/>
         </w:rPr>
+        <w:lastRenderedPageBreak/>
         <w:t>1.3 Desired Outcomes</w:t>
       </w:r>
       <w:bookmarkEnd w:id="3"/>
@@ -1114,7 +1909,16 @@
             <w:tcW w:w="715" w:type="dxa"/>
           </w:tcPr>
           <w:p>
-            <w:r>
+            <w:pPr>
+              <w:spacing w:line="360" w:lineRule="auto"/>
+              <w:rPr>
+                <w:rFonts w:ascii="Times New Roman" w:hAnsi="Times New Roman" w:cs="Times New Roman"/>
+              </w:rPr>
+            </w:pPr>
+            <w:r>
+              <w:rPr>
+                <w:rFonts w:ascii="Times New Roman" w:hAnsi="Times New Roman" w:cs="Times New Roman"/>
+              </w:rPr>
               <w:t>ID</w:t>
             </w:r>
           </w:p>
@@ -1124,7 +1928,16 @@
             <w:tcW w:w="2520" w:type="dxa"/>
           </w:tcPr>
           <w:p>
-            <w:r>
+            <w:pPr>
+              <w:spacing w:line="360" w:lineRule="auto"/>
+              <w:rPr>
+                <w:rFonts w:ascii="Times New Roman" w:hAnsi="Times New Roman" w:cs="Times New Roman"/>
+              </w:rPr>
+            </w:pPr>
+            <w:r>
+              <w:rPr>
+                <w:rFonts w:ascii="Times New Roman" w:hAnsi="Times New Roman" w:cs="Times New Roman"/>
+              </w:rPr>
               <w:t>Related Problem</w:t>
             </w:r>
           </w:p>
@@ -1134,7 +1947,16 @@
             <w:tcW w:w="6115" w:type="dxa"/>
           </w:tcPr>
           <w:p>
-            <w:r>
+            <w:pPr>
+              <w:spacing w:line="360" w:lineRule="auto"/>
+              <w:rPr>
+                <w:rFonts w:ascii="Times New Roman" w:hAnsi="Times New Roman" w:cs="Times New Roman"/>
+              </w:rPr>
+            </w:pPr>
+            <w:r>
+              <w:rPr>
+                <w:rFonts w:ascii="Times New Roman" w:hAnsi="Times New Roman" w:cs="Times New Roman"/>
+              </w:rPr>
               <w:t>Desired Outcome</w:t>
             </w:r>
           </w:p>
@@ -1146,7 +1968,16 @@
             <w:tcW w:w="715" w:type="dxa"/>
           </w:tcPr>
           <w:p>
-            <w:r>
+            <w:pPr>
+              <w:spacing w:line="360" w:lineRule="auto"/>
+              <w:rPr>
+                <w:rFonts w:ascii="Times New Roman" w:hAnsi="Times New Roman" w:cs="Times New Roman"/>
+              </w:rPr>
+            </w:pPr>
+            <w:r>
+              <w:rPr>
+                <w:rFonts w:ascii="Times New Roman" w:hAnsi="Times New Roman" w:cs="Times New Roman"/>
+              </w:rPr>
               <w:t>DO1</w:t>
             </w:r>
           </w:p>
@@ -1156,7 +1987,16 @@
             <w:tcW w:w="2520" w:type="dxa"/>
           </w:tcPr>
           <w:p>
-            <w:r>
+            <w:pPr>
+              <w:spacing w:line="360" w:lineRule="auto"/>
+              <w:rPr>
+                <w:rFonts w:ascii="Times New Roman" w:hAnsi="Times New Roman" w:cs="Times New Roman"/>
+              </w:rPr>
+            </w:pPr>
+            <w:r>
+              <w:rPr>
+                <w:rFonts w:ascii="Times New Roman" w:hAnsi="Times New Roman" w:cs="Times New Roman"/>
+              </w:rPr>
               <w:t>P1 – Recipe version records</w:t>
             </w:r>
           </w:p>
@@ -1166,7 +2006,16 @@
             <w:tcW w:w="6115" w:type="dxa"/>
           </w:tcPr>
           <w:p>
-            <w:r>
+            <w:pPr>
+              <w:spacing w:line="360" w:lineRule="auto"/>
+              <w:rPr>
+                <w:rFonts w:ascii="Times New Roman" w:hAnsi="Times New Roman" w:cs="Times New Roman"/>
+              </w:rPr>
+            </w:pPr>
+            <w:r>
+              <w:rPr>
+                <w:rFonts w:ascii="Times New Roman" w:hAnsi="Times New Roman" w:cs="Times New Roman"/>
+              </w:rPr>
               <w:t>Improve the reliability and consistency of recipe version records used for production</w:t>
             </w:r>
           </w:p>
@@ -1178,7 +2027,16 @@
             <w:tcW w:w="715" w:type="dxa"/>
           </w:tcPr>
           <w:p>
-            <w:r>
+            <w:pPr>
+              <w:spacing w:line="360" w:lineRule="auto"/>
+              <w:rPr>
+                <w:rFonts w:ascii="Times New Roman" w:hAnsi="Times New Roman" w:cs="Times New Roman"/>
+              </w:rPr>
+            </w:pPr>
+            <w:r>
+              <w:rPr>
+                <w:rFonts w:ascii="Times New Roman" w:hAnsi="Times New Roman" w:cs="Times New Roman"/>
+              </w:rPr>
               <w:t>DO2</w:t>
             </w:r>
           </w:p>
@@ -1188,7 +2046,16 @@
             <w:tcW w:w="2520" w:type="dxa"/>
           </w:tcPr>
           <w:p>
-            <w:r>
+            <w:pPr>
+              <w:spacing w:line="360" w:lineRule="auto"/>
+              <w:rPr>
+                <w:rFonts w:ascii="Times New Roman" w:hAnsi="Times New Roman" w:cs="Times New Roman"/>
+              </w:rPr>
+            </w:pPr>
+            <w:r>
+              <w:rPr>
+                <w:rFonts w:ascii="Times New Roman" w:hAnsi="Times New Roman" w:cs="Times New Roman"/>
+              </w:rPr>
               <w:t>P2 – Ingredient availability records</w:t>
             </w:r>
           </w:p>
@@ -1198,11 +2065,17 @@
             <w:tcW w:w="6115" w:type="dxa"/>
           </w:tcPr>
           <w:p>
-            <w:r>
-              <w:t xml:space="preserve">Improve </w:t>
-            </w:r>
-            <w:r>
-              <w:t>the accuracy and timeliness of ingredient availability information for production planning</w:t>
+            <w:pPr>
+              <w:spacing w:line="360" w:lineRule="auto"/>
+              <w:rPr>
+                <w:rFonts w:ascii="Times New Roman" w:hAnsi="Times New Roman" w:cs="Times New Roman"/>
+              </w:rPr>
+            </w:pPr>
+            <w:r>
+              <w:rPr>
+                <w:rFonts w:ascii="Times New Roman" w:hAnsi="Times New Roman" w:cs="Times New Roman"/>
+              </w:rPr>
+              <w:t>Improve the accuracy and timeliness of ingredient availability information for production planning</w:t>
             </w:r>
           </w:p>
         </w:tc>
@@ -1213,7 +2086,16 @@
             <w:tcW w:w="715" w:type="dxa"/>
           </w:tcPr>
           <w:p>
-            <w:r>
+            <w:pPr>
+              <w:spacing w:line="360" w:lineRule="auto"/>
+              <w:rPr>
+                <w:rFonts w:ascii="Times New Roman" w:hAnsi="Times New Roman" w:cs="Times New Roman"/>
+              </w:rPr>
+            </w:pPr>
+            <w:r>
+              <w:rPr>
+                <w:rFonts w:ascii="Times New Roman" w:hAnsi="Times New Roman" w:cs="Times New Roman"/>
+              </w:rPr>
               <w:t>DO3</w:t>
             </w:r>
           </w:p>
@@ -1223,7 +2105,16 @@
             <w:tcW w:w="2520" w:type="dxa"/>
           </w:tcPr>
           <w:p>
-            <w:r>
+            <w:pPr>
+              <w:spacing w:line="360" w:lineRule="auto"/>
+              <w:rPr>
+                <w:rFonts w:ascii="Times New Roman" w:hAnsi="Times New Roman" w:cs="Times New Roman"/>
+              </w:rPr>
+            </w:pPr>
+            <w:r>
+              <w:rPr>
+                <w:rFonts w:ascii="Times New Roman" w:hAnsi="Times New Roman" w:cs="Times New Roman"/>
+              </w:rPr>
               <w:t>P3 – Batch / order traceability</w:t>
             </w:r>
           </w:p>
@@ -1233,32 +2124,40 @@
             <w:tcW w:w="6115" w:type="dxa"/>
           </w:tcPr>
           <w:p>
-            <w:r>
-              <w:t xml:space="preserve">Ensure reliable </w:t>
-            </w:r>
-            <w:r>
-              <w:t>traceability between production batches and customer orders</w:t>
+            <w:pPr>
+              <w:spacing w:line="360" w:lineRule="auto"/>
+              <w:rPr>
+                <w:rFonts w:ascii="Times New Roman" w:hAnsi="Times New Roman" w:cs="Times New Roman"/>
+              </w:rPr>
+            </w:pPr>
+            <w:r>
+              <w:rPr>
+                <w:rFonts w:ascii="Times New Roman" w:hAnsi="Times New Roman" w:cs="Times New Roman"/>
+              </w:rPr>
+              <w:t>Ensure reliable traceability between production batches and customer orders</w:t>
             </w:r>
           </w:p>
         </w:tc>
       </w:tr>
     </w:tbl>
-    <w:p/>
     <w:p>
       <w:pPr>
         <w:pStyle w:val="Heading2"/>
+        <w:spacing w:line="360" w:lineRule="auto"/>
         <w:rPr>
+          <w:rFonts w:ascii="Times New Roman" w:hAnsi="Times New Roman" w:cs="Times New Roman"/>
           <w:color w:val="auto"/>
-          <w:sz w:val="28"/>
-          <w:szCs w:val="28"/>
+          <w:sz w:val="24"/>
+          <w:szCs w:val="24"/>
         </w:rPr>
       </w:pPr>
-      <w:bookmarkStart w:id="4" w:name="_Toc242386955"/>
+      <w:bookmarkStart w:id="4" w:name="_Toc242467208"/>
       <w:r>
         <w:rPr>
+          <w:rFonts w:ascii="Times New Roman" w:hAnsi="Times New Roman" w:cs="Times New Roman"/>
           <w:color w:val="auto"/>
-          <w:sz w:val="28"/>
-          <w:szCs w:val="28"/>
+          <w:sz w:val="24"/>
+          <w:szCs w:val="24"/>
         </w:rPr>
         <w:t>1.4 Evidence and Uncertainty</w:t>
       </w:r>
@@ -1271,48 +2170,84 @@
         <w:tblLook w:val="04A0" w:firstRow="1" w:lastRow="0" w:firstColumn="1" w:lastColumn="0" w:noHBand="0" w:noVBand="1"/>
       </w:tblPr>
       <w:tblGrid>
-        <w:gridCol w:w="641"/>
-        <w:gridCol w:w="3944"/>
-        <w:gridCol w:w="2448"/>
-        <w:gridCol w:w="2317"/>
+        <w:gridCol w:w="656"/>
+        <w:gridCol w:w="3396"/>
+        <w:gridCol w:w="1443"/>
+        <w:gridCol w:w="3855"/>
       </w:tblGrid>
       <w:tr>
         <w:tc>
           <w:tcPr>
-            <w:tcW w:w="641" w:type="dxa"/>
-          </w:tcPr>
-          <w:p>
-            <w:r>
+            <w:tcW w:w="656" w:type="dxa"/>
+          </w:tcPr>
+          <w:p>
+            <w:pPr>
+              <w:spacing w:line="360" w:lineRule="auto"/>
+              <w:rPr>
+                <w:rFonts w:ascii="Times New Roman" w:hAnsi="Times New Roman" w:cs="Times New Roman"/>
+              </w:rPr>
+            </w:pPr>
+            <w:r>
+              <w:rPr>
+                <w:rFonts w:ascii="Times New Roman" w:hAnsi="Times New Roman" w:cs="Times New Roman"/>
+              </w:rPr>
               <w:t>ID</w:t>
             </w:r>
           </w:p>
         </w:tc>
         <w:tc>
           <w:tcPr>
-            <w:tcW w:w="3944" w:type="dxa"/>
-          </w:tcPr>
-          <w:p>
-            <w:r>
+            <w:tcW w:w="3396" w:type="dxa"/>
+          </w:tcPr>
+          <w:p>
+            <w:pPr>
+              <w:spacing w:line="360" w:lineRule="auto"/>
+              <w:rPr>
+                <w:rFonts w:ascii="Times New Roman" w:hAnsi="Times New Roman" w:cs="Times New Roman"/>
+              </w:rPr>
+            </w:pPr>
+            <w:r>
+              <w:rPr>
+                <w:rFonts w:ascii="Times New Roman" w:hAnsi="Times New Roman" w:cs="Times New Roman"/>
+              </w:rPr>
               <w:t>Evidence from Scenario</w:t>
             </w:r>
           </w:p>
         </w:tc>
         <w:tc>
           <w:tcPr>
-            <w:tcW w:w="2448" w:type="dxa"/>
-          </w:tcPr>
-          <w:p>
-            <w:r>
+            <w:tcW w:w="1443" w:type="dxa"/>
+          </w:tcPr>
+          <w:p>
+            <w:pPr>
+              <w:spacing w:line="360" w:lineRule="auto"/>
+              <w:rPr>
+                <w:rFonts w:ascii="Times New Roman" w:hAnsi="Times New Roman" w:cs="Times New Roman"/>
+              </w:rPr>
+            </w:pPr>
+            <w:r>
+              <w:rPr>
+                <w:rFonts w:ascii="Times New Roman" w:hAnsi="Times New Roman" w:cs="Times New Roman"/>
+              </w:rPr>
               <w:t>Related Area</w:t>
             </w:r>
           </w:p>
         </w:tc>
         <w:tc>
           <w:tcPr>
-            <w:tcW w:w="2317" w:type="dxa"/>
-          </w:tcPr>
-          <w:p>
-            <w:r>
+            <w:tcW w:w="3855" w:type="dxa"/>
+          </w:tcPr>
+          <w:p>
+            <w:pPr>
+              <w:spacing w:line="360" w:lineRule="auto"/>
+              <w:rPr>
+                <w:rFonts w:ascii="Times New Roman" w:hAnsi="Times New Roman" w:cs="Times New Roman"/>
+              </w:rPr>
+            </w:pPr>
+            <w:r>
+              <w:rPr>
+                <w:rFonts w:ascii="Times New Roman" w:hAnsi="Times New Roman" w:cs="Times New Roman"/>
+              </w:rPr>
               <w:t>Uncertainty / Question</w:t>
             </w:r>
           </w:p>
@@ -1321,49 +2256,77 @@
       <w:tr>
         <w:tc>
           <w:tcPr>
-            <w:tcW w:w="641" w:type="dxa"/>
-          </w:tcPr>
-          <w:p>
-            <w:r>
+            <w:tcW w:w="656" w:type="dxa"/>
+          </w:tcPr>
+          <w:p>
+            <w:pPr>
+              <w:spacing w:line="360" w:lineRule="auto"/>
+              <w:rPr>
+                <w:rFonts w:ascii="Times New Roman" w:hAnsi="Times New Roman" w:cs="Times New Roman"/>
+              </w:rPr>
+            </w:pPr>
+            <w:r>
+              <w:rPr>
+                <w:rFonts w:ascii="Times New Roman" w:hAnsi="Times New Roman" w:cs="Times New Roman"/>
+              </w:rPr>
               <w:t>EU1</w:t>
             </w:r>
           </w:p>
         </w:tc>
         <w:tc>
           <w:tcPr>
-            <w:tcW w:w="3944" w:type="dxa"/>
-          </w:tcPr>
-          <w:p>
-            <w:r>
+            <w:tcW w:w="3396" w:type="dxa"/>
+          </w:tcPr>
+          <w:p>
+            <w:pPr>
+              <w:spacing w:line="360" w:lineRule="auto"/>
+              <w:rPr>
+                <w:rFonts w:ascii="Times New Roman" w:hAnsi="Times New Roman" w:cs="Times New Roman"/>
+              </w:rPr>
+            </w:pPr>
+            <w:r>
+              <w:rPr>
+                <w:rFonts w:ascii="Times New Roman" w:hAnsi="Times New Roman" w:cs="Times New Roman"/>
+              </w:rPr>
               <w:t>Staff sometimes annotate paper recipe without updating the master recipe</w:t>
             </w:r>
           </w:p>
         </w:tc>
         <w:tc>
           <w:tcPr>
-            <w:tcW w:w="2448" w:type="dxa"/>
-          </w:tcPr>
-          <w:p>
-            <w:r>
+            <w:tcW w:w="1443" w:type="dxa"/>
+          </w:tcPr>
+          <w:p>
+            <w:pPr>
+              <w:spacing w:line="360" w:lineRule="auto"/>
+              <w:rPr>
+                <w:rFonts w:ascii="Times New Roman" w:hAnsi="Times New Roman" w:cs="Times New Roman"/>
+              </w:rPr>
+            </w:pPr>
+            <w:r>
+              <w:rPr>
+                <w:rFonts w:ascii="Times New Roman" w:hAnsi="Times New Roman" w:cs="Times New Roman"/>
+              </w:rPr>
               <w:t>Recipe management</w:t>
             </w:r>
           </w:p>
         </w:tc>
         <w:tc>
           <w:tcPr>
-            <w:tcW w:w="2317" w:type="dxa"/>
-          </w:tcPr>
-          <w:p>
-            <w:r>
-              <w:t xml:space="preserve">Who is </w:t>
-            </w:r>
-            <w:proofErr w:type="spellStart"/>
-            <w:r>
-              <w:t>authorised</w:t>
-            </w:r>
-            <w:proofErr w:type="spellEnd"/>
-            <w:r>
-              <w:t xml:space="preserve"> to approve a new recipe version?</w:t>
+            <w:tcW w:w="3855" w:type="dxa"/>
+          </w:tcPr>
+          <w:p>
+            <w:pPr>
+              <w:spacing w:line="360" w:lineRule="auto"/>
+              <w:rPr>
+                <w:rFonts w:ascii="Times New Roman" w:hAnsi="Times New Roman" w:cs="Times New Roman"/>
+              </w:rPr>
+            </w:pPr>
+            <w:r>
+              <w:rPr>
+                <w:rFonts w:ascii="Times New Roman" w:hAnsi="Times New Roman" w:cs="Times New Roman"/>
+              </w:rPr>
+              <w:t>Who is authorised to approve a new recipe version?</w:t>
             </w:r>
           </w:p>
         </w:tc>
@@ -1371,35 +2334,2001 @@
       <w:tr>
         <w:tc>
           <w:tcPr>
-            <w:tcW w:w="641" w:type="dxa"/>
-          </w:tcPr>
-          <w:p>
-            <w:r>
+            <w:tcW w:w="656" w:type="dxa"/>
+          </w:tcPr>
+          <w:p>
+            <w:pPr>
+              <w:spacing w:line="360" w:lineRule="auto"/>
+              <w:rPr>
+                <w:rFonts w:ascii="Times New Roman" w:hAnsi="Times New Roman" w:cs="Times New Roman"/>
+              </w:rPr>
+            </w:pPr>
+            <w:r>
+              <w:rPr>
+                <w:rFonts w:ascii="Times New Roman" w:hAnsi="Times New Roman" w:cs="Times New Roman"/>
+              </w:rPr>
               <w:t>EU2</w:t>
             </w:r>
           </w:p>
         </w:tc>
         <w:tc>
           <w:tcPr>
-            <w:tcW w:w="3944" w:type="dxa"/>
-          </w:tcPr>
-          <w:p/>
-        </w:tc>
-        <w:tc>
-          <w:tcPr>
-            <w:tcW w:w="2448" w:type="dxa"/>
-          </w:tcPr>
-          <w:p/>
-        </w:tc>
-        <w:tc>
-          <w:tcPr>
-            <w:tcW w:w="2317" w:type="dxa"/>
-          </w:tcPr>
-          <w:p/>
+            <w:tcW w:w="3396" w:type="dxa"/>
+          </w:tcPr>
+          <w:p>
+            <w:pPr>
+              <w:spacing w:line="360" w:lineRule="auto"/>
+              <w:rPr>
+                <w:rFonts w:ascii="Times New Roman" w:hAnsi="Times New Roman" w:cs="Times New Roman"/>
+              </w:rPr>
+            </w:pPr>
+            <w:r>
+              <w:rPr>
+                <w:rFonts w:ascii="Times New Roman" w:hAnsi="Times New Roman" w:cs="Times New Roman"/>
+              </w:rPr>
+              <w:t xml:space="preserve">Opened ingredients and substitutions </w:t>
+            </w:r>
+            <w:r>
+              <w:rPr>
+                <w:rFonts w:ascii="Times New Roman" w:hAnsi="Times New Roman" w:cs="Times New Roman"/>
+              </w:rPr>
+              <w:t>are not always reflected promptly in ingredient records</w:t>
+            </w:r>
+          </w:p>
+        </w:tc>
+        <w:tc>
+          <w:tcPr>
+            <w:tcW w:w="1443" w:type="dxa"/>
+          </w:tcPr>
+          <w:p>
+            <w:pPr>
+              <w:spacing w:line="360" w:lineRule="auto"/>
+              <w:rPr>
+                <w:rFonts w:ascii="Times New Roman" w:hAnsi="Times New Roman" w:cs="Times New Roman"/>
+              </w:rPr>
+            </w:pPr>
+            <w:r>
+              <w:rPr>
+                <w:rFonts w:ascii="Times New Roman" w:hAnsi="Times New Roman" w:cs="Times New Roman"/>
+              </w:rPr>
+              <w:t>Ingredient management</w:t>
+            </w:r>
+          </w:p>
+        </w:tc>
+        <w:tc>
+          <w:tcPr>
+            <w:tcW w:w="3855" w:type="dxa"/>
+          </w:tcPr>
+          <w:p>
+            <w:pPr>
+              <w:spacing w:line="360" w:lineRule="auto"/>
+              <w:rPr>
+                <w:rFonts w:ascii="Times New Roman" w:hAnsi="Times New Roman" w:cs="Times New Roman"/>
+              </w:rPr>
+            </w:pPr>
+            <w:r>
+              <w:rPr>
+                <w:rFonts w:ascii="Times New Roman" w:hAnsi="Times New Roman" w:cs="Times New Roman"/>
+              </w:rPr>
+              <w:t>Who is authorised to approve an ingredient substitution, and when does an ingredient become reserved or unavailable for another batch?</w:t>
+            </w:r>
+          </w:p>
+        </w:tc>
+      </w:tr>
+      <w:tr>
+        <w:tc>
+          <w:tcPr>
+            <w:tcW w:w="656" w:type="dxa"/>
+          </w:tcPr>
+          <w:p>
+            <w:pPr>
+              <w:spacing w:line="360" w:lineRule="auto"/>
+              <w:rPr>
+                <w:rFonts w:ascii="Times New Roman" w:hAnsi="Times New Roman" w:cs="Times New Roman"/>
+              </w:rPr>
+            </w:pPr>
+            <w:r>
+              <w:rPr>
+                <w:rFonts w:ascii="Times New Roman" w:hAnsi="Times New Roman" w:cs="Times New Roman"/>
+              </w:rPr>
+              <w:t>EU3</w:t>
+            </w:r>
+          </w:p>
+        </w:tc>
+        <w:tc>
+          <w:tcPr>
+            <w:tcW w:w="3396" w:type="dxa"/>
+          </w:tcPr>
+          <w:p>
+            <w:pPr>
+              <w:spacing w:line="360" w:lineRule="auto"/>
+              <w:rPr>
+                <w:rFonts w:ascii="Times New Roman" w:hAnsi="Times New Roman" w:cs="Times New Roman"/>
+              </w:rPr>
+            </w:pPr>
+            <w:r>
+              <w:rPr>
+                <w:rFonts w:ascii="Times New Roman" w:hAnsi="Times New Roman" w:cs="Times New Roman"/>
+              </w:rPr>
+              <w:t>Actual production yield can differ from the expected yield</w:t>
+            </w:r>
+          </w:p>
+        </w:tc>
+        <w:tc>
+          <w:tcPr>
+            <w:tcW w:w="1443" w:type="dxa"/>
+          </w:tcPr>
+          <w:p>
+            <w:pPr>
+              <w:spacing w:line="360" w:lineRule="auto"/>
+              <w:rPr>
+                <w:rFonts w:ascii="Times New Roman" w:hAnsi="Times New Roman" w:cs="Times New Roman"/>
+              </w:rPr>
+            </w:pPr>
+            <w:r>
+              <w:rPr>
+                <w:rFonts w:ascii="Times New Roman" w:hAnsi="Times New Roman" w:cs="Times New Roman"/>
+              </w:rPr>
+              <w:t>Yield / order allocation</w:t>
+            </w:r>
+          </w:p>
+        </w:tc>
+        <w:tc>
+          <w:tcPr>
+            <w:tcW w:w="3855" w:type="dxa"/>
+          </w:tcPr>
+          <w:p>
+            <w:pPr>
+              <w:spacing w:line="360" w:lineRule="auto"/>
+              <w:rPr>
+                <w:rFonts w:ascii="Times New Roman" w:hAnsi="Times New Roman" w:cs="Times New Roman"/>
+              </w:rPr>
+            </w:pPr>
+            <w:r>
+              <w:rPr>
+                <w:rFonts w:ascii="Times New Roman" w:hAnsi="Times New Roman" w:cs="Times New Roman"/>
+              </w:rPr>
+              <w:t>How should differences between expected and actual yield affect customer order allocation?</w:t>
+            </w:r>
+          </w:p>
+        </w:tc>
+      </w:tr>
+      <w:tr>
+        <w:tc>
+          <w:tcPr>
+            <w:tcW w:w="656" w:type="dxa"/>
+          </w:tcPr>
+          <w:p>
+            <w:pPr>
+              <w:spacing w:line="360" w:lineRule="auto"/>
+              <w:rPr>
+                <w:rFonts w:ascii="Times New Roman" w:hAnsi="Times New Roman" w:cs="Times New Roman"/>
+              </w:rPr>
+            </w:pPr>
+            <w:r>
+              <w:rPr>
+                <w:rFonts w:ascii="Times New Roman" w:hAnsi="Times New Roman" w:cs="Times New Roman"/>
+              </w:rPr>
+              <w:t>EU4</w:t>
+            </w:r>
+          </w:p>
+        </w:tc>
+        <w:tc>
+          <w:tcPr>
+            <w:tcW w:w="3396" w:type="dxa"/>
+          </w:tcPr>
+          <w:p>
+            <w:pPr>
+              <w:spacing w:line="360" w:lineRule="auto"/>
+              <w:rPr>
+                <w:rFonts w:ascii="Times New Roman" w:hAnsi="Times New Roman" w:cs="Times New Roman"/>
+              </w:rPr>
+            </w:pPr>
+            <w:r>
+              <w:rPr>
+                <w:rFonts w:ascii="Times New Roman" w:hAnsi="Times New Roman" w:cs="Times New Roman"/>
+              </w:rPr>
+              <w:t>Production output may be released, held, reworked where appropriate, or rejected after quality checks. A packed batch may remain held pending checks</w:t>
+            </w:r>
+          </w:p>
+        </w:tc>
+        <w:tc>
+          <w:tcPr>
+            <w:tcW w:w="1443" w:type="dxa"/>
+          </w:tcPr>
+          <w:p>
+            <w:pPr>
+              <w:spacing w:line="360" w:lineRule="auto"/>
+              <w:rPr>
+                <w:rFonts w:ascii="Times New Roman" w:hAnsi="Times New Roman" w:cs="Times New Roman"/>
+              </w:rPr>
+            </w:pPr>
+            <w:r>
+              <w:rPr>
+                <w:rFonts w:ascii="Times New Roman" w:hAnsi="Times New Roman" w:cs="Times New Roman"/>
+              </w:rPr>
+              <w:t>Quality and release</w:t>
+            </w:r>
+          </w:p>
+        </w:tc>
+        <w:tc>
+          <w:tcPr>
+            <w:tcW w:w="3855" w:type="dxa"/>
+          </w:tcPr>
+          <w:p>
+            <w:pPr>
+              <w:spacing w:line="360" w:lineRule="auto"/>
+              <w:rPr>
+                <w:rFonts w:ascii="Times New Roman" w:hAnsi="Times New Roman" w:cs="Times New Roman"/>
+              </w:rPr>
+            </w:pPr>
+            <w:r>
+              <w:rPr>
+                <w:rFonts w:ascii="Times New Roman" w:hAnsi="Times New Roman" w:cs="Times New Roman"/>
+              </w:rPr>
+              <w:t>Which quality checks are required before different products can be released, and when is rework permitted?</w:t>
+            </w:r>
+          </w:p>
+        </w:tc>
+      </w:tr>
+      <w:tr>
+        <w:tc>
+          <w:tcPr>
+            <w:tcW w:w="656" w:type="dxa"/>
+          </w:tcPr>
+          <w:p>
+            <w:pPr>
+              <w:spacing w:line="360" w:lineRule="auto"/>
+              <w:rPr>
+                <w:rFonts w:ascii="Times New Roman" w:hAnsi="Times New Roman" w:cs="Times New Roman"/>
+              </w:rPr>
+            </w:pPr>
+            <w:r>
+              <w:rPr>
+                <w:rFonts w:ascii="Times New Roman" w:hAnsi="Times New Roman" w:cs="Times New Roman"/>
+              </w:rPr>
+              <w:t>EU5</w:t>
+            </w:r>
+          </w:p>
+        </w:tc>
+        <w:tc>
+          <w:tcPr>
+            <w:tcW w:w="3396" w:type="dxa"/>
+          </w:tcPr>
+          <w:p>
+            <w:pPr>
+              <w:spacing w:line="360" w:lineRule="auto"/>
+              <w:rPr>
+                <w:rFonts w:ascii="Times New Roman" w:hAnsi="Times New Roman" w:cs="Times New Roman"/>
+              </w:rPr>
+            </w:pPr>
+            <w:r>
+              <w:rPr>
+                <w:rFonts w:ascii="Times New Roman" w:hAnsi="Times New Roman" w:cs="Times New Roman"/>
+              </w:rPr>
+              <w:t xml:space="preserve">Several customer orders may receive units from the same batch, and one order may contain units from several </w:t>
+            </w:r>
+            <w:r>
+              <w:rPr>
+                <w:rFonts w:ascii="Times New Roman" w:hAnsi="Times New Roman" w:cs="Times New Roman"/>
+              </w:rPr>
+              <w:lastRenderedPageBreak/>
+              <w:t>batches. This relationship is not consistently recorded</w:t>
+            </w:r>
+          </w:p>
+        </w:tc>
+        <w:tc>
+          <w:tcPr>
+            <w:tcW w:w="1443" w:type="dxa"/>
+          </w:tcPr>
+          <w:p>
+            <w:pPr>
+              <w:spacing w:line="360" w:lineRule="auto"/>
+              <w:rPr>
+                <w:rFonts w:ascii="Times New Roman" w:hAnsi="Times New Roman" w:cs="Times New Roman"/>
+              </w:rPr>
+            </w:pPr>
+            <w:r>
+              <w:rPr>
+                <w:rFonts w:ascii="Times New Roman" w:hAnsi="Times New Roman" w:cs="Times New Roman"/>
+              </w:rPr>
+              <w:lastRenderedPageBreak/>
+              <w:t>Traceability</w:t>
+            </w:r>
+          </w:p>
+        </w:tc>
+        <w:tc>
+          <w:tcPr>
+            <w:tcW w:w="3855" w:type="dxa"/>
+          </w:tcPr>
+          <w:p>
+            <w:pPr>
+              <w:spacing w:line="360" w:lineRule="auto"/>
+              <w:rPr>
+                <w:rFonts w:ascii="Times New Roman" w:hAnsi="Times New Roman" w:cs="Times New Roman"/>
+              </w:rPr>
+            </w:pPr>
+            <w:r>
+              <w:rPr>
+                <w:rFonts w:ascii="Times New Roman" w:hAnsi="Times New Roman" w:cs="Times New Roman"/>
+              </w:rPr>
+              <w:t>How should packed units be linked to production batches and customer orders?</w:t>
+            </w:r>
+          </w:p>
+        </w:tc>
+      </w:tr>
+      <w:tr>
+        <w:tc>
+          <w:tcPr>
+            <w:tcW w:w="656" w:type="dxa"/>
+          </w:tcPr>
+          <w:p>
+            <w:pPr>
+              <w:spacing w:line="360" w:lineRule="auto"/>
+              <w:rPr>
+                <w:rFonts w:ascii="Times New Roman" w:hAnsi="Times New Roman" w:cs="Times New Roman"/>
+              </w:rPr>
+            </w:pPr>
+            <w:r>
+              <w:rPr>
+                <w:rFonts w:ascii="Times New Roman" w:hAnsi="Times New Roman" w:cs="Times New Roman"/>
+              </w:rPr>
+              <w:t>EU6</w:t>
+            </w:r>
+          </w:p>
+        </w:tc>
+        <w:tc>
+          <w:tcPr>
+            <w:tcW w:w="3396" w:type="dxa"/>
+          </w:tcPr>
+          <w:p>
+            <w:pPr>
+              <w:spacing w:line="360" w:lineRule="auto"/>
+              <w:rPr>
+                <w:rFonts w:ascii="Times New Roman" w:hAnsi="Times New Roman" w:cs="Times New Roman"/>
+              </w:rPr>
+            </w:pPr>
+            <w:r>
+              <w:rPr>
+                <w:rFonts w:ascii="Times New Roman" w:hAnsi="Times New Roman" w:cs="Times New Roman"/>
+              </w:rPr>
+              <w:t>Different roles work with production, supplier and customer information</w:t>
+            </w:r>
+          </w:p>
+        </w:tc>
+        <w:tc>
+          <w:tcPr>
+            <w:tcW w:w="1443" w:type="dxa"/>
+          </w:tcPr>
+          <w:p>
+            <w:pPr>
+              <w:spacing w:line="360" w:lineRule="auto"/>
+              <w:rPr>
+                <w:rFonts w:ascii="Times New Roman" w:hAnsi="Times New Roman" w:cs="Times New Roman"/>
+              </w:rPr>
+            </w:pPr>
+            <w:r>
+              <w:rPr>
+                <w:rFonts w:ascii="Times New Roman" w:hAnsi="Times New Roman" w:cs="Times New Roman"/>
+              </w:rPr>
+              <w:t>Access / permissions</w:t>
+            </w:r>
+          </w:p>
+        </w:tc>
+        <w:tc>
+          <w:tcPr>
+            <w:tcW w:w="3855" w:type="dxa"/>
+          </w:tcPr>
+          <w:p>
+            <w:pPr>
+              <w:spacing w:line="360" w:lineRule="auto"/>
+              <w:rPr>
+                <w:rFonts w:ascii="Times New Roman" w:hAnsi="Times New Roman" w:cs="Times New Roman"/>
+              </w:rPr>
+            </w:pPr>
+            <w:r>
+              <w:rPr>
+                <w:rFonts w:ascii="Times New Roman" w:hAnsi="Times New Roman" w:cs="Times New Roman"/>
+              </w:rPr>
+              <w:t>Which production, supplier and customer information should each role be permitted to see?</w:t>
+            </w:r>
+          </w:p>
         </w:tc>
       </w:tr>
     </w:tbl>
-    <w:p/>
+    <w:p>
+      <w:pPr>
+        <w:pStyle w:val="Heading1"/>
+        <w:numPr>
+          <w:ilvl w:val="0"/>
+          <w:numId w:val="1"/>
+        </w:numPr>
+        <w:spacing w:line="360" w:lineRule="auto"/>
+        <w:ind w:left="0"/>
+        <w:rPr>
+          <w:rFonts w:ascii="Times New Roman" w:hAnsi="Times New Roman" w:cs="Times New Roman"/>
+          <w:color w:val="auto"/>
+          <w:sz w:val="28"/>
+          <w:szCs w:val="28"/>
+        </w:rPr>
+      </w:pPr>
+      <w:bookmarkStart w:id="5" w:name="_Toc242467209"/>
+      <w:r>
+        <w:rPr>
+          <w:rFonts w:ascii="Times New Roman" w:hAnsi="Times New Roman" w:cs="Times New Roman"/>
+          <w:color w:val="auto"/>
+          <w:sz w:val="28"/>
+          <w:szCs w:val="28"/>
+        </w:rPr>
+        <w:t>Purpose, Scope and Boundary</w:t>
+      </w:r>
+      <w:bookmarkEnd w:id="5"/>
+    </w:p>
+    <w:p>
+      <w:pPr>
+        <w:pStyle w:val="Heading2"/>
+        <w:spacing w:line="360" w:lineRule="auto"/>
+        <w:rPr>
+          <w:rFonts w:ascii="Times New Roman" w:hAnsi="Times New Roman" w:cs="Times New Roman"/>
+          <w:color w:val="auto"/>
+          <w:sz w:val="24"/>
+          <w:szCs w:val="24"/>
+        </w:rPr>
+      </w:pPr>
+      <w:bookmarkStart w:id="6" w:name="_Toc242467210"/>
+      <w:r>
+        <w:rPr>
+          <w:rFonts w:ascii="Times New Roman" w:hAnsi="Times New Roman" w:cs="Times New Roman"/>
+          <w:color w:val="auto"/>
+          <w:sz w:val="24"/>
+          <w:szCs w:val="24"/>
+        </w:rPr>
+        <w:t>2.1 Purpose</w:t>
+      </w:r>
+      <w:bookmarkEnd w:id="6"/>
+    </w:p>
+    <w:p>
+      <w:pPr>
+        <w:spacing w:line="360" w:lineRule="auto"/>
+        <w:rPr>
+          <w:rFonts w:ascii="Times New Roman" w:hAnsi="Times New Roman" w:cs="Times New Roman"/>
+        </w:rPr>
+      </w:pPr>
+      <w:r>
+        <w:rPr>
+          <w:rFonts w:ascii="Times New Roman" w:hAnsi="Times New Roman" w:cs="Times New Roman"/>
+        </w:rPr>
+        <w:t>The system is intended to provide stronger control over approved recipe version, allergen information, ingredient batches and availability, planned production, production batch records, and product release status. It should also improve traceability between ingredients, production batches, packaged products, and customer orders, enabling staff to identify relevant production and customer information more reliably when issues arise.</w:t>
+      </w:r>
+    </w:p>
+    <w:p>
+      <w:pPr>
+        <w:pStyle w:val="Heading2"/>
+        <w:spacing w:line="360" w:lineRule="auto"/>
+        <w:rPr>
+          <w:rFonts w:ascii="Times New Roman" w:hAnsi="Times New Roman" w:cs="Times New Roman"/>
+          <w:color w:val="auto"/>
+          <w:sz w:val="24"/>
+          <w:szCs w:val="24"/>
+        </w:rPr>
+      </w:pPr>
+      <w:bookmarkStart w:id="7" w:name="_Toc242467211"/>
+      <w:r>
+        <w:rPr>
+          <w:rFonts w:ascii="Times New Roman" w:hAnsi="Times New Roman" w:cs="Times New Roman"/>
+          <w:color w:val="auto"/>
+          <w:sz w:val="24"/>
+          <w:szCs w:val="24"/>
+        </w:rPr>
+        <w:t>2.2 Scope and Boundary: In Scope / Out of Scope</w:t>
+      </w:r>
+      <w:bookmarkEnd w:id="7"/>
+    </w:p>
+    <w:p>
+      <w:pPr>
+        <w:pStyle w:val="Heading2"/>
+        <w:spacing w:line="360" w:lineRule="auto"/>
+        <w:rPr>
+          <w:rFonts w:ascii="Times New Roman" w:hAnsi="Times New Roman" w:cs="Times New Roman"/>
+          <w:color w:val="auto"/>
+          <w:sz w:val="24"/>
+          <w:szCs w:val="24"/>
+        </w:rPr>
+      </w:pPr>
+      <w:bookmarkStart w:id="8" w:name="_Toc242467212"/>
+      <w:r>
+        <w:rPr>
+          <w:rFonts w:ascii="Times New Roman" w:hAnsi="Times New Roman" w:cs="Times New Roman"/>
+          <w:color w:val="auto"/>
+          <w:sz w:val="24"/>
+          <w:szCs w:val="24"/>
+        </w:rPr>
+        <w:t>2.2.1 In Scope</w:t>
+      </w:r>
+      <w:bookmarkEnd w:id="8"/>
+    </w:p>
+    <w:tbl>
+      <w:tblPr>
+        <w:tblStyle w:val="TableGrid"/>
+        <w:tblW w:w="0" w:type="auto"/>
+        <w:tblLook w:val="04A0" w:firstRow="1" w:lastRow="0" w:firstColumn="1" w:lastColumn="0" w:noHBand="0" w:noVBand="1"/>
+      </w:tblPr>
+      <w:tblGrid>
+        <w:gridCol w:w="550"/>
+        <w:gridCol w:w="1702"/>
+        <w:gridCol w:w="7098"/>
+      </w:tblGrid>
+      <w:tr>
+        <w:tc>
+          <w:tcPr>
+            <w:tcW w:w="550" w:type="dxa"/>
+          </w:tcPr>
+          <w:p>
+            <w:pPr>
+              <w:spacing w:line="360" w:lineRule="auto"/>
+              <w:rPr>
+                <w:rFonts w:ascii="Times New Roman" w:hAnsi="Times New Roman" w:cs="Times New Roman"/>
+              </w:rPr>
+            </w:pPr>
+            <w:r>
+              <w:rPr>
+                <w:rFonts w:ascii="Times New Roman" w:hAnsi="Times New Roman" w:cs="Times New Roman"/>
+              </w:rPr>
+              <w:t>ID</w:t>
+            </w:r>
+          </w:p>
+        </w:tc>
+        <w:tc>
+          <w:tcPr>
+            <w:tcW w:w="1702" w:type="dxa"/>
+          </w:tcPr>
+          <w:p>
+            <w:pPr>
+              <w:spacing w:line="360" w:lineRule="auto"/>
+              <w:rPr>
+                <w:rFonts w:ascii="Times New Roman" w:hAnsi="Times New Roman" w:cs="Times New Roman"/>
+              </w:rPr>
+            </w:pPr>
+            <w:r>
+              <w:rPr>
+                <w:rFonts w:ascii="Times New Roman" w:hAnsi="Times New Roman" w:cs="Times New Roman"/>
+              </w:rPr>
+              <w:t>In Scope Area</w:t>
+            </w:r>
+          </w:p>
+        </w:tc>
+        <w:tc>
+          <w:tcPr>
+            <w:tcW w:w="7098" w:type="dxa"/>
+          </w:tcPr>
+          <w:p>
+            <w:pPr>
+              <w:spacing w:line="360" w:lineRule="auto"/>
+              <w:rPr>
+                <w:rFonts w:ascii="Times New Roman" w:hAnsi="Times New Roman" w:cs="Times New Roman"/>
+              </w:rPr>
+            </w:pPr>
+            <w:r>
+              <w:rPr>
+                <w:rFonts w:ascii="Times New Roman" w:hAnsi="Times New Roman" w:cs="Times New Roman"/>
+              </w:rPr>
+              <w:t>Description</w:t>
+            </w:r>
+          </w:p>
+        </w:tc>
+      </w:tr>
+      <w:tr>
+        <w:tc>
+          <w:tcPr>
+            <w:tcW w:w="550" w:type="dxa"/>
+          </w:tcPr>
+          <w:p>
+            <w:pPr>
+              <w:spacing w:line="360" w:lineRule="auto"/>
+              <w:rPr>
+                <w:rFonts w:ascii="Times New Roman" w:hAnsi="Times New Roman" w:cs="Times New Roman"/>
+              </w:rPr>
+            </w:pPr>
+            <w:r>
+              <w:rPr>
+                <w:rFonts w:ascii="Times New Roman" w:hAnsi="Times New Roman" w:cs="Times New Roman"/>
+              </w:rPr>
+              <w:t>IS1</w:t>
+            </w:r>
+          </w:p>
+        </w:tc>
+        <w:tc>
+          <w:tcPr>
+            <w:tcW w:w="1702" w:type="dxa"/>
+          </w:tcPr>
+          <w:p>
+            <w:pPr>
+              <w:spacing w:line="360" w:lineRule="auto"/>
+              <w:rPr>
+                <w:rFonts w:ascii="Times New Roman" w:hAnsi="Times New Roman" w:cs="Times New Roman"/>
+              </w:rPr>
+            </w:pPr>
+            <w:r>
+              <w:rPr>
+                <w:rFonts w:ascii="Times New Roman" w:hAnsi="Times New Roman" w:cs="Times New Roman"/>
+              </w:rPr>
+              <w:t>Recipe management</w:t>
+            </w:r>
+          </w:p>
+        </w:tc>
+        <w:tc>
+          <w:tcPr>
+            <w:tcW w:w="7098" w:type="dxa"/>
+          </w:tcPr>
+          <w:p>
+            <w:pPr>
+              <w:spacing w:line="360" w:lineRule="auto"/>
+              <w:rPr>
+                <w:rFonts w:ascii="Times New Roman" w:hAnsi="Times New Roman" w:cs="Times New Roman"/>
+              </w:rPr>
+            </w:pPr>
+            <w:r>
+              <w:rPr>
+                <w:rFonts w:ascii="Times New Roman" w:hAnsi="Times New Roman" w:cs="Times New Roman"/>
+              </w:rPr>
+              <w:t xml:space="preserve">Management of approved recipe versions and production information associated with each version, </w:t>
+            </w:r>
+            <w:r>
+              <w:rPr>
+                <w:rFonts w:ascii="Times New Roman" w:hAnsi="Times New Roman" w:cs="Times New Roman"/>
+              </w:rPr>
+              <w:t>including details on ingredients, quantities, preparation methods, expected product yield, allergen presence, and packaging instructions.</w:t>
+            </w:r>
+          </w:p>
+        </w:tc>
+      </w:tr>
+      <w:tr>
+        <w:tc>
+          <w:tcPr>
+            <w:tcW w:w="550" w:type="dxa"/>
+          </w:tcPr>
+          <w:p>
+            <w:pPr>
+              <w:spacing w:line="360" w:lineRule="auto"/>
+              <w:rPr>
+                <w:rFonts w:ascii="Times New Roman" w:hAnsi="Times New Roman" w:cs="Times New Roman"/>
+              </w:rPr>
+            </w:pPr>
+            <w:r>
+              <w:rPr>
+                <w:rFonts w:ascii="Times New Roman" w:hAnsi="Times New Roman" w:cs="Times New Roman"/>
+              </w:rPr>
+              <w:t>IS2</w:t>
+            </w:r>
+          </w:p>
+        </w:tc>
+        <w:tc>
+          <w:tcPr>
+            <w:tcW w:w="1702" w:type="dxa"/>
+          </w:tcPr>
+          <w:p>
+            <w:pPr>
+              <w:spacing w:line="360" w:lineRule="auto"/>
+              <w:rPr>
+                <w:rFonts w:ascii="Times New Roman" w:hAnsi="Times New Roman" w:cs="Times New Roman"/>
+              </w:rPr>
+            </w:pPr>
+            <w:r>
+              <w:rPr>
+                <w:rFonts w:ascii="Times New Roman" w:hAnsi="Times New Roman" w:cs="Times New Roman"/>
+              </w:rPr>
+              <w:t>Ingredient management</w:t>
+            </w:r>
+          </w:p>
+        </w:tc>
+        <w:tc>
+          <w:tcPr>
+            <w:tcW w:w="7098" w:type="dxa"/>
+          </w:tcPr>
+          <w:p>
+            <w:pPr>
+              <w:spacing w:line="360" w:lineRule="auto"/>
+              <w:rPr>
+                <w:rFonts w:ascii="Times New Roman" w:hAnsi="Times New Roman" w:cs="Times New Roman"/>
+              </w:rPr>
+            </w:pPr>
+            <w:r>
+              <w:rPr>
+                <w:rFonts w:ascii="Times New Roman" w:hAnsi="Times New Roman" w:cs="Times New Roman"/>
+              </w:rPr>
+              <w:t>Management of ingredient inventory information, including data on quantities, supplier batches, relevant dates, availability, reservations, opened packages, and substitutions</w:t>
+            </w:r>
+          </w:p>
+        </w:tc>
+      </w:tr>
+      <w:tr>
+        <w:tc>
+          <w:tcPr>
+            <w:tcW w:w="550" w:type="dxa"/>
+          </w:tcPr>
+          <w:p>
+            <w:pPr>
+              <w:spacing w:line="360" w:lineRule="auto"/>
+              <w:rPr>
+                <w:rFonts w:ascii="Times New Roman" w:hAnsi="Times New Roman" w:cs="Times New Roman"/>
+              </w:rPr>
+            </w:pPr>
+            <w:r>
+              <w:rPr>
+                <w:rFonts w:ascii="Times New Roman" w:hAnsi="Times New Roman" w:cs="Times New Roman"/>
+              </w:rPr>
+              <w:t>IS3</w:t>
+            </w:r>
+          </w:p>
+        </w:tc>
+        <w:tc>
+          <w:tcPr>
+            <w:tcW w:w="1702" w:type="dxa"/>
+          </w:tcPr>
+          <w:p>
+            <w:pPr>
+              <w:spacing w:line="360" w:lineRule="auto"/>
+              <w:rPr>
+                <w:rFonts w:ascii="Times New Roman" w:hAnsi="Times New Roman" w:cs="Times New Roman"/>
+              </w:rPr>
+            </w:pPr>
+            <w:r>
+              <w:rPr>
+                <w:rFonts w:ascii="Times New Roman" w:hAnsi="Times New Roman" w:cs="Times New Roman"/>
+              </w:rPr>
+              <w:t>Customer order management</w:t>
+            </w:r>
+          </w:p>
+        </w:tc>
+        <w:tc>
+          <w:tcPr>
+            <w:tcW w:w="7098" w:type="dxa"/>
+          </w:tcPr>
+          <w:p>
+            <w:pPr>
+              <w:spacing w:line="360" w:lineRule="auto"/>
+              <w:rPr>
+                <w:rFonts w:ascii="Times New Roman" w:hAnsi="Times New Roman" w:cs="Times New Roman"/>
+              </w:rPr>
+            </w:pPr>
+            <w:r>
+              <w:rPr>
+                <w:rFonts w:ascii="Times New Roman" w:hAnsi="Times New Roman" w:cs="Times New Roman"/>
+              </w:rPr>
+              <w:t>Management of customer orders comprising standard products, seasonal ranges, or custom – specific pack sizes – including orders requiring the delivery of multiple product types and the use of different production batches</w:t>
+            </w:r>
+          </w:p>
+        </w:tc>
+      </w:tr>
+      <w:tr>
+        <w:tc>
+          <w:tcPr>
+            <w:tcW w:w="550" w:type="dxa"/>
+          </w:tcPr>
+          <w:p>
+            <w:pPr>
+              <w:spacing w:line="360" w:lineRule="auto"/>
+              <w:rPr>
+                <w:rFonts w:ascii="Times New Roman" w:hAnsi="Times New Roman" w:cs="Times New Roman"/>
+              </w:rPr>
+            </w:pPr>
+            <w:r>
+              <w:rPr>
+                <w:rFonts w:ascii="Times New Roman" w:hAnsi="Times New Roman" w:cs="Times New Roman"/>
+              </w:rPr>
+              <w:t>IS4</w:t>
+            </w:r>
+          </w:p>
+        </w:tc>
+        <w:tc>
+          <w:tcPr>
+            <w:tcW w:w="1702" w:type="dxa"/>
+          </w:tcPr>
+          <w:p>
+            <w:pPr>
+              <w:spacing w:line="360" w:lineRule="auto"/>
+              <w:rPr>
+                <w:rFonts w:ascii="Times New Roman" w:hAnsi="Times New Roman" w:cs="Times New Roman"/>
+              </w:rPr>
+            </w:pPr>
+            <w:r>
+              <w:rPr>
+                <w:rFonts w:ascii="Times New Roman" w:hAnsi="Times New Roman" w:cs="Times New Roman"/>
+              </w:rPr>
+              <w:t>Production planning</w:t>
+            </w:r>
+          </w:p>
+        </w:tc>
+        <w:tc>
+          <w:tcPr>
+            <w:tcW w:w="7098" w:type="dxa"/>
+          </w:tcPr>
+          <w:p>
+            <w:pPr>
+              <w:spacing w:line="360" w:lineRule="auto"/>
+              <w:rPr>
+                <w:rFonts w:ascii="Times New Roman" w:hAnsi="Times New Roman" w:cs="Times New Roman"/>
+              </w:rPr>
+            </w:pPr>
+            <w:r>
+              <w:rPr>
+                <w:rFonts w:ascii="Times New Roman" w:hAnsi="Times New Roman" w:cs="Times New Roman"/>
+              </w:rPr>
+              <w:t xml:space="preserve">Production batch planning taking into account customer orders, ingredient </w:t>
+            </w:r>
+            <w:r>
+              <w:rPr>
+                <w:rFonts w:ascii="Times New Roman" w:hAnsi="Times New Roman" w:cs="Times New Roman"/>
+              </w:rPr>
+              <w:t xml:space="preserve">availability, kitchen production capacity, equipment </w:t>
+            </w:r>
+            <w:r>
+              <w:rPr>
+                <w:rFonts w:ascii="Times New Roman" w:hAnsi="Times New Roman" w:cs="Times New Roman"/>
+              </w:rPr>
+              <w:lastRenderedPageBreak/>
+              <w:t>availability, and staff qualifications, as well as preparation and cooling times and packaging requirements</w:t>
+            </w:r>
+          </w:p>
+        </w:tc>
+      </w:tr>
+      <w:tr>
+        <w:tc>
+          <w:tcPr>
+            <w:tcW w:w="550" w:type="dxa"/>
+          </w:tcPr>
+          <w:p>
+            <w:pPr>
+              <w:spacing w:line="360" w:lineRule="auto"/>
+              <w:rPr>
+                <w:rFonts w:ascii="Times New Roman" w:hAnsi="Times New Roman" w:cs="Times New Roman"/>
+              </w:rPr>
+            </w:pPr>
+            <w:r>
+              <w:rPr>
+                <w:rFonts w:ascii="Times New Roman" w:hAnsi="Times New Roman" w:cs="Times New Roman"/>
+              </w:rPr>
+              <w:lastRenderedPageBreak/>
+              <w:t>IS5</w:t>
+            </w:r>
+          </w:p>
+        </w:tc>
+        <w:tc>
+          <w:tcPr>
+            <w:tcW w:w="1702" w:type="dxa"/>
+          </w:tcPr>
+          <w:p>
+            <w:pPr>
+              <w:spacing w:line="360" w:lineRule="auto"/>
+              <w:rPr>
+                <w:rFonts w:ascii="Times New Roman" w:hAnsi="Times New Roman" w:cs="Times New Roman"/>
+              </w:rPr>
+            </w:pPr>
+            <w:r>
+              <w:rPr>
+                <w:rFonts w:ascii="Times New Roman" w:hAnsi="Times New Roman" w:cs="Times New Roman"/>
+              </w:rPr>
+              <w:t>Production batch recording</w:t>
+            </w:r>
+          </w:p>
+        </w:tc>
+        <w:tc>
+          <w:tcPr>
+            <w:tcW w:w="7098" w:type="dxa"/>
+          </w:tcPr>
+          <w:p>
+            <w:pPr>
+              <w:spacing w:line="360" w:lineRule="auto"/>
+              <w:rPr>
+                <w:rFonts w:ascii="Times New Roman" w:hAnsi="Times New Roman" w:cs="Times New Roman"/>
+              </w:rPr>
+            </w:pPr>
+            <w:r>
+              <w:rPr>
+                <w:rFonts w:ascii="Times New Roman" w:hAnsi="Times New Roman" w:cs="Times New Roman"/>
+              </w:rPr>
+              <w:t>Recording production batch information, including the recipe version used, ingredient batches, actual quantities, production time, and actual product yield</w:t>
+            </w:r>
+          </w:p>
+        </w:tc>
+      </w:tr>
+      <w:tr>
+        <w:tc>
+          <w:tcPr>
+            <w:tcW w:w="550" w:type="dxa"/>
+          </w:tcPr>
+          <w:p>
+            <w:pPr>
+              <w:spacing w:line="360" w:lineRule="auto"/>
+              <w:rPr>
+                <w:rFonts w:ascii="Times New Roman" w:hAnsi="Times New Roman" w:cs="Times New Roman"/>
+              </w:rPr>
+            </w:pPr>
+            <w:r>
+              <w:rPr>
+                <w:rFonts w:ascii="Times New Roman" w:hAnsi="Times New Roman" w:cs="Times New Roman"/>
+              </w:rPr>
+              <w:t>IS6</w:t>
+            </w:r>
+          </w:p>
+        </w:tc>
+        <w:tc>
+          <w:tcPr>
+            <w:tcW w:w="1702" w:type="dxa"/>
+          </w:tcPr>
+          <w:p>
+            <w:pPr>
+              <w:spacing w:line="360" w:lineRule="auto"/>
+              <w:rPr>
+                <w:rFonts w:ascii="Times New Roman" w:hAnsi="Times New Roman" w:cs="Times New Roman"/>
+              </w:rPr>
+            </w:pPr>
+            <w:r>
+              <w:rPr>
+                <w:rFonts w:ascii="Times New Roman" w:hAnsi="Times New Roman" w:cs="Times New Roman"/>
+              </w:rPr>
+              <w:t>Quality and product release</w:t>
+            </w:r>
+          </w:p>
+        </w:tc>
+        <w:tc>
+          <w:tcPr>
+            <w:tcW w:w="7098" w:type="dxa"/>
+          </w:tcPr>
+          <w:p>
+            <w:pPr>
+              <w:spacing w:line="360" w:lineRule="auto"/>
+              <w:rPr>
+                <w:rFonts w:ascii="Times New Roman" w:hAnsi="Times New Roman" w:cs="Times New Roman"/>
+              </w:rPr>
+            </w:pPr>
+            <w:r>
+              <w:rPr>
+                <w:rFonts w:ascii="Times New Roman" w:hAnsi="Times New Roman" w:cs="Times New Roman"/>
+              </w:rPr>
+              <w:t xml:space="preserve">Recording the results of relevant quality checks and the status of production output, including products that are held, </w:t>
+            </w:r>
+            <w:r>
+              <w:rPr>
+                <w:rFonts w:ascii="Times New Roman" w:hAnsi="Times New Roman" w:cs="Times New Roman"/>
+              </w:rPr>
+              <w:t>released, reworked where appropriate, or rejected</w:t>
+            </w:r>
+          </w:p>
+        </w:tc>
+      </w:tr>
+      <w:tr>
+        <w:tc>
+          <w:tcPr>
+            <w:tcW w:w="550" w:type="dxa"/>
+          </w:tcPr>
+          <w:p>
+            <w:pPr>
+              <w:spacing w:line="360" w:lineRule="auto"/>
+              <w:rPr>
+                <w:rFonts w:ascii="Times New Roman" w:hAnsi="Times New Roman" w:cs="Times New Roman"/>
+              </w:rPr>
+            </w:pPr>
+            <w:r>
+              <w:rPr>
+                <w:rFonts w:ascii="Times New Roman" w:hAnsi="Times New Roman" w:cs="Times New Roman"/>
+              </w:rPr>
+              <w:t>IS7</w:t>
+            </w:r>
+          </w:p>
+        </w:tc>
+        <w:tc>
+          <w:tcPr>
+            <w:tcW w:w="1702" w:type="dxa"/>
+          </w:tcPr>
+          <w:p>
+            <w:pPr>
+              <w:spacing w:line="360" w:lineRule="auto"/>
+              <w:rPr>
+                <w:rFonts w:ascii="Times New Roman" w:hAnsi="Times New Roman" w:cs="Times New Roman"/>
+              </w:rPr>
+            </w:pPr>
+            <w:r>
+              <w:rPr>
+                <w:rFonts w:ascii="Times New Roman" w:hAnsi="Times New Roman" w:cs="Times New Roman"/>
+              </w:rPr>
+              <w:t>Packing and traceability</w:t>
+            </w:r>
+          </w:p>
+        </w:tc>
+        <w:tc>
+          <w:tcPr>
+            <w:tcW w:w="7098" w:type="dxa"/>
+          </w:tcPr>
+          <w:p>
+            <w:pPr>
+              <w:spacing w:line="360" w:lineRule="auto"/>
+              <w:rPr>
+                <w:rFonts w:ascii="Times New Roman" w:hAnsi="Times New Roman" w:cs="Times New Roman"/>
+              </w:rPr>
+            </w:pPr>
+            <w:r>
+              <w:rPr>
+                <w:rFonts w:ascii="Times New Roman" w:hAnsi="Times New Roman" w:cs="Times New Roman"/>
+              </w:rPr>
+              <w:t>Providing information on product packaging and release, and maintaining traceability between ingredient batches, production batches, packaged units, and customer orders</w:t>
+            </w:r>
+          </w:p>
+        </w:tc>
+      </w:tr>
+    </w:tbl>
+    <w:p>
+      <w:pPr>
+        <w:pStyle w:val="Heading2"/>
+        <w:spacing w:line="360" w:lineRule="auto"/>
+        <w:rPr>
+          <w:rFonts w:ascii="Times New Roman" w:hAnsi="Times New Roman" w:cs="Times New Roman"/>
+          <w:color w:val="auto"/>
+          <w:sz w:val="24"/>
+          <w:szCs w:val="24"/>
+        </w:rPr>
+      </w:pPr>
+      <w:bookmarkStart w:id="9" w:name="_Toc242467213"/>
+      <w:r>
+        <w:rPr>
+          <w:rFonts w:ascii="Times New Roman" w:hAnsi="Times New Roman" w:cs="Times New Roman"/>
+          <w:color w:val="auto"/>
+          <w:sz w:val="24"/>
+          <w:szCs w:val="24"/>
+        </w:rPr>
+        <w:t>2.2.2 Out of Scope</w:t>
+      </w:r>
+      <w:bookmarkEnd w:id="9"/>
+    </w:p>
+    <w:tbl>
+      <w:tblPr>
+        <w:tblStyle w:val="TableGrid"/>
+        <w:tblW w:w="0" w:type="auto"/>
+        <w:tblLook w:val="04A0" w:firstRow="1" w:lastRow="0" w:firstColumn="1" w:lastColumn="0" w:noHBand="0" w:noVBand="1"/>
+      </w:tblPr>
+      <w:tblGrid>
+        <w:gridCol w:w="656"/>
+        <w:gridCol w:w="2129"/>
+        <w:gridCol w:w="6565"/>
+      </w:tblGrid>
+      <w:tr>
+        <w:tc>
+          <w:tcPr>
+            <w:tcW w:w="656" w:type="dxa"/>
+          </w:tcPr>
+          <w:p>
+            <w:pPr>
+              <w:spacing w:line="360" w:lineRule="auto"/>
+              <w:rPr>
+                <w:rFonts w:ascii="Times New Roman" w:hAnsi="Times New Roman" w:cs="Times New Roman"/>
+              </w:rPr>
+            </w:pPr>
+            <w:r>
+              <w:rPr>
+                <w:rFonts w:ascii="Times New Roman" w:hAnsi="Times New Roman" w:cs="Times New Roman"/>
+              </w:rPr>
+              <w:t>ID</w:t>
+            </w:r>
+          </w:p>
+        </w:tc>
+        <w:tc>
+          <w:tcPr>
+            <w:tcW w:w="2129" w:type="dxa"/>
+          </w:tcPr>
+          <w:p>
+            <w:pPr>
+              <w:spacing w:line="360" w:lineRule="auto"/>
+              <w:rPr>
+                <w:rFonts w:ascii="Times New Roman" w:hAnsi="Times New Roman" w:cs="Times New Roman"/>
+              </w:rPr>
+            </w:pPr>
+            <w:r>
+              <w:rPr>
+                <w:rFonts w:ascii="Times New Roman" w:hAnsi="Times New Roman" w:cs="Times New Roman"/>
+              </w:rPr>
+              <w:t>Out of Scope Area</w:t>
+            </w:r>
+          </w:p>
+        </w:tc>
+        <w:tc>
+          <w:tcPr>
+            <w:tcW w:w="6565" w:type="dxa"/>
+          </w:tcPr>
+          <w:p>
+            <w:pPr>
+              <w:spacing w:line="360" w:lineRule="auto"/>
+              <w:rPr>
+                <w:rFonts w:ascii="Times New Roman" w:hAnsi="Times New Roman" w:cs="Times New Roman"/>
+              </w:rPr>
+            </w:pPr>
+            <w:r>
+              <w:rPr>
+                <w:rFonts w:ascii="Times New Roman" w:hAnsi="Times New Roman" w:cs="Times New Roman"/>
+              </w:rPr>
+              <w:t>Description</w:t>
+            </w:r>
+          </w:p>
+        </w:tc>
+      </w:tr>
+      <w:tr>
+        <w:tc>
+          <w:tcPr>
+            <w:tcW w:w="656" w:type="dxa"/>
+          </w:tcPr>
+          <w:p>
+            <w:pPr>
+              <w:spacing w:line="360" w:lineRule="auto"/>
+              <w:rPr>
+                <w:rFonts w:ascii="Times New Roman" w:hAnsi="Times New Roman" w:cs="Times New Roman"/>
+              </w:rPr>
+            </w:pPr>
+            <w:r>
+              <w:rPr>
+                <w:rFonts w:ascii="Times New Roman" w:hAnsi="Times New Roman" w:cs="Times New Roman"/>
+              </w:rPr>
+              <w:t>OS1</w:t>
+            </w:r>
+          </w:p>
+        </w:tc>
+        <w:tc>
+          <w:tcPr>
+            <w:tcW w:w="2129" w:type="dxa"/>
+          </w:tcPr>
+          <w:p>
+            <w:pPr>
+              <w:spacing w:line="360" w:lineRule="auto"/>
+              <w:rPr>
+                <w:rFonts w:ascii="Times New Roman" w:hAnsi="Times New Roman" w:cs="Times New Roman"/>
+              </w:rPr>
+            </w:pPr>
+            <w:r>
+              <w:rPr>
+                <w:rFonts w:ascii="Times New Roman" w:hAnsi="Times New Roman" w:cs="Times New Roman"/>
+              </w:rPr>
+              <w:t>Kitchen equipment control</w:t>
+            </w:r>
+          </w:p>
+        </w:tc>
+        <w:tc>
+          <w:tcPr>
+            <w:tcW w:w="6565" w:type="dxa"/>
+          </w:tcPr>
+          <w:p>
+            <w:pPr>
+              <w:tabs>
+                <w:tab w:val="left" w:pos="2025"/>
+              </w:tabs>
+              <w:spacing w:line="360" w:lineRule="auto"/>
+              <w:rPr>
+                <w:rFonts w:ascii="Times New Roman" w:hAnsi="Times New Roman" w:cs="Times New Roman"/>
+              </w:rPr>
+            </w:pPr>
+            <w:r>
+              <w:rPr>
+                <w:rFonts w:ascii="Times New Roman" w:hAnsi="Times New Roman" w:cs="Times New Roman"/>
+              </w:rPr>
+              <w:t>Direct control of kitchen equipment is outside the initial scope of tasks. Equipment availability may still be considered during production planning</w:t>
+            </w:r>
+          </w:p>
+        </w:tc>
+      </w:tr>
+      <w:tr>
+        <w:tc>
+          <w:tcPr>
+            <w:tcW w:w="656" w:type="dxa"/>
+          </w:tcPr>
+          <w:p>
+            <w:pPr>
+              <w:spacing w:line="360" w:lineRule="auto"/>
+              <w:rPr>
+                <w:rFonts w:ascii="Times New Roman" w:hAnsi="Times New Roman" w:cs="Times New Roman"/>
+              </w:rPr>
+            </w:pPr>
+            <w:r>
+              <w:rPr>
+                <w:rFonts w:ascii="Times New Roman" w:hAnsi="Times New Roman" w:cs="Times New Roman"/>
+              </w:rPr>
+              <w:t>OS2</w:t>
+            </w:r>
+          </w:p>
+        </w:tc>
+        <w:tc>
+          <w:tcPr>
+            <w:tcW w:w="2129" w:type="dxa"/>
+          </w:tcPr>
+          <w:p>
+            <w:pPr>
+              <w:spacing w:line="360" w:lineRule="auto"/>
+              <w:rPr>
+                <w:rFonts w:ascii="Times New Roman" w:hAnsi="Times New Roman" w:cs="Times New Roman"/>
+              </w:rPr>
+            </w:pPr>
+            <w:r>
+              <w:rPr>
+                <w:rFonts w:ascii="Times New Roman" w:hAnsi="Times New Roman" w:cs="Times New Roman"/>
+              </w:rPr>
+              <w:t>Retail payment processing</w:t>
+            </w:r>
+          </w:p>
+        </w:tc>
+        <w:tc>
+          <w:tcPr>
+            <w:tcW w:w="6565" w:type="dxa"/>
+          </w:tcPr>
+          <w:p>
+            <w:pPr>
+              <w:spacing w:line="360" w:lineRule="auto"/>
+              <w:rPr>
+                <w:rFonts w:ascii="Times New Roman" w:hAnsi="Times New Roman" w:cs="Times New Roman"/>
+              </w:rPr>
+            </w:pPr>
+            <w:r>
+              <w:rPr>
+                <w:rFonts w:ascii="Times New Roman" w:hAnsi="Times New Roman" w:cs="Times New Roman"/>
+              </w:rPr>
+              <w:t>Processing retail customer payments is outside the initial scope</w:t>
+            </w:r>
+          </w:p>
+        </w:tc>
+      </w:tr>
+      <w:tr>
+        <w:tc>
+          <w:tcPr>
+            <w:tcW w:w="656" w:type="dxa"/>
+          </w:tcPr>
+          <w:p>
+            <w:pPr>
+              <w:spacing w:line="360" w:lineRule="auto"/>
+              <w:rPr>
+                <w:rFonts w:ascii="Times New Roman" w:hAnsi="Times New Roman" w:cs="Times New Roman"/>
+              </w:rPr>
+            </w:pPr>
+            <w:r>
+              <w:rPr>
+                <w:rFonts w:ascii="Times New Roman" w:hAnsi="Times New Roman" w:cs="Times New Roman"/>
+              </w:rPr>
+              <w:t>OS3</w:t>
+            </w:r>
+          </w:p>
+        </w:tc>
+        <w:tc>
+          <w:tcPr>
+            <w:tcW w:w="2129" w:type="dxa"/>
+          </w:tcPr>
+          <w:p>
+            <w:pPr>
+              <w:spacing w:line="360" w:lineRule="auto"/>
+              <w:rPr>
+                <w:rFonts w:ascii="Times New Roman" w:hAnsi="Times New Roman" w:cs="Times New Roman"/>
+              </w:rPr>
+            </w:pPr>
+            <w:r>
+              <w:rPr>
+                <w:rFonts w:ascii="Times New Roman" w:hAnsi="Times New Roman" w:cs="Times New Roman"/>
+              </w:rPr>
+              <w:t>Full financial accounting</w:t>
+            </w:r>
+          </w:p>
+        </w:tc>
+        <w:tc>
+          <w:tcPr>
+            <w:tcW w:w="6565" w:type="dxa"/>
+          </w:tcPr>
+          <w:p>
+            <w:pPr>
+              <w:spacing w:line="360" w:lineRule="auto"/>
+              <w:rPr>
+                <w:rFonts w:ascii="Times New Roman" w:hAnsi="Times New Roman" w:cs="Times New Roman"/>
+              </w:rPr>
+            </w:pPr>
+            <w:r>
+              <w:rPr>
+                <w:rFonts w:ascii="Times New Roman" w:hAnsi="Times New Roman" w:cs="Times New Roman"/>
+              </w:rPr>
+              <w:t>Full financial accounting activities are outside the initial scope</w:t>
+            </w:r>
+          </w:p>
+        </w:tc>
+      </w:tr>
+    </w:tbl>
+    <w:p>
+      <w:pPr>
+        <w:pStyle w:val="Heading2"/>
+        <w:spacing w:line="360" w:lineRule="auto"/>
+        <w:rPr>
+          <w:rFonts w:ascii="Times New Roman" w:hAnsi="Times New Roman" w:cs="Times New Roman"/>
+          <w:color w:val="auto"/>
+          <w:sz w:val="24"/>
+          <w:szCs w:val="24"/>
+        </w:rPr>
+      </w:pPr>
+      <w:bookmarkStart w:id="10" w:name="_Toc242467214"/>
+      <w:r>
+        <w:rPr>
+          <w:rFonts w:ascii="Times New Roman" w:hAnsi="Times New Roman" w:cs="Times New Roman"/>
+          <w:color w:val="auto"/>
+          <w:sz w:val="24"/>
+          <w:szCs w:val="24"/>
+        </w:rPr>
+        <w:t>2.3 Dependencies, Assumptions and Constraints</w:t>
+      </w:r>
+      <w:bookmarkEnd w:id="10"/>
+    </w:p>
+    <w:p>
+      <w:pPr>
+        <w:pStyle w:val="Heading2"/>
+        <w:spacing w:line="360" w:lineRule="auto"/>
+        <w:rPr>
+          <w:rFonts w:ascii="Times New Roman" w:hAnsi="Times New Roman" w:cs="Times New Roman"/>
+          <w:color w:val="auto"/>
+          <w:sz w:val="24"/>
+          <w:szCs w:val="24"/>
+        </w:rPr>
+      </w:pPr>
+      <w:bookmarkStart w:id="11" w:name="_Toc242467215"/>
+      <w:r>
+        <w:rPr>
+          <w:rFonts w:ascii="Times New Roman" w:hAnsi="Times New Roman" w:cs="Times New Roman"/>
+          <w:color w:val="auto"/>
+          <w:sz w:val="24"/>
+          <w:szCs w:val="24"/>
+        </w:rPr>
+        <w:t>2.3.1 Constraints</w:t>
+      </w:r>
+      <w:bookmarkEnd w:id="11"/>
+    </w:p>
+    <w:tbl>
+      <w:tblPr>
+        <w:tblStyle w:val="TableGrid"/>
+        <w:tblW w:w="0" w:type="auto"/>
+        <w:tblLook w:val="04A0" w:firstRow="1" w:lastRow="0" w:firstColumn="1" w:lastColumn="0" w:noHBand="0" w:noVBand="1"/>
+      </w:tblPr>
+      <w:tblGrid>
+        <w:gridCol w:w="511"/>
+        <w:gridCol w:w="4344"/>
+        <w:gridCol w:w="4495"/>
+      </w:tblGrid>
+      <w:tr>
+        <w:tc>
+          <w:tcPr>
+            <w:tcW w:w="511" w:type="dxa"/>
+          </w:tcPr>
+          <w:p>
+            <w:pPr>
+              <w:spacing w:line="360" w:lineRule="auto"/>
+              <w:rPr>
+                <w:rFonts w:ascii="Times New Roman" w:hAnsi="Times New Roman" w:cs="Times New Roman"/>
+              </w:rPr>
+            </w:pPr>
+            <w:r>
+              <w:rPr>
+                <w:rFonts w:ascii="Times New Roman" w:hAnsi="Times New Roman" w:cs="Times New Roman"/>
+              </w:rPr>
+              <w:t>ID</w:t>
+            </w:r>
+          </w:p>
+        </w:tc>
+        <w:tc>
+          <w:tcPr>
+            <w:tcW w:w="4344" w:type="dxa"/>
+          </w:tcPr>
+          <w:p>
+            <w:pPr>
+              <w:spacing w:line="360" w:lineRule="auto"/>
+              <w:rPr>
+                <w:rFonts w:ascii="Times New Roman" w:hAnsi="Times New Roman" w:cs="Times New Roman"/>
+              </w:rPr>
+            </w:pPr>
+            <w:r>
+              <w:rPr>
+                <w:rFonts w:ascii="Times New Roman" w:hAnsi="Times New Roman" w:cs="Times New Roman"/>
+              </w:rPr>
+              <w:t>Constraint</w:t>
+            </w:r>
+          </w:p>
+        </w:tc>
+        <w:tc>
+          <w:tcPr>
+            <w:tcW w:w="4495" w:type="dxa"/>
+          </w:tcPr>
+          <w:p>
+            <w:pPr>
+              <w:spacing w:line="360" w:lineRule="auto"/>
+              <w:rPr>
+                <w:rFonts w:ascii="Times New Roman" w:hAnsi="Times New Roman" w:cs="Times New Roman"/>
+              </w:rPr>
+            </w:pPr>
+            <w:r>
+              <w:rPr>
+                <w:rFonts w:ascii="Times New Roman" w:hAnsi="Times New Roman" w:cs="Times New Roman"/>
+              </w:rPr>
+              <w:t>Evidence / Rationale</w:t>
+            </w:r>
+          </w:p>
+        </w:tc>
+      </w:tr>
+      <w:tr>
+        <w:tc>
+          <w:tcPr>
+            <w:tcW w:w="511" w:type="dxa"/>
+          </w:tcPr>
+          <w:p>
+            <w:pPr>
+              <w:spacing w:line="360" w:lineRule="auto"/>
+              <w:rPr>
+                <w:rFonts w:ascii="Times New Roman" w:hAnsi="Times New Roman" w:cs="Times New Roman"/>
+              </w:rPr>
+            </w:pPr>
+            <w:r>
+              <w:rPr>
+                <w:rFonts w:ascii="Times New Roman" w:hAnsi="Times New Roman" w:cs="Times New Roman"/>
+              </w:rPr>
+              <w:t>C1</w:t>
+            </w:r>
+          </w:p>
+        </w:tc>
+        <w:tc>
+          <w:tcPr>
+            <w:tcW w:w="4344" w:type="dxa"/>
+          </w:tcPr>
+          <w:p>
+            <w:pPr>
+              <w:spacing w:line="360" w:lineRule="auto"/>
+              <w:rPr>
+                <w:rFonts w:ascii="Times New Roman" w:hAnsi="Times New Roman" w:cs="Times New Roman"/>
+              </w:rPr>
+            </w:pPr>
+            <w:r>
+              <w:rPr>
+                <w:rFonts w:ascii="Times New Roman" w:hAnsi="Times New Roman" w:cs="Times New Roman"/>
+              </w:rPr>
+              <w:t>Production takes place in a shared kitchen with limited equipment and storage</w:t>
+            </w:r>
+          </w:p>
+        </w:tc>
+        <w:tc>
+          <w:tcPr>
+            <w:tcW w:w="4495" w:type="dxa"/>
+          </w:tcPr>
+          <w:p>
+            <w:pPr>
+              <w:spacing w:line="360" w:lineRule="auto"/>
+              <w:rPr>
+                <w:rFonts w:ascii="Times New Roman" w:hAnsi="Times New Roman" w:cs="Times New Roman"/>
+              </w:rPr>
+            </w:pPr>
+            <w:r>
+              <w:rPr>
+                <w:rFonts w:ascii="Times New Roman" w:hAnsi="Times New Roman" w:cs="Times New Roman"/>
+              </w:rPr>
+              <w:t>The scenario explicitly identifies limited equipment and storage as part of the production environment</w:t>
+            </w:r>
+          </w:p>
+        </w:tc>
+      </w:tr>
+      <w:tr>
+        <w:tc>
+          <w:tcPr>
+            <w:tcW w:w="511" w:type="dxa"/>
+          </w:tcPr>
+          <w:p>
+            <w:pPr>
+              <w:spacing w:line="360" w:lineRule="auto"/>
+              <w:rPr>
+                <w:rFonts w:ascii="Times New Roman" w:hAnsi="Times New Roman" w:cs="Times New Roman"/>
+              </w:rPr>
+            </w:pPr>
+            <w:r>
+              <w:rPr>
+                <w:rFonts w:ascii="Times New Roman" w:hAnsi="Times New Roman" w:cs="Times New Roman"/>
+              </w:rPr>
+              <w:t>C2</w:t>
+            </w:r>
+          </w:p>
+        </w:tc>
+        <w:tc>
+          <w:tcPr>
+            <w:tcW w:w="4344" w:type="dxa"/>
+          </w:tcPr>
+          <w:p>
+            <w:pPr>
+              <w:spacing w:line="360" w:lineRule="auto"/>
+              <w:rPr>
+                <w:rFonts w:ascii="Times New Roman" w:hAnsi="Times New Roman" w:cs="Times New Roman"/>
+              </w:rPr>
+            </w:pPr>
+            <w:r>
+              <w:rPr>
+                <w:rFonts w:ascii="Times New Roman" w:hAnsi="Times New Roman" w:cs="Times New Roman"/>
+              </w:rPr>
+              <w:t>Production planning must consider kitchen capacity and equipment availability</w:t>
+            </w:r>
+          </w:p>
+        </w:tc>
+        <w:tc>
+          <w:tcPr>
+            <w:tcW w:w="4495" w:type="dxa"/>
+          </w:tcPr>
+          <w:p>
+            <w:pPr>
+              <w:spacing w:line="360" w:lineRule="auto"/>
+              <w:rPr>
+                <w:rFonts w:ascii="Times New Roman" w:hAnsi="Times New Roman" w:cs="Times New Roman"/>
+              </w:rPr>
+            </w:pPr>
+            <w:r>
+              <w:rPr>
+                <w:rFonts w:ascii="Times New Roman" w:hAnsi="Times New Roman" w:cs="Times New Roman"/>
+              </w:rPr>
+              <w:t>The scenario states that production planning considers kitchen capacity and equipment</w:t>
+            </w:r>
+          </w:p>
+        </w:tc>
+      </w:tr>
+      <w:tr>
+        <w:tc>
+          <w:tcPr>
+            <w:tcW w:w="511" w:type="dxa"/>
+          </w:tcPr>
+          <w:p>
+            <w:pPr>
+              <w:spacing w:line="360" w:lineRule="auto"/>
+              <w:rPr>
+                <w:rFonts w:ascii="Times New Roman" w:hAnsi="Times New Roman" w:cs="Times New Roman"/>
+              </w:rPr>
+            </w:pPr>
+            <w:r>
+              <w:rPr>
+                <w:rFonts w:ascii="Times New Roman" w:hAnsi="Times New Roman" w:cs="Times New Roman"/>
+              </w:rPr>
+              <w:lastRenderedPageBreak/>
+              <w:t>C3</w:t>
+            </w:r>
+          </w:p>
+        </w:tc>
+        <w:tc>
+          <w:tcPr>
+            <w:tcW w:w="4344" w:type="dxa"/>
+          </w:tcPr>
+          <w:p>
+            <w:pPr>
+              <w:spacing w:line="360" w:lineRule="auto"/>
+              <w:rPr>
+                <w:rFonts w:ascii="Times New Roman" w:hAnsi="Times New Roman" w:cs="Times New Roman"/>
+              </w:rPr>
+            </w:pPr>
+            <w:r>
+              <w:rPr>
+                <w:rFonts w:ascii="Times New Roman" w:hAnsi="Times New Roman" w:cs="Times New Roman"/>
+              </w:rPr>
+              <w:t>Production planning must consider staff skills and the time required for preparation, cooling and packing</w:t>
+            </w:r>
+          </w:p>
+        </w:tc>
+        <w:tc>
+          <w:tcPr>
+            <w:tcW w:w="4495" w:type="dxa"/>
+          </w:tcPr>
+          <w:p>
+            <w:pPr>
+              <w:spacing w:line="360" w:lineRule="auto"/>
+              <w:rPr>
+                <w:rFonts w:ascii="Times New Roman" w:hAnsi="Times New Roman" w:cs="Times New Roman"/>
+              </w:rPr>
+            </w:pPr>
+            <w:r>
+              <w:rPr>
+                <w:rFonts w:ascii="Times New Roman" w:hAnsi="Times New Roman" w:cs="Times New Roman"/>
+              </w:rPr>
+              <w:t>These factors are explicitly identified as considerations when planning production</w:t>
+            </w:r>
+          </w:p>
+        </w:tc>
+      </w:tr>
+      <w:tr>
+        <w:tc>
+          <w:tcPr>
+            <w:tcW w:w="511" w:type="dxa"/>
+          </w:tcPr>
+          <w:p>
+            <w:pPr>
+              <w:spacing w:line="360" w:lineRule="auto"/>
+              <w:rPr>
+                <w:rFonts w:ascii="Times New Roman" w:hAnsi="Times New Roman" w:cs="Times New Roman"/>
+              </w:rPr>
+            </w:pPr>
+            <w:r>
+              <w:rPr>
+                <w:rFonts w:ascii="Times New Roman" w:hAnsi="Times New Roman" w:cs="Times New Roman"/>
+              </w:rPr>
+              <w:t>C4</w:t>
+            </w:r>
+          </w:p>
+        </w:tc>
+        <w:tc>
+          <w:tcPr>
+            <w:tcW w:w="4344" w:type="dxa"/>
+          </w:tcPr>
+          <w:p>
+            <w:pPr>
+              <w:spacing w:line="360" w:lineRule="auto"/>
+              <w:rPr>
+                <w:rFonts w:ascii="Times New Roman" w:hAnsi="Times New Roman" w:cs="Times New Roman"/>
+              </w:rPr>
+            </w:pPr>
+            <w:r>
+              <w:rPr>
+                <w:rFonts w:ascii="Times New Roman" w:hAnsi="Times New Roman" w:cs="Times New Roman"/>
+              </w:rPr>
+              <w:t>The initial system scope excludes kitchen equipment control, retail payment processing and full financial accounting</w:t>
+            </w:r>
+          </w:p>
+        </w:tc>
+        <w:tc>
+          <w:tcPr>
+            <w:tcW w:w="4495" w:type="dxa"/>
+          </w:tcPr>
+          <w:p>
+            <w:pPr>
+              <w:spacing w:line="360" w:lineRule="auto"/>
+              <w:rPr>
+                <w:rFonts w:ascii="Times New Roman" w:hAnsi="Times New Roman" w:cs="Times New Roman"/>
+              </w:rPr>
+            </w:pPr>
+            <w:r>
+              <w:rPr>
+                <w:rFonts w:ascii="Times New Roman" w:hAnsi="Times New Roman" w:cs="Times New Roman"/>
+              </w:rPr>
+              <w:t>These areas are explicitly excluded from the initial scope</w:t>
+            </w:r>
+          </w:p>
+        </w:tc>
+      </w:tr>
+    </w:tbl>
+    <w:p>
+      <w:pPr>
+        <w:pStyle w:val="Heading2"/>
+        <w:spacing w:line="360" w:lineRule="auto"/>
+        <w:rPr>
+          <w:rFonts w:ascii="Times New Roman" w:hAnsi="Times New Roman" w:cs="Times New Roman"/>
+          <w:color w:val="auto"/>
+          <w:sz w:val="24"/>
+          <w:szCs w:val="24"/>
+        </w:rPr>
+      </w:pPr>
+      <w:bookmarkStart w:id="12" w:name="_Toc242467216"/>
+      <w:r>
+        <w:rPr>
+          <w:rFonts w:ascii="Times New Roman" w:hAnsi="Times New Roman" w:cs="Times New Roman"/>
+          <w:color w:val="auto"/>
+          <w:sz w:val="24"/>
+          <w:szCs w:val="24"/>
+        </w:rPr>
+        <w:t>2.3.2 Dependencies</w:t>
+      </w:r>
+      <w:bookmarkEnd w:id="12"/>
+    </w:p>
+    <w:tbl>
+      <w:tblPr>
+        <w:tblStyle w:val="TableGrid"/>
+        <w:tblW w:w="0" w:type="auto"/>
+        <w:tblLook w:val="04A0" w:firstRow="1" w:lastRow="0" w:firstColumn="1" w:lastColumn="0" w:noHBand="0" w:noVBand="1"/>
+      </w:tblPr>
+      <w:tblGrid>
+        <w:gridCol w:w="510"/>
+        <w:gridCol w:w="4346"/>
+        <w:gridCol w:w="4494"/>
+      </w:tblGrid>
+      <w:tr>
+        <w:tc>
+          <w:tcPr>
+            <w:tcW w:w="510" w:type="dxa"/>
+          </w:tcPr>
+          <w:p>
+            <w:pPr>
+              <w:spacing w:line="360" w:lineRule="auto"/>
+              <w:rPr>
+                <w:rFonts w:ascii="Times New Roman" w:hAnsi="Times New Roman" w:cs="Times New Roman"/>
+              </w:rPr>
+            </w:pPr>
+            <w:r>
+              <w:rPr>
+                <w:rFonts w:ascii="Times New Roman" w:hAnsi="Times New Roman" w:cs="Times New Roman"/>
+              </w:rPr>
+              <w:t>ID</w:t>
+            </w:r>
+          </w:p>
+        </w:tc>
+        <w:tc>
+          <w:tcPr>
+            <w:tcW w:w="4346" w:type="dxa"/>
+          </w:tcPr>
+          <w:p>
+            <w:pPr>
+              <w:spacing w:line="360" w:lineRule="auto"/>
+              <w:rPr>
+                <w:rFonts w:ascii="Times New Roman" w:hAnsi="Times New Roman" w:cs="Times New Roman"/>
+              </w:rPr>
+            </w:pPr>
+            <w:r>
+              <w:rPr>
+                <w:rFonts w:ascii="Times New Roman" w:hAnsi="Times New Roman" w:cs="Times New Roman"/>
+              </w:rPr>
+              <w:t>Dependency</w:t>
+            </w:r>
+          </w:p>
+        </w:tc>
+        <w:tc>
+          <w:tcPr>
+            <w:tcW w:w="4494" w:type="dxa"/>
+          </w:tcPr>
+          <w:p>
+            <w:pPr>
+              <w:spacing w:line="360" w:lineRule="auto"/>
+              <w:rPr>
+                <w:rFonts w:ascii="Times New Roman" w:hAnsi="Times New Roman" w:cs="Times New Roman"/>
+              </w:rPr>
+            </w:pPr>
+            <w:r>
+              <w:rPr>
+                <w:rFonts w:ascii="Times New Roman" w:hAnsi="Times New Roman" w:cs="Times New Roman"/>
+              </w:rPr>
+              <w:t>Rationale</w:t>
+            </w:r>
+          </w:p>
+        </w:tc>
+      </w:tr>
+      <w:tr>
+        <w:tc>
+          <w:tcPr>
+            <w:tcW w:w="510" w:type="dxa"/>
+          </w:tcPr>
+          <w:p>
+            <w:pPr>
+              <w:spacing w:line="360" w:lineRule="auto"/>
+              <w:rPr>
+                <w:rFonts w:ascii="Times New Roman" w:hAnsi="Times New Roman" w:cs="Times New Roman"/>
+              </w:rPr>
+            </w:pPr>
+            <w:r>
+              <w:rPr>
+                <w:rFonts w:ascii="Times New Roman" w:hAnsi="Times New Roman" w:cs="Times New Roman"/>
+              </w:rPr>
+              <w:t>D1</w:t>
+            </w:r>
+          </w:p>
+        </w:tc>
+        <w:tc>
+          <w:tcPr>
+            <w:tcW w:w="4346" w:type="dxa"/>
+          </w:tcPr>
+          <w:p>
+            <w:pPr>
+              <w:spacing w:line="360" w:lineRule="auto"/>
+              <w:rPr>
+                <w:rFonts w:ascii="Times New Roman" w:hAnsi="Times New Roman" w:cs="Times New Roman"/>
+              </w:rPr>
+            </w:pPr>
+            <w:r>
+              <w:rPr>
+                <w:rFonts w:ascii="Times New Roman" w:hAnsi="Times New Roman" w:cs="Times New Roman"/>
+              </w:rPr>
+              <w:t>Production planning depends on accurate ingredient availability information</w:t>
+            </w:r>
+          </w:p>
+        </w:tc>
+        <w:tc>
+          <w:tcPr>
+            <w:tcW w:w="4494" w:type="dxa"/>
+          </w:tcPr>
+          <w:p>
+            <w:pPr>
+              <w:spacing w:line="360" w:lineRule="auto"/>
+              <w:rPr>
+                <w:rFonts w:ascii="Times New Roman" w:hAnsi="Times New Roman" w:cs="Times New Roman"/>
+              </w:rPr>
+            </w:pPr>
+            <w:r>
+              <w:rPr>
+                <w:rFonts w:ascii="Times New Roman" w:hAnsi="Times New Roman" w:cs="Times New Roman"/>
+              </w:rPr>
+              <w:t>Ingredient availability is one of the factors considered when planning production</w:t>
+            </w:r>
+          </w:p>
+        </w:tc>
+      </w:tr>
+      <w:tr>
+        <w:tc>
+          <w:tcPr>
+            <w:tcW w:w="510" w:type="dxa"/>
+          </w:tcPr>
+          <w:p>
+            <w:pPr>
+              <w:spacing w:line="360" w:lineRule="auto"/>
+              <w:rPr>
+                <w:rFonts w:ascii="Times New Roman" w:hAnsi="Times New Roman" w:cs="Times New Roman"/>
+              </w:rPr>
+            </w:pPr>
+            <w:r>
+              <w:rPr>
+                <w:rFonts w:ascii="Times New Roman" w:hAnsi="Times New Roman" w:cs="Times New Roman"/>
+              </w:rPr>
+              <w:t>D2</w:t>
+            </w:r>
+          </w:p>
+        </w:tc>
+        <w:tc>
+          <w:tcPr>
+            <w:tcW w:w="4346" w:type="dxa"/>
+          </w:tcPr>
+          <w:p>
+            <w:pPr>
+              <w:spacing w:line="360" w:lineRule="auto"/>
+              <w:rPr>
+                <w:rFonts w:ascii="Times New Roman" w:hAnsi="Times New Roman" w:cs="Times New Roman"/>
+              </w:rPr>
+            </w:pPr>
+            <w:r>
+              <w:rPr>
+                <w:rFonts w:ascii="Times New Roman" w:hAnsi="Times New Roman" w:cs="Times New Roman"/>
+              </w:rPr>
+              <w:t>Production batches depend on an identifiable approved recipe version</w:t>
+            </w:r>
+          </w:p>
+        </w:tc>
+        <w:tc>
+          <w:tcPr>
+            <w:tcW w:w="4494" w:type="dxa"/>
+          </w:tcPr>
+          <w:p>
+            <w:pPr>
+              <w:spacing w:line="360" w:lineRule="auto"/>
+              <w:rPr>
+                <w:rFonts w:ascii="Times New Roman" w:hAnsi="Times New Roman" w:cs="Times New Roman"/>
+              </w:rPr>
+            </w:pPr>
+            <w:r>
+              <w:rPr>
+                <w:rFonts w:ascii="Times New Roman" w:hAnsi="Times New Roman" w:cs="Times New Roman"/>
+              </w:rPr>
+              <w:t>Each product uses an approved recipe version, and the applicable version needs to be known for each batch</w:t>
+            </w:r>
+          </w:p>
+        </w:tc>
+      </w:tr>
+      <w:tr>
+        <w:tc>
+          <w:tcPr>
+            <w:tcW w:w="510" w:type="dxa"/>
+          </w:tcPr>
+          <w:p>
+            <w:pPr>
+              <w:spacing w:line="360" w:lineRule="auto"/>
+              <w:rPr>
+                <w:rFonts w:ascii="Times New Roman" w:hAnsi="Times New Roman" w:cs="Times New Roman"/>
+              </w:rPr>
+            </w:pPr>
+            <w:r>
+              <w:rPr>
+                <w:rFonts w:ascii="Times New Roman" w:hAnsi="Times New Roman" w:cs="Times New Roman"/>
+              </w:rPr>
+              <w:t>D3</w:t>
+            </w:r>
+          </w:p>
+        </w:tc>
+        <w:tc>
+          <w:tcPr>
+            <w:tcW w:w="4346" w:type="dxa"/>
+          </w:tcPr>
+          <w:p>
+            <w:pPr>
+              <w:spacing w:line="360" w:lineRule="auto"/>
+              <w:rPr>
+                <w:rFonts w:ascii="Times New Roman" w:hAnsi="Times New Roman" w:cs="Times New Roman"/>
+              </w:rPr>
+            </w:pPr>
+            <w:r>
+              <w:rPr>
+                <w:rFonts w:ascii="Times New Roman" w:hAnsi="Times New Roman" w:cs="Times New Roman"/>
+              </w:rPr>
+              <w:t>Product release depends on completion of the required quality checks</w:t>
+            </w:r>
+          </w:p>
+        </w:tc>
+        <w:tc>
+          <w:tcPr>
+            <w:tcW w:w="4494" w:type="dxa"/>
+          </w:tcPr>
+          <w:p>
+            <w:pPr>
+              <w:spacing w:line="360" w:lineRule="auto"/>
+              <w:rPr>
+                <w:rFonts w:ascii="Times New Roman" w:hAnsi="Times New Roman" w:cs="Times New Roman"/>
+              </w:rPr>
+            </w:pPr>
+            <w:r>
+              <w:rPr>
+                <w:rFonts w:ascii="Times New Roman" w:hAnsi="Times New Roman" w:cs="Times New Roman"/>
+              </w:rPr>
+              <w:t>A batch may be packed but remain held pending checks</w:t>
+            </w:r>
+          </w:p>
+        </w:tc>
+      </w:tr>
+      <w:tr>
+        <w:tc>
+          <w:tcPr>
+            <w:tcW w:w="510" w:type="dxa"/>
+          </w:tcPr>
+          <w:p>
+            <w:pPr>
+              <w:spacing w:line="360" w:lineRule="auto"/>
+              <w:rPr>
+                <w:rFonts w:ascii="Times New Roman" w:hAnsi="Times New Roman" w:cs="Times New Roman"/>
+              </w:rPr>
+            </w:pPr>
+            <w:r>
+              <w:rPr>
+                <w:rFonts w:ascii="Times New Roman" w:hAnsi="Times New Roman" w:cs="Times New Roman"/>
+              </w:rPr>
+              <w:t>D4</w:t>
+            </w:r>
+          </w:p>
+        </w:tc>
+        <w:tc>
+          <w:tcPr>
+            <w:tcW w:w="4346" w:type="dxa"/>
+          </w:tcPr>
+          <w:p>
+            <w:pPr>
+              <w:spacing w:line="360" w:lineRule="auto"/>
+              <w:rPr>
+                <w:rFonts w:ascii="Times New Roman" w:hAnsi="Times New Roman" w:cs="Times New Roman"/>
+              </w:rPr>
+            </w:pPr>
+            <w:r>
+              <w:rPr>
+                <w:rFonts w:ascii="Times New Roman" w:hAnsi="Times New Roman" w:cs="Times New Roman"/>
+              </w:rPr>
+              <w:t>Effective traceability depends on maintaining relationships between ingredient batches, production batches, packaged units and customer order</w:t>
+            </w:r>
+          </w:p>
+        </w:tc>
+        <w:tc>
+          <w:tcPr>
+            <w:tcW w:w="4494" w:type="dxa"/>
+          </w:tcPr>
+          <w:p>
+            <w:pPr>
+              <w:spacing w:line="360" w:lineRule="auto"/>
+              <w:rPr>
+                <w:rFonts w:ascii="Times New Roman" w:hAnsi="Times New Roman" w:cs="Times New Roman"/>
+              </w:rPr>
+            </w:pPr>
+            <w:r>
+              <w:rPr>
+                <w:rFonts w:ascii="Times New Roman" w:hAnsi="Times New Roman" w:cs="Times New Roman"/>
+              </w:rPr>
+              <w:t>These relationships</w:t>
+            </w:r>
+            <w:r>
+              <w:rPr>
+                <w:rFonts w:ascii="Times New Roman" w:hAnsi="Times New Roman" w:cs="Times New Roman"/>
+              </w:rPr>
+              <w:t xml:space="preserve"> are required when identifying affected production and customer records after an issue is discovered</w:t>
+            </w:r>
+          </w:p>
+        </w:tc>
+      </w:tr>
+    </w:tbl>
+    <w:p>
+      <w:pPr>
+        <w:spacing w:line="360" w:lineRule="auto"/>
+        <w:rPr>
+          <w:rFonts w:ascii="Times New Roman" w:hAnsi="Times New Roman" w:cs="Times New Roman"/>
+        </w:rPr>
+      </w:pPr>
+    </w:p>
     <w:sectPr>
       <w:headerReference w:type="default" r:id="rId8"/>
       <w:footerReference w:type="default" r:id="rId9"/>
@@ -2306,6 +5235,7 @@
   <w:style w:type="character" w:default="1" w:styleId="DefaultParagraphFont">
     <w:name w:val="Default Paragraph Font"/>
     <w:uiPriority w:val="1"/>
+    <w:semiHidden/>
     <w:unhideWhenUsed/>
   </w:style>
   <w:style w:type="table" w:default="1" w:styleId="TableNormal">

</xml_diff>

<commit_message>
Add Rules and Uncertainty Register
</commit_message>
<xml_diff>
--- a/report/Analysis Dossier.docx
+++ b/report/Analysis Dossier.docx
@@ -7741,11 +7741,11 @@
         <w:tblLook w:val="04A0" w:firstRow="1" w:lastRow="0" w:firstColumn="1" w:lastColumn="0" w:noHBand="0" w:noVBand="1"/>
       </w:tblPr>
       <w:tblGrid>
-        <w:gridCol w:w="617"/>
-        <w:gridCol w:w="2845"/>
-        <w:gridCol w:w="2459"/>
-        <w:gridCol w:w="1187"/>
-        <w:gridCol w:w="2242"/>
+        <w:gridCol w:w="630"/>
+        <w:gridCol w:w="2844"/>
+        <w:gridCol w:w="2452"/>
+        <w:gridCol w:w="1190"/>
+        <w:gridCol w:w="2234"/>
       </w:tblGrid>
       <w:tr>
         <w:tc>
@@ -7753,7 +7753,16 @@
             <w:tcW w:w="616" w:type="dxa"/>
           </w:tcPr>
           <w:p>
-            <w:r>
+            <w:pPr>
+              <w:spacing w:line="360" w:lineRule="auto"/>
+              <w:rPr>
+                <w:rFonts w:ascii="Times New Roman" w:hAnsi="Times New Roman" w:cs="Times New Roman"/>
+              </w:rPr>
+            </w:pPr>
+            <w:r>
+              <w:rPr>
+                <w:rFonts w:ascii="Times New Roman" w:hAnsi="Times New Roman" w:cs="Times New Roman"/>
+              </w:rPr>
               <w:t>ID</w:t>
             </w:r>
           </w:p>
@@ -7763,7 +7772,16 @@
             <w:tcW w:w="3017" w:type="dxa"/>
           </w:tcPr>
           <w:p>
-            <w:r>
+            <w:pPr>
+              <w:spacing w:line="360" w:lineRule="auto"/>
+              <w:rPr>
+                <w:rFonts w:ascii="Times New Roman" w:hAnsi="Times New Roman" w:cs="Times New Roman"/>
+              </w:rPr>
+            </w:pPr>
+            <w:r>
+              <w:rPr>
+                <w:rFonts w:ascii="Times New Roman" w:hAnsi="Times New Roman" w:cs="Times New Roman"/>
+              </w:rPr>
               <w:t>Functional Requirement</w:t>
             </w:r>
           </w:p>
@@ -7773,7 +7791,16 @@
             <w:tcW w:w="2575" w:type="dxa"/>
           </w:tcPr>
           <w:p>
-            <w:r>
+            <w:pPr>
+              <w:spacing w:line="360" w:lineRule="auto"/>
+              <w:rPr>
+                <w:rFonts w:ascii="Times New Roman" w:hAnsi="Times New Roman" w:cs="Times New Roman"/>
+              </w:rPr>
+            </w:pPr>
+            <w:r>
+              <w:rPr>
+                <w:rFonts w:ascii="Times New Roman" w:hAnsi="Times New Roman" w:cs="Times New Roman"/>
+              </w:rPr>
               <w:t>Source / Rationale</w:t>
             </w:r>
           </w:p>
@@ -7783,8 +7810,17 @@
             <w:tcW w:w="807" w:type="dxa"/>
           </w:tcPr>
           <w:p>
+            <w:pPr>
+              <w:spacing w:line="360" w:lineRule="auto"/>
+              <w:rPr>
+                <w:rFonts w:ascii="Times New Roman" w:hAnsi="Times New Roman" w:cs="Times New Roman"/>
+              </w:rPr>
+            </w:pPr>
             <w:proofErr w:type="spellStart"/>
             <w:r>
+              <w:rPr>
+                <w:rFonts w:ascii="Times New Roman" w:hAnsi="Times New Roman" w:cs="Times New Roman"/>
+              </w:rPr>
               <w:t>MoSCoW</w:t>
             </w:r>
             <w:proofErr w:type="spellEnd"/>
@@ -7795,7 +7831,16 @@
             <w:tcW w:w="2335" w:type="dxa"/>
           </w:tcPr>
           <w:p>
-            <w:r>
+            <w:pPr>
+              <w:spacing w:line="360" w:lineRule="auto"/>
+              <w:rPr>
+                <w:rFonts w:ascii="Times New Roman" w:hAnsi="Times New Roman" w:cs="Times New Roman"/>
+              </w:rPr>
+            </w:pPr>
+            <w:r>
+              <w:rPr>
+                <w:rFonts w:ascii="Times New Roman" w:hAnsi="Times New Roman" w:cs="Times New Roman"/>
+              </w:rPr>
               <w:t>Verification</w:t>
             </w:r>
           </w:p>
@@ -7807,7 +7852,16 @@
             <w:tcW w:w="616" w:type="dxa"/>
           </w:tcPr>
           <w:p>
-            <w:r>
+            <w:pPr>
+              <w:spacing w:line="360" w:lineRule="auto"/>
+              <w:rPr>
+                <w:rFonts w:ascii="Times New Roman" w:hAnsi="Times New Roman" w:cs="Times New Roman"/>
+              </w:rPr>
+            </w:pPr>
+            <w:r>
+              <w:rPr>
+                <w:rFonts w:ascii="Times New Roman" w:hAnsi="Times New Roman" w:cs="Times New Roman"/>
+              </w:rPr>
               <w:t>FR1</w:t>
             </w:r>
           </w:p>
@@ -7817,8 +7871,24 @@
             <w:tcW w:w="3017" w:type="dxa"/>
           </w:tcPr>
           <w:p>
-            <w:r>
-              <w:t>The system shall maintain identifiable approved recipe versions for products</w:t>
+            <w:pPr>
+              <w:spacing w:line="360" w:lineRule="auto"/>
+              <w:rPr>
+                <w:rFonts w:ascii="Times New Roman" w:hAnsi="Times New Roman" w:cs="Times New Roman"/>
+              </w:rPr>
+            </w:pPr>
+            <w:r>
+              <w:rPr>
+                <w:rFonts w:ascii="Times New Roman" w:hAnsi="Times New Roman" w:cs="Times New Roman"/>
+              </w:rPr>
+              <w:t xml:space="preserve">The system shall maintain identifiable approved </w:t>
+            </w:r>
+            <w:r>
+              <w:rPr>
+                <w:rFonts w:ascii="Times New Roman" w:hAnsi="Times New Roman" w:cs="Times New Roman"/>
+              </w:rPr>
+              <w:lastRenderedPageBreak/>
+              <w:t>recipe versions for products</w:t>
             </w:r>
           </w:p>
         </w:tc>
@@ -7827,41 +7897,86 @@
             <w:tcW w:w="2575" w:type="dxa"/>
           </w:tcPr>
           <w:p>
-            <w:r>
+            <w:pPr>
+              <w:spacing w:line="360" w:lineRule="auto"/>
+              <w:rPr>
+                <w:rFonts w:ascii="Times New Roman" w:hAnsi="Times New Roman" w:cs="Times New Roman"/>
+              </w:rPr>
+            </w:pPr>
+            <w:r>
+              <w:rPr>
+                <w:rFonts w:ascii="Times New Roman" w:hAnsi="Times New Roman" w:cs="Times New Roman"/>
+              </w:rPr>
+              <w:lastRenderedPageBreak/>
               <w:t xml:space="preserve">Each production batch must be associated with </w:t>
             </w:r>
             <w:r>
+              <w:rPr>
+                <w:rFonts w:ascii="Times New Roman" w:hAnsi="Times New Roman" w:cs="Times New Roman"/>
+              </w:rPr>
               <w:t xml:space="preserve">the </w:t>
             </w:r>
             <w:r>
-              <w:t>applicable approved recipe version</w:t>
-            </w:r>
-          </w:p>
-        </w:tc>
-        <w:tc>
-          <w:tcPr>
-            <w:tcW w:w="807" w:type="dxa"/>
-          </w:tcPr>
-          <w:p>
-            <w:r>
-              <w:t>Must have</w:t>
-            </w:r>
-          </w:p>
-        </w:tc>
-        <w:tc>
-          <w:tcPr>
-            <w:tcW w:w="2335" w:type="dxa"/>
-          </w:tcPr>
-          <w:p>
-            <w:r>
-              <w:t xml:space="preserve">Verify that a production batch can be associated with an identifiable </w:t>
-            </w:r>
-            <w:r>
+              <w:rPr>
+                <w:rFonts w:ascii="Times New Roman" w:hAnsi="Times New Roman" w:cs="Times New Roman"/>
+              </w:rPr>
+              <w:t xml:space="preserve">applicable </w:t>
+            </w:r>
+            <w:r>
+              <w:rPr>
+                <w:rFonts w:ascii="Times New Roman" w:hAnsi="Times New Roman" w:cs="Times New Roman"/>
+              </w:rPr>
               <w:lastRenderedPageBreak/>
               <w:t>approved recipe version</w:t>
             </w:r>
           </w:p>
         </w:tc>
+        <w:tc>
+          <w:tcPr>
+            <w:tcW w:w="807" w:type="dxa"/>
+          </w:tcPr>
+          <w:p>
+            <w:pPr>
+              <w:spacing w:line="360" w:lineRule="auto"/>
+              <w:rPr>
+                <w:rFonts w:ascii="Times New Roman" w:hAnsi="Times New Roman" w:cs="Times New Roman"/>
+              </w:rPr>
+            </w:pPr>
+            <w:r>
+              <w:rPr>
+                <w:rFonts w:ascii="Times New Roman" w:hAnsi="Times New Roman" w:cs="Times New Roman"/>
+              </w:rPr>
+              <w:lastRenderedPageBreak/>
+              <w:t>Must have</w:t>
+            </w:r>
+          </w:p>
+        </w:tc>
+        <w:tc>
+          <w:tcPr>
+            <w:tcW w:w="2335" w:type="dxa"/>
+          </w:tcPr>
+          <w:p>
+            <w:pPr>
+              <w:spacing w:line="360" w:lineRule="auto"/>
+              <w:rPr>
+                <w:rFonts w:ascii="Times New Roman" w:hAnsi="Times New Roman" w:cs="Times New Roman"/>
+              </w:rPr>
+            </w:pPr>
+            <w:r>
+              <w:rPr>
+                <w:rFonts w:ascii="Times New Roman" w:hAnsi="Times New Roman" w:cs="Times New Roman"/>
+              </w:rPr>
+              <w:t xml:space="preserve">Verify that a production batch can be associated with </w:t>
+            </w:r>
+            <w:r>
+              <w:rPr>
+                <w:rFonts w:ascii="Times New Roman" w:hAnsi="Times New Roman" w:cs="Times New Roman"/>
+              </w:rPr>
+              <w:lastRenderedPageBreak/>
+              <w:t>an identifiable approved recipe version</w:t>
+            </w:r>
+          </w:p>
+        </w:tc>
       </w:tr>
       <w:tr>
         <w:tc>
@@ -7869,7 +7984,16 @@
             <w:tcW w:w="616" w:type="dxa"/>
           </w:tcPr>
           <w:p>
-            <w:r>
+            <w:pPr>
+              <w:spacing w:line="360" w:lineRule="auto"/>
+              <w:rPr>
+                <w:rFonts w:ascii="Times New Roman" w:hAnsi="Times New Roman" w:cs="Times New Roman"/>
+              </w:rPr>
+            </w:pPr>
+            <w:r>
+              <w:rPr>
+                <w:rFonts w:ascii="Times New Roman" w:hAnsi="Times New Roman" w:cs="Times New Roman"/>
+              </w:rPr>
               <w:lastRenderedPageBreak/>
               <w:t>FR2</w:t>
             </w:r>
@@ -7880,7 +8004,16 @@
             <w:tcW w:w="3017" w:type="dxa"/>
           </w:tcPr>
           <w:p>
-            <w:r>
+            <w:pPr>
+              <w:spacing w:line="360" w:lineRule="auto"/>
+              <w:rPr>
+                <w:rFonts w:ascii="Times New Roman" w:hAnsi="Times New Roman" w:cs="Times New Roman"/>
+              </w:rPr>
+            </w:pPr>
+            <w:r>
+              <w:rPr>
+                <w:rFonts w:ascii="Times New Roman" w:hAnsi="Times New Roman" w:cs="Times New Roman"/>
+              </w:rPr>
               <w:t>The system shall provide current ingredient availability information for production planning</w:t>
             </w:r>
           </w:p>
@@ -7890,7 +8023,16 @@
             <w:tcW w:w="2575" w:type="dxa"/>
           </w:tcPr>
           <w:p>
-            <w:r>
+            <w:pPr>
+              <w:spacing w:line="360" w:lineRule="auto"/>
+              <w:rPr>
+                <w:rFonts w:ascii="Times New Roman" w:hAnsi="Times New Roman" w:cs="Times New Roman"/>
+              </w:rPr>
+            </w:pPr>
+            <w:r>
+              <w:rPr>
+                <w:rFonts w:ascii="Times New Roman" w:hAnsi="Times New Roman" w:cs="Times New Roman"/>
+              </w:rPr>
               <w:t>Ingredient stock may be available, reserved, opened or unsuitable for a planned production batch</w:t>
             </w:r>
           </w:p>
@@ -7900,7 +8042,16 @@
             <w:tcW w:w="807" w:type="dxa"/>
           </w:tcPr>
           <w:p>
-            <w:r>
+            <w:pPr>
+              <w:spacing w:line="360" w:lineRule="auto"/>
+              <w:rPr>
+                <w:rFonts w:ascii="Times New Roman" w:hAnsi="Times New Roman" w:cs="Times New Roman"/>
+              </w:rPr>
+            </w:pPr>
+            <w:r>
+              <w:rPr>
+                <w:rFonts w:ascii="Times New Roman" w:hAnsi="Times New Roman" w:cs="Times New Roman"/>
+              </w:rPr>
               <w:t>Must have</w:t>
             </w:r>
           </w:p>
@@ -7910,7 +8061,16 @@
             <w:tcW w:w="2335" w:type="dxa"/>
           </w:tcPr>
           <w:p>
-            <w:r>
+            <w:pPr>
+              <w:spacing w:line="360" w:lineRule="auto"/>
+              <w:rPr>
+                <w:rFonts w:ascii="Times New Roman" w:hAnsi="Times New Roman" w:cs="Times New Roman"/>
+              </w:rPr>
+            </w:pPr>
+            <w:r>
+              <w:rPr>
+                <w:rFonts w:ascii="Times New Roman" w:hAnsi="Times New Roman" w:cs="Times New Roman"/>
+              </w:rPr>
               <w:t>Verify that current ingredient availability information can be viewed for production planning</w:t>
             </w:r>
           </w:p>
@@ -7922,7 +8082,16 @@
             <w:tcW w:w="616" w:type="dxa"/>
           </w:tcPr>
           <w:p>
-            <w:r>
+            <w:pPr>
+              <w:spacing w:line="360" w:lineRule="auto"/>
+              <w:rPr>
+                <w:rFonts w:ascii="Times New Roman" w:hAnsi="Times New Roman" w:cs="Times New Roman"/>
+              </w:rPr>
+            </w:pPr>
+            <w:r>
+              <w:rPr>
+                <w:rFonts w:ascii="Times New Roman" w:hAnsi="Times New Roman" w:cs="Times New Roman"/>
+              </w:rPr>
               <w:t>FR3</w:t>
             </w:r>
           </w:p>
@@ -7932,25 +8101,52 @@
             <w:tcW w:w="3017" w:type="dxa"/>
           </w:tcPr>
           <w:p>
-            <w:r>
+            <w:pPr>
+              <w:spacing w:line="360" w:lineRule="auto"/>
+              <w:rPr>
+                <w:rFonts w:ascii="Times New Roman" w:hAnsi="Times New Roman" w:cs="Times New Roman"/>
+              </w:rPr>
+            </w:pPr>
+            <w:r>
+              <w:rPr>
+                <w:rFonts w:ascii="Times New Roman" w:hAnsi="Times New Roman" w:cs="Times New Roman"/>
+              </w:rPr>
               <w:t>The system shall maintain a production batch record including the recipe version used, ingredient batche</w:t>
             </w:r>
             <w:r>
+              <w:rPr>
+                <w:rFonts w:ascii="Times New Roman" w:hAnsi="Times New Roman" w:cs="Times New Roman"/>
+              </w:rPr>
               <w:t>s</w:t>
             </w:r>
             <w:r>
+              <w:rPr>
+                <w:rFonts w:ascii="Times New Roman" w:hAnsi="Times New Roman" w:cs="Times New Roman"/>
+              </w:rPr>
               <w:t>, actual qua</w:t>
             </w:r>
             <w:r>
+              <w:rPr>
+                <w:rFonts w:ascii="Times New Roman" w:hAnsi="Times New Roman" w:cs="Times New Roman"/>
+              </w:rPr>
               <w:t>n</w:t>
             </w:r>
             <w:r>
+              <w:rPr>
+                <w:rFonts w:ascii="Times New Roman" w:hAnsi="Times New Roman" w:cs="Times New Roman"/>
+              </w:rPr>
               <w:t>ti</w:t>
             </w:r>
             <w:r>
+              <w:rPr>
+                <w:rFonts w:ascii="Times New Roman" w:hAnsi="Times New Roman" w:cs="Times New Roman"/>
+              </w:rPr>
               <w:t>ti</w:t>
             </w:r>
             <w:r>
+              <w:rPr>
+                <w:rFonts w:ascii="Times New Roman" w:hAnsi="Times New Roman" w:cs="Times New Roman"/>
+              </w:rPr>
               <w:t>es, production time, actual yield and production observations</w:t>
             </w:r>
           </w:p>
@@ -7960,7 +8156,16 @@
             <w:tcW w:w="2575" w:type="dxa"/>
           </w:tcPr>
           <w:p>
-            <w:r>
+            <w:pPr>
+              <w:spacing w:line="360" w:lineRule="auto"/>
+              <w:rPr>
+                <w:rFonts w:ascii="Times New Roman" w:hAnsi="Times New Roman" w:cs="Times New Roman"/>
+              </w:rPr>
+            </w:pPr>
+            <w:r>
+              <w:rPr>
+                <w:rFonts w:ascii="Times New Roman" w:hAnsi="Times New Roman" w:cs="Times New Roman"/>
+              </w:rPr>
               <w:t>Production staff need to record the actual production information for each batch</w:t>
             </w:r>
           </w:p>
@@ -7970,7 +8175,16 @@
             <w:tcW w:w="807" w:type="dxa"/>
           </w:tcPr>
           <w:p>
-            <w:r>
+            <w:pPr>
+              <w:spacing w:line="360" w:lineRule="auto"/>
+              <w:rPr>
+                <w:rFonts w:ascii="Times New Roman" w:hAnsi="Times New Roman" w:cs="Times New Roman"/>
+              </w:rPr>
+            </w:pPr>
+            <w:r>
+              <w:rPr>
+                <w:rFonts w:ascii="Times New Roman" w:hAnsi="Times New Roman" w:cs="Times New Roman"/>
+              </w:rPr>
               <w:t>Must have</w:t>
             </w:r>
           </w:p>
@@ -7980,7 +8194,16 @@
             <w:tcW w:w="2335" w:type="dxa"/>
           </w:tcPr>
           <w:p>
-            <w:r>
+            <w:pPr>
+              <w:spacing w:line="360" w:lineRule="auto"/>
+              <w:rPr>
+                <w:rFonts w:ascii="Times New Roman" w:hAnsi="Times New Roman" w:cs="Times New Roman"/>
+              </w:rPr>
+            </w:pPr>
+            <w:r>
+              <w:rPr>
+                <w:rFonts w:ascii="Times New Roman" w:hAnsi="Times New Roman" w:cs="Times New Roman"/>
+              </w:rPr>
               <w:t>Verify that the recipe version, ingredient batches, actual quantities, production time, actual yield and production observations can be recorder for a production batch</w:t>
             </w:r>
           </w:p>
@@ -7992,7 +8215,16 @@
             <w:tcW w:w="616" w:type="dxa"/>
           </w:tcPr>
           <w:p>
-            <w:r>
+            <w:pPr>
+              <w:spacing w:line="360" w:lineRule="auto"/>
+              <w:rPr>
+                <w:rFonts w:ascii="Times New Roman" w:hAnsi="Times New Roman" w:cs="Times New Roman"/>
+              </w:rPr>
+            </w:pPr>
+            <w:r>
+              <w:rPr>
+                <w:rFonts w:ascii="Times New Roman" w:hAnsi="Times New Roman" w:cs="Times New Roman"/>
+              </w:rPr>
               <w:t>FR4</w:t>
             </w:r>
           </w:p>
@@ -8002,10 +8234,22 @@
             <w:tcW w:w="3017" w:type="dxa"/>
           </w:tcPr>
           <w:p>
-            <w:r>
+            <w:pPr>
+              <w:spacing w:line="360" w:lineRule="auto"/>
+              <w:rPr>
+                <w:rFonts w:ascii="Times New Roman" w:hAnsi="Times New Roman" w:cs="Times New Roman"/>
+              </w:rPr>
+            </w:pPr>
+            <w:r>
+              <w:rPr>
+                <w:rFonts w:ascii="Times New Roman" w:hAnsi="Times New Roman" w:cs="Times New Roman"/>
+              </w:rPr>
               <w:t xml:space="preserve">The system shall </w:t>
             </w:r>
             <w:r>
+              <w:rPr>
+                <w:rFonts w:ascii="Times New Roman" w:hAnsi="Times New Roman" w:cs="Times New Roman"/>
+              </w:rPr>
               <w:t>record quality – check results and the release status of each production batch</w:t>
             </w:r>
           </w:p>
@@ -8015,14 +8259,17 @@
             <w:tcW w:w="2575" w:type="dxa"/>
           </w:tcPr>
           <w:p>
-            <w:r>
-              <w:t xml:space="preserve">Quality – check results and </w:t>
-            </w:r>
-            <w:r>
-              <w:t xml:space="preserve">production </w:t>
-            </w:r>
-            <w:r>
-              <w:t>output status need to be recorded before release</w:t>
+            <w:pPr>
+              <w:spacing w:line="360" w:lineRule="auto"/>
+              <w:rPr>
+                <w:rFonts w:ascii="Times New Roman" w:hAnsi="Times New Roman" w:cs="Times New Roman"/>
+              </w:rPr>
+            </w:pPr>
+            <w:r>
+              <w:rPr>
+                <w:rFonts w:ascii="Times New Roman" w:hAnsi="Times New Roman" w:cs="Times New Roman"/>
+              </w:rPr>
+              <w:t>Quality – check results and production output status need to be recorded before release</w:t>
             </w:r>
           </w:p>
         </w:tc>
@@ -8031,7 +8278,16 @@
             <w:tcW w:w="807" w:type="dxa"/>
           </w:tcPr>
           <w:p>
-            <w:r>
+            <w:pPr>
+              <w:spacing w:line="360" w:lineRule="auto"/>
+              <w:rPr>
+                <w:rFonts w:ascii="Times New Roman" w:hAnsi="Times New Roman" w:cs="Times New Roman"/>
+              </w:rPr>
+            </w:pPr>
+            <w:r>
+              <w:rPr>
+                <w:rFonts w:ascii="Times New Roman" w:hAnsi="Times New Roman" w:cs="Times New Roman"/>
+              </w:rPr>
               <w:t>Must have</w:t>
             </w:r>
           </w:p>
@@ -8041,7 +8297,16 @@
             <w:tcW w:w="2335" w:type="dxa"/>
           </w:tcPr>
           <w:p>
-            <w:r>
+            <w:pPr>
+              <w:spacing w:line="360" w:lineRule="auto"/>
+              <w:rPr>
+                <w:rFonts w:ascii="Times New Roman" w:hAnsi="Times New Roman" w:cs="Times New Roman"/>
+              </w:rPr>
+            </w:pPr>
+            <w:r>
+              <w:rPr>
+                <w:rFonts w:ascii="Times New Roman" w:hAnsi="Times New Roman" w:cs="Times New Roman"/>
+              </w:rPr>
               <w:t>Verify that quality – check results and release status can be recorded for each production batch</w:t>
             </w:r>
           </w:p>
@@ -8053,7 +8318,16 @@
             <w:tcW w:w="616" w:type="dxa"/>
           </w:tcPr>
           <w:p>
-            <w:r>
+            <w:pPr>
+              <w:spacing w:line="360" w:lineRule="auto"/>
+              <w:rPr>
+                <w:rFonts w:ascii="Times New Roman" w:hAnsi="Times New Roman" w:cs="Times New Roman"/>
+              </w:rPr>
+            </w:pPr>
+            <w:r>
+              <w:rPr>
+                <w:rFonts w:ascii="Times New Roman" w:hAnsi="Times New Roman" w:cs="Times New Roman"/>
+              </w:rPr>
               <w:t>FR5</w:t>
             </w:r>
           </w:p>
@@ -8063,10 +8337,22 @@
             <w:tcW w:w="3017" w:type="dxa"/>
           </w:tcPr>
           <w:p>
-            <w:r>
+            <w:pPr>
+              <w:spacing w:line="360" w:lineRule="auto"/>
+              <w:rPr>
+                <w:rFonts w:ascii="Times New Roman" w:hAnsi="Times New Roman" w:cs="Times New Roman"/>
+              </w:rPr>
+            </w:pPr>
+            <w:r>
+              <w:rPr>
+                <w:rFonts w:ascii="Times New Roman" w:hAnsi="Times New Roman" w:cs="Times New Roman"/>
+              </w:rPr>
               <w:t xml:space="preserve">The system shall </w:t>
             </w:r>
             <w:r>
+              <w:rPr>
+                <w:rFonts w:ascii="Times New Roman" w:hAnsi="Times New Roman" w:cs="Times New Roman"/>
+              </w:rPr>
               <w:t>maintain the relationship between customer orders and the production batches used to fulfil them</w:t>
             </w:r>
           </w:p>
@@ -8076,7 +8362,16 @@
             <w:tcW w:w="2575" w:type="dxa"/>
           </w:tcPr>
           <w:p>
-            <w:r>
+            <w:pPr>
+              <w:spacing w:line="360" w:lineRule="auto"/>
+              <w:rPr>
+                <w:rFonts w:ascii="Times New Roman" w:hAnsi="Times New Roman" w:cs="Times New Roman"/>
+              </w:rPr>
+            </w:pPr>
+            <w:r>
+              <w:rPr>
+                <w:rFonts w:ascii="Times New Roman" w:hAnsi="Times New Roman" w:cs="Times New Roman"/>
+              </w:rPr>
               <w:t>One customer order may be supplied from multiple production batches, while one production batch may supply multiple customer orders</w:t>
             </w:r>
           </w:p>
@@ -8086,7 +8381,16 @@
             <w:tcW w:w="807" w:type="dxa"/>
           </w:tcPr>
           <w:p>
-            <w:r>
+            <w:pPr>
+              <w:spacing w:line="360" w:lineRule="auto"/>
+              <w:rPr>
+                <w:rFonts w:ascii="Times New Roman" w:hAnsi="Times New Roman" w:cs="Times New Roman"/>
+              </w:rPr>
+            </w:pPr>
+            <w:r>
+              <w:rPr>
+                <w:rFonts w:ascii="Times New Roman" w:hAnsi="Times New Roman" w:cs="Times New Roman"/>
+              </w:rPr>
               <w:t>Must have</w:t>
             </w:r>
           </w:p>
@@ -8096,11 +8400,30 @@
             <w:tcW w:w="2335" w:type="dxa"/>
           </w:tcPr>
           <w:p>
-            <w:r>
+            <w:pPr>
+              <w:spacing w:line="360" w:lineRule="auto"/>
+              <w:rPr>
+                <w:rFonts w:ascii="Times New Roman" w:hAnsi="Times New Roman" w:cs="Times New Roman"/>
+              </w:rPr>
+            </w:pPr>
+            <w:r>
+              <w:rPr>
+                <w:rFonts w:ascii="Times New Roman" w:hAnsi="Times New Roman" w:cs="Times New Roman"/>
+              </w:rPr>
               <w:t xml:space="preserve">Verify that </w:t>
             </w:r>
             <w:r>
-              <w:t>a customer order can be associated with multiple production batches and that a production batch can be associated with multiple customer orders</w:t>
+              <w:rPr>
+                <w:rFonts w:ascii="Times New Roman" w:hAnsi="Times New Roman" w:cs="Times New Roman"/>
+              </w:rPr>
+              <w:t xml:space="preserve">a customer order can be associated with multiple production batches and that a production batch can be associated with </w:t>
+            </w:r>
+            <w:r>
+              <w:rPr>
+                <w:rFonts w:ascii="Times New Roman" w:hAnsi="Times New Roman" w:cs="Times New Roman"/>
+              </w:rPr>
+              <w:lastRenderedPageBreak/>
+              <w:t>multiple customer orders</w:t>
             </w:r>
           </w:p>
         </w:tc>
@@ -8111,7 +8434,17 @@
             <w:tcW w:w="616" w:type="dxa"/>
           </w:tcPr>
           <w:p>
-            <w:r>
+            <w:pPr>
+              <w:spacing w:line="360" w:lineRule="auto"/>
+              <w:rPr>
+                <w:rFonts w:ascii="Times New Roman" w:hAnsi="Times New Roman" w:cs="Times New Roman"/>
+              </w:rPr>
+            </w:pPr>
+            <w:r>
+              <w:rPr>
+                <w:rFonts w:ascii="Times New Roman" w:hAnsi="Times New Roman" w:cs="Times New Roman"/>
+              </w:rPr>
+              <w:lastRenderedPageBreak/>
               <w:t>FR6</w:t>
             </w:r>
           </w:p>
@@ -8121,10 +8454,22 @@
             <w:tcW w:w="3017" w:type="dxa"/>
           </w:tcPr>
           <w:p>
-            <w:r>
+            <w:pPr>
+              <w:spacing w:line="360" w:lineRule="auto"/>
+              <w:rPr>
+                <w:rFonts w:ascii="Times New Roman" w:hAnsi="Times New Roman" w:cs="Times New Roman"/>
+              </w:rPr>
+            </w:pPr>
+            <w:r>
+              <w:rPr>
+                <w:rFonts w:ascii="Times New Roman" w:hAnsi="Times New Roman" w:cs="Times New Roman"/>
+              </w:rPr>
               <w:t xml:space="preserve">The system shall provide information </w:t>
             </w:r>
             <w:r>
+              <w:rPr>
+                <w:rFonts w:ascii="Times New Roman" w:hAnsi="Times New Roman" w:cs="Times New Roman"/>
+              </w:rPr>
               <w:t>required to plan production batches</w:t>
             </w:r>
           </w:p>
@@ -8134,21 +8479,35 @@
             <w:tcW w:w="2575" w:type="dxa"/>
           </w:tcPr>
           <w:p>
-            <w:r>
+            <w:pPr>
+              <w:spacing w:line="360" w:lineRule="auto"/>
+              <w:rPr>
+                <w:rFonts w:ascii="Times New Roman" w:hAnsi="Times New Roman" w:cs="Times New Roman"/>
+              </w:rPr>
+            </w:pPr>
+            <w:r>
+              <w:rPr>
+                <w:rFonts w:ascii="Times New Roman" w:hAnsi="Times New Roman" w:cs="Times New Roman"/>
+              </w:rPr>
               <w:t xml:space="preserve">Production </w:t>
             </w:r>
             <w:r>
+              <w:rPr>
+                <w:rFonts w:ascii="Times New Roman" w:hAnsi="Times New Roman" w:cs="Times New Roman"/>
+              </w:rPr>
               <w:t xml:space="preserve">planning must consider orders, ingredient availability, </w:t>
             </w:r>
             <w:r>
+              <w:rPr>
+                <w:rFonts w:ascii="Times New Roman" w:hAnsi="Times New Roman" w:cs="Times New Roman"/>
+              </w:rPr>
               <w:t xml:space="preserve">kitchen capacity, equipment availability, staff skills, </w:t>
             </w:r>
             <w:r>
-              <w:t xml:space="preserve">preparation time, cooling and </w:t>
-            </w:r>
-            <w:r>
-              <w:lastRenderedPageBreak/>
-              <w:t xml:space="preserve">packing requirements </w:t>
+              <w:rPr>
+                <w:rFonts w:ascii="Times New Roman" w:hAnsi="Times New Roman" w:cs="Times New Roman"/>
+              </w:rPr>
+              <w:t xml:space="preserve">preparation time, cooling and packing requirements </w:t>
             </w:r>
           </w:p>
         </w:tc>
@@ -8157,8 +8516,16 @@
             <w:tcW w:w="807" w:type="dxa"/>
           </w:tcPr>
           <w:p>
-            <w:r>
-              <w:lastRenderedPageBreak/>
+            <w:pPr>
+              <w:spacing w:line="360" w:lineRule="auto"/>
+              <w:rPr>
+                <w:rFonts w:ascii="Times New Roman" w:hAnsi="Times New Roman" w:cs="Times New Roman"/>
+              </w:rPr>
+            </w:pPr>
+            <w:r>
+              <w:rPr>
+                <w:rFonts w:ascii="Times New Roman" w:hAnsi="Times New Roman" w:cs="Times New Roman"/>
+              </w:rPr>
               <w:t>Must have</w:t>
             </w:r>
           </w:p>
@@ -8168,7 +8535,16 @@
             <w:tcW w:w="2335" w:type="dxa"/>
           </w:tcPr>
           <w:p>
-            <w:r>
+            <w:pPr>
+              <w:spacing w:line="360" w:lineRule="auto"/>
+              <w:rPr>
+                <w:rFonts w:ascii="Times New Roman" w:hAnsi="Times New Roman" w:cs="Times New Roman"/>
+              </w:rPr>
+            </w:pPr>
+            <w:r>
+              <w:rPr>
+                <w:rFonts w:ascii="Times New Roman" w:hAnsi="Times New Roman" w:cs="Times New Roman"/>
+              </w:rPr>
               <w:t>Verify that the information required for production planning can be accessed when planning a production batch</w:t>
             </w:r>
           </w:p>
@@ -8180,7 +8556,16 @@
             <w:tcW w:w="616" w:type="dxa"/>
           </w:tcPr>
           <w:p>
-            <w:r>
+            <w:pPr>
+              <w:spacing w:line="360" w:lineRule="auto"/>
+              <w:rPr>
+                <w:rFonts w:ascii="Times New Roman" w:hAnsi="Times New Roman" w:cs="Times New Roman"/>
+              </w:rPr>
+            </w:pPr>
+            <w:r>
+              <w:rPr>
+                <w:rFonts w:ascii="Times New Roman" w:hAnsi="Times New Roman" w:cs="Times New Roman"/>
+              </w:rPr>
               <w:t>FR7</w:t>
             </w:r>
           </w:p>
@@ -8190,7 +8575,16 @@
             <w:tcW w:w="3017" w:type="dxa"/>
           </w:tcPr>
           <w:p>
-            <w:r>
+            <w:pPr>
+              <w:spacing w:line="360" w:lineRule="auto"/>
+              <w:rPr>
+                <w:rFonts w:ascii="Times New Roman" w:hAnsi="Times New Roman" w:cs="Times New Roman"/>
+              </w:rPr>
+            </w:pPr>
+            <w:r>
+              <w:rPr>
+                <w:rFonts w:ascii="Times New Roman" w:hAnsi="Times New Roman" w:cs="Times New Roman"/>
+              </w:rPr>
               <w:t>The system shall record ingredient substitutions associated with a production batch</w:t>
             </w:r>
           </w:p>
@@ -8200,7 +8594,16 @@
             <w:tcW w:w="2575" w:type="dxa"/>
           </w:tcPr>
           <w:p>
-            <w:r>
+            <w:pPr>
+              <w:spacing w:line="360" w:lineRule="auto"/>
+              <w:rPr>
+                <w:rFonts w:ascii="Times New Roman" w:hAnsi="Times New Roman" w:cs="Times New Roman"/>
+              </w:rPr>
+            </w:pPr>
+            <w:r>
+              <w:rPr>
+                <w:rFonts w:ascii="Times New Roman" w:hAnsi="Times New Roman" w:cs="Times New Roman"/>
+              </w:rPr>
               <w:t>Ingredient substitutions require review because they may affect allergen information, production quality and labelling</w:t>
             </w:r>
           </w:p>
@@ -8210,7 +8613,16 @@
             <w:tcW w:w="807" w:type="dxa"/>
           </w:tcPr>
           <w:p>
-            <w:r>
+            <w:pPr>
+              <w:spacing w:line="360" w:lineRule="auto"/>
+              <w:rPr>
+                <w:rFonts w:ascii="Times New Roman" w:hAnsi="Times New Roman" w:cs="Times New Roman"/>
+              </w:rPr>
+            </w:pPr>
+            <w:r>
+              <w:rPr>
+                <w:rFonts w:ascii="Times New Roman" w:hAnsi="Times New Roman" w:cs="Times New Roman"/>
+              </w:rPr>
               <w:t>Should have</w:t>
             </w:r>
           </w:p>
@@ -8220,7 +8632,16 @@
             <w:tcW w:w="2335" w:type="dxa"/>
           </w:tcPr>
           <w:p>
-            <w:r>
+            <w:pPr>
+              <w:spacing w:line="360" w:lineRule="auto"/>
+              <w:rPr>
+                <w:rFonts w:ascii="Times New Roman" w:hAnsi="Times New Roman" w:cs="Times New Roman"/>
+              </w:rPr>
+            </w:pPr>
+            <w:r>
+              <w:rPr>
+                <w:rFonts w:ascii="Times New Roman" w:hAnsi="Times New Roman" w:cs="Times New Roman"/>
+              </w:rPr>
               <w:t>Verify that an ingredient substitution can be recorded and associated with the relevant production batch</w:t>
             </w:r>
           </w:p>
@@ -8232,7 +8653,16 @@
             <w:tcW w:w="616" w:type="dxa"/>
           </w:tcPr>
           <w:p>
-            <w:r>
+            <w:pPr>
+              <w:spacing w:line="360" w:lineRule="auto"/>
+              <w:rPr>
+                <w:rFonts w:ascii="Times New Roman" w:hAnsi="Times New Roman" w:cs="Times New Roman"/>
+              </w:rPr>
+            </w:pPr>
+            <w:r>
+              <w:rPr>
+                <w:rFonts w:ascii="Times New Roman" w:hAnsi="Times New Roman" w:cs="Times New Roman"/>
+              </w:rPr>
               <w:t>FR8</w:t>
             </w:r>
           </w:p>
@@ -8242,7 +8672,16 @@
             <w:tcW w:w="3017" w:type="dxa"/>
           </w:tcPr>
           <w:p>
-            <w:r>
+            <w:pPr>
+              <w:spacing w:line="360" w:lineRule="auto"/>
+              <w:rPr>
+                <w:rFonts w:ascii="Times New Roman" w:hAnsi="Times New Roman" w:cs="Times New Roman"/>
+              </w:rPr>
+            </w:pPr>
+            <w:r>
+              <w:rPr>
+                <w:rFonts w:ascii="Times New Roman" w:hAnsi="Times New Roman" w:cs="Times New Roman"/>
+              </w:rPr>
               <w:t>The system shall provide traceability from ingredient batches through production batches to affected customer orders</w:t>
             </w:r>
           </w:p>
@@ -8252,7 +8691,16 @@
             <w:tcW w:w="2575" w:type="dxa"/>
           </w:tcPr>
           <w:p>
-            <w:r>
+            <w:pPr>
+              <w:spacing w:line="360" w:lineRule="auto"/>
+              <w:rPr>
+                <w:rFonts w:ascii="Times New Roman" w:hAnsi="Times New Roman" w:cs="Times New Roman"/>
+              </w:rPr>
+            </w:pPr>
+            <w:r>
+              <w:rPr>
+                <w:rFonts w:ascii="Times New Roman" w:hAnsi="Times New Roman" w:cs="Times New Roman"/>
+              </w:rPr>
               <w:t>Staff need to identify the ingredient batches, production batches and customer orders affected when an error is found</w:t>
             </w:r>
           </w:p>
@@ -8262,7 +8710,16 @@
             <w:tcW w:w="807" w:type="dxa"/>
           </w:tcPr>
           <w:p>
-            <w:r>
+            <w:pPr>
+              <w:spacing w:line="360" w:lineRule="auto"/>
+              <w:rPr>
+                <w:rFonts w:ascii="Times New Roman" w:hAnsi="Times New Roman" w:cs="Times New Roman"/>
+              </w:rPr>
+            </w:pPr>
+            <w:r>
+              <w:rPr>
+                <w:rFonts w:ascii="Times New Roman" w:hAnsi="Times New Roman" w:cs="Times New Roman"/>
+              </w:rPr>
               <w:t>Must have</w:t>
             </w:r>
           </w:p>
@@ -8272,7 +8729,16 @@
             <w:tcW w:w="2335" w:type="dxa"/>
           </w:tcPr>
           <w:p>
-            <w:r>
+            <w:pPr>
+              <w:spacing w:line="360" w:lineRule="auto"/>
+              <w:rPr>
+                <w:rFonts w:ascii="Times New Roman" w:hAnsi="Times New Roman" w:cs="Times New Roman"/>
+              </w:rPr>
+            </w:pPr>
+            <w:r>
+              <w:rPr>
+                <w:rFonts w:ascii="Times New Roman" w:hAnsi="Times New Roman" w:cs="Times New Roman"/>
+              </w:rPr>
               <w:t>Verify that an ingredient batch can be traced through the relevant production batch to the affected customer orders</w:t>
             </w:r>
           </w:p>
@@ -8280,7 +8746,607 @@
       </w:tr>
     </w:tbl>
     <w:p/>
-    <w:p/>
+    <w:p>
+      <w:pPr>
+        <w:pStyle w:val="Heading2"/>
+        <w:spacing w:line="360" w:lineRule="auto"/>
+        <w:rPr>
+          <w:rFonts w:ascii="Times New Roman" w:hAnsi="Times New Roman" w:cs="Times New Roman"/>
+          <w:color w:val="auto"/>
+          <w:sz w:val="24"/>
+          <w:szCs w:val="24"/>
+        </w:rPr>
+      </w:pPr>
+      <w:r>
+        <w:rPr>
+          <w:rFonts w:ascii="Times New Roman" w:hAnsi="Times New Roman" w:cs="Times New Roman"/>
+          <w:color w:val="auto"/>
+          <w:sz w:val="24"/>
+          <w:szCs w:val="24"/>
+        </w:rPr>
+        <w:t>4.2 Non – Functional Requirements</w:t>
+      </w:r>
+    </w:p>
+    <w:tbl>
+      <w:tblPr>
+        <w:tblStyle w:val="TableGrid"/>
+        <w:tblW w:w="0" w:type="auto"/>
+        <w:tblLook w:val="04A0" w:firstRow="1" w:lastRow="0" w:firstColumn="1" w:lastColumn="0" w:noHBand="0" w:noVBand="1"/>
+      </w:tblPr>
+      <w:tblGrid>
+        <w:gridCol w:w="803"/>
+        <w:gridCol w:w="1551"/>
+        <w:gridCol w:w="2106"/>
+        <w:gridCol w:w="2536"/>
+        <w:gridCol w:w="2354"/>
+      </w:tblGrid>
+      <w:tr>
+        <w:tc>
+          <w:tcPr>
+            <w:tcW w:w="786" w:type="dxa"/>
+          </w:tcPr>
+          <w:p>
+            <w:pPr>
+              <w:spacing w:line="360" w:lineRule="auto"/>
+              <w:rPr>
+                <w:rFonts w:ascii="Times New Roman" w:hAnsi="Times New Roman" w:cs="Times New Roman"/>
+              </w:rPr>
+            </w:pPr>
+            <w:r>
+              <w:rPr>
+                <w:rFonts w:ascii="Times New Roman" w:hAnsi="Times New Roman" w:cs="Times New Roman"/>
+              </w:rPr>
+              <w:t>ID</w:t>
+            </w:r>
+          </w:p>
+        </w:tc>
+        <w:tc>
+          <w:tcPr>
+            <w:tcW w:w="1552" w:type="dxa"/>
+          </w:tcPr>
+          <w:p>
+            <w:pPr>
+              <w:spacing w:line="360" w:lineRule="auto"/>
+              <w:rPr>
+                <w:rFonts w:ascii="Times New Roman" w:hAnsi="Times New Roman" w:cs="Times New Roman"/>
+              </w:rPr>
+            </w:pPr>
+            <w:r>
+              <w:rPr>
+                <w:rFonts w:ascii="Times New Roman" w:hAnsi="Times New Roman" w:cs="Times New Roman"/>
+              </w:rPr>
+              <w:t>Category</w:t>
+            </w:r>
+          </w:p>
+        </w:tc>
+        <w:tc>
+          <w:tcPr>
+            <w:tcW w:w="2110" w:type="dxa"/>
+          </w:tcPr>
+          <w:p>
+            <w:pPr>
+              <w:spacing w:line="360" w:lineRule="auto"/>
+              <w:rPr>
+                <w:rFonts w:ascii="Times New Roman" w:hAnsi="Times New Roman" w:cs="Times New Roman"/>
+              </w:rPr>
+            </w:pPr>
+            <w:r>
+              <w:rPr>
+                <w:rFonts w:ascii="Times New Roman" w:hAnsi="Times New Roman" w:cs="Times New Roman"/>
+              </w:rPr>
+              <w:t>Non – Functional Requirement</w:t>
+            </w:r>
+          </w:p>
+        </w:tc>
+        <w:tc>
+          <w:tcPr>
+            <w:tcW w:w="2542" w:type="dxa"/>
+          </w:tcPr>
+          <w:p>
+            <w:pPr>
+              <w:spacing w:line="360" w:lineRule="auto"/>
+              <w:rPr>
+                <w:rFonts w:ascii="Times New Roman" w:hAnsi="Times New Roman" w:cs="Times New Roman"/>
+              </w:rPr>
+            </w:pPr>
+            <w:r>
+              <w:rPr>
+                <w:rFonts w:ascii="Times New Roman" w:hAnsi="Times New Roman" w:cs="Times New Roman"/>
+              </w:rPr>
+              <w:t>Rationale</w:t>
+            </w:r>
+          </w:p>
+        </w:tc>
+        <w:tc>
+          <w:tcPr>
+            <w:tcW w:w="2360" w:type="dxa"/>
+          </w:tcPr>
+          <w:p>
+            <w:pPr>
+              <w:spacing w:line="360" w:lineRule="auto"/>
+              <w:rPr>
+                <w:rFonts w:ascii="Times New Roman" w:hAnsi="Times New Roman" w:cs="Times New Roman"/>
+              </w:rPr>
+            </w:pPr>
+            <w:r>
+              <w:rPr>
+                <w:rFonts w:ascii="Times New Roman" w:hAnsi="Times New Roman" w:cs="Times New Roman"/>
+              </w:rPr>
+              <w:t>Verification</w:t>
+            </w:r>
+          </w:p>
+        </w:tc>
+      </w:tr>
+      <w:tr>
+        <w:tc>
+          <w:tcPr>
+            <w:tcW w:w="786" w:type="dxa"/>
+          </w:tcPr>
+          <w:p>
+            <w:pPr>
+              <w:spacing w:line="360" w:lineRule="auto"/>
+              <w:rPr>
+                <w:rFonts w:ascii="Times New Roman" w:hAnsi="Times New Roman" w:cs="Times New Roman"/>
+              </w:rPr>
+            </w:pPr>
+            <w:r>
+              <w:rPr>
+                <w:rFonts w:ascii="Times New Roman" w:hAnsi="Times New Roman" w:cs="Times New Roman"/>
+              </w:rPr>
+              <w:t>NFR1</w:t>
+            </w:r>
+          </w:p>
+        </w:tc>
+        <w:tc>
+          <w:tcPr>
+            <w:tcW w:w="1552" w:type="dxa"/>
+          </w:tcPr>
+          <w:p>
+            <w:pPr>
+              <w:spacing w:line="360" w:lineRule="auto"/>
+              <w:rPr>
+                <w:rFonts w:ascii="Times New Roman" w:hAnsi="Times New Roman" w:cs="Times New Roman"/>
+              </w:rPr>
+            </w:pPr>
+            <w:r>
+              <w:rPr>
+                <w:rFonts w:ascii="Times New Roman" w:hAnsi="Times New Roman" w:cs="Times New Roman"/>
+              </w:rPr>
+              <w:t>Data Integrity</w:t>
+            </w:r>
+          </w:p>
+        </w:tc>
+        <w:tc>
+          <w:tcPr>
+            <w:tcW w:w="2110" w:type="dxa"/>
+          </w:tcPr>
+          <w:p>
+            <w:pPr>
+              <w:spacing w:line="360" w:lineRule="auto"/>
+              <w:rPr>
+                <w:rFonts w:ascii="Times New Roman" w:hAnsi="Times New Roman" w:cs="Times New Roman"/>
+              </w:rPr>
+            </w:pPr>
+            <w:r>
+              <w:rPr>
+                <w:rFonts w:ascii="Times New Roman" w:hAnsi="Times New Roman" w:cs="Times New Roman"/>
+              </w:rPr>
+              <w:t xml:space="preserve">The system shall prevent a </w:t>
+            </w:r>
+            <w:r>
+              <w:rPr>
+                <w:rFonts w:ascii="Times New Roman" w:hAnsi="Times New Roman" w:cs="Times New Roman"/>
+              </w:rPr>
+              <w:lastRenderedPageBreak/>
+              <w:t>production batch record from being completed without an identifiable recipe version</w:t>
+            </w:r>
+          </w:p>
+        </w:tc>
+        <w:tc>
+          <w:tcPr>
+            <w:tcW w:w="2542" w:type="dxa"/>
+          </w:tcPr>
+          <w:p>
+            <w:pPr>
+              <w:spacing w:line="360" w:lineRule="auto"/>
+              <w:rPr>
+                <w:rFonts w:ascii="Times New Roman" w:hAnsi="Times New Roman" w:cs="Times New Roman"/>
+              </w:rPr>
+            </w:pPr>
+            <w:r>
+              <w:rPr>
+                <w:rFonts w:ascii="Times New Roman" w:hAnsi="Times New Roman" w:cs="Times New Roman"/>
+              </w:rPr>
+              <w:lastRenderedPageBreak/>
+              <w:t xml:space="preserve">Reliable identification of the recipe version </w:t>
+            </w:r>
+            <w:r>
+              <w:rPr>
+                <w:rFonts w:ascii="Times New Roman" w:hAnsi="Times New Roman" w:cs="Times New Roman"/>
+              </w:rPr>
+              <w:lastRenderedPageBreak/>
+              <w:t>used for each production batch is required for production records and traceability</w:t>
+            </w:r>
+          </w:p>
+        </w:tc>
+        <w:tc>
+          <w:tcPr>
+            <w:tcW w:w="2360" w:type="dxa"/>
+          </w:tcPr>
+          <w:p>
+            <w:pPr>
+              <w:spacing w:line="360" w:lineRule="auto"/>
+              <w:rPr>
+                <w:rFonts w:ascii="Times New Roman" w:hAnsi="Times New Roman" w:cs="Times New Roman"/>
+              </w:rPr>
+            </w:pPr>
+            <w:r>
+              <w:rPr>
+                <w:rFonts w:ascii="Times New Roman" w:hAnsi="Times New Roman" w:cs="Times New Roman"/>
+              </w:rPr>
+              <w:lastRenderedPageBreak/>
+              <w:t xml:space="preserve">Verify that the system does not allow a </w:t>
+            </w:r>
+            <w:r>
+              <w:rPr>
+                <w:rFonts w:ascii="Times New Roman" w:hAnsi="Times New Roman" w:cs="Times New Roman"/>
+              </w:rPr>
+              <w:lastRenderedPageBreak/>
+              <w:t>production batch record to be completed when no recipe version is identified</w:t>
+            </w:r>
+          </w:p>
+        </w:tc>
+      </w:tr>
+      <w:tr>
+        <w:tc>
+          <w:tcPr>
+            <w:tcW w:w="786" w:type="dxa"/>
+          </w:tcPr>
+          <w:p>
+            <w:pPr>
+              <w:spacing w:line="360" w:lineRule="auto"/>
+              <w:rPr>
+                <w:rFonts w:ascii="Times New Roman" w:hAnsi="Times New Roman" w:cs="Times New Roman"/>
+              </w:rPr>
+            </w:pPr>
+            <w:r>
+              <w:rPr>
+                <w:rFonts w:ascii="Times New Roman" w:hAnsi="Times New Roman" w:cs="Times New Roman"/>
+              </w:rPr>
+              <w:lastRenderedPageBreak/>
+              <w:t>NFR2</w:t>
+            </w:r>
+          </w:p>
+        </w:tc>
+        <w:tc>
+          <w:tcPr>
+            <w:tcW w:w="1552" w:type="dxa"/>
+          </w:tcPr>
+          <w:p>
+            <w:pPr>
+              <w:spacing w:line="360" w:lineRule="auto"/>
+              <w:rPr>
+                <w:rFonts w:ascii="Times New Roman" w:hAnsi="Times New Roman" w:cs="Times New Roman"/>
+              </w:rPr>
+            </w:pPr>
+            <w:r>
+              <w:rPr>
+                <w:rFonts w:ascii="Times New Roman" w:hAnsi="Times New Roman" w:cs="Times New Roman"/>
+              </w:rPr>
+              <w:t>Performance</w:t>
+            </w:r>
+          </w:p>
+        </w:tc>
+        <w:tc>
+          <w:tcPr>
+            <w:tcW w:w="2110" w:type="dxa"/>
+          </w:tcPr>
+          <w:p>
+            <w:pPr>
+              <w:spacing w:line="360" w:lineRule="auto"/>
+              <w:rPr>
+                <w:rFonts w:ascii="Times New Roman" w:hAnsi="Times New Roman" w:cs="Times New Roman"/>
+              </w:rPr>
+            </w:pPr>
+            <w:r>
+              <w:rPr>
+                <w:rFonts w:ascii="Times New Roman" w:hAnsi="Times New Roman" w:cs="Times New Roman"/>
+              </w:rPr>
+              <w:t>The system shall respond within 2 seconds when saving or displaying information</w:t>
+            </w:r>
+          </w:p>
+        </w:tc>
+        <w:tc>
+          <w:tcPr>
+            <w:tcW w:w="2542" w:type="dxa"/>
+          </w:tcPr>
+          <w:p>
+            <w:pPr>
+              <w:spacing w:line="360" w:lineRule="auto"/>
+              <w:rPr>
+                <w:rFonts w:ascii="Times New Roman" w:hAnsi="Times New Roman" w:cs="Times New Roman"/>
+              </w:rPr>
+            </w:pPr>
+            <w:r>
+              <w:rPr>
+                <w:rFonts w:ascii="Times New Roman" w:hAnsi="Times New Roman" w:cs="Times New Roman"/>
+              </w:rPr>
+              <w:t>A responsive system is required to support efficient day – to – day production activities</w:t>
+            </w:r>
+          </w:p>
+        </w:tc>
+        <w:tc>
+          <w:tcPr>
+            <w:tcW w:w="2360" w:type="dxa"/>
+          </w:tcPr>
+          <w:p>
+            <w:pPr>
+              <w:spacing w:line="360" w:lineRule="auto"/>
+              <w:rPr>
+                <w:rFonts w:ascii="Times New Roman" w:hAnsi="Times New Roman" w:cs="Times New Roman"/>
+              </w:rPr>
+            </w:pPr>
+            <w:r>
+              <w:rPr>
+                <w:rFonts w:ascii="Times New Roman" w:hAnsi="Times New Roman" w:cs="Times New Roman"/>
+              </w:rPr>
+              <w:t>Verify that saving or displaying information completes within 2 seconds under normal operating conditions</w:t>
+            </w:r>
+          </w:p>
+        </w:tc>
+      </w:tr>
+      <w:tr>
+        <w:tc>
+          <w:tcPr>
+            <w:tcW w:w="786" w:type="dxa"/>
+          </w:tcPr>
+          <w:p>
+            <w:pPr>
+              <w:spacing w:line="360" w:lineRule="auto"/>
+              <w:rPr>
+                <w:rFonts w:ascii="Times New Roman" w:hAnsi="Times New Roman" w:cs="Times New Roman"/>
+                <w:lang w:val="ru-RU"/>
+              </w:rPr>
+            </w:pPr>
+            <w:r>
+              <w:rPr>
+                <w:rFonts w:ascii="Times New Roman" w:hAnsi="Times New Roman" w:cs="Times New Roman"/>
+              </w:rPr>
+              <w:t>NFR3</w:t>
+            </w:r>
+          </w:p>
+        </w:tc>
+        <w:tc>
+          <w:tcPr>
+            <w:tcW w:w="1552" w:type="dxa"/>
+          </w:tcPr>
+          <w:p>
+            <w:pPr>
+              <w:spacing w:line="360" w:lineRule="auto"/>
+              <w:rPr>
+                <w:rFonts w:ascii="Times New Roman" w:hAnsi="Times New Roman" w:cs="Times New Roman"/>
+              </w:rPr>
+            </w:pPr>
+            <w:r>
+              <w:rPr>
+                <w:rFonts w:ascii="Times New Roman" w:hAnsi="Times New Roman" w:cs="Times New Roman"/>
+              </w:rPr>
+              <w:t>Security / Access Control</w:t>
+            </w:r>
+          </w:p>
+        </w:tc>
+        <w:tc>
+          <w:tcPr>
+            <w:tcW w:w="2110" w:type="dxa"/>
+          </w:tcPr>
+          <w:p>
+            <w:pPr>
+              <w:spacing w:line="360" w:lineRule="auto"/>
+              <w:rPr>
+                <w:rFonts w:ascii="Times New Roman" w:hAnsi="Times New Roman" w:cs="Times New Roman"/>
+              </w:rPr>
+            </w:pPr>
+            <w:r>
+              <w:rPr>
+                <w:rFonts w:ascii="Times New Roman" w:hAnsi="Times New Roman" w:cs="Times New Roman"/>
+              </w:rPr>
+              <w:t xml:space="preserve">The system shall display only information that the user is </w:t>
+            </w:r>
+            <w:proofErr w:type="spellStart"/>
+            <w:r>
+              <w:rPr>
+                <w:rFonts w:ascii="Times New Roman" w:hAnsi="Times New Roman" w:cs="Times New Roman"/>
+              </w:rPr>
+              <w:t>authorised</w:t>
+            </w:r>
+            <w:proofErr w:type="spellEnd"/>
+            <w:r>
+              <w:rPr>
+                <w:rFonts w:ascii="Times New Roman" w:hAnsi="Times New Roman" w:cs="Times New Roman"/>
+              </w:rPr>
+              <w:t xml:space="preserve"> to access</w:t>
+            </w:r>
+          </w:p>
+        </w:tc>
+        <w:tc>
+          <w:tcPr>
+            <w:tcW w:w="2542" w:type="dxa"/>
+          </w:tcPr>
+          <w:p>
+            <w:pPr>
+              <w:spacing w:line="360" w:lineRule="auto"/>
+              <w:rPr>
+                <w:rFonts w:ascii="Times New Roman" w:hAnsi="Times New Roman" w:cs="Times New Roman"/>
+              </w:rPr>
+            </w:pPr>
+            <w:r>
+              <w:rPr>
+                <w:rFonts w:ascii="Times New Roman" w:hAnsi="Times New Roman" w:cs="Times New Roman"/>
+              </w:rPr>
+              <w:t>Different roles may require different levels of access to production, supplier and customer information</w:t>
+            </w:r>
+          </w:p>
+        </w:tc>
+        <w:tc>
+          <w:tcPr>
+            <w:tcW w:w="2360" w:type="dxa"/>
+          </w:tcPr>
+          <w:p>
+            <w:pPr>
+              <w:spacing w:line="360" w:lineRule="auto"/>
+              <w:rPr>
+                <w:rFonts w:ascii="Times New Roman" w:hAnsi="Times New Roman" w:cs="Times New Roman"/>
+              </w:rPr>
+            </w:pPr>
+            <w:r>
+              <w:rPr>
+                <w:rFonts w:ascii="Times New Roman" w:hAnsi="Times New Roman" w:cs="Times New Roman"/>
+              </w:rPr>
+              <w:t xml:space="preserve">Verify that a user cannot view information that is not </w:t>
+            </w:r>
+            <w:proofErr w:type="spellStart"/>
+            <w:r>
+              <w:rPr>
+                <w:rFonts w:ascii="Times New Roman" w:hAnsi="Times New Roman" w:cs="Times New Roman"/>
+              </w:rPr>
+              <w:t>authorised</w:t>
+            </w:r>
+            <w:proofErr w:type="spellEnd"/>
+            <w:r>
+              <w:rPr>
+                <w:rFonts w:ascii="Times New Roman" w:hAnsi="Times New Roman" w:cs="Times New Roman"/>
+              </w:rPr>
+              <w:t xml:space="preserve"> for their role</w:t>
+            </w:r>
+          </w:p>
+        </w:tc>
+      </w:tr>
+      <w:tr>
+        <w:tc>
+          <w:tcPr>
+            <w:tcW w:w="786" w:type="dxa"/>
+          </w:tcPr>
+          <w:p>
+            <w:pPr>
+              <w:spacing w:line="360" w:lineRule="auto"/>
+              <w:rPr>
+                <w:rFonts w:ascii="Times New Roman" w:hAnsi="Times New Roman" w:cs="Times New Roman"/>
+              </w:rPr>
+            </w:pPr>
+            <w:r>
+              <w:rPr>
+                <w:rFonts w:ascii="Times New Roman" w:hAnsi="Times New Roman" w:cs="Times New Roman"/>
+              </w:rPr>
+              <w:t>NFR4</w:t>
+            </w:r>
+          </w:p>
+        </w:tc>
+        <w:tc>
+          <w:tcPr>
+            <w:tcW w:w="1552" w:type="dxa"/>
+          </w:tcPr>
+          <w:p>
+            <w:pPr>
+              <w:spacing w:line="360" w:lineRule="auto"/>
+              <w:rPr>
+                <w:rFonts w:ascii="Times New Roman" w:hAnsi="Times New Roman" w:cs="Times New Roman"/>
+              </w:rPr>
+            </w:pPr>
+            <w:r>
+              <w:rPr>
+                <w:rFonts w:ascii="Times New Roman" w:hAnsi="Times New Roman" w:cs="Times New Roman"/>
+              </w:rPr>
+              <w:t>Availability</w:t>
+            </w:r>
+          </w:p>
+        </w:tc>
+        <w:tc>
+          <w:tcPr>
+            <w:tcW w:w="2110" w:type="dxa"/>
+          </w:tcPr>
+          <w:p>
+            <w:pPr>
+              <w:spacing w:line="360" w:lineRule="auto"/>
+              <w:rPr>
+                <w:rFonts w:ascii="Times New Roman" w:hAnsi="Times New Roman" w:cs="Times New Roman"/>
+              </w:rPr>
+            </w:pPr>
+            <w:r>
+              <w:rPr>
+                <w:rFonts w:ascii="Times New Roman" w:hAnsi="Times New Roman" w:cs="Times New Roman"/>
+              </w:rPr>
+              <w:t>The system shall be available throughout all scheduled work shifts and during order preparation activities</w:t>
+            </w:r>
+          </w:p>
+        </w:tc>
+        <w:tc>
+          <w:tcPr>
+            <w:tcW w:w="2542" w:type="dxa"/>
+          </w:tcPr>
+          <w:p>
+            <w:pPr>
+              <w:spacing w:line="360" w:lineRule="auto"/>
+              <w:rPr>
+                <w:rFonts w:ascii="Times New Roman" w:hAnsi="Times New Roman" w:cs="Times New Roman"/>
+              </w:rPr>
+            </w:pPr>
+            <w:r>
+              <w:rPr>
+                <w:rFonts w:ascii="Times New Roman" w:hAnsi="Times New Roman" w:cs="Times New Roman"/>
+              </w:rPr>
+              <w:t>Staff require access to production, ingredients, quality and order information during operational activities</w:t>
+            </w:r>
+          </w:p>
+        </w:tc>
+        <w:tc>
+          <w:tcPr>
+            <w:tcW w:w="2360" w:type="dxa"/>
+          </w:tcPr>
+          <w:p>
+            <w:pPr>
+              <w:spacing w:line="360" w:lineRule="auto"/>
+              <w:rPr>
+                <w:rFonts w:ascii="Times New Roman" w:hAnsi="Times New Roman" w:cs="Times New Roman"/>
+              </w:rPr>
+            </w:pPr>
+            <w:r>
+              <w:rPr>
+                <w:rFonts w:ascii="Times New Roman" w:hAnsi="Times New Roman" w:cs="Times New Roman"/>
+              </w:rPr>
+              <w:t>Verify that the system is accessible throughout scheduled work shifts and during order preparation activities</w:t>
+            </w:r>
+          </w:p>
+        </w:tc>
+      </w:tr>
+    </w:tbl>
+    <w:p>
+      <w:pPr>
+        <w:spacing w:line="360" w:lineRule="auto"/>
+        <w:rPr>
+          <w:rFonts w:ascii="Times New Roman" w:hAnsi="Times New Roman" w:cs="Times New Roman"/>
+        </w:rPr>
+      </w:pPr>
+      <w:r>
+        <w:rPr>
+          <w:rFonts w:ascii="Times New Roman" w:hAnsi="Times New Roman" w:cs="Times New Roman"/>
+        </w:rPr>
+        <w:t xml:space="preserve">NFR2 and NFR4 contain provisional quality targets that require stockholder confirmation because specific performance and availability targets are not </w:t>
+      </w:r>
+      <w:proofErr w:type="gramStart"/>
+      <w:r>
+        <w:rPr>
+          <w:rFonts w:ascii="Times New Roman" w:hAnsi="Times New Roman" w:cs="Times New Roman"/>
+        </w:rPr>
+        <w:t>define</w:t>
+      </w:r>
+      <w:proofErr w:type="gramEnd"/>
+      <w:r>
+        <w:rPr>
+          <w:rFonts w:ascii="Times New Roman" w:hAnsi="Times New Roman" w:cs="Times New Roman"/>
+        </w:rPr>
+        <w:t xml:space="preserve"> in the scenario</w:t>
+      </w:r>
+    </w:p>
     <w:p>
       <w:pPr>
         <w:rPr>
@@ -8314,36 +9380,6 @@
     </w:p>
     <w:p>
       <w:pPr>
-        <w:spacing w:line="360" w:lineRule="auto"/>
-        <w:rPr>
-          <w:rFonts w:ascii="Times New Roman" w:hAnsi="Times New Roman" w:cs="Times New Roman"/>
-        </w:rPr>
-      </w:pPr>
-    </w:p>
-    <w:p>
-      <w:pPr>
-        <w:spacing w:line="360" w:lineRule="auto"/>
-        <w:rPr>
-          <w:rFonts w:ascii="Times New Roman" w:hAnsi="Times New Roman" w:cs="Times New Roman"/>
-        </w:rPr>
-      </w:pPr>
-    </w:p>
-    <w:p>
-      <w:pPr>
-        <w:spacing w:line="360" w:lineRule="auto"/>
-        <w:rPr>
-          <w:rFonts w:ascii="Times New Roman" w:hAnsi="Times New Roman" w:cs="Times New Roman"/>
-        </w:rPr>
-      </w:pPr>
-      <w:r>
-        <w:rPr>
-          <w:rFonts w:ascii="Times New Roman" w:hAnsi="Times New Roman" w:cs="Times New Roman"/>
-        </w:rPr>
-        <w:br w:type="page"/>
-      </w:r>
-    </w:p>
-    <w:p>
-      <w:pPr>
         <w:pStyle w:val="Heading1"/>
         <w:spacing w:line="360" w:lineRule="auto"/>
         <w:rPr>
@@ -8366,6 +9402,1084 @@
       </w:r>
       <w:bookmarkEnd w:id="14"/>
     </w:p>
+    <w:p>
+      <w:pPr>
+        <w:pStyle w:val="Heading2"/>
+        <w:rPr>
+          <w:rFonts w:ascii="Times New Roman" w:hAnsi="Times New Roman" w:cs="Times New Roman"/>
+          <w:color w:val="auto"/>
+          <w:sz w:val="24"/>
+          <w:szCs w:val="24"/>
+        </w:rPr>
+      </w:pPr>
+      <w:r>
+        <w:rPr>
+          <w:rFonts w:ascii="Times New Roman" w:hAnsi="Times New Roman" w:cs="Times New Roman"/>
+          <w:color w:val="auto"/>
+          <w:sz w:val="24"/>
+          <w:szCs w:val="24"/>
+        </w:rPr>
+        <w:t>5.1 Business Rules</w:t>
+      </w:r>
+    </w:p>
+    <w:tbl>
+      <w:tblPr>
+        <w:tblStyle w:val="TableGrid"/>
+        <w:tblW w:w="0" w:type="auto"/>
+        <w:tblLook w:val="04A0" w:firstRow="1" w:lastRow="0" w:firstColumn="1" w:lastColumn="0" w:noHBand="0" w:noVBand="1"/>
+      </w:tblPr>
+      <w:tblGrid>
+        <w:gridCol w:w="657"/>
+        <w:gridCol w:w="3940"/>
+        <w:gridCol w:w="4753"/>
+      </w:tblGrid>
+      <w:tr>
+        <w:tc>
+          <w:tcPr>
+            <w:tcW w:w="635" w:type="dxa"/>
+          </w:tcPr>
+          <w:p>
+            <w:pPr>
+              <w:spacing w:line="360" w:lineRule="auto"/>
+              <w:rPr>
+                <w:rFonts w:ascii="Times New Roman" w:hAnsi="Times New Roman" w:cs="Times New Roman"/>
+              </w:rPr>
+            </w:pPr>
+            <w:r>
+              <w:rPr>
+                <w:rFonts w:ascii="Times New Roman" w:hAnsi="Times New Roman" w:cs="Times New Roman"/>
+              </w:rPr>
+              <w:t>ID</w:t>
+            </w:r>
+          </w:p>
+        </w:tc>
+        <w:tc>
+          <w:tcPr>
+            <w:tcW w:w="3950" w:type="dxa"/>
+          </w:tcPr>
+          <w:p>
+            <w:pPr>
+              <w:spacing w:line="360" w:lineRule="auto"/>
+              <w:rPr>
+                <w:rFonts w:ascii="Times New Roman" w:hAnsi="Times New Roman" w:cs="Times New Roman"/>
+              </w:rPr>
+            </w:pPr>
+            <w:r>
+              <w:rPr>
+                <w:rFonts w:ascii="Times New Roman" w:hAnsi="Times New Roman" w:cs="Times New Roman"/>
+              </w:rPr>
+              <w:t>Business Rule</w:t>
+            </w:r>
+          </w:p>
+        </w:tc>
+        <w:tc>
+          <w:tcPr>
+            <w:tcW w:w="4765" w:type="dxa"/>
+          </w:tcPr>
+          <w:p>
+            <w:pPr>
+              <w:spacing w:line="360" w:lineRule="auto"/>
+              <w:rPr>
+                <w:rFonts w:ascii="Times New Roman" w:hAnsi="Times New Roman" w:cs="Times New Roman"/>
+              </w:rPr>
+            </w:pPr>
+            <w:r>
+              <w:rPr>
+                <w:rFonts w:ascii="Times New Roman" w:hAnsi="Times New Roman" w:cs="Times New Roman"/>
+              </w:rPr>
+              <w:t>Source / Rationale</w:t>
+            </w:r>
+          </w:p>
+        </w:tc>
+      </w:tr>
+      <w:tr>
+        <w:tc>
+          <w:tcPr>
+            <w:tcW w:w="635" w:type="dxa"/>
+          </w:tcPr>
+          <w:p>
+            <w:pPr>
+              <w:spacing w:line="360" w:lineRule="auto"/>
+              <w:rPr>
+                <w:rFonts w:ascii="Times New Roman" w:hAnsi="Times New Roman" w:cs="Times New Roman"/>
+              </w:rPr>
+            </w:pPr>
+            <w:r>
+              <w:rPr>
+                <w:rFonts w:ascii="Times New Roman" w:hAnsi="Times New Roman" w:cs="Times New Roman"/>
+              </w:rPr>
+              <w:t>BR1</w:t>
+            </w:r>
+          </w:p>
+        </w:tc>
+        <w:tc>
+          <w:tcPr>
+            <w:tcW w:w="3950" w:type="dxa"/>
+          </w:tcPr>
+          <w:p>
+            <w:pPr>
+              <w:spacing w:line="360" w:lineRule="auto"/>
+              <w:rPr>
+                <w:rFonts w:ascii="Times New Roman" w:hAnsi="Times New Roman" w:cs="Times New Roman"/>
+              </w:rPr>
+            </w:pPr>
+            <w:r>
+              <w:rPr>
+                <w:rFonts w:ascii="Times New Roman" w:hAnsi="Times New Roman" w:cs="Times New Roman"/>
+              </w:rPr>
+              <w:t>Each production batch must use an approved recipe version, and the version used must be identifiable</w:t>
+            </w:r>
+          </w:p>
+        </w:tc>
+        <w:tc>
+          <w:tcPr>
+            <w:tcW w:w="4765" w:type="dxa"/>
+          </w:tcPr>
+          <w:p>
+            <w:pPr>
+              <w:spacing w:line="360" w:lineRule="auto"/>
+              <w:rPr>
+                <w:rFonts w:ascii="Times New Roman" w:hAnsi="Times New Roman" w:cs="Times New Roman"/>
+              </w:rPr>
+            </w:pPr>
+            <w:r>
+              <w:rPr>
+                <w:rFonts w:ascii="Times New Roman" w:hAnsi="Times New Roman" w:cs="Times New Roman"/>
+              </w:rPr>
+              <w:t>Each product uses an approved recipe version, and staff need to know which recipe version applies to each production batch</w:t>
+            </w:r>
+          </w:p>
+        </w:tc>
+      </w:tr>
+      <w:tr>
+        <w:tc>
+          <w:tcPr>
+            <w:tcW w:w="635" w:type="dxa"/>
+          </w:tcPr>
+          <w:p>
+            <w:pPr>
+              <w:spacing w:line="360" w:lineRule="auto"/>
+              <w:rPr>
+                <w:rFonts w:ascii="Times New Roman" w:hAnsi="Times New Roman" w:cs="Times New Roman"/>
+              </w:rPr>
+            </w:pPr>
+            <w:r>
+              <w:rPr>
+                <w:rFonts w:ascii="Times New Roman" w:hAnsi="Times New Roman" w:cs="Times New Roman"/>
+              </w:rPr>
+              <w:t>BR2</w:t>
+            </w:r>
+          </w:p>
+        </w:tc>
+        <w:tc>
+          <w:tcPr>
+            <w:tcW w:w="3950" w:type="dxa"/>
+          </w:tcPr>
+          <w:p>
+            <w:pPr>
+              <w:spacing w:line="360" w:lineRule="auto"/>
+              <w:rPr>
+                <w:rFonts w:ascii="Times New Roman" w:hAnsi="Times New Roman" w:cs="Times New Roman"/>
+              </w:rPr>
+            </w:pPr>
+            <w:r>
+              <w:rPr>
+                <w:rFonts w:ascii="Times New Roman" w:hAnsi="Times New Roman" w:cs="Times New Roman"/>
+              </w:rPr>
+              <w:t xml:space="preserve">An ingredient substitution must be reviewed because it may affect allergen information, </w:t>
+            </w:r>
+            <w:r>
+              <w:rPr>
+                <w:rFonts w:ascii="Times New Roman" w:hAnsi="Times New Roman" w:cs="Times New Roman"/>
+              </w:rPr>
+              <w:t>product quality and labeling</w:t>
+            </w:r>
+          </w:p>
+        </w:tc>
+        <w:tc>
+          <w:tcPr>
+            <w:tcW w:w="4765" w:type="dxa"/>
+          </w:tcPr>
+          <w:p>
+            <w:pPr>
+              <w:spacing w:line="360" w:lineRule="auto"/>
+              <w:rPr>
+                <w:rFonts w:ascii="Times New Roman" w:hAnsi="Times New Roman" w:cs="Times New Roman"/>
+              </w:rPr>
+            </w:pPr>
+            <w:r>
+              <w:rPr>
+                <w:rFonts w:ascii="Times New Roman" w:hAnsi="Times New Roman" w:cs="Times New Roman"/>
+              </w:rPr>
+              <w:t>Ingredient substitutions require review because they may change allergens, quality and labelling</w:t>
+            </w:r>
+          </w:p>
+        </w:tc>
+      </w:tr>
+      <w:tr>
+        <w:tc>
+          <w:tcPr>
+            <w:tcW w:w="635" w:type="dxa"/>
+          </w:tcPr>
+          <w:p>
+            <w:pPr>
+              <w:spacing w:line="360" w:lineRule="auto"/>
+              <w:rPr>
+                <w:rFonts w:ascii="Times New Roman" w:hAnsi="Times New Roman" w:cs="Times New Roman"/>
+              </w:rPr>
+            </w:pPr>
+            <w:r>
+              <w:rPr>
+                <w:rFonts w:ascii="Times New Roman" w:hAnsi="Times New Roman" w:cs="Times New Roman"/>
+              </w:rPr>
+              <w:t>BR3</w:t>
+            </w:r>
+          </w:p>
+        </w:tc>
+        <w:tc>
+          <w:tcPr>
+            <w:tcW w:w="3950" w:type="dxa"/>
+          </w:tcPr>
+          <w:p>
+            <w:pPr>
+              <w:spacing w:line="360" w:lineRule="auto"/>
+              <w:rPr>
+                <w:rFonts w:ascii="Times New Roman" w:hAnsi="Times New Roman" w:cs="Times New Roman"/>
+              </w:rPr>
+            </w:pPr>
+            <w:r>
+              <w:rPr>
+                <w:rFonts w:ascii="Times New Roman" w:hAnsi="Times New Roman" w:cs="Times New Roman"/>
+              </w:rPr>
+              <w:t>A production batch must not be released until the required quality checks have been completed</w:t>
+            </w:r>
+          </w:p>
+        </w:tc>
+        <w:tc>
+          <w:tcPr>
+            <w:tcW w:w="4765" w:type="dxa"/>
+          </w:tcPr>
+          <w:p>
+            <w:pPr>
+              <w:spacing w:line="360" w:lineRule="auto"/>
+              <w:rPr>
+                <w:rFonts w:ascii="Times New Roman" w:hAnsi="Times New Roman" w:cs="Times New Roman"/>
+              </w:rPr>
+            </w:pPr>
+            <w:r>
+              <w:rPr>
+                <w:rFonts w:ascii="Times New Roman" w:hAnsi="Times New Roman" w:cs="Times New Roman"/>
+              </w:rPr>
+              <w:t>A production batch may remain held pending quality checks even when it has already been packed</w:t>
+            </w:r>
+          </w:p>
+        </w:tc>
+      </w:tr>
+      <w:tr>
+        <w:tc>
+          <w:tcPr>
+            <w:tcW w:w="635" w:type="dxa"/>
+          </w:tcPr>
+          <w:p>
+            <w:pPr>
+              <w:spacing w:line="360" w:lineRule="auto"/>
+              <w:rPr>
+                <w:rFonts w:ascii="Times New Roman" w:hAnsi="Times New Roman" w:cs="Times New Roman"/>
+              </w:rPr>
+            </w:pPr>
+            <w:r>
+              <w:rPr>
+                <w:rFonts w:ascii="Times New Roman" w:hAnsi="Times New Roman" w:cs="Times New Roman"/>
+              </w:rPr>
+              <w:t>BR4</w:t>
+            </w:r>
+          </w:p>
+        </w:tc>
+        <w:tc>
+          <w:tcPr>
+            <w:tcW w:w="3950" w:type="dxa"/>
+          </w:tcPr>
+          <w:p>
+            <w:pPr>
+              <w:spacing w:line="360" w:lineRule="auto"/>
+              <w:rPr>
+                <w:rFonts w:ascii="Times New Roman" w:hAnsi="Times New Roman" w:cs="Times New Roman"/>
+              </w:rPr>
+            </w:pPr>
+            <w:r>
+              <w:rPr>
+                <w:rFonts w:ascii="Times New Roman" w:hAnsi="Times New Roman" w:cs="Times New Roman"/>
+              </w:rPr>
+              <w:t xml:space="preserve">A customer order may be fulfilled from multiple production batches, and one production batch may supply multiple customer orders </w:t>
+            </w:r>
+          </w:p>
+        </w:tc>
+        <w:tc>
+          <w:tcPr>
+            <w:tcW w:w="4765" w:type="dxa"/>
+          </w:tcPr>
+          <w:p>
+            <w:pPr>
+              <w:spacing w:line="360" w:lineRule="auto"/>
+              <w:rPr>
+                <w:rFonts w:ascii="Times New Roman" w:hAnsi="Times New Roman" w:cs="Times New Roman"/>
+              </w:rPr>
+            </w:pPr>
+            <w:r>
+              <w:rPr>
+                <w:rFonts w:ascii="Times New Roman" w:hAnsi="Times New Roman" w:cs="Times New Roman"/>
+              </w:rPr>
+              <w:t>The scenario identifies both forms of batch – to order allocation</w:t>
+            </w:r>
+          </w:p>
+        </w:tc>
+      </w:tr>
+    </w:tbl>
+    <w:p>
+      <w:pPr>
+        <w:pStyle w:val="Heading2"/>
+        <w:rPr>
+          <w:rFonts w:ascii="Times New Roman" w:hAnsi="Times New Roman" w:cs="Times New Roman"/>
+          <w:color w:val="auto"/>
+          <w:sz w:val="24"/>
+          <w:szCs w:val="24"/>
+        </w:rPr>
+      </w:pPr>
+      <w:r>
+        <w:rPr>
+          <w:rFonts w:ascii="Times New Roman" w:hAnsi="Times New Roman" w:cs="Times New Roman"/>
+          <w:color w:val="auto"/>
+          <w:sz w:val="24"/>
+          <w:szCs w:val="24"/>
+        </w:rPr>
+        <w:t>5.2 Assumptions</w:t>
+      </w:r>
+    </w:p>
+    <w:tbl>
+      <w:tblPr>
+        <w:tblStyle w:val="TableGrid"/>
+        <w:tblW w:w="0" w:type="auto"/>
+        <w:tblLook w:val="04A0" w:firstRow="1" w:lastRow="0" w:firstColumn="1" w:lastColumn="0" w:noHBand="0" w:noVBand="1"/>
+      </w:tblPr>
+      <w:tblGrid>
+        <w:gridCol w:w="510"/>
+        <w:gridCol w:w="5786"/>
+        <w:gridCol w:w="3054"/>
+      </w:tblGrid>
+      <w:tr>
+        <w:tc>
+          <w:tcPr>
+            <w:tcW w:w="486" w:type="dxa"/>
+          </w:tcPr>
+          <w:p>
+            <w:pPr>
+              <w:spacing w:line="360" w:lineRule="auto"/>
+              <w:rPr>
+                <w:rFonts w:ascii="Times New Roman" w:hAnsi="Times New Roman" w:cs="Times New Roman"/>
+              </w:rPr>
+            </w:pPr>
+            <w:r>
+              <w:rPr>
+                <w:rFonts w:ascii="Times New Roman" w:hAnsi="Times New Roman" w:cs="Times New Roman"/>
+              </w:rPr>
+              <w:t>ID</w:t>
+            </w:r>
+          </w:p>
+        </w:tc>
+        <w:tc>
+          <w:tcPr>
+            <w:tcW w:w="5804" w:type="dxa"/>
+          </w:tcPr>
+          <w:p>
+            <w:pPr>
+              <w:spacing w:line="360" w:lineRule="auto"/>
+              <w:rPr>
+                <w:rFonts w:ascii="Times New Roman" w:hAnsi="Times New Roman" w:cs="Times New Roman"/>
+              </w:rPr>
+            </w:pPr>
+            <w:r>
+              <w:rPr>
+                <w:rFonts w:ascii="Times New Roman" w:hAnsi="Times New Roman" w:cs="Times New Roman"/>
+              </w:rPr>
+              <w:t>Assumption</w:t>
+            </w:r>
+          </w:p>
+        </w:tc>
+        <w:tc>
+          <w:tcPr>
+            <w:tcW w:w="3060" w:type="dxa"/>
+          </w:tcPr>
+          <w:p>
+            <w:pPr>
+              <w:spacing w:line="360" w:lineRule="auto"/>
+              <w:rPr>
+                <w:rFonts w:ascii="Times New Roman" w:hAnsi="Times New Roman" w:cs="Times New Roman"/>
+              </w:rPr>
+            </w:pPr>
+            <w:r>
+              <w:rPr>
+                <w:rFonts w:ascii="Times New Roman" w:hAnsi="Times New Roman" w:cs="Times New Roman"/>
+              </w:rPr>
+              <w:t>Status</w:t>
+            </w:r>
+          </w:p>
+        </w:tc>
+      </w:tr>
+      <w:tr>
+        <w:tc>
+          <w:tcPr>
+            <w:tcW w:w="486" w:type="dxa"/>
+          </w:tcPr>
+          <w:p>
+            <w:pPr>
+              <w:spacing w:line="360" w:lineRule="auto"/>
+              <w:rPr>
+                <w:rFonts w:ascii="Times New Roman" w:hAnsi="Times New Roman" w:cs="Times New Roman"/>
+              </w:rPr>
+            </w:pPr>
+            <w:r>
+              <w:rPr>
+                <w:rFonts w:ascii="Times New Roman" w:hAnsi="Times New Roman" w:cs="Times New Roman"/>
+              </w:rPr>
+              <w:t>A1</w:t>
+            </w:r>
+          </w:p>
+        </w:tc>
+        <w:tc>
+          <w:tcPr>
+            <w:tcW w:w="5804" w:type="dxa"/>
+          </w:tcPr>
+          <w:p>
+            <w:pPr>
+              <w:spacing w:line="360" w:lineRule="auto"/>
+              <w:rPr>
+                <w:rFonts w:ascii="Times New Roman" w:hAnsi="Times New Roman" w:cs="Times New Roman"/>
+              </w:rPr>
+            </w:pPr>
+            <w:r>
+              <w:rPr>
+                <w:rFonts w:ascii="Times New Roman" w:hAnsi="Times New Roman" w:cs="Times New Roman"/>
+              </w:rPr>
+              <w:t xml:space="preserve">It is assumed that the Production Manger is </w:t>
+            </w:r>
+            <w:proofErr w:type="spellStart"/>
+            <w:r>
+              <w:rPr>
+                <w:rFonts w:ascii="Times New Roman" w:hAnsi="Times New Roman" w:cs="Times New Roman"/>
+              </w:rPr>
+              <w:t>authorised</w:t>
+            </w:r>
+            <w:proofErr w:type="spellEnd"/>
+            <w:r>
+              <w:rPr>
+                <w:rFonts w:ascii="Times New Roman" w:hAnsi="Times New Roman" w:cs="Times New Roman"/>
+              </w:rPr>
+              <w:t xml:space="preserve"> to approve new recipe versions</w:t>
+            </w:r>
+          </w:p>
+        </w:tc>
+        <w:tc>
+          <w:tcPr>
+            <w:tcW w:w="3060" w:type="dxa"/>
+          </w:tcPr>
+          <w:p>
+            <w:pPr>
+              <w:spacing w:line="360" w:lineRule="auto"/>
+              <w:rPr>
+                <w:rFonts w:ascii="Times New Roman" w:hAnsi="Times New Roman" w:cs="Times New Roman"/>
+              </w:rPr>
+            </w:pPr>
+            <w:r>
+              <w:rPr>
+                <w:rFonts w:ascii="Times New Roman" w:hAnsi="Times New Roman" w:cs="Times New Roman"/>
+              </w:rPr>
+              <w:t>Requires stakeholder confirmation</w:t>
+            </w:r>
+          </w:p>
+        </w:tc>
+      </w:tr>
+      <w:tr>
+        <w:tc>
+          <w:tcPr>
+            <w:tcW w:w="486" w:type="dxa"/>
+          </w:tcPr>
+          <w:p>
+            <w:pPr>
+              <w:spacing w:line="360" w:lineRule="auto"/>
+              <w:rPr>
+                <w:rFonts w:ascii="Times New Roman" w:hAnsi="Times New Roman" w:cs="Times New Roman"/>
+              </w:rPr>
+            </w:pPr>
+            <w:r>
+              <w:rPr>
+                <w:rFonts w:ascii="Times New Roman" w:hAnsi="Times New Roman" w:cs="Times New Roman"/>
+              </w:rPr>
+              <w:t>A2</w:t>
+            </w:r>
+          </w:p>
+        </w:tc>
+        <w:tc>
+          <w:tcPr>
+            <w:tcW w:w="5804" w:type="dxa"/>
+          </w:tcPr>
+          <w:p>
+            <w:pPr>
+              <w:spacing w:line="360" w:lineRule="auto"/>
+              <w:rPr>
+                <w:rFonts w:ascii="Times New Roman" w:hAnsi="Times New Roman" w:cs="Times New Roman"/>
+              </w:rPr>
+            </w:pPr>
+            <w:r>
+              <w:rPr>
+                <w:rFonts w:ascii="Times New Roman" w:hAnsi="Times New Roman" w:cs="Times New Roman"/>
+              </w:rPr>
+              <w:t xml:space="preserve">It is assumed that </w:t>
+            </w:r>
+            <w:r>
+              <w:rPr>
+                <w:rFonts w:ascii="Times New Roman" w:hAnsi="Times New Roman" w:cs="Times New Roman"/>
+              </w:rPr>
+              <w:t xml:space="preserve">the Production Manager is </w:t>
+            </w:r>
+            <w:proofErr w:type="spellStart"/>
+            <w:r>
+              <w:rPr>
+                <w:rFonts w:ascii="Times New Roman" w:hAnsi="Times New Roman" w:cs="Times New Roman"/>
+              </w:rPr>
+              <w:t>authorised</w:t>
+            </w:r>
+            <w:proofErr w:type="spellEnd"/>
+            <w:r>
+              <w:rPr>
+                <w:rFonts w:ascii="Times New Roman" w:hAnsi="Times New Roman" w:cs="Times New Roman"/>
+              </w:rPr>
+              <w:t xml:space="preserve"> to approve ingredient substitution</w:t>
+            </w:r>
+          </w:p>
+        </w:tc>
+        <w:tc>
+          <w:tcPr>
+            <w:tcW w:w="3060" w:type="dxa"/>
+          </w:tcPr>
+          <w:p>
+            <w:pPr>
+              <w:spacing w:line="360" w:lineRule="auto"/>
+              <w:rPr>
+                <w:rFonts w:ascii="Times New Roman" w:hAnsi="Times New Roman" w:cs="Times New Roman"/>
+              </w:rPr>
+            </w:pPr>
+            <w:r>
+              <w:rPr>
+                <w:rFonts w:ascii="Times New Roman" w:hAnsi="Times New Roman" w:cs="Times New Roman"/>
+              </w:rPr>
+              <w:t>Requires stakeholder confirmation</w:t>
+            </w:r>
+          </w:p>
+        </w:tc>
+      </w:tr>
+      <w:tr>
+        <w:tc>
+          <w:tcPr>
+            <w:tcW w:w="486" w:type="dxa"/>
+          </w:tcPr>
+          <w:p>
+            <w:pPr>
+              <w:spacing w:line="360" w:lineRule="auto"/>
+              <w:rPr>
+                <w:rFonts w:ascii="Times New Roman" w:hAnsi="Times New Roman" w:cs="Times New Roman"/>
+              </w:rPr>
+            </w:pPr>
+            <w:r>
+              <w:rPr>
+                <w:rFonts w:ascii="Times New Roman" w:hAnsi="Times New Roman" w:cs="Times New Roman"/>
+              </w:rPr>
+              <w:t>A3</w:t>
+            </w:r>
+          </w:p>
+        </w:tc>
+        <w:tc>
+          <w:tcPr>
+            <w:tcW w:w="5804" w:type="dxa"/>
+          </w:tcPr>
+          <w:p>
+            <w:pPr>
+              <w:spacing w:line="360" w:lineRule="auto"/>
+              <w:rPr>
+                <w:rFonts w:ascii="Times New Roman" w:hAnsi="Times New Roman" w:cs="Times New Roman"/>
+              </w:rPr>
+            </w:pPr>
+            <w:r>
+              <w:rPr>
+                <w:rFonts w:ascii="Times New Roman" w:hAnsi="Times New Roman" w:cs="Times New Roman"/>
+              </w:rPr>
+              <w:t>It is assumed that customer order allocations are adjusted when the actual production yield differs from the expected yield</w:t>
+            </w:r>
+          </w:p>
+        </w:tc>
+        <w:tc>
+          <w:tcPr>
+            <w:tcW w:w="3060" w:type="dxa"/>
+          </w:tcPr>
+          <w:p>
+            <w:pPr>
+              <w:spacing w:line="360" w:lineRule="auto"/>
+              <w:rPr>
+                <w:rFonts w:ascii="Times New Roman" w:hAnsi="Times New Roman" w:cs="Times New Roman"/>
+              </w:rPr>
+            </w:pPr>
+            <w:r>
+              <w:rPr>
+                <w:rFonts w:ascii="Times New Roman" w:hAnsi="Times New Roman" w:cs="Times New Roman"/>
+              </w:rPr>
+              <w:t>Requires stakeholder confirmation</w:t>
+            </w:r>
+          </w:p>
+        </w:tc>
+      </w:tr>
+    </w:tbl>
+    <w:p/>
+    <w:p>
+      <w:pPr>
+        <w:pStyle w:val="Heading2"/>
+        <w:rPr>
+          <w:rFonts w:ascii="Times New Roman" w:hAnsi="Times New Roman" w:cs="Times New Roman"/>
+          <w:color w:val="auto"/>
+          <w:sz w:val="24"/>
+          <w:szCs w:val="24"/>
+        </w:rPr>
+      </w:pPr>
+      <w:r>
+        <w:rPr>
+          <w:rFonts w:ascii="Times New Roman" w:hAnsi="Times New Roman" w:cs="Times New Roman"/>
+          <w:color w:val="auto"/>
+          <w:sz w:val="24"/>
+          <w:szCs w:val="24"/>
+        </w:rPr>
+        <w:t>5.3 Constraints</w:t>
+      </w:r>
+    </w:p>
+    <w:tbl>
+      <w:tblPr>
+        <w:tblStyle w:val="TableGrid"/>
+        <w:tblW w:w="0" w:type="auto"/>
+        <w:tblLook w:val="04A0" w:firstRow="1" w:lastRow="0" w:firstColumn="1" w:lastColumn="0" w:noHBand="0" w:noVBand="1"/>
+      </w:tblPr>
+      <w:tblGrid>
+        <w:gridCol w:w="511"/>
+        <w:gridCol w:w="4704"/>
+        <w:gridCol w:w="4135"/>
+      </w:tblGrid>
+      <w:tr>
+        <w:tc>
+          <w:tcPr>
+            <w:tcW w:w="511" w:type="dxa"/>
+          </w:tcPr>
+          <w:p>
+            <w:pPr>
+              <w:spacing w:line="360" w:lineRule="auto"/>
+              <w:rPr>
+                <w:rFonts w:ascii="Times New Roman" w:hAnsi="Times New Roman" w:cs="Times New Roman"/>
+              </w:rPr>
+            </w:pPr>
+            <w:r>
+              <w:rPr>
+                <w:rFonts w:ascii="Times New Roman" w:hAnsi="Times New Roman" w:cs="Times New Roman"/>
+              </w:rPr>
+              <w:t>ID</w:t>
+            </w:r>
+          </w:p>
+        </w:tc>
+        <w:tc>
+          <w:tcPr>
+            <w:tcW w:w="4704" w:type="dxa"/>
+          </w:tcPr>
+          <w:p>
+            <w:pPr>
+              <w:spacing w:line="360" w:lineRule="auto"/>
+              <w:rPr>
+                <w:rFonts w:ascii="Times New Roman" w:hAnsi="Times New Roman" w:cs="Times New Roman"/>
+              </w:rPr>
+            </w:pPr>
+            <w:r>
+              <w:rPr>
+                <w:rFonts w:ascii="Times New Roman" w:hAnsi="Times New Roman" w:cs="Times New Roman"/>
+              </w:rPr>
+              <w:t>Constraints</w:t>
+            </w:r>
+          </w:p>
+        </w:tc>
+        <w:tc>
+          <w:tcPr>
+            <w:tcW w:w="4135" w:type="dxa"/>
+          </w:tcPr>
+          <w:p>
+            <w:pPr>
+              <w:spacing w:line="360" w:lineRule="auto"/>
+              <w:rPr>
+                <w:rFonts w:ascii="Times New Roman" w:hAnsi="Times New Roman" w:cs="Times New Roman"/>
+              </w:rPr>
+            </w:pPr>
+            <w:r>
+              <w:rPr>
+                <w:rFonts w:ascii="Times New Roman" w:hAnsi="Times New Roman" w:cs="Times New Roman"/>
+              </w:rPr>
+              <w:t>Source / Rationale</w:t>
+            </w:r>
+          </w:p>
+        </w:tc>
+      </w:tr>
+      <w:tr>
+        <w:tc>
+          <w:tcPr>
+            <w:tcW w:w="511" w:type="dxa"/>
+          </w:tcPr>
+          <w:p>
+            <w:pPr>
+              <w:spacing w:line="360" w:lineRule="auto"/>
+              <w:rPr>
+                <w:rFonts w:ascii="Times New Roman" w:hAnsi="Times New Roman" w:cs="Times New Roman"/>
+              </w:rPr>
+            </w:pPr>
+            <w:r>
+              <w:rPr>
+                <w:rFonts w:ascii="Times New Roman" w:hAnsi="Times New Roman" w:cs="Times New Roman"/>
+              </w:rPr>
+              <w:lastRenderedPageBreak/>
+              <w:t>C1</w:t>
+            </w:r>
+          </w:p>
+        </w:tc>
+        <w:tc>
+          <w:tcPr>
+            <w:tcW w:w="4704" w:type="dxa"/>
+          </w:tcPr>
+          <w:p>
+            <w:pPr>
+              <w:spacing w:line="360" w:lineRule="auto"/>
+              <w:rPr>
+                <w:rFonts w:ascii="Times New Roman" w:hAnsi="Times New Roman" w:cs="Times New Roman"/>
+              </w:rPr>
+            </w:pPr>
+            <w:r>
+              <w:rPr>
+                <w:rFonts w:ascii="Times New Roman" w:hAnsi="Times New Roman" w:cs="Times New Roman"/>
+              </w:rPr>
+              <w:t>Production is carried out in a shared kitchen with limited equipment and storage</w:t>
+            </w:r>
+          </w:p>
+        </w:tc>
+        <w:tc>
+          <w:tcPr>
+            <w:tcW w:w="4135" w:type="dxa"/>
+          </w:tcPr>
+          <w:p>
+            <w:pPr>
+              <w:spacing w:line="360" w:lineRule="auto"/>
+              <w:rPr>
+                <w:rFonts w:ascii="Times New Roman" w:hAnsi="Times New Roman" w:cs="Times New Roman"/>
+              </w:rPr>
+            </w:pPr>
+            <w:r>
+              <w:rPr>
+                <w:rFonts w:ascii="Times New Roman" w:hAnsi="Times New Roman" w:cs="Times New Roman"/>
+              </w:rPr>
+              <w:t>Limited kitchen resources constrain production planning and scheduling</w:t>
+            </w:r>
+          </w:p>
+        </w:tc>
+      </w:tr>
+      <w:tr>
+        <w:tc>
+          <w:tcPr>
+            <w:tcW w:w="511" w:type="dxa"/>
+          </w:tcPr>
+          <w:p>
+            <w:pPr>
+              <w:spacing w:line="360" w:lineRule="auto"/>
+              <w:rPr>
+                <w:rFonts w:ascii="Times New Roman" w:hAnsi="Times New Roman" w:cs="Times New Roman"/>
+              </w:rPr>
+            </w:pPr>
+            <w:r>
+              <w:rPr>
+                <w:rFonts w:ascii="Times New Roman" w:hAnsi="Times New Roman" w:cs="Times New Roman"/>
+              </w:rPr>
+              <w:t>C2</w:t>
+            </w:r>
+          </w:p>
+        </w:tc>
+        <w:tc>
+          <w:tcPr>
+            <w:tcW w:w="4704" w:type="dxa"/>
+          </w:tcPr>
+          <w:p>
+            <w:pPr>
+              <w:spacing w:line="360" w:lineRule="auto"/>
+              <w:rPr>
+                <w:rFonts w:ascii="Times New Roman" w:hAnsi="Times New Roman" w:cs="Times New Roman"/>
+              </w:rPr>
+            </w:pPr>
+            <w:r>
+              <w:rPr>
+                <w:rFonts w:ascii="Times New Roman" w:hAnsi="Times New Roman" w:cs="Times New Roman"/>
+              </w:rPr>
+              <w:t>Production scheduling must consider ingredient availability, kitchen capacity, equipment availability, staff skill, preparation time, cooling, and packing requirements</w:t>
+            </w:r>
+          </w:p>
+        </w:tc>
+        <w:tc>
+          <w:tcPr>
+            <w:tcW w:w="4135" w:type="dxa"/>
+          </w:tcPr>
+          <w:p>
+            <w:pPr>
+              <w:spacing w:line="360" w:lineRule="auto"/>
+              <w:rPr>
+                <w:rFonts w:ascii="Times New Roman" w:hAnsi="Times New Roman" w:cs="Times New Roman"/>
+              </w:rPr>
+            </w:pPr>
+            <w:r>
+              <w:rPr>
+                <w:rFonts w:ascii="Times New Roman" w:hAnsi="Times New Roman" w:cs="Times New Roman"/>
+              </w:rPr>
+              <w:t>Production cannot always be scheduled solely by customer order date because operational resources and timing requirements must also be considered</w:t>
+            </w:r>
+          </w:p>
+        </w:tc>
+      </w:tr>
+      <w:tr>
+        <w:tc>
+          <w:tcPr>
+            <w:tcW w:w="511" w:type="dxa"/>
+          </w:tcPr>
+          <w:p>
+            <w:pPr>
+              <w:spacing w:line="360" w:lineRule="auto"/>
+              <w:rPr>
+                <w:rFonts w:ascii="Times New Roman" w:hAnsi="Times New Roman" w:cs="Times New Roman"/>
+              </w:rPr>
+            </w:pPr>
+            <w:r>
+              <w:rPr>
+                <w:rFonts w:ascii="Times New Roman" w:hAnsi="Times New Roman" w:cs="Times New Roman"/>
+              </w:rPr>
+              <w:t>C3</w:t>
+            </w:r>
+          </w:p>
+        </w:tc>
+        <w:tc>
+          <w:tcPr>
+            <w:tcW w:w="4704" w:type="dxa"/>
+          </w:tcPr>
+          <w:p>
+            <w:pPr>
+              <w:spacing w:line="360" w:lineRule="auto"/>
+              <w:rPr>
+                <w:rFonts w:ascii="Times New Roman" w:hAnsi="Times New Roman" w:cs="Times New Roman"/>
+              </w:rPr>
+            </w:pPr>
+            <w:r>
+              <w:rPr>
+                <w:rFonts w:ascii="Times New Roman" w:hAnsi="Times New Roman" w:cs="Times New Roman"/>
+              </w:rPr>
+              <w:t>The initial system scope excludes kitchen equipment control, retail payment processing and full financial accounting</w:t>
+            </w:r>
+          </w:p>
+        </w:tc>
+        <w:tc>
+          <w:tcPr>
+            <w:tcW w:w="4135" w:type="dxa"/>
+          </w:tcPr>
+          <w:p>
+            <w:pPr>
+              <w:spacing w:line="360" w:lineRule="auto"/>
+              <w:rPr>
+                <w:rFonts w:ascii="Times New Roman" w:hAnsi="Times New Roman" w:cs="Times New Roman"/>
+              </w:rPr>
+            </w:pPr>
+            <w:r>
+              <w:rPr>
+                <w:rFonts w:ascii="Times New Roman" w:hAnsi="Times New Roman" w:cs="Times New Roman"/>
+              </w:rPr>
+              <w:t>These activities are explicitly excluded from the initial scope of the scenario</w:t>
+            </w:r>
+          </w:p>
+        </w:tc>
+      </w:tr>
+    </w:tbl>
+    <w:p/>
+    <w:p>
+      <w:pPr>
+        <w:pStyle w:val="Heading2"/>
+        <w:rPr>
+          <w:rFonts w:ascii="Times New Roman" w:hAnsi="Times New Roman" w:cs="Times New Roman"/>
+          <w:color w:val="auto"/>
+          <w:sz w:val="24"/>
+          <w:szCs w:val="24"/>
+        </w:rPr>
+      </w:pPr>
+      <w:r>
+        <w:rPr>
+          <w:rFonts w:ascii="Times New Roman" w:hAnsi="Times New Roman" w:cs="Times New Roman"/>
+          <w:color w:val="auto"/>
+          <w:sz w:val="24"/>
+          <w:szCs w:val="24"/>
+        </w:rPr>
+        <w:t>5.4 Risks</w:t>
+      </w:r>
+    </w:p>
+    <w:tbl>
+      <w:tblPr>
+        <w:tblStyle w:val="TableGrid"/>
+        <w:tblW w:w="0" w:type="auto"/>
+        <w:tblLook w:val="04A0" w:firstRow="1" w:lastRow="0" w:firstColumn="1" w:lastColumn="0" w:noHBand="0" w:noVBand="1"/>
+      </w:tblPr>
+      <w:tblGrid>
+        <w:gridCol w:w="490"/>
+        <w:gridCol w:w="4455"/>
+        <w:gridCol w:w="4405"/>
+      </w:tblGrid>
+      <w:tr>
+        <w:tc>
+          <w:tcPr>
+            <w:tcW w:w="490" w:type="dxa"/>
+          </w:tcPr>
+          <w:p>
+            <w:r>
+              <w:t>ID</w:t>
+            </w:r>
+          </w:p>
+        </w:tc>
+        <w:tc>
+          <w:tcPr>
+            <w:tcW w:w="4455" w:type="dxa"/>
+          </w:tcPr>
+          <w:p>
+            <w:r>
+              <w:t>Risk</w:t>
+            </w:r>
+          </w:p>
+        </w:tc>
+        <w:tc>
+          <w:tcPr>
+            <w:tcW w:w="4405" w:type="dxa"/>
+          </w:tcPr>
+          <w:p>
+            <w:r>
+              <w:t>Potential Impact</w:t>
+            </w:r>
+          </w:p>
+        </w:tc>
+      </w:tr>
+      <w:tr>
+        <w:tc>
+          <w:tcPr>
+            <w:tcW w:w="490" w:type="dxa"/>
+          </w:tcPr>
+          <w:p>
+            <w:r>
+              <w:t>R1</w:t>
+            </w:r>
+          </w:p>
+        </w:tc>
+        <w:tc>
+          <w:tcPr>
+            <w:tcW w:w="4455" w:type="dxa"/>
+          </w:tcPr>
+          <w:p>
+            <w:r>
+              <w:t xml:space="preserve">There is a risk that </w:t>
+            </w:r>
+            <w:r>
+              <w:t>an incorrect or unidentified recipe version may be used during production</w:t>
+            </w:r>
+          </w:p>
+        </w:tc>
+        <w:tc>
+          <w:tcPr>
+            <w:tcW w:w="4405" w:type="dxa"/>
+          </w:tcPr>
+          <w:p>
+            <w:r>
+              <w:t xml:space="preserve">This may </w:t>
+            </w:r>
+            <w:proofErr w:type="gramStart"/>
+            <w:r>
+              <w:t>results</w:t>
+            </w:r>
+            <w:proofErr w:type="gramEnd"/>
+            <w:r>
+              <w:t xml:space="preserve"> in incorrect labeling, cost calculations, expected yield, or allergen information</w:t>
+            </w:r>
+          </w:p>
+        </w:tc>
+      </w:tr>
+      <w:tr>
+        <w:tc>
+          <w:tcPr>
+            <w:tcW w:w="490" w:type="dxa"/>
+          </w:tcPr>
+          <w:p>
+            <w:r>
+              <w:t>R2</w:t>
+            </w:r>
+          </w:p>
+        </w:tc>
+        <w:tc>
+          <w:tcPr>
+            <w:tcW w:w="4455" w:type="dxa"/>
+          </w:tcPr>
+          <w:p>
+            <w:r>
+              <w:t>There is a risk that an ingredient substitution may not be properly reviewed or recorded</w:t>
+            </w:r>
+          </w:p>
+        </w:tc>
+        <w:tc>
+          <w:tcPr>
+            <w:tcW w:w="4405" w:type="dxa"/>
+          </w:tcPr>
+          <w:p>
+            <w:r>
+              <w:t>This may result in incorrect allergen information, production quality issues, or incorrect labeling</w:t>
+            </w:r>
+          </w:p>
+        </w:tc>
+      </w:tr>
+      <w:tr>
+        <w:tc>
+          <w:tcPr>
+            <w:tcW w:w="490" w:type="dxa"/>
+          </w:tcPr>
+          <w:p>
+            <w:r>
+              <w:t>R3</w:t>
+            </w:r>
+          </w:p>
+        </w:tc>
+        <w:tc>
+          <w:tcPr>
+            <w:tcW w:w="4455" w:type="dxa"/>
+          </w:tcPr>
+          <w:p>
+            <w:r>
+              <w:t>There is a risk that affected customer orders may not be quickly identified when an error is found in a production batch</w:t>
+            </w:r>
+          </w:p>
+        </w:tc>
+        <w:tc>
+          <w:tcPr>
+            <w:tcW w:w="4405" w:type="dxa"/>
+          </w:tcPr>
+          <w:p>
+            <w:r>
+              <w:t>This may result in delays in traceability and an identifying affected customer</w:t>
+            </w:r>
+          </w:p>
+        </w:tc>
+      </w:tr>
+    </w:tbl>
+    <w:p/>
     <w:p>
       <w:pPr>
         <w:pStyle w:val="Heading2"/>
@@ -8517,7 +10631,7 @@
               <w:rPr>
                 <w:rFonts w:ascii="Times New Roman" w:hAnsi="Times New Roman" w:cs="Times New Roman"/>
               </w:rPr>
-              <w:t xml:space="preserve"> to approve a new recipe version?</w:t>
+              <w:t xml:space="preserve"> to approve a recipe version?</w:t>
             </w:r>
           </w:p>
         </w:tc>
@@ -8689,6 +10803,7 @@
               <w:rPr>
                 <w:rFonts w:ascii="Times New Roman" w:hAnsi="Times New Roman" w:cs="Times New Roman"/>
               </w:rPr>
+              <w:lastRenderedPageBreak/>
               <w:t>CQ4</w:t>
             </w:r>
           </w:p>

</xml_diff>

<commit_message>
Add Use Case Diagrams
</commit_message>
<xml_diff>
--- a/report/Analysis Dossier.docx
+++ b/report/Analysis Dossier.docx
@@ -7,6 +7,7 @@
         <w:spacing w:line="360" w:lineRule="auto"/>
         <w:rPr>
           <w:rFonts w:ascii="Times New Roman" w:hAnsi="Times New Roman" w:cs="Times New Roman"/>
+          <w:lang w:val="ru-RU"/>
         </w:rPr>
       </w:pPr>
     </w:p>
@@ -9860,7 +9861,21 @@
               <w:rPr>
                 <w:rFonts w:ascii="Times New Roman" w:hAnsi="Times New Roman" w:cs="Times New Roman"/>
               </w:rPr>
-              <w:t xml:space="preserve">It is assumed that the Production Manger is </w:t>
+              <w:t xml:space="preserve">It is assumed that the Production </w:t>
+            </w:r>
+            <w:proofErr w:type="spellStart"/>
+            <w:r>
+              <w:rPr>
+                <w:rFonts w:ascii="Times New Roman" w:hAnsi="Times New Roman" w:cs="Times New Roman"/>
+              </w:rPr>
+              <w:t>Manger</w:t>
+            </w:r>
+            <w:proofErr w:type="spellEnd"/>
+            <w:r>
+              <w:rPr>
+                <w:rFonts w:ascii="Times New Roman" w:hAnsi="Times New Roman" w:cs="Times New Roman"/>
+              </w:rPr>
+              <w:t xml:space="preserve"> is </w:t>
             </w:r>
             <w:proofErr w:type="spellStart"/>
             <w:r>
@@ -10519,14 +10534,14 @@
         <w:tblLook w:val="04A0" w:firstRow="1" w:lastRow="0" w:firstColumn="1" w:lastColumn="0" w:noHBand="0" w:noVBand="1"/>
       </w:tblPr>
       <w:tblGrid>
-        <w:gridCol w:w="3116"/>
-        <w:gridCol w:w="3117"/>
-        <w:gridCol w:w="3117"/>
+        <w:gridCol w:w="670"/>
+        <w:gridCol w:w="4905"/>
+        <w:gridCol w:w="3775"/>
       </w:tblGrid>
       <w:tr>
         <w:tc>
           <w:tcPr>
-            <w:tcW w:w="3116" w:type="dxa"/>
+            <w:tcW w:w="670" w:type="dxa"/>
           </w:tcPr>
           <w:p>
             <w:pPr>
@@ -10545,7 +10560,7 @@
         </w:tc>
         <w:tc>
           <w:tcPr>
-            <w:tcW w:w="3117" w:type="dxa"/>
+            <w:tcW w:w="4905" w:type="dxa"/>
           </w:tcPr>
           <w:p>
             <w:pPr>
@@ -10564,7 +10579,7 @@
         </w:tc>
         <w:tc>
           <w:tcPr>
-            <w:tcW w:w="3117" w:type="dxa"/>
+            <w:tcW w:w="3775" w:type="dxa"/>
           </w:tcPr>
           <w:p>
             <w:pPr>
@@ -10585,7 +10600,7 @@
       <w:tr>
         <w:tc>
           <w:tcPr>
-            <w:tcW w:w="3116" w:type="dxa"/>
+            <w:tcW w:w="670" w:type="dxa"/>
           </w:tcPr>
           <w:p>
             <w:pPr>
@@ -10604,7 +10619,7 @@
         </w:tc>
         <w:tc>
           <w:tcPr>
-            <w:tcW w:w="3117" w:type="dxa"/>
+            <w:tcW w:w="4905" w:type="dxa"/>
           </w:tcPr>
           <w:p>
             <w:pPr>
@@ -10637,7 +10652,7 @@
         </w:tc>
         <w:tc>
           <w:tcPr>
-            <w:tcW w:w="3117" w:type="dxa"/>
+            <w:tcW w:w="3775" w:type="dxa"/>
           </w:tcPr>
           <w:p>
             <w:pPr>
@@ -10658,7 +10673,7 @@
       <w:tr>
         <w:tc>
           <w:tcPr>
-            <w:tcW w:w="3116" w:type="dxa"/>
+            <w:tcW w:w="670" w:type="dxa"/>
           </w:tcPr>
           <w:p>
             <w:pPr>
@@ -10677,7 +10692,7 @@
         </w:tc>
         <w:tc>
           <w:tcPr>
-            <w:tcW w:w="3117" w:type="dxa"/>
+            <w:tcW w:w="4905" w:type="dxa"/>
           </w:tcPr>
           <w:p>
             <w:pPr>
@@ -10710,7 +10725,7 @@
         </w:tc>
         <w:tc>
           <w:tcPr>
-            <w:tcW w:w="3117" w:type="dxa"/>
+            <w:tcW w:w="3775" w:type="dxa"/>
           </w:tcPr>
           <w:p>
             <w:pPr>
@@ -10731,7 +10746,7 @@
       <w:tr>
         <w:tc>
           <w:tcPr>
-            <w:tcW w:w="3116" w:type="dxa"/>
+            <w:tcW w:w="670" w:type="dxa"/>
           </w:tcPr>
           <w:p>
             <w:pPr>
@@ -10750,7 +10765,7 @@
         </w:tc>
         <w:tc>
           <w:tcPr>
-            <w:tcW w:w="3117" w:type="dxa"/>
+            <w:tcW w:w="4905" w:type="dxa"/>
           </w:tcPr>
           <w:p>
             <w:pPr>
@@ -10769,7 +10784,7 @@
         </w:tc>
         <w:tc>
           <w:tcPr>
-            <w:tcW w:w="3117" w:type="dxa"/>
+            <w:tcW w:w="3775" w:type="dxa"/>
           </w:tcPr>
           <w:p>
             <w:pPr>
@@ -10790,27 +10805,26 @@
       <w:tr>
         <w:tc>
           <w:tcPr>
-            <w:tcW w:w="3116" w:type="dxa"/>
-          </w:tcPr>
-          <w:p>
-            <w:pPr>
-              <w:spacing w:line="360" w:lineRule="auto"/>
-              <w:rPr>
-                <w:rFonts w:ascii="Times New Roman" w:hAnsi="Times New Roman" w:cs="Times New Roman"/>
-              </w:rPr>
-            </w:pPr>
-            <w:r>
-              <w:rPr>
-                <w:rFonts w:ascii="Times New Roman" w:hAnsi="Times New Roman" w:cs="Times New Roman"/>
-              </w:rPr>
-              <w:lastRenderedPageBreak/>
+            <w:tcW w:w="670" w:type="dxa"/>
+          </w:tcPr>
+          <w:p>
+            <w:pPr>
+              <w:spacing w:line="360" w:lineRule="auto"/>
+              <w:rPr>
+                <w:rFonts w:ascii="Times New Roman" w:hAnsi="Times New Roman" w:cs="Times New Roman"/>
+              </w:rPr>
+            </w:pPr>
+            <w:r>
+              <w:rPr>
+                <w:rFonts w:ascii="Times New Roman" w:hAnsi="Times New Roman" w:cs="Times New Roman"/>
+              </w:rPr>
               <w:t>CQ4</w:t>
             </w:r>
           </w:p>
         </w:tc>
         <w:tc>
           <w:tcPr>
-            <w:tcW w:w="3117" w:type="dxa"/>
+            <w:tcW w:w="4905" w:type="dxa"/>
           </w:tcPr>
           <w:p>
             <w:pPr>
@@ -10829,7 +10843,7 @@
         </w:tc>
         <w:tc>
           <w:tcPr>
-            <w:tcW w:w="3117" w:type="dxa"/>
+            <w:tcW w:w="3775" w:type="dxa"/>
           </w:tcPr>
           <w:p>
             <w:pPr>
@@ -10850,26 +10864,27 @@
       <w:tr>
         <w:tc>
           <w:tcPr>
-            <w:tcW w:w="3116" w:type="dxa"/>
-          </w:tcPr>
-          <w:p>
-            <w:pPr>
-              <w:spacing w:line="360" w:lineRule="auto"/>
-              <w:rPr>
-                <w:rFonts w:ascii="Times New Roman" w:hAnsi="Times New Roman" w:cs="Times New Roman"/>
-              </w:rPr>
-            </w:pPr>
-            <w:r>
-              <w:rPr>
-                <w:rFonts w:ascii="Times New Roman" w:hAnsi="Times New Roman" w:cs="Times New Roman"/>
-              </w:rPr>
+            <w:tcW w:w="670" w:type="dxa"/>
+          </w:tcPr>
+          <w:p>
+            <w:pPr>
+              <w:spacing w:line="360" w:lineRule="auto"/>
+              <w:rPr>
+                <w:rFonts w:ascii="Times New Roman" w:hAnsi="Times New Roman" w:cs="Times New Roman"/>
+              </w:rPr>
+            </w:pPr>
+            <w:r>
+              <w:rPr>
+                <w:rFonts w:ascii="Times New Roman" w:hAnsi="Times New Roman" w:cs="Times New Roman"/>
+              </w:rPr>
+              <w:lastRenderedPageBreak/>
               <w:t>CQ5</w:t>
             </w:r>
           </w:p>
         </w:tc>
         <w:tc>
           <w:tcPr>
-            <w:tcW w:w="3117" w:type="dxa"/>
+            <w:tcW w:w="4905" w:type="dxa"/>
           </w:tcPr>
           <w:p>
             <w:pPr>
@@ -10894,7 +10909,7 @@
         </w:tc>
         <w:tc>
           <w:tcPr>
-            <w:tcW w:w="3117" w:type="dxa"/>
+            <w:tcW w:w="3775" w:type="dxa"/>
           </w:tcPr>
           <w:p>
             <w:pPr>
@@ -10915,7 +10930,7 @@
       <w:tr>
         <w:tc>
           <w:tcPr>
-            <w:tcW w:w="3116" w:type="dxa"/>
+            <w:tcW w:w="670" w:type="dxa"/>
           </w:tcPr>
           <w:p>
             <w:pPr>
@@ -10934,7 +10949,7 @@
         </w:tc>
         <w:tc>
           <w:tcPr>
-            <w:tcW w:w="3117" w:type="dxa"/>
+            <w:tcW w:w="4905" w:type="dxa"/>
           </w:tcPr>
           <w:p>
             <w:pPr>
@@ -10953,7 +10968,7 @@
         </w:tc>
         <w:tc>
           <w:tcPr>
-            <w:tcW w:w="3117" w:type="dxa"/>
+            <w:tcW w:w="3775" w:type="dxa"/>
           </w:tcPr>
           <w:p>
             <w:pPr>
@@ -10974,7 +10989,7 @@
       <w:tr>
         <w:tc>
           <w:tcPr>
-            <w:tcW w:w="3116" w:type="dxa"/>
+            <w:tcW w:w="670" w:type="dxa"/>
           </w:tcPr>
           <w:p>
             <w:pPr>
@@ -10993,7 +11008,7 @@
         </w:tc>
         <w:tc>
           <w:tcPr>
-            <w:tcW w:w="3117" w:type="dxa"/>
+            <w:tcW w:w="4905" w:type="dxa"/>
           </w:tcPr>
           <w:p>
             <w:pPr>
@@ -11026,7 +11041,7 @@
         </w:tc>
         <w:tc>
           <w:tcPr>
-            <w:tcW w:w="3117" w:type="dxa"/>
+            <w:tcW w:w="3775" w:type="dxa"/>
           </w:tcPr>
           <w:p>
             <w:pPr>
@@ -11047,7 +11062,7 @@
       <w:tr>
         <w:tc>
           <w:tcPr>
-            <w:tcW w:w="3116" w:type="dxa"/>
+            <w:tcW w:w="670" w:type="dxa"/>
           </w:tcPr>
           <w:p>
             <w:pPr>
@@ -11066,7 +11081,7 @@
         </w:tc>
         <w:tc>
           <w:tcPr>
-            <w:tcW w:w="3117" w:type="dxa"/>
+            <w:tcW w:w="4905" w:type="dxa"/>
           </w:tcPr>
           <w:p>
             <w:pPr>
@@ -11085,7 +11100,7 @@
         </w:tc>
         <w:tc>
           <w:tcPr>
-            <w:tcW w:w="3117" w:type="dxa"/>
+            <w:tcW w:w="3775" w:type="dxa"/>
           </w:tcPr>
           <w:p>
             <w:pPr>
@@ -11100,6 +11115,1335 @@
                 <w:rFonts w:ascii="Times New Roman" w:hAnsi="Times New Roman" w:cs="Times New Roman"/>
               </w:rPr>
               <w:t>Access / permissions</w:t>
+            </w:r>
+          </w:p>
+        </w:tc>
+      </w:tr>
+    </w:tbl>
+    <w:p>
+      <w:pPr>
+        <w:pStyle w:val="Heading1"/>
+        <w:rPr>
+          <w:color w:val="auto"/>
+          <w:sz w:val="28"/>
+          <w:szCs w:val="28"/>
+        </w:rPr>
+      </w:pPr>
+      <w:r>
+        <w:rPr>
+          <w:color w:val="auto"/>
+          <w:sz w:val="28"/>
+          <w:szCs w:val="28"/>
+          <w:lang w:val="ru-RU"/>
+        </w:rPr>
+        <w:t>6</w:t>
+      </w:r>
+      <w:r>
+        <w:rPr>
+          <w:color w:val="auto"/>
+          <w:sz w:val="28"/>
+          <w:szCs w:val="28"/>
+        </w:rPr>
+        <w:t>. Use – Case Model</w:t>
+      </w:r>
+    </w:p>
+    <w:p>
+      <w:pPr>
+        <w:pStyle w:val="Heading2"/>
+        <w:spacing w:line="360" w:lineRule="auto"/>
+        <w:rPr>
+          <w:rFonts w:ascii="Times New Roman" w:hAnsi="Times New Roman" w:cs="Times New Roman"/>
+          <w:color w:val="auto"/>
+          <w:sz w:val="24"/>
+          <w:szCs w:val="24"/>
+        </w:rPr>
+      </w:pPr>
+      <w:r>
+        <w:rPr>
+          <w:rFonts w:ascii="Times New Roman" w:hAnsi="Times New Roman" w:cs="Times New Roman"/>
+          <w:color w:val="auto"/>
+          <w:sz w:val="24"/>
+          <w:szCs w:val="24"/>
+        </w:rPr>
+        <w:t>6.1 System Boundary</w:t>
+      </w:r>
+    </w:p>
+    <w:p>
+      <w:pPr>
+        <w:spacing w:line="360" w:lineRule="auto"/>
+        <w:rPr>
+          <w:rFonts w:ascii="Times New Roman" w:hAnsi="Times New Roman" w:cs="Times New Roman"/>
+        </w:rPr>
+      </w:pPr>
+      <w:r>
+        <w:rPr>
+          <w:rFonts w:ascii="Times New Roman" w:hAnsi="Times New Roman" w:cs="Times New Roman"/>
+        </w:rPr>
+        <w:t>The proposed system supports the management of recipe versions, ingredient information, production planning and batch records, quality and release information, customer orders, and production traceability for Kerry Kitchen Collective. The actors identified in Section 3.2 interact with the system to achieve the business goal represented by the use cases below.</w:t>
+      </w:r>
+    </w:p>
+    <w:p>
+      <w:pPr>
+        <w:pStyle w:val="Heading2"/>
+        <w:spacing w:line="360" w:lineRule="auto"/>
+        <w:rPr>
+          <w:rFonts w:ascii="Times New Roman" w:hAnsi="Times New Roman" w:cs="Times New Roman"/>
+          <w:color w:val="auto"/>
+          <w:sz w:val="24"/>
+          <w:szCs w:val="24"/>
+        </w:rPr>
+      </w:pPr>
+      <w:r>
+        <w:rPr>
+          <w:rFonts w:ascii="Times New Roman" w:hAnsi="Times New Roman" w:cs="Times New Roman"/>
+          <w:color w:val="auto"/>
+          <w:sz w:val="24"/>
+          <w:szCs w:val="24"/>
+        </w:rPr>
+        <w:t>6.2 Use – Case Catalogue</w:t>
+      </w:r>
+    </w:p>
+    <w:tbl>
+      <w:tblPr>
+        <w:tblStyle w:val="TableGrid"/>
+        <w:tblW w:w="0" w:type="auto"/>
+        <w:tblLook w:val="04A0" w:firstRow="1" w:lastRow="0" w:firstColumn="1" w:lastColumn="0" w:noHBand="0" w:noVBand="1"/>
+      </w:tblPr>
+      <w:tblGrid>
+        <w:gridCol w:w="673"/>
+        <w:gridCol w:w="1932"/>
+        <w:gridCol w:w="1620"/>
+        <w:gridCol w:w="5125"/>
+      </w:tblGrid>
+      <w:tr>
+        <w:tc>
+          <w:tcPr>
+            <w:tcW w:w="673" w:type="dxa"/>
+          </w:tcPr>
+          <w:p>
+            <w:pPr>
+              <w:spacing w:line="360" w:lineRule="auto"/>
+              <w:rPr>
+                <w:rFonts w:ascii="Times New Roman" w:hAnsi="Times New Roman" w:cs="Times New Roman"/>
+              </w:rPr>
+            </w:pPr>
+            <w:r>
+              <w:rPr>
+                <w:rFonts w:ascii="Times New Roman" w:hAnsi="Times New Roman" w:cs="Times New Roman"/>
+              </w:rPr>
+              <w:t>ID</w:t>
+            </w:r>
+          </w:p>
+        </w:tc>
+        <w:tc>
+          <w:tcPr>
+            <w:tcW w:w="1932" w:type="dxa"/>
+          </w:tcPr>
+          <w:p>
+            <w:pPr>
+              <w:spacing w:line="360" w:lineRule="auto"/>
+              <w:rPr>
+                <w:rFonts w:ascii="Times New Roman" w:hAnsi="Times New Roman" w:cs="Times New Roman"/>
+              </w:rPr>
+            </w:pPr>
+            <w:r>
+              <w:rPr>
+                <w:rFonts w:ascii="Times New Roman" w:hAnsi="Times New Roman" w:cs="Times New Roman"/>
+              </w:rPr>
+              <w:t>Use Case</w:t>
+            </w:r>
+          </w:p>
+        </w:tc>
+        <w:tc>
+          <w:tcPr>
+            <w:tcW w:w="1620" w:type="dxa"/>
+          </w:tcPr>
+          <w:p>
+            <w:pPr>
+              <w:spacing w:line="360" w:lineRule="auto"/>
+              <w:rPr>
+                <w:rFonts w:ascii="Times New Roman" w:hAnsi="Times New Roman" w:cs="Times New Roman"/>
+              </w:rPr>
+            </w:pPr>
+            <w:r>
+              <w:rPr>
+                <w:rFonts w:ascii="Times New Roman" w:hAnsi="Times New Roman" w:cs="Times New Roman"/>
+              </w:rPr>
+              <w:t>Primary Actor</w:t>
+            </w:r>
+          </w:p>
+        </w:tc>
+        <w:tc>
+          <w:tcPr>
+            <w:tcW w:w="5125" w:type="dxa"/>
+          </w:tcPr>
+          <w:p>
+            <w:pPr>
+              <w:spacing w:line="360" w:lineRule="auto"/>
+              <w:rPr>
+                <w:rFonts w:ascii="Times New Roman" w:hAnsi="Times New Roman" w:cs="Times New Roman"/>
+              </w:rPr>
+            </w:pPr>
+            <w:r>
+              <w:rPr>
+                <w:rFonts w:ascii="Times New Roman" w:hAnsi="Times New Roman" w:cs="Times New Roman"/>
+              </w:rPr>
+              <w:t>Goal</w:t>
+            </w:r>
+          </w:p>
+        </w:tc>
+      </w:tr>
+      <w:tr>
+        <w:tc>
+          <w:tcPr>
+            <w:tcW w:w="673" w:type="dxa"/>
+          </w:tcPr>
+          <w:p>
+            <w:pPr>
+              <w:spacing w:line="360" w:lineRule="auto"/>
+              <w:rPr>
+                <w:rFonts w:ascii="Times New Roman" w:hAnsi="Times New Roman" w:cs="Times New Roman"/>
+              </w:rPr>
+            </w:pPr>
+            <w:r>
+              <w:rPr>
+                <w:rFonts w:ascii="Times New Roman" w:hAnsi="Times New Roman" w:cs="Times New Roman"/>
+              </w:rPr>
+              <w:t>UC1</w:t>
+            </w:r>
+          </w:p>
+        </w:tc>
+        <w:tc>
+          <w:tcPr>
+            <w:tcW w:w="1932" w:type="dxa"/>
+          </w:tcPr>
+          <w:p>
+            <w:pPr>
+              <w:spacing w:line="360" w:lineRule="auto"/>
+              <w:rPr>
+                <w:rFonts w:ascii="Times New Roman" w:hAnsi="Times New Roman" w:cs="Times New Roman"/>
+              </w:rPr>
+            </w:pPr>
+            <w:r>
+              <w:rPr>
+                <w:rFonts w:ascii="Times New Roman" w:hAnsi="Times New Roman" w:cs="Times New Roman"/>
+              </w:rPr>
+              <w:t>Manage Recipe Versions</w:t>
+            </w:r>
+          </w:p>
+        </w:tc>
+        <w:tc>
+          <w:tcPr>
+            <w:tcW w:w="1620" w:type="dxa"/>
+          </w:tcPr>
+          <w:p>
+            <w:pPr>
+              <w:spacing w:line="360" w:lineRule="auto"/>
+              <w:rPr>
+                <w:rFonts w:ascii="Times New Roman" w:hAnsi="Times New Roman" w:cs="Times New Roman"/>
+              </w:rPr>
+            </w:pPr>
+            <w:r>
+              <w:rPr>
+                <w:rFonts w:ascii="Times New Roman" w:hAnsi="Times New Roman" w:cs="Times New Roman"/>
+              </w:rPr>
+              <w:t>Production Manager</w:t>
+            </w:r>
+          </w:p>
+        </w:tc>
+        <w:tc>
+          <w:tcPr>
+            <w:tcW w:w="5125" w:type="dxa"/>
+          </w:tcPr>
+          <w:p>
+            <w:pPr>
+              <w:spacing w:line="360" w:lineRule="auto"/>
+              <w:rPr>
+                <w:rFonts w:ascii="Times New Roman" w:hAnsi="Times New Roman" w:cs="Times New Roman"/>
+              </w:rPr>
+            </w:pPr>
+            <w:r>
+              <w:rPr>
+                <w:rFonts w:ascii="Times New Roman" w:hAnsi="Times New Roman" w:cs="Times New Roman"/>
+              </w:rPr>
+              <w:t>Maintain identifiable approved recipe versions for products</w:t>
+            </w:r>
+          </w:p>
+        </w:tc>
+      </w:tr>
+      <w:tr>
+        <w:tc>
+          <w:tcPr>
+            <w:tcW w:w="673" w:type="dxa"/>
+          </w:tcPr>
+          <w:p>
+            <w:pPr>
+              <w:spacing w:line="360" w:lineRule="auto"/>
+              <w:rPr>
+                <w:rFonts w:ascii="Times New Roman" w:hAnsi="Times New Roman" w:cs="Times New Roman"/>
+              </w:rPr>
+            </w:pPr>
+            <w:r>
+              <w:rPr>
+                <w:rFonts w:ascii="Times New Roman" w:hAnsi="Times New Roman" w:cs="Times New Roman"/>
+              </w:rPr>
+              <w:t>UC2</w:t>
+            </w:r>
+          </w:p>
+        </w:tc>
+        <w:tc>
+          <w:tcPr>
+            <w:tcW w:w="1932" w:type="dxa"/>
+          </w:tcPr>
+          <w:p>
+            <w:pPr>
+              <w:spacing w:line="360" w:lineRule="auto"/>
+              <w:rPr>
+                <w:rFonts w:ascii="Times New Roman" w:hAnsi="Times New Roman" w:cs="Times New Roman"/>
+              </w:rPr>
+            </w:pPr>
+            <w:r>
+              <w:rPr>
+                <w:rFonts w:ascii="Times New Roman" w:hAnsi="Times New Roman" w:cs="Times New Roman"/>
+              </w:rPr>
+              <w:t>Maintain Ingredient Information</w:t>
+            </w:r>
+          </w:p>
+        </w:tc>
+        <w:tc>
+          <w:tcPr>
+            <w:tcW w:w="1620" w:type="dxa"/>
+          </w:tcPr>
+          <w:p>
+            <w:pPr>
+              <w:spacing w:line="360" w:lineRule="auto"/>
+              <w:rPr>
+                <w:rFonts w:ascii="Times New Roman" w:hAnsi="Times New Roman" w:cs="Times New Roman"/>
+              </w:rPr>
+            </w:pPr>
+            <w:r>
+              <w:rPr>
+                <w:rFonts w:ascii="Times New Roman" w:hAnsi="Times New Roman" w:cs="Times New Roman"/>
+              </w:rPr>
+              <w:t>Stores Coordinator</w:t>
+            </w:r>
+          </w:p>
+        </w:tc>
+        <w:tc>
+          <w:tcPr>
+            <w:tcW w:w="5125" w:type="dxa"/>
+          </w:tcPr>
+          <w:p>
+            <w:pPr>
+              <w:spacing w:line="360" w:lineRule="auto"/>
+              <w:rPr>
+                <w:rFonts w:ascii="Times New Roman" w:hAnsi="Times New Roman" w:cs="Times New Roman"/>
+              </w:rPr>
+            </w:pPr>
+            <w:r>
+              <w:rPr>
+                <w:rFonts w:ascii="Times New Roman" w:hAnsi="Times New Roman" w:cs="Times New Roman"/>
+              </w:rPr>
+              <w:t>Maintain current ingredient stock, supplier batch and availability information</w:t>
+            </w:r>
+          </w:p>
+        </w:tc>
+      </w:tr>
+      <w:tr>
+        <w:tc>
+          <w:tcPr>
+            <w:tcW w:w="673" w:type="dxa"/>
+          </w:tcPr>
+          <w:p>
+            <w:pPr>
+              <w:spacing w:line="360" w:lineRule="auto"/>
+              <w:rPr>
+                <w:rFonts w:ascii="Times New Roman" w:hAnsi="Times New Roman" w:cs="Times New Roman"/>
+              </w:rPr>
+            </w:pPr>
+            <w:r>
+              <w:rPr>
+                <w:rFonts w:ascii="Times New Roman" w:hAnsi="Times New Roman" w:cs="Times New Roman"/>
+              </w:rPr>
+              <w:t>UC3</w:t>
+            </w:r>
+          </w:p>
+        </w:tc>
+        <w:tc>
+          <w:tcPr>
+            <w:tcW w:w="1932" w:type="dxa"/>
+          </w:tcPr>
+          <w:p>
+            <w:pPr>
+              <w:spacing w:line="360" w:lineRule="auto"/>
+              <w:rPr>
+                <w:rFonts w:ascii="Times New Roman" w:hAnsi="Times New Roman" w:cs="Times New Roman"/>
+              </w:rPr>
+            </w:pPr>
+            <w:r>
+              <w:rPr>
+                <w:rFonts w:ascii="Times New Roman" w:hAnsi="Times New Roman" w:cs="Times New Roman"/>
+              </w:rPr>
+              <w:t>Plan Production Batch</w:t>
+            </w:r>
+          </w:p>
+        </w:tc>
+        <w:tc>
+          <w:tcPr>
+            <w:tcW w:w="1620" w:type="dxa"/>
+          </w:tcPr>
+          <w:p>
+            <w:pPr>
+              <w:spacing w:line="360" w:lineRule="auto"/>
+              <w:rPr>
+                <w:rFonts w:ascii="Times New Roman" w:hAnsi="Times New Roman" w:cs="Times New Roman"/>
+              </w:rPr>
+            </w:pPr>
+            <w:r>
+              <w:rPr>
+                <w:rFonts w:ascii="Times New Roman" w:hAnsi="Times New Roman" w:cs="Times New Roman"/>
+              </w:rPr>
+              <w:t>Production Manager</w:t>
+            </w:r>
+          </w:p>
+        </w:tc>
+        <w:tc>
+          <w:tcPr>
+            <w:tcW w:w="5125" w:type="dxa"/>
+          </w:tcPr>
+          <w:p>
+            <w:pPr>
+              <w:spacing w:line="360" w:lineRule="auto"/>
+              <w:rPr>
+                <w:rFonts w:ascii="Times New Roman" w:hAnsi="Times New Roman" w:cs="Times New Roman"/>
+              </w:rPr>
+            </w:pPr>
+            <w:r>
+              <w:rPr>
+                <w:rFonts w:ascii="Times New Roman" w:hAnsi="Times New Roman" w:cs="Times New Roman"/>
+              </w:rPr>
+              <w:t>Use relevant order, ingredient and production information to plan a production batch</w:t>
+            </w:r>
+          </w:p>
+        </w:tc>
+      </w:tr>
+      <w:tr>
+        <w:tc>
+          <w:tcPr>
+            <w:tcW w:w="673" w:type="dxa"/>
+          </w:tcPr>
+          <w:p>
+            <w:pPr>
+              <w:spacing w:line="360" w:lineRule="auto"/>
+              <w:rPr>
+                <w:rFonts w:ascii="Times New Roman" w:hAnsi="Times New Roman" w:cs="Times New Roman"/>
+              </w:rPr>
+            </w:pPr>
+            <w:r>
+              <w:rPr>
+                <w:rFonts w:ascii="Times New Roman" w:hAnsi="Times New Roman" w:cs="Times New Roman"/>
+              </w:rPr>
+              <w:t>UC4</w:t>
+            </w:r>
+          </w:p>
+        </w:tc>
+        <w:tc>
+          <w:tcPr>
+            <w:tcW w:w="1932" w:type="dxa"/>
+          </w:tcPr>
+          <w:p>
+            <w:pPr>
+              <w:spacing w:line="360" w:lineRule="auto"/>
+              <w:rPr>
+                <w:rFonts w:ascii="Times New Roman" w:hAnsi="Times New Roman" w:cs="Times New Roman"/>
+              </w:rPr>
+            </w:pPr>
+            <w:r>
+              <w:rPr>
+                <w:rFonts w:ascii="Times New Roman" w:hAnsi="Times New Roman" w:cs="Times New Roman"/>
+              </w:rPr>
+              <w:t>Record Production Batch</w:t>
+            </w:r>
+          </w:p>
+        </w:tc>
+        <w:tc>
+          <w:tcPr>
+            <w:tcW w:w="1620" w:type="dxa"/>
+          </w:tcPr>
+          <w:p>
+            <w:pPr>
+              <w:spacing w:line="360" w:lineRule="auto"/>
+              <w:rPr>
+                <w:rFonts w:ascii="Times New Roman" w:hAnsi="Times New Roman" w:cs="Times New Roman"/>
+              </w:rPr>
+            </w:pPr>
+            <w:r>
+              <w:rPr>
+                <w:rFonts w:ascii="Times New Roman" w:hAnsi="Times New Roman" w:cs="Times New Roman"/>
+              </w:rPr>
+              <w:t>Kitchen Worker</w:t>
+            </w:r>
+          </w:p>
+        </w:tc>
+        <w:tc>
+          <w:tcPr>
+            <w:tcW w:w="5125" w:type="dxa"/>
+          </w:tcPr>
+          <w:p>
+            <w:pPr>
+              <w:spacing w:line="360" w:lineRule="auto"/>
+              <w:rPr>
+                <w:rFonts w:ascii="Times New Roman" w:hAnsi="Times New Roman" w:cs="Times New Roman"/>
+              </w:rPr>
+            </w:pPr>
+            <w:r>
+              <w:rPr>
+                <w:rFonts w:ascii="Times New Roman" w:hAnsi="Times New Roman" w:cs="Times New Roman"/>
+              </w:rPr>
+              <w:t>Record the recipe version, ingredient batches, actual quantities, production time, yield and observations for a production batch</w:t>
+            </w:r>
+          </w:p>
+        </w:tc>
+      </w:tr>
+      <w:tr>
+        <w:tc>
+          <w:tcPr>
+            <w:tcW w:w="673" w:type="dxa"/>
+          </w:tcPr>
+          <w:p>
+            <w:pPr>
+              <w:spacing w:line="360" w:lineRule="auto"/>
+              <w:rPr>
+                <w:rFonts w:ascii="Times New Roman" w:hAnsi="Times New Roman" w:cs="Times New Roman"/>
+              </w:rPr>
+            </w:pPr>
+            <w:r>
+              <w:rPr>
+                <w:rFonts w:ascii="Times New Roman" w:hAnsi="Times New Roman" w:cs="Times New Roman"/>
+              </w:rPr>
+              <w:lastRenderedPageBreak/>
+              <w:t>UC5</w:t>
+            </w:r>
+          </w:p>
+        </w:tc>
+        <w:tc>
+          <w:tcPr>
+            <w:tcW w:w="1932" w:type="dxa"/>
+          </w:tcPr>
+          <w:p>
+            <w:pPr>
+              <w:spacing w:line="360" w:lineRule="auto"/>
+              <w:rPr>
+                <w:rFonts w:ascii="Times New Roman" w:hAnsi="Times New Roman" w:cs="Times New Roman"/>
+              </w:rPr>
+            </w:pPr>
+            <w:r>
+              <w:rPr>
+                <w:rFonts w:ascii="Times New Roman" w:hAnsi="Times New Roman" w:cs="Times New Roman"/>
+              </w:rPr>
+              <w:t>Record Ingredient Substitution</w:t>
+            </w:r>
+          </w:p>
+        </w:tc>
+        <w:tc>
+          <w:tcPr>
+            <w:tcW w:w="1620" w:type="dxa"/>
+          </w:tcPr>
+          <w:p>
+            <w:pPr>
+              <w:spacing w:line="360" w:lineRule="auto"/>
+              <w:rPr>
+                <w:rFonts w:ascii="Times New Roman" w:hAnsi="Times New Roman" w:cs="Times New Roman"/>
+              </w:rPr>
+            </w:pPr>
+            <w:r>
+              <w:rPr>
+                <w:rFonts w:ascii="Times New Roman" w:hAnsi="Times New Roman" w:cs="Times New Roman"/>
+              </w:rPr>
+              <w:t>Kitchen Worker</w:t>
+            </w:r>
+          </w:p>
+        </w:tc>
+        <w:tc>
+          <w:tcPr>
+            <w:tcW w:w="5125" w:type="dxa"/>
+          </w:tcPr>
+          <w:p>
+            <w:pPr>
+              <w:spacing w:line="360" w:lineRule="auto"/>
+              <w:rPr>
+                <w:rFonts w:ascii="Times New Roman" w:hAnsi="Times New Roman" w:cs="Times New Roman"/>
+              </w:rPr>
+            </w:pPr>
+            <w:r>
+              <w:rPr>
+                <w:rFonts w:ascii="Times New Roman" w:hAnsi="Times New Roman" w:cs="Times New Roman"/>
+              </w:rPr>
+              <w:t>Record an ingredient substitution associated with a production batch</w:t>
+            </w:r>
+          </w:p>
+        </w:tc>
+      </w:tr>
+      <w:tr>
+        <w:tc>
+          <w:tcPr>
+            <w:tcW w:w="673" w:type="dxa"/>
+          </w:tcPr>
+          <w:p>
+            <w:pPr>
+              <w:spacing w:line="360" w:lineRule="auto"/>
+              <w:rPr>
+                <w:rFonts w:ascii="Times New Roman" w:hAnsi="Times New Roman" w:cs="Times New Roman"/>
+              </w:rPr>
+            </w:pPr>
+            <w:r>
+              <w:rPr>
+                <w:rFonts w:ascii="Times New Roman" w:hAnsi="Times New Roman" w:cs="Times New Roman"/>
+              </w:rPr>
+              <w:t>UC6</w:t>
+            </w:r>
+          </w:p>
+        </w:tc>
+        <w:tc>
+          <w:tcPr>
+            <w:tcW w:w="1932" w:type="dxa"/>
+          </w:tcPr>
+          <w:p>
+            <w:pPr>
+              <w:spacing w:line="360" w:lineRule="auto"/>
+              <w:rPr>
+                <w:rFonts w:ascii="Times New Roman" w:hAnsi="Times New Roman" w:cs="Times New Roman"/>
+              </w:rPr>
+            </w:pPr>
+            <w:r>
+              <w:rPr>
+                <w:rFonts w:ascii="Times New Roman" w:hAnsi="Times New Roman" w:cs="Times New Roman"/>
+              </w:rPr>
+              <w:t>Record Quality Check</w:t>
+            </w:r>
+          </w:p>
+        </w:tc>
+        <w:tc>
+          <w:tcPr>
+            <w:tcW w:w="1620" w:type="dxa"/>
+          </w:tcPr>
+          <w:p>
+            <w:pPr>
+              <w:spacing w:line="360" w:lineRule="auto"/>
+              <w:rPr>
+                <w:rFonts w:ascii="Times New Roman" w:hAnsi="Times New Roman" w:cs="Times New Roman"/>
+              </w:rPr>
+            </w:pPr>
+            <w:r>
+              <w:rPr>
+                <w:rFonts w:ascii="Times New Roman" w:hAnsi="Times New Roman" w:cs="Times New Roman"/>
+              </w:rPr>
+              <w:t>Quality Checker</w:t>
+            </w:r>
+          </w:p>
+        </w:tc>
+        <w:tc>
+          <w:tcPr>
+            <w:tcW w:w="5125" w:type="dxa"/>
+          </w:tcPr>
+          <w:p>
+            <w:pPr>
+              <w:spacing w:line="360" w:lineRule="auto"/>
+              <w:rPr>
+                <w:rFonts w:ascii="Times New Roman" w:hAnsi="Times New Roman" w:cs="Times New Roman"/>
+              </w:rPr>
+            </w:pPr>
+            <w:r>
+              <w:rPr>
+                <w:rFonts w:ascii="Times New Roman" w:hAnsi="Times New Roman" w:cs="Times New Roman"/>
+              </w:rPr>
+              <w:t>Record quality – results and the status of production output</w:t>
+            </w:r>
+          </w:p>
+        </w:tc>
+      </w:tr>
+      <w:tr>
+        <w:tc>
+          <w:tcPr>
+            <w:tcW w:w="673" w:type="dxa"/>
+          </w:tcPr>
+          <w:p>
+            <w:pPr>
+              <w:spacing w:line="360" w:lineRule="auto"/>
+              <w:rPr>
+                <w:rFonts w:ascii="Times New Roman" w:hAnsi="Times New Roman" w:cs="Times New Roman"/>
+              </w:rPr>
+            </w:pPr>
+            <w:r>
+              <w:rPr>
+                <w:rFonts w:ascii="Times New Roman" w:hAnsi="Times New Roman" w:cs="Times New Roman"/>
+              </w:rPr>
+              <w:t>UC7</w:t>
+            </w:r>
+          </w:p>
+        </w:tc>
+        <w:tc>
+          <w:tcPr>
+            <w:tcW w:w="1932" w:type="dxa"/>
+          </w:tcPr>
+          <w:p>
+            <w:pPr>
+              <w:spacing w:line="360" w:lineRule="auto"/>
+              <w:rPr>
+                <w:rFonts w:ascii="Times New Roman" w:hAnsi="Times New Roman" w:cs="Times New Roman"/>
+              </w:rPr>
+            </w:pPr>
+            <w:r>
+              <w:rPr>
+                <w:rFonts w:ascii="Times New Roman" w:hAnsi="Times New Roman" w:cs="Times New Roman"/>
+              </w:rPr>
+              <w:t>Maintain Order Allocation</w:t>
+            </w:r>
+          </w:p>
+        </w:tc>
+        <w:tc>
+          <w:tcPr>
+            <w:tcW w:w="1620" w:type="dxa"/>
+          </w:tcPr>
+          <w:p>
+            <w:pPr>
+              <w:spacing w:line="360" w:lineRule="auto"/>
+              <w:rPr>
+                <w:rFonts w:ascii="Times New Roman" w:hAnsi="Times New Roman" w:cs="Times New Roman"/>
+              </w:rPr>
+            </w:pPr>
+            <w:r>
+              <w:rPr>
+                <w:rFonts w:ascii="Times New Roman" w:hAnsi="Times New Roman" w:cs="Times New Roman"/>
+              </w:rPr>
+              <w:t>Customer Coordinator</w:t>
+            </w:r>
+          </w:p>
+        </w:tc>
+        <w:tc>
+          <w:tcPr>
+            <w:tcW w:w="5125" w:type="dxa"/>
+          </w:tcPr>
+          <w:p>
+            <w:pPr>
+              <w:spacing w:line="360" w:lineRule="auto"/>
+              <w:rPr>
+                <w:rFonts w:ascii="Times New Roman" w:hAnsi="Times New Roman" w:cs="Times New Roman"/>
+              </w:rPr>
+            </w:pPr>
+            <w:r>
+              <w:rPr>
+                <w:rFonts w:ascii="Times New Roman" w:hAnsi="Times New Roman" w:cs="Times New Roman"/>
+              </w:rPr>
+              <w:t>Maintain the relationship between customer orders and the production batches used to fulfill them</w:t>
+            </w:r>
+          </w:p>
+        </w:tc>
+      </w:tr>
+      <w:tr>
+        <w:tc>
+          <w:tcPr>
+            <w:tcW w:w="673" w:type="dxa"/>
+          </w:tcPr>
+          <w:p>
+            <w:pPr>
+              <w:spacing w:line="360" w:lineRule="auto"/>
+              <w:rPr>
+                <w:rFonts w:ascii="Times New Roman" w:hAnsi="Times New Roman" w:cs="Times New Roman"/>
+              </w:rPr>
+            </w:pPr>
+            <w:r>
+              <w:rPr>
+                <w:rFonts w:ascii="Times New Roman" w:hAnsi="Times New Roman" w:cs="Times New Roman"/>
+              </w:rPr>
+              <w:t>UC8</w:t>
+            </w:r>
+          </w:p>
+        </w:tc>
+        <w:tc>
+          <w:tcPr>
+            <w:tcW w:w="1932" w:type="dxa"/>
+          </w:tcPr>
+          <w:p>
+            <w:pPr>
+              <w:spacing w:line="360" w:lineRule="auto"/>
+              <w:rPr>
+                <w:rFonts w:ascii="Times New Roman" w:hAnsi="Times New Roman" w:cs="Times New Roman"/>
+              </w:rPr>
+            </w:pPr>
+            <w:r>
+              <w:rPr>
+                <w:rFonts w:ascii="Times New Roman" w:hAnsi="Times New Roman" w:cs="Times New Roman"/>
+              </w:rPr>
+              <w:t>Trace Affected Orders</w:t>
+            </w:r>
+          </w:p>
+        </w:tc>
+        <w:tc>
+          <w:tcPr>
+            <w:tcW w:w="1620" w:type="dxa"/>
+          </w:tcPr>
+          <w:p>
+            <w:pPr>
+              <w:spacing w:line="360" w:lineRule="auto"/>
+              <w:rPr>
+                <w:rFonts w:ascii="Times New Roman" w:hAnsi="Times New Roman" w:cs="Times New Roman"/>
+              </w:rPr>
+            </w:pPr>
+            <w:r>
+              <w:rPr>
+                <w:rFonts w:ascii="Times New Roman" w:hAnsi="Times New Roman" w:cs="Times New Roman"/>
+              </w:rPr>
+              <w:t>Traceability Lead</w:t>
+            </w:r>
+          </w:p>
+        </w:tc>
+        <w:tc>
+          <w:tcPr>
+            <w:tcW w:w="5125" w:type="dxa"/>
+          </w:tcPr>
+          <w:p>
+            <w:pPr>
+              <w:spacing w:line="360" w:lineRule="auto"/>
+              <w:rPr>
+                <w:rFonts w:ascii="Times New Roman" w:hAnsi="Times New Roman" w:cs="Times New Roman"/>
+              </w:rPr>
+            </w:pPr>
+            <w:r>
+              <w:rPr>
+                <w:rFonts w:ascii="Times New Roman" w:hAnsi="Times New Roman" w:cs="Times New Roman"/>
+              </w:rPr>
+              <w:t>Trace ingredient batches through production batches to affected customer orders</w:t>
+            </w:r>
+          </w:p>
+        </w:tc>
+      </w:tr>
+    </w:tbl>
+    <w:p>
+      <w:pPr>
+        <w:spacing w:line="360" w:lineRule="auto"/>
+        <w:rPr>
+          <w:rFonts w:ascii="Times New Roman" w:hAnsi="Times New Roman" w:cs="Times New Roman"/>
+        </w:rPr>
+      </w:pPr>
+      <w:r>
+        <w:rPr>
+          <w:rFonts w:ascii="Times New Roman" w:hAnsi="Times New Roman" w:cs="Times New Roman"/>
+        </w:rPr>
+        <w:t>The Production Manager is provisionally associated with UC1 based on Assumption A1. The authority to approve recipe versions requires stakeholder confirmation CQ1</w:t>
+      </w:r>
+    </w:p>
+    <w:p>
+      <w:pPr>
+        <w:pStyle w:val="Heading2"/>
+        <w:rPr>
+          <w:rFonts w:ascii="Times New Roman" w:hAnsi="Times New Roman" w:cs="Times New Roman"/>
+          <w:color w:val="auto"/>
+          <w:sz w:val="24"/>
+          <w:szCs w:val="24"/>
+        </w:rPr>
+      </w:pPr>
+      <w:r>
+        <w:rPr>
+          <w:rFonts w:ascii="Times New Roman" w:hAnsi="Times New Roman" w:cs="Times New Roman"/>
+          <w:color w:val="auto"/>
+          <w:sz w:val="24"/>
+          <w:szCs w:val="24"/>
+        </w:rPr>
+        <w:lastRenderedPageBreak/>
+        <w:t>6.3 Use – Case Diagram</w:t>
+      </w:r>
+    </w:p>
+    <w:p>
+      <w:r>
+        <w:rPr>
+          <w:noProof/>
+        </w:rPr>
+        <w:drawing>
+          <wp:inline distT="0" distB="0" distL="0" distR="0" wp14:anchorId="121D387B" wp14:editId="3F6DBD3D">
+            <wp:extent cx="5306165" cy="7201905"/>
+            <wp:effectExtent l="0" t="0" r="8890" b="0"/>
+            <wp:docPr id="1827913816" name="Picture 1"/>
+            <wp:cNvGraphicFramePr>
+              <a:graphicFrameLocks xmlns:a="http://schemas.openxmlformats.org/drawingml/2006/main" noChangeAspect="1"/>
+            </wp:cNvGraphicFramePr>
+            <a:graphic xmlns:a="http://schemas.openxmlformats.org/drawingml/2006/main">
+              <a:graphicData uri="http://schemas.openxmlformats.org/drawingml/2006/picture">
+                <pic:pic xmlns:pic="http://schemas.openxmlformats.org/drawingml/2006/picture">
+                  <pic:nvPicPr>
+                    <pic:cNvPr id="1827913816" name="Picture 1827913816"/>
+                    <pic:cNvPicPr/>
+                  </pic:nvPicPr>
+                  <pic:blipFill>
+                    <a:blip r:embed="rId8">
+                      <a:extLst>
+                        <a:ext uri="{28A0092B-C50C-407E-A947-70E740481C1C}">
+                          <a14:useLocalDpi xmlns:a14="http://schemas.microsoft.com/office/drawing/2010/main" val="0"/>
+                        </a:ext>
+                      </a:extLst>
+                    </a:blip>
+                    <a:stretch>
+                      <a:fillRect/>
+                    </a:stretch>
+                  </pic:blipFill>
+                  <pic:spPr>
+                    <a:xfrm>
+                      <a:off x="0" y="0"/>
+                      <a:ext cx="5306165" cy="7201905"/>
+                    </a:xfrm>
+                    <a:prstGeom prst="rect">
+                      <a:avLst/>
+                    </a:prstGeom>
+                  </pic:spPr>
+                </pic:pic>
+              </a:graphicData>
+            </a:graphic>
+          </wp:inline>
+        </w:drawing>
+      </w:r>
+    </w:p>
+    <w:p>
+      <w:pPr>
+        <w:pStyle w:val="Heading2"/>
+        <w:spacing w:line="360" w:lineRule="auto"/>
+        <w:rPr>
+          <w:rFonts w:ascii="Times New Roman" w:hAnsi="Times New Roman" w:cs="Times New Roman"/>
+          <w:color w:val="auto"/>
+          <w:sz w:val="24"/>
+          <w:szCs w:val="24"/>
+        </w:rPr>
+      </w:pPr>
+      <w:r>
+        <w:rPr>
+          <w:rFonts w:ascii="Times New Roman" w:hAnsi="Times New Roman" w:cs="Times New Roman"/>
+          <w:color w:val="auto"/>
+          <w:sz w:val="24"/>
+          <w:szCs w:val="24"/>
+        </w:rPr>
+        <w:t>6.4 Detailed Use Case – UC4 Record Production Batch</w:t>
+      </w:r>
+    </w:p>
+    <w:tbl>
+      <w:tblPr>
+        <w:tblStyle w:val="TableGrid"/>
+        <w:tblW w:w="0" w:type="auto"/>
+        <w:tblLook w:val="04A0" w:firstRow="1" w:lastRow="0" w:firstColumn="1" w:lastColumn="0" w:noHBand="0" w:noVBand="1"/>
+      </w:tblPr>
+      <w:tblGrid>
+        <w:gridCol w:w="1885"/>
+        <w:gridCol w:w="7465"/>
+      </w:tblGrid>
+      <w:tr>
+        <w:tc>
+          <w:tcPr>
+            <w:tcW w:w="1885" w:type="dxa"/>
+          </w:tcPr>
+          <w:p>
+            <w:pPr>
+              <w:spacing w:line="360" w:lineRule="auto"/>
+              <w:rPr>
+                <w:rFonts w:ascii="Times New Roman" w:hAnsi="Times New Roman" w:cs="Times New Roman"/>
+              </w:rPr>
+            </w:pPr>
+            <w:r>
+              <w:rPr>
+                <w:rFonts w:ascii="Times New Roman" w:hAnsi="Times New Roman" w:cs="Times New Roman"/>
+              </w:rPr>
+              <w:t>Field</w:t>
+            </w:r>
+          </w:p>
+        </w:tc>
+        <w:tc>
+          <w:tcPr>
+            <w:tcW w:w="7465" w:type="dxa"/>
+          </w:tcPr>
+          <w:p>
+            <w:pPr>
+              <w:spacing w:line="360" w:lineRule="auto"/>
+              <w:rPr>
+                <w:rFonts w:ascii="Times New Roman" w:hAnsi="Times New Roman" w:cs="Times New Roman"/>
+              </w:rPr>
+            </w:pPr>
+            <w:r>
+              <w:rPr>
+                <w:rFonts w:ascii="Times New Roman" w:hAnsi="Times New Roman" w:cs="Times New Roman"/>
+              </w:rPr>
+              <w:t>Description</w:t>
+            </w:r>
+          </w:p>
+        </w:tc>
+      </w:tr>
+      <w:tr>
+        <w:tc>
+          <w:tcPr>
+            <w:tcW w:w="1885" w:type="dxa"/>
+          </w:tcPr>
+          <w:p>
+            <w:pPr>
+              <w:spacing w:line="360" w:lineRule="auto"/>
+              <w:rPr>
+                <w:rFonts w:ascii="Times New Roman" w:hAnsi="Times New Roman" w:cs="Times New Roman"/>
+              </w:rPr>
+            </w:pPr>
+            <w:r>
+              <w:rPr>
+                <w:rFonts w:ascii="Times New Roman" w:hAnsi="Times New Roman" w:cs="Times New Roman"/>
+              </w:rPr>
+              <w:lastRenderedPageBreak/>
+              <w:t>Use Case ID</w:t>
+            </w:r>
+          </w:p>
+        </w:tc>
+        <w:tc>
+          <w:tcPr>
+            <w:tcW w:w="7465" w:type="dxa"/>
+          </w:tcPr>
+          <w:p>
+            <w:pPr>
+              <w:spacing w:line="360" w:lineRule="auto"/>
+              <w:rPr>
+                <w:rFonts w:ascii="Times New Roman" w:hAnsi="Times New Roman" w:cs="Times New Roman"/>
+              </w:rPr>
+            </w:pPr>
+            <w:r>
+              <w:rPr>
+                <w:rFonts w:ascii="Times New Roman" w:hAnsi="Times New Roman" w:cs="Times New Roman"/>
+              </w:rPr>
+              <w:t>UC4</w:t>
+            </w:r>
+          </w:p>
+        </w:tc>
+      </w:tr>
+      <w:tr>
+        <w:tc>
+          <w:tcPr>
+            <w:tcW w:w="1885" w:type="dxa"/>
+          </w:tcPr>
+          <w:p>
+            <w:pPr>
+              <w:spacing w:line="360" w:lineRule="auto"/>
+              <w:rPr>
+                <w:rFonts w:ascii="Times New Roman" w:hAnsi="Times New Roman" w:cs="Times New Roman"/>
+              </w:rPr>
+            </w:pPr>
+            <w:r>
+              <w:rPr>
+                <w:rFonts w:ascii="Times New Roman" w:hAnsi="Times New Roman" w:cs="Times New Roman"/>
+              </w:rPr>
+              <w:t>Use Case Name</w:t>
+            </w:r>
+          </w:p>
+        </w:tc>
+        <w:tc>
+          <w:tcPr>
+            <w:tcW w:w="7465" w:type="dxa"/>
+          </w:tcPr>
+          <w:p>
+            <w:pPr>
+              <w:spacing w:line="360" w:lineRule="auto"/>
+              <w:rPr>
+                <w:rFonts w:ascii="Times New Roman" w:hAnsi="Times New Roman" w:cs="Times New Roman"/>
+              </w:rPr>
+            </w:pPr>
+            <w:r>
+              <w:rPr>
+                <w:rFonts w:ascii="Times New Roman" w:hAnsi="Times New Roman" w:cs="Times New Roman"/>
+              </w:rPr>
+              <w:t>Record Production Batch</w:t>
+            </w:r>
+          </w:p>
+        </w:tc>
+      </w:tr>
+      <w:tr>
+        <w:tc>
+          <w:tcPr>
+            <w:tcW w:w="1885" w:type="dxa"/>
+          </w:tcPr>
+          <w:p>
+            <w:pPr>
+              <w:spacing w:line="360" w:lineRule="auto"/>
+              <w:rPr>
+                <w:rFonts w:ascii="Times New Roman" w:hAnsi="Times New Roman" w:cs="Times New Roman"/>
+              </w:rPr>
+            </w:pPr>
+            <w:r>
+              <w:rPr>
+                <w:rFonts w:ascii="Times New Roman" w:hAnsi="Times New Roman" w:cs="Times New Roman"/>
+              </w:rPr>
+              <w:t>Scope</w:t>
+            </w:r>
+          </w:p>
+        </w:tc>
+        <w:tc>
+          <w:tcPr>
+            <w:tcW w:w="7465" w:type="dxa"/>
+          </w:tcPr>
+          <w:p>
+            <w:pPr>
+              <w:spacing w:line="360" w:lineRule="auto"/>
+              <w:rPr>
+                <w:rFonts w:ascii="Times New Roman" w:hAnsi="Times New Roman" w:cs="Times New Roman"/>
+              </w:rPr>
+            </w:pPr>
+            <w:r>
+              <w:rPr>
+                <w:rFonts w:ascii="Times New Roman" w:hAnsi="Times New Roman" w:cs="Times New Roman"/>
+              </w:rPr>
+              <w:t>Kitchen Production Management System</w:t>
+            </w:r>
+          </w:p>
+        </w:tc>
+      </w:tr>
+      <w:tr>
+        <w:tc>
+          <w:tcPr>
+            <w:tcW w:w="1885" w:type="dxa"/>
+          </w:tcPr>
+          <w:p>
+            <w:pPr>
+              <w:spacing w:line="360" w:lineRule="auto"/>
+              <w:rPr>
+                <w:rFonts w:ascii="Times New Roman" w:hAnsi="Times New Roman" w:cs="Times New Roman"/>
+              </w:rPr>
+            </w:pPr>
+            <w:r>
+              <w:rPr>
+                <w:rFonts w:ascii="Times New Roman" w:hAnsi="Times New Roman" w:cs="Times New Roman"/>
+              </w:rPr>
+              <w:t xml:space="preserve">Level </w:t>
+            </w:r>
+          </w:p>
+        </w:tc>
+        <w:tc>
+          <w:tcPr>
+            <w:tcW w:w="7465" w:type="dxa"/>
+          </w:tcPr>
+          <w:p>
+            <w:pPr>
+              <w:spacing w:line="360" w:lineRule="auto"/>
+              <w:rPr>
+                <w:rFonts w:ascii="Times New Roman" w:hAnsi="Times New Roman" w:cs="Times New Roman"/>
+              </w:rPr>
+            </w:pPr>
+            <w:r>
+              <w:rPr>
+                <w:rFonts w:ascii="Times New Roman" w:hAnsi="Times New Roman" w:cs="Times New Roman"/>
+              </w:rPr>
+              <w:t>User Goal</w:t>
+            </w:r>
+          </w:p>
+        </w:tc>
+      </w:tr>
+      <w:tr>
+        <w:tc>
+          <w:tcPr>
+            <w:tcW w:w="1885" w:type="dxa"/>
+          </w:tcPr>
+          <w:p>
+            <w:pPr>
+              <w:spacing w:line="360" w:lineRule="auto"/>
+              <w:rPr>
+                <w:rFonts w:ascii="Times New Roman" w:hAnsi="Times New Roman" w:cs="Times New Roman"/>
+              </w:rPr>
+            </w:pPr>
+            <w:r>
+              <w:rPr>
+                <w:rFonts w:ascii="Times New Roman" w:hAnsi="Times New Roman" w:cs="Times New Roman"/>
+              </w:rPr>
+              <w:t>Primary Actor</w:t>
+            </w:r>
+          </w:p>
+        </w:tc>
+        <w:tc>
+          <w:tcPr>
+            <w:tcW w:w="7465" w:type="dxa"/>
+          </w:tcPr>
+          <w:p>
+            <w:pPr>
+              <w:spacing w:line="360" w:lineRule="auto"/>
+              <w:rPr>
+                <w:rFonts w:ascii="Times New Roman" w:hAnsi="Times New Roman" w:cs="Times New Roman"/>
+              </w:rPr>
+            </w:pPr>
+            <w:r>
+              <w:rPr>
+                <w:rFonts w:ascii="Times New Roman" w:hAnsi="Times New Roman" w:cs="Times New Roman"/>
+              </w:rPr>
+              <w:t>Kitchen Worker</w:t>
+            </w:r>
+          </w:p>
+        </w:tc>
+      </w:tr>
+      <w:tr>
+        <w:tc>
+          <w:tcPr>
+            <w:tcW w:w="1885" w:type="dxa"/>
+          </w:tcPr>
+          <w:p>
+            <w:pPr>
+              <w:spacing w:line="360" w:lineRule="auto"/>
+              <w:rPr>
+                <w:rFonts w:ascii="Times New Roman" w:hAnsi="Times New Roman" w:cs="Times New Roman"/>
+              </w:rPr>
+            </w:pPr>
+            <w:r>
+              <w:rPr>
+                <w:rFonts w:ascii="Times New Roman" w:hAnsi="Times New Roman" w:cs="Times New Roman"/>
+              </w:rPr>
+              <w:t>Stakeholders and Interests</w:t>
+            </w:r>
+          </w:p>
+        </w:tc>
+        <w:tc>
+          <w:tcPr>
+            <w:tcW w:w="7465" w:type="dxa"/>
+          </w:tcPr>
+          <w:p>
+            <w:pPr>
+              <w:spacing w:line="360" w:lineRule="auto"/>
+              <w:rPr>
+                <w:rFonts w:ascii="Times New Roman" w:hAnsi="Times New Roman" w:cs="Times New Roman"/>
+              </w:rPr>
+            </w:pPr>
+            <w:r>
+              <w:rPr>
+                <w:rFonts w:ascii="Times New Roman" w:hAnsi="Times New Roman" w:cs="Times New Roman"/>
+              </w:rPr>
+              <w:t>Kitchen Worker: needs to record accurate production information. Production Manager: needs reliable production and yield information. Quality Checker: requires production batch information to support quality checks. Traceability Lead: requires batch information to support traceability</w:t>
+            </w:r>
+          </w:p>
+        </w:tc>
+      </w:tr>
+      <w:tr>
+        <w:tc>
+          <w:tcPr>
+            <w:tcW w:w="1885" w:type="dxa"/>
+          </w:tcPr>
+          <w:p>
+            <w:pPr>
+              <w:spacing w:line="360" w:lineRule="auto"/>
+              <w:rPr>
+                <w:rFonts w:ascii="Times New Roman" w:hAnsi="Times New Roman" w:cs="Times New Roman"/>
+              </w:rPr>
+            </w:pPr>
+            <w:r>
+              <w:rPr>
+                <w:rFonts w:ascii="Times New Roman" w:hAnsi="Times New Roman" w:cs="Times New Roman"/>
+              </w:rPr>
+              <w:t>Preconditions</w:t>
+            </w:r>
+          </w:p>
+        </w:tc>
+        <w:tc>
+          <w:tcPr>
+            <w:tcW w:w="7465" w:type="dxa"/>
+          </w:tcPr>
+          <w:p>
+            <w:pPr>
+              <w:spacing w:line="360" w:lineRule="auto"/>
+              <w:rPr>
+                <w:rFonts w:ascii="Times New Roman" w:hAnsi="Times New Roman" w:cs="Times New Roman"/>
+              </w:rPr>
+            </w:pPr>
+            <w:r>
+              <w:rPr>
+                <w:rFonts w:ascii="Times New Roman" w:hAnsi="Times New Roman" w:cs="Times New Roman"/>
+              </w:rPr>
+              <w:t xml:space="preserve">A production batch has been </w:t>
+            </w:r>
+            <w:proofErr w:type="gramStart"/>
+            <w:r>
+              <w:rPr>
+                <w:rFonts w:ascii="Times New Roman" w:hAnsi="Times New Roman" w:cs="Times New Roman"/>
+              </w:rPr>
+              <w:t>planned</w:t>
+            </w:r>
+            <w:proofErr w:type="gramEnd"/>
+            <w:r>
+              <w:rPr>
+                <w:rFonts w:ascii="Times New Roman" w:hAnsi="Times New Roman" w:cs="Times New Roman"/>
+              </w:rPr>
+              <w:t xml:space="preserve"> and an applicable recipe version has been identified</w:t>
+            </w:r>
+          </w:p>
+        </w:tc>
+      </w:tr>
+      <w:tr>
+        <w:tc>
+          <w:tcPr>
+            <w:tcW w:w="1885" w:type="dxa"/>
+          </w:tcPr>
+          <w:p>
+            <w:pPr>
+              <w:spacing w:line="360" w:lineRule="auto"/>
+              <w:rPr>
+                <w:rFonts w:ascii="Times New Roman" w:hAnsi="Times New Roman" w:cs="Times New Roman"/>
+              </w:rPr>
+            </w:pPr>
+            <w:r>
+              <w:rPr>
+                <w:rFonts w:ascii="Times New Roman" w:hAnsi="Times New Roman" w:cs="Times New Roman"/>
+              </w:rPr>
+              <w:t>Trigger</w:t>
+            </w:r>
+          </w:p>
+        </w:tc>
+        <w:tc>
+          <w:tcPr>
+            <w:tcW w:w="7465" w:type="dxa"/>
+          </w:tcPr>
+          <w:p>
+            <w:pPr>
+              <w:spacing w:line="360" w:lineRule="auto"/>
+              <w:rPr>
+                <w:rFonts w:ascii="Times New Roman" w:hAnsi="Times New Roman" w:cs="Times New Roman"/>
+              </w:rPr>
+            </w:pPr>
+            <w:r>
+              <w:rPr>
+                <w:rFonts w:ascii="Times New Roman" w:hAnsi="Times New Roman" w:cs="Times New Roman"/>
+              </w:rPr>
+              <w:t>The Kitcher Worker begins recording the actual production information for the batch</w:t>
+            </w:r>
+          </w:p>
+        </w:tc>
+      </w:tr>
+      <w:tr>
+        <w:tc>
+          <w:tcPr>
+            <w:tcW w:w="1885" w:type="dxa"/>
+          </w:tcPr>
+          <w:p>
+            <w:pPr>
+              <w:spacing w:line="360" w:lineRule="auto"/>
+              <w:rPr>
+                <w:rFonts w:ascii="Times New Roman" w:hAnsi="Times New Roman" w:cs="Times New Roman"/>
+              </w:rPr>
+            </w:pPr>
+            <w:r>
+              <w:rPr>
+                <w:rFonts w:ascii="Times New Roman" w:hAnsi="Times New Roman" w:cs="Times New Roman"/>
+              </w:rPr>
+              <w:t>Success Guarantee / Postconditions</w:t>
+            </w:r>
+          </w:p>
+        </w:tc>
+        <w:tc>
+          <w:tcPr>
+            <w:tcW w:w="7465" w:type="dxa"/>
+          </w:tcPr>
+          <w:p>
+            <w:pPr>
+              <w:spacing w:line="360" w:lineRule="auto"/>
+              <w:rPr>
+                <w:rFonts w:ascii="Times New Roman" w:hAnsi="Times New Roman" w:cs="Times New Roman"/>
+              </w:rPr>
+            </w:pPr>
+            <w:r>
+              <w:rPr>
+                <w:rFonts w:ascii="Times New Roman" w:hAnsi="Times New Roman" w:cs="Times New Roman"/>
+              </w:rPr>
+              <w:t>The production batch record contains the recipe version used, ingredient batches, actual quantities, production time, actual yield and production observations</w:t>
             </w:r>
           </w:p>
         </w:tc>
@@ -11113,9 +12457,626 @@
         </w:rPr>
       </w:pPr>
     </w:p>
+    <w:p>
+      <w:pPr>
+        <w:spacing w:line="360" w:lineRule="auto"/>
+        <w:rPr>
+          <w:rFonts w:ascii="Times New Roman" w:hAnsi="Times New Roman" w:cs="Times New Roman"/>
+        </w:rPr>
+      </w:pPr>
+      <w:r>
+        <w:rPr>
+          <w:rFonts w:ascii="Times New Roman" w:hAnsi="Times New Roman" w:cs="Times New Roman"/>
+        </w:rPr>
+        <w:t>Main Success Scenario</w:t>
+      </w:r>
+    </w:p>
+    <w:tbl>
+      <w:tblPr>
+        <w:tblStyle w:val="TableGrid"/>
+        <w:tblW w:w="0" w:type="auto"/>
+        <w:tblLook w:val="04A0" w:firstRow="1" w:lastRow="0" w:firstColumn="1" w:lastColumn="0" w:noHBand="0" w:noVBand="1"/>
+      </w:tblPr>
+      <w:tblGrid>
+        <w:gridCol w:w="690"/>
+        <w:gridCol w:w="8660"/>
+      </w:tblGrid>
+      <w:tr>
+        <w:tc>
+          <w:tcPr>
+            <w:tcW w:w="690" w:type="dxa"/>
+          </w:tcPr>
+          <w:p>
+            <w:pPr>
+              <w:spacing w:line="360" w:lineRule="auto"/>
+              <w:rPr>
+                <w:rFonts w:ascii="Times New Roman" w:hAnsi="Times New Roman" w:cs="Times New Roman"/>
+              </w:rPr>
+            </w:pPr>
+            <w:r>
+              <w:rPr>
+                <w:rFonts w:ascii="Times New Roman" w:hAnsi="Times New Roman" w:cs="Times New Roman"/>
+              </w:rPr>
+              <w:t>Step</w:t>
+            </w:r>
+          </w:p>
+        </w:tc>
+        <w:tc>
+          <w:tcPr>
+            <w:tcW w:w="8660" w:type="dxa"/>
+          </w:tcPr>
+          <w:p>
+            <w:pPr>
+              <w:spacing w:line="360" w:lineRule="auto"/>
+              <w:rPr>
+                <w:rFonts w:ascii="Times New Roman" w:hAnsi="Times New Roman" w:cs="Times New Roman"/>
+              </w:rPr>
+            </w:pPr>
+            <w:r>
+              <w:rPr>
+                <w:rFonts w:ascii="Times New Roman" w:hAnsi="Times New Roman" w:cs="Times New Roman"/>
+              </w:rPr>
+              <w:t>Action</w:t>
+            </w:r>
+          </w:p>
+        </w:tc>
+      </w:tr>
+      <w:tr>
+        <w:tc>
+          <w:tcPr>
+            <w:tcW w:w="690" w:type="dxa"/>
+          </w:tcPr>
+          <w:p>
+            <w:pPr>
+              <w:spacing w:line="360" w:lineRule="auto"/>
+              <w:rPr>
+                <w:rFonts w:ascii="Times New Roman" w:hAnsi="Times New Roman" w:cs="Times New Roman"/>
+              </w:rPr>
+            </w:pPr>
+            <w:r>
+              <w:rPr>
+                <w:rFonts w:ascii="Times New Roman" w:hAnsi="Times New Roman" w:cs="Times New Roman"/>
+              </w:rPr>
+              <w:t>1</w:t>
+            </w:r>
+          </w:p>
+        </w:tc>
+        <w:tc>
+          <w:tcPr>
+            <w:tcW w:w="8660" w:type="dxa"/>
+          </w:tcPr>
+          <w:p>
+            <w:pPr>
+              <w:spacing w:line="360" w:lineRule="auto"/>
+              <w:rPr>
+                <w:rFonts w:ascii="Times New Roman" w:hAnsi="Times New Roman" w:cs="Times New Roman"/>
+              </w:rPr>
+            </w:pPr>
+            <w:r>
+              <w:rPr>
+                <w:rFonts w:ascii="Times New Roman" w:hAnsi="Times New Roman" w:cs="Times New Roman"/>
+              </w:rPr>
+              <w:t>The Kitchen Worker identifies the production batch being recorded</w:t>
+            </w:r>
+          </w:p>
+        </w:tc>
+      </w:tr>
+      <w:tr>
+        <w:tc>
+          <w:tcPr>
+            <w:tcW w:w="690" w:type="dxa"/>
+          </w:tcPr>
+          <w:p>
+            <w:pPr>
+              <w:spacing w:line="360" w:lineRule="auto"/>
+              <w:rPr>
+                <w:rFonts w:ascii="Times New Roman" w:hAnsi="Times New Roman" w:cs="Times New Roman"/>
+              </w:rPr>
+            </w:pPr>
+            <w:r>
+              <w:rPr>
+                <w:rFonts w:ascii="Times New Roman" w:hAnsi="Times New Roman" w:cs="Times New Roman"/>
+              </w:rPr>
+              <w:t>2</w:t>
+            </w:r>
+          </w:p>
+        </w:tc>
+        <w:tc>
+          <w:tcPr>
+            <w:tcW w:w="8660" w:type="dxa"/>
+          </w:tcPr>
+          <w:p>
+            <w:pPr>
+              <w:spacing w:line="360" w:lineRule="auto"/>
+              <w:rPr>
+                <w:rFonts w:ascii="Times New Roman" w:hAnsi="Times New Roman" w:cs="Times New Roman"/>
+              </w:rPr>
+            </w:pPr>
+            <w:r>
+              <w:rPr>
+                <w:rFonts w:ascii="Times New Roman" w:hAnsi="Times New Roman" w:cs="Times New Roman"/>
+              </w:rPr>
+              <w:t>The system provides the production batch information and the applicable recipe version</w:t>
+            </w:r>
+          </w:p>
+        </w:tc>
+      </w:tr>
+      <w:tr>
+        <w:tc>
+          <w:tcPr>
+            <w:tcW w:w="690" w:type="dxa"/>
+          </w:tcPr>
+          <w:p>
+            <w:pPr>
+              <w:spacing w:line="360" w:lineRule="auto"/>
+              <w:rPr>
+                <w:rFonts w:ascii="Times New Roman" w:hAnsi="Times New Roman" w:cs="Times New Roman"/>
+              </w:rPr>
+            </w:pPr>
+            <w:r>
+              <w:rPr>
+                <w:rFonts w:ascii="Times New Roman" w:hAnsi="Times New Roman" w:cs="Times New Roman"/>
+              </w:rPr>
+              <w:t>3</w:t>
+            </w:r>
+          </w:p>
+        </w:tc>
+        <w:tc>
+          <w:tcPr>
+            <w:tcW w:w="8660" w:type="dxa"/>
+          </w:tcPr>
+          <w:p>
+            <w:pPr>
+              <w:spacing w:line="360" w:lineRule="auto"/>
+              <w:rPr>
+                <w:rFonts w:ascii="Times New Roman" w:hAnsi="Times New Roman" w:cs="Times New Roman"/>
+              </w:rPr>
+            </w:pPr>
+            <w:r>
+              <w:rPr>
+                <w:rFonts w:ascii="Times New Roman" w:hAnsi="Times New Roman" w:cs="Times New Roman"/>
+              </w:rPr>
+              <w:t>The Kitchen Worker records the ingredient</w:t>
+            </w:r>
+            <w:r>
+              <w:rPr>
+                <w:rFonts w:ascii="Times New Roman" w:hAnsi="Times New Roman" w:cs="Times New Roman"/>
+              </w:rPr>
+              <w:t xml:space="preserve"> batches and actual quantities used</w:t>
+            </w:r>
+          </w:p>
+        </w:tc>
+      </w:tr>
+      <w:tr>
+        <w:tc>
+          <w:tcPr>
+            <w:tcW w:w="690" w:type="dxa"/>
+          </w:tcPr>
+          <w:p>
+            <w:pPr>
+              <w:spacing w:line="360" w:lineRule="auto"/>
+              <w:rPr>
+                <w:rFonts w:ascii="Times New Roman" w:hAnsi="Times New Roman" w:cs="Times New Roman"/>
+              </w:rPr>
+            </w:pPr>
+            <w:r>
+              <w:rPr>
+                <w:rFonts w:ascii="Times New Roman" w:hAnsi="Times New Roman" w:cs="Times New Roman"/>
+              </w:rPr>
+              <w:t>4</w:t>
+            </w:r>
+          </w:p>
+        </w:tc>
+        <w:tc>
+          <w:tcPr>
+            <w:tcW w:w="8660" w:type="dxa"/>
+          </w:tcPr>
+          <w:p>
+            <w:pPr>
+              <w:spacing w:line="360" w:lineRule="auto"/>
+              <w:rPr>
+                <w:rFonts w:ascii="Times New Roman" w:hAnsi="Times New Roman" w:cs="Times New Roman"/>
+              </w:rPr>
+            </w:pPr>
+            <w:r>
+              <w:rPr>
+                <w:rFonts w:ascii="Times New Roman" w:hAnsi="Times New Roman" w:cs="Times New Roman"/>
+              </w:rPr>
+              <w:t>The Kitchen Worker records the production time, actual yield and production observations</w:t>
+            </w:r>
+          </w:p>
+        </w:tc>
+      </w:tr>
+      <w:tr>
+        <w:tc>
+          <w:tcPr>
+            <w:tcW w:w="690" w:type="dxa"/>
+          </w:tcPr>
+          <w:p>
+            <w:pPr>
+              <w:spacing w:line="360" w:lineRule="auto"/>
+              <w:rPr>
+                <w:rFonts w:ascii="Times New Roman" w:hAnsi="Times New Roman" w:cs="Times New Roman"/>
+              </w:rPr>
+            </w:pPr>
+            <w:r>
+              <w:rPr>
+                <w:rFonts w:ascii="Times New Roman" w:hAnsi="Times New Roman" w:cs="Times New Roman"/>
+              </w:rPr>
+              <w:t>5</w:t>
+            </w:r>
+          </w:p>
+        </w:tc>
+        <w:tc>
+          <w:tcPr>
+            <w:tcW w:w="8660" w:type="dxa"/>
+          </w:tcPr>
+          <w:p>
+            <w:pPr>
+              <w:spacing w:line="360" w:lineRule="auto"/>
+              <w:rPr>
+                <w:rFonts w:ascii="Times New Roman" w:hAnsi="Times New Roman" w:cs="Times New Roman"/>
+              </w:rPr>
+            </w:pPr>
+            <w:r>
+              <w:rPr>
+                <w:rFonts w:ascii="Times New Roman" w:hAnsi="Times New Roman" w:cs="Times New Roman"/>
+              </w:rPr>
+              <w:t>The system records the production information against the identified production batch</w:t>
+            </w:r>
+          </w:p>
+        </w:tc>
+      </w:tr>
+      <w:tr>
+        <w:tc>
+          <w:tcPr>
+            <w:tcW w:w="690" w:type="dxa"/>
+          </w:tcPr>
+          <w:p>
+            <w:pPr>
+              <w:spacing w:line="360" w:lineRule="auto"/>
+              <w:rPr>
+                <w:rFonts w:ascii="Times New Roman" w:hAnsi="Times New Roman" w:cs="Times New Roman"/>
+              </w:rPr>
+            </w:pPr>
+            <w:r>
+              <w:rPr>
+                <w:rFonts w:ascii="Times New Roman" w:hAnsi="Times New Roman" w:cs="Times New Roman"/>
+              </w:rPr>
+              <w:t>6</w:t>
+            </w:r>
+          </w:p>
+        </w:tc>
+        <w:tc>
+          <w:tcPr>
+            <w:tcW w:w="8660" w:type="dxa"/>
+          </w:tcPr>
+          <w:p>
+            <w:pPr>
+              <w:spacing w:line="360" w:lineRule="auto"/>
+              <w:rPr>
+                <w:rFonts w:ascii="Times New Roman" w:hAnsi="Times New Roman" w:cs="Times New Roman"/>
+              </w:rPr>
+            </w:pPr>
+            <w:r>
+              <w:rPr>
+                <w:rFonts w:ascii="Times New Roman" w:hAnsi="Times New Roman" w:cs="Times New Roman"/>
+              </w:rPr>
+              <w:t>The system confirms that the production batch record has been recorded</w:t>
+            </w:r>
+          </w:p>
+        </w:tc>
+      </w:tr>
+    </w:tbl>
+    <w:p>
+      <w:pPr>
+        <w:spacing w:line="360" w:lineRule="auto"/>
+        <w:rPr>
+          <w:rFonts w:ascii="Times New Roman" w:hAnsi="Times New Roman" w:cs="Times New Roman"/>
+        </w:rPr>
+      </w:pPr>
+    </w:p>
+    <w:p>
+      <w:pPr>
+        <w:spacing w:line="360" w:lineRule="auto"/>
+        <w:rPr>
+          <w:rFonts w:ascii="Times New Roman" w:hAnsi="Times New Roman" w:cs="Times New Roman"/>
+        </w:rPr>
+      </w:pPr>
+      <w:r>
+        <w:rPr>
+          <w:rFonts w:ascii="Times New Roman" w:hAnsi="Times New Roman" w:cs="Times New Roman"/>
+        </w:rPr>
+        <w:t>Alternative / Exception Flows</w:t>
+      </w:r>
+    </w:p>
+    <w:tbl>
+      <w:tblPr>
+        <w:tblStyle w:val="TableGrid"/>
+        <w:tblW w:w="0" w:type="auto"/>
+        <w:tblLook w:val="04A0" w:firstRow="1" w:lastRow="0" w:firstColumn="1" w:lastColumn="0" w:noHBand="0" w:noVBand="1"/>
+      </w:tblPr>
+      <w:tblGrid>
+        <w:gridCol w:w="535"/>
+        <w:gridCol w:w="1620"/>
+        <w:gridCol w:w="7195"/>
+      </w:tblGrid>
+      <w:tr>
+        <w:tc>
+          <w:tcPr>
+            <w:tcW w:w="535" w:type="dxa"/>
+          </w:tcPr>
+          <w:p>
+            <w:pPr>
+              <w:spacing w:line="360" w:lineRule="auto"/>
+              <w:rPr>
+                <w:rFonts w:ascii="Times New Roman" w:hAnsi="Times New Roman" w:cs="Times New Roman"/>
+              </w:rPr>
+            </w:pPr>
+            <w:r>
+              <w:rPr>
+                <w:rFonts w:ascii="Times New Roman" w:hAnsi="Times New Roman" w:cs="Times New Roman"/>
+              </w:rPr>
+              <w:lastRenderedPageBreak/>
+              <w:t>ID</w:t>
+            </w:r>
+          </w:p>
+        </w:tc>
+        <w:tc>
+          <w:tcPr>
+            <w:tcW w:w="1620" w:type="dxa"/>
+          </w:tcPr>
+          <w:p>
+            <w:pPr>
+              <w:spacing w:line="360" w:lineRule="auto"/>
+              <w:rPr>
+                <w:rFonts w:ascii="Times New Roman" w:hAnsi="Times New Roman" w:cs="Times New Roman"/>
+              </w:rPr>
+            </w:pPr>
+            <w:r>
+              <w:rPr>
+                <w:rFonts w:ascii="Times New Roman" w:hAnsi="Times New Roman" w:cs="Times New Roman"/>
+              </w:rPr>
+              <w:t>Related Step</w:t>
+            </w:r>
+          </w:p>
+        </w:tc>
+        <w:tc>
+          <w:tcPr>
+            <w:tcW w:w="7195" w:type="dxa"/>
+          </w:tcPr>
+          <w:p>
+            <w:pPr>
+              <w:spacing w:line="360" w:lineRule="auto"/>
+              <w:rPr>
+                <w:rFonts w:ascii="Times New Roman" w:hAnsi="Times New Roman" w:cs="Times New Roman"/>
+              </w:rPr>
+            </w:pPr>
+            <w:r>
+              <w:rPr>
+                <w:rFonts w:ascii="Times New Roman" w:hAnsi="Times New Roman" w:cs="Times New Roman"/>
+              </w:rPr>
+              <w:t>Condition and Response</w:t>
+            </w:r>
+          </w:p>
+        </w:tc>
+      </w:tr>
+      <w:tr>
+        <w:tc>
+          <w:tcPr>
+            <w:tcW w:w="535" w:type="dxa"/>
+          </w:tcPr>
+          <w:p>
+            <w:pPr>
+              <w:spacing w:line="360" w:lineRule="auto"/>
+              <w:rPr>
+                <w:rFonts w:ascii="Times New Roman" w:hAnsi="Times New Roman" w:cs="Times New Roman"/>
+              </w:rPr>
+            </w:pPr>
+            <w:r>
+              <w:rPr>
+                <w:rFonts w:ascii="Times New Roman" w:hAnsi="Times New Roman" w:cs="Times New Roman"/>
+              </w:rPr>
+              <w:t>3a</w:t>
+            </w:r>
+          </w:p>
+        </w:tc>
+        <w:tc>
+          <w:tcPr>
+            <w:tcW w:w="1620" w:type="dxa"/>
+          </w:tcPr>
+          <w:p>
+            <w:pPr>
+              <w:spacing w:line="360" w:lineRule="auto"/>
+              <w:rPr>
+                <w:rFonts w:ascii="Times New Roman" w:hAnsi="Times New Roman" w:cs="Times New Roman"/>
+              </w:rPr>
+            </w:pPr>
+            <w:r>
+              <w:rPr>
+                <w:rFonts w:ascii="Times New Roman" w:hAnsi="Times New Roman" w:cs="Times New Roman"/>
+              </w:rPr>
+              <w:t>Step 3</w:t>
+            </w:r>
+          </w:p>
+        </w:tc>
+        <w:tc>
+          <w:tcPr>
+            <w:tcW w:w="7195" w:type="dxa"/>
+          </w:tcPr>
+          <w:p>
+            <w:pPr>
+              <w:spacing w:line="360" w:lineRule="auto"/>
+              <w:rPr>
+                <w:rFonts w:ascii="Times New Roman" w:hAnsi="Times New Roman" w:cs="Times New Roman"/>
+              </w:rPr>
+            </w:pPr>
+            <w:r>
+              <w:rPr>
+                <w:rFonts w:ascii="Times New Roman" w:hAnsi="Times New Roman" w:cs="Times New Roman"/>
+              </w:rPr>
+              <w:t>An ingredient substitution has been used. The Kitchen Worker records the substitution against the production batch. The substitution requires review because it may affect allergen information, product quality and labelling</w:t>
+            </w:r>
+          </w:p>
+        </w:tc>
+      </w:tr>
+      <w:tr>
+        <w:tc>
+          <w:tcPr>
+            <w:tcW w:w="535" w:type="dxa"/>
+          </w:tcPr>
+          <w:p>
+            <w:pPr>
+              <w:spacing w:line="360" w:lineRule="auto"/>
+              <w:rPr>
+                <w:rFonts w:ascii="Times New Roman" w:hAnsi="Times New Roman" w:cs="Times New Roman"/>
+              </w:rPr>
+            </w:pPr>
+            <w:r>
+              <w:rPr>
+                <w:rFonts w:ascii="Times New Roman" w:hAnsi="Times New Roman" w:cs="Times New Roman"/>
+              </w:rPr>
+              <w:t>4a</w:t>
+            </w:r>
+          </w:p>
+        </w:tc>
+        <w:tc>
+          <w:tcPr>
+            <w:tcW w:w="1620" w:type="dxa"/>
+          </w:tcPr>
+          <w:p>
+            <w:pPr>
+              <w:spacing w:line="360" w:lineRule="auto"/>
+              <w:rPr>
+                <w:rFonts w:ascii="Times New Roman" w:hAnsi="Times New Roman" w:cs="Times New Roman"/>
+              </w:rPr>
+            </w:pPr>
+            <w:r>
+              <w:rPr>
+                <w:rFonts w:ascii="Times New Roman" w:hAnsi="Times New Roman" w:cs="Times New Roman"/>
+              </w:rPr>
+              <w:t>Step 4</w:t>
+            </w:r>
+          </w:p>
+        </w:tc>
+        <w:tc>
+          <w:tcPr>
+            <w:tcW w:w="7195" w:type="dxa"/>
+          </w:tcPr>
+          <w:p>
+            <w:pPr>
+              <w:spacing w:line="360" w:lineRule="auto"/>
+              <w:rPr>
+                <w:rFonts w:ascii="Times New Roman" w:hAnsi="Times New Roman" w:cs="Times New Roman"/>
+              </w:rPr>
+            </w:pPr>
+            <w:r>
+              <w:rPr>
+                <w:rFonts w:ascii="Times New Roman" w:hAnsi="Times New Roman" w:cs="Times New Roman"/>
+              </w:rPr>
+              <w:t>The actual yield differs from the expected yield. The Kitchen Worker records the actual yield. The effect on customer – order allocation requires clarification</w:t>
+            </w:r>
+          </w:p>
+        </w:tc>
+      </w:tr>
+      <w:tr>
+        <w:tc>
+          <w:tcPr>
+            <w:tcW w:w="535" w:type="dxa"/>
+          </w:tcPr>
+          <w:p>
+            <w:pPr>
+              <w:spacing w:line="360" w:lineRule="auto"/>
+              <w:rPr>
+                <w:rFonts w:ascii="Times New Roman" w:hAnsi="Times New Roman" w:cs="Times New Roman"/>
+              </w:rPr>
+            </w:pPr>
+            <w:r>
+              <w:rPr>
+                <w:rFonts w:ascii="Times New Roman" w:hAnsi="Times New Roman" w:cs="Times New Roman"/>
+              </w:rPr>
+              <w:t>4b</w:t>
+            </w:r>
+          </w:p>
+        </w:tc>
+        <w:tc>
+          <w:tcPr>
+            <w:tcW w:w="1620" w:type="dxa"/>
+          </w:tcPr>
+          <w:p>
+            <w:pPr>
+              <w:spacing w:line="360" w:lineRule="auto"/>
+              <w:rPr>
+                <w:rFonts w:ascii="Times New Roman" w:hAnsi="Times New Roman" w:cs="Times New Roman"/>
+              </w:rPr>
+            </w:pPr>
+            <w:r>
+              <w:rPr>
+                <w:rFonts w:ascii="Times New Roman" w:hAnsi="Times New Roman" w:cs="Times New Roman"/>
+              </w:rPr>
+              <w:t>Step 4</w:t>
+            </w:r>
+          </w:p>
+        </w:tc>
+        <w:tc>
+          <w:tcPr>
+            <w:tcW w:w="7195" w:type="dxa"/>
+          </w:tcPr>
+          <w:p>
+            <w:pPr>
+              <w:spacing w:line="360" w:lineRule="auto"/>
+              <w:rPr>
+                <w:rFonts w:ascii="Times New Roman" w:hAnsi="Times New Roman" w:cs="Times New Roman"/>
+              </w:rPr>
+            </w:pPr>
+            <w:r>
+              <w:rPr>
+                <w:rFonts w:ascii="Times New Roman" w:hAnsi="Times New Roman" w:cs="Times New Roman"/>
+              </w:rPr>
+              <w:t>Production observations identify an issue requiring further attention. The observation is recorded as part of the production batch record for subsequent review</w:t>
+            </w:r>
+          </w:p>
+        </w:tc>
+      </w:tr>
+    </w:tbl>
+    <w:p>
+      <w:pPr>
+        <w:spacing w:line="360" w:lineRule="auto"/>
+        <w:rPr>
+          <w:rFonts w:ascii="Times New Roman" w:hAnsi="Times New Roman" w:cs="Times New Roman"/>
+        </w:rPr>
+      </w:pPr>
+      <w:r>
+        <w:rPr>
+          <w:rFonts w:ascii="Times New Roman" w:hAnsi="Times New Roman" w:cs="Times New Roman"/>
+        </w:rPr>
+        <w:t>UC4 primarily supports FR3 and is also related to BR1, FR7, A2, CQ2 and CQ4</w:t>
+      </w:r>
+    </w:p>
+    <w:p>
+      <w:pPr>
+        <w:pStyle w:val="Heading1"/>
+        <w:rPr>
+          <w:rFonts w:ascii="Times New Roman" w:hAnsi="Times New Roman" w:cs="Times New Roman"/>
+          <w:color w:val="auto"/>
+          <w:sz w:val="28"/>
+          <w:szCs w:val="28"/>
+        </w:rPr>
+      </w:pPr>
+      <w:r>
+        <w:rPr>
+          <w:rFonts w:ascii="Times New Roman" w:hAnsi="Times New Roman" w:cs="Times New Roman"/>
+          <w:color w:val="auto"/>
+          <w:sz w:val="28"/>
+          <w:szCs w:val="28"/>
+        </w:rPr>
+        <w:t>7 Gherkin Acceptance Examples</w:t>
+      </w:r>
+    </w:p>
+    <w:p/>
     <w:sectPr>
-      <w:headerReference w:type="default" r:id="rId8"/>
-      <w:footerReference w:type="default" r:id="rId9"/>
+      <w:headerReference w:type="default" r:id="rId9"/>
+      <w:footerReference w:type="default" r:id="rId10"/>
       <w:pgSz w:w="12240" w:h="15840"/>
       <w:pgMar w:top="1440" w:right="1440" w:bottom="1440" w:left="1440" w:header="720" w:footer="720" w:gutter="0"/>
       <w:cols w:space="720"/>

</xml_diff>

<commit_message>
Add AI Declaration and AI interaction evidence
</commit_message>
<xml_diff>
--- a/report/Analysis Dossier.docx
+++ b/report/Analysis Dossier.docx
@@ -214,7 +214,7 @@
             </w:rPr>
             <w:fldChar w:fldCharType="separate"/>
           </w:r>
-          <w:hyperlink w:anchor="_Toc243166372" w:history="1">
+          <w:hyperlink w:anchor="_Toc243414608" w:history="1">
             <w:r>
               <w:rPr>
                 <w:rStyle w:val="Hyperlink"/>
@@ -261,7 +261,7 @@
                 <w:noProof/>
                 <w:webHidden/>
               </w:rPr>
-              <w:instrText xml:space="preserve"> PAGEREF _Toc243166372 \h </w:instrText>
+              <w:instrText xml:space="preserve"> PAGEREF _Toc243414608 \h </w:instrText>
             </w:r>
             <w:r>
               <w:rPr>
@@ -307,7 +307,7 @@
               <w14:ligatures w14:val="standardContextual"/>
             </w:rPr>
           </w:pPr>
-          <w:hyperlink w:anchor="_Toc243166373" w:history="1">
+          <w:hyperlink w:anchor="_Toc243414609" w:history="1">
             <w:r>
               <w:rPr>
                 <w:rStyle w:val="Hyperlink"/>
@@ -335,7 +335,7 @@
                 <w:noProof/>
                 <w:webHidden/>
               </w:rPr>
-              <w:instrText xml:space="preserve"> PAGEREF _Toc243166373 \h </w:instrText>
+              <w:instrText xml:space="preserve"> PAGEREF _Toc243414609 \h </w:instrText>
             </w:r>
             <w:r>
               <w:rPr>
@@ -381,7 +381,7 @@
               <w14:ligatures w14:val="standardContextual"/>
             </w:rPr>
           </w:pPr>
-          <w:hyperlink w:anchor="_Toc243166374" w:history="1">
+          <w:hyperlink w:anchor="_Toc243414610" w:history="1">
             <w:r>
               <w:rPr>
                 <w:rStyle w:val="Hyperlink"/>
@@ -409,7 +409,7 @@
                 <w:noProof/>
                 <w:webHidden/>
               </w:rPr>
-              <w:instrText xml:space="preserve"> PAGEREF _Toc243166374 \h </w:instrText>
+              <w:instrText xml:space="preserve"> PAGEREF _Toc243414610 \h </w:instrText>
             </w:r>
             <w:r>
               <w:rPr>
@@ -455,7 +455,7 @@
               <w14:ligatures w14:val="standardContextual"/>
             </w:rPr>
           </w:pPr>
-          <w:hyperlink w:anchor="_Toc243166375" w:history="1">
+          <w:hyperlink w:anchor="_Toc243414611" w:history="1">
             <w:r>
               <w:rPr>
                 <w:rStyle w:val="Hyperlink"/>
@@ -483,7 +483,7 @@
                 <w:noProof/>
                 <w:webHidden/>
               </w:rPr>
-              <w:instrText xml:space="preserve"> PAGEREF _Toc243166375 \h </w:instrText>
+              <w:instrText xml:space="preserve"> PAGEREF _Toc243414611 \h </w:instrText>
             </w:r>
             <w:r>
               <w:rPr>
@@ -530,7 +530,7 @@
               <w14:ligatures w14:val="standardContextual"/>
             </w:rPr>
           </w:pPr>
-          <w:hyperlink w:anchor="_Toc243166376" w:history="1">
+          <w:hyperlink w:anchor="_Toc243414612" w:history="1">
             <w:r>
               <w:rPr>
                 <w:rStyle w:val="Hyperlink"/>
@@ -577,7 +577,7 @@
                 <w:noProof/>
                 <w:webHidden/>
               </w:rPr>
-              <w:instrText xml:space="preserve"> PAGEREF _Toc243166376 \h </w:instrText>
+              <w:instrText xml:space="preserve"> PAGEREF _Toc243414612 \h </w:instrText>
             </w:r>
             <w:r>
               <w:rPr>
@@ -623,7 +623,7 @@
               <w14:ligatures w14:val="standardContextual"/>
             </w:rPr>
           </w:pPr>
-          <w:hyperlink w:anchor="_Toc243166377" w:history="1">
+          <w:hyperlink w:anchor="_Toc243414613" w:history="1">
             <w:r>
               <w:rPr>
                 <w:rStyle w:val="Hyperlink"/>
@@ -651,7 +651,7 @@
                 <w:noProof/>
                 <w:webHidden/>
               </w:rPr>
-              <w:instrText xml:space="preserve"> PAGEREF _Toc243166377 \h </w:instrText>
+              <w:instrText xml:space="preserve"> PAGEREF _Toc243414613 \h </w:instrText>
             </w:r>
             <w:r>
               <w:rPr>
@@ -697,7 +697,7 @@
               <w14:ligatures w14:val="standardContextual"/>
             </w:rPr>
           </w:pPr>
-          <w:hyperlink w:anchor="_Toc243166378" w:history="1">
+          <w:hyperlink w:anchor="_Toc243414614" w:history="1">
             <w:r>
               <w:rPr>
                 <w:rStyle w:val="Hyperlink"/>
@@ -725,7 +725,7 @@
                 <w:noProof/>
                 <w:webHidden/>
               </w:rPr>
-              <w:instrText xml:space="preserve"> PAGEREF _Toc243166378 \h </w:instrText>
+              <w:instrText xml:space="preserve"> PAGEREF _Toc243414614 \h </w:instrText>
             </w:r>
             <w:r>
               <w:rPr>
@@ -771,7 +771,7 @@
               <w14:ligatures w14:val="standardContextual"/>
             </w:rPr>
           </w:pPr>
-          <w:hyperlink w:anchor="_Toc243166379" w:history="1">
+          <w:hyperlink w:anchor="_Toc243414615" w:history="1">
             <w:r>
               <w:rPr>
                 <w:rStyle w:val="Hyperlink"/>
@@ -799,7 +799,7 @@
                 <w:noProof/>
                 <w:webHidden/>
               </w:rPr>
-              <w:instrText xml:space="preserve"> PAGEREF _Toc243166379 \h </w:instrText>
+              <w:instrText xml:space="preserve"> PAGEREF _Toc243414615 \h </w:instrText>
             </w:r>
             <w:r>
               <w:rPr>
@@ -845,7 +845,7 @@
               <w14:ligatures w14:val="standardContextual"/>
             </w:rPr>
           </w:pPr>
-          <w:hyperlink w:anchor="_Toc243166380" w:history="1">
+          <w:hyperlink w:anchor="_Toc243414616" w:history="1">
             <w:r>
               <w:rPr>
                 <w:rStyle w:val="Hyperlink"/>
@@ -873,7 +873,7 @@
                 <w:noProof/>
                 <w:webHidden/>
               </w:rPr>
-              <w:instrText xml:space="preserve"> PAGEREF _Toc243166380 \h </w:instrText>
+              <w:instrText xml:space="preserve"> PAGEREF _Toc243414616 \h </w:instrText>
             </w:r>
             <w:r>
               <w:rPr>
@@ -919,7 +919,7 @@
               <w14:ligatures w14:val="standardContextual"/>
             </w:rPr>
           </w:pPr>
-          <w:hyperlink w:anchor="_Toc243166381" w:history="1">
+          <w:hyperlink w:anchor="_Toc243414617" w:history="1">
             <w:r>
               <w:rPr>
                 <w:rStyle w:val="Hyperlink"/>
@@ -947,7 +947,7 @@
                 <w:noProof/>
                 <w:webHidden/>
               </w:rPr>
-              <w:instrText xml:space="preserve"> PAGEREF _Toc243166381 \h </w:instrText>
+              <w:instrText xml:space="preserve"> PAGEREF _Toc243414617 \h </w:instrText>
             </w:r>
             <w:r>
               <w:rPr>
@@ -993,7 +993,7 @@
               <w14:ligatures w14:val="standardContextual"/>
             </w:rPr>
           </w:pPr>
-          <w:hyperlink w:anchor="_Toc243166382" w:history="1">
+          <w:hyperlink w:anchor="_Toc243414618" w:history="1">
             <w:r>
               <w:rPr>
                 <w:rStyle w:val="Hyperlink"/>
@@ -1021,7 +1021,7 @@
                 <w:noProof/>
                 <w:webHidden/>
               </w:rPr>
-              <w:instrText xml:space="preserve"> PAGEREF _Toc243166382 \h </w:instrText>
+              <w:instrText xml:space="preserve"> PAGEREF _Toc243414618 \h </w:instrText>
             </w:r>
             <w:r>
               <w:rPr>
@@ -1067,7 +1067,7 @@
               <w14:ligatures w14:val="standardContextual"/>
             </w:rPr>
           </w:pPr>
-          <w:hyperlink w:anchor="_Toc243166383" w:history="1">
+          <w:hyperlink w:anchor="_Toc243414619" w:history="1">
             <w:r>
               <w:rPr>
                 <w:rStyle w:val="Hyperlink"/>
@@ -1095,7 +1095,7 @@
                 <w:noProof/>
                 <w:webHidden/>
               </w:rPr>
-              <w:instrText xml:space="preserve"> PAGEREF _Toc243166383 \h </w:instrText>
+              <w:instrText xml:space="preserve"> PAGEREF _Toc243414619 \h </w:instrText>
             </w:r>
             <w:r>
               <w:rPr>
@@ -1141,7 +1141,7 @@
               <w14:ligatures w14:val="standardContextual"/>
             </w:rPr>
           </w:pPr>
-          <w:hyperlink w:anchor="_Toc243166384" w:history="1">
+          <w:hyperlink w:anchor="_Toc243414620" w:history="1">
             <w:r>
               <w:rPr>
                 <w:rStyle w:val="Hyperlink"/>
@@ -1169,7 +1169,7 @@
                 <w:noProof/>
                 <w:webHidden/>
               </w:rPr>
-              <w:instrText xml:space="preserve"> PAGEREF _Toc243166384 \h </w:instrText>
+              <w:instrText xml:space="preserve"> PAGEREF _Toc243414620 \h </w:instrText>
             </w:r>
             <w:r>
               <w:rPr>
@@ -1215,7 +1215,7 @@
               <w14:ligatures w14:val="standardContextual"/>
             </w:rPr>
           </w:pPr>
-          <w:hyperlink w:anchor="_Toc243166385" w:history="1">
+          <w:hyperlink w:anchor="_Toc243414621" w:history="1">
             <w:r>
               <w:rPr>
                 <w:rStyle w:val="Hyperlink"/>
@@ -1243,7 +1243,7 @@
                 <w:noProof/>
                 <w:webHidden/>
               </w:rPr>
-              <w:instrText xml:space="preserve"> PAGEREF _Toc243166385 \h </w:instrText>
+              <w:instrText xml:space="preserve"> PAGEREF _Toc243414621 \h </w:instrText>
             </w:r>
             <w:r>
               <w:rPr>
@@ -1289,7 +1289,7 @@
               <w14:ligatures w14:val="standardContextual"/>
             </w:rPr>
           </w:pPr>
-          <w:hyperlink w:anchor="_Toc243166386" w:history="1">
+          <w:hyperlink w:anchor="_Toc243414622" w:history="1">
             <w:r>
               <w:rPr>
                 <w:rStyle w:val="Hyperlink"/>
@@ -1317,7 +1317,7 @@
                 <w:noProof/>
                 <w:webHidden/>
               </w:rPr>
-              <w:instrText xml:space="preserve"> PAGEREF _Toc243166386 \h </w:instrText>
+              <w:instrText xml:space="preserve"> PAGEREF _Toc243414622 \h </w:instrText>
             </w:r>
             <w:r>
               <w:rPr>
@@ -1363,7 +1363,7 @@
               <w14:ligatures w14:val="standardContextual"/>
             </w:rPr>
           </w:pPr>
-          <w:hyperlink w:anchor="_Toc243166387" w:history="1">
+          <w:hyperlink w:anchor="_Toc243414623" w:history="1">
             <w:r>
               <w:rPr>
                 <w:rStyle w:val="Hyperlink"/>
@@ -1391,7 +1391,7 @@
                 <w:noProof/>
                 <w:webHidden/>
               </w:rPr>
-              <w:instrText xml:space="preserve"> PAGEREF _Toc243166387 \h </w:instrText>
+              <w:instrText xml:space="preserve"> PAGEREF _Toc243414623 \h </w:instrText>
             </w:r>
             <w:r>
               <w:rPr>
@@ -1437,7 +1437,7 @@
               <w14:ligatures w14:val="standardContextual"/>
             </w:rPr>
           </w:pPr>
-          <w:hyperlink w:anchor="_Toc243166388" w:history="1">
+          <w:hyperlink w:anchor="_Toc243414624" w:history="1">
             <w:r>
               <w:rPr>
                 <w:rStyle w:val="Hyperlink"/>
@@ -1465,7 +1465,7 @@
                 <w:noProof/>
                 <w:webHidden/>
               </w:rPr>
-              <w:instrText xml:space="preserve"> PAGEREF _Toc243166388 \h </w:instrText>
+              <w:instrText xml:space="preserve"> PAGEREF _Toc243414624 \h </w:instrText>
             </w:r>
             <w:r>
               <w:rPr>
@@ -1511,7 +1511,7 @@
               <w14:ligatures w14:val="standardContextual"/>
             </w:rPr>
           </w:pPr>
-          <w:hyperlink w:anchor="_Toc243166389" w:history="1">
+          <w:hyperlink w:anchor="_Toc243414625" w:history="1">
             <w:r>
               <w:rPr>
                 <w:rStyle w:val="Hyperlink"/>
@@ -1539,7 +1539,7 @@
                 <w:noProof/>
                 <w:webHidden/>
               </w:rPr>
-              <w:instrText xml:space="preserve"> PAGEREF _Toc243166389 \h </w:instrText>
+              <w:instrText xml:space="preserve"> PAGEREF _Toc243414625 \h </w:instrText>
             </w:r>
             <w:r>
               <w:rPr>
@@ -1585,7 +1585,7 @@
               <w14:ligatures w14:val="standardContextual"/>
             </w:rPr>
           </w:pPr>
-          <w:hyperlink w:anchor="_Toc243166390" w:history="1">
+          <w:hyperlink w:anchor="_Toc243414626" w:history="1">
             <w:r>
               <w:rPr>
                 <w:rStyle w:val="Hyperlink"/>
@@ -1613,7 +1613,7 @@
                 <w:noProof/>
                 <w:webHidden/>
               </w:rPr>
-              <w:instrText xml:space="preserve"> PAGEREF _Toc243166390 \h </w:instrText>
+              <w:instrText xml:space="preserve"> PAGEREF _Toc243414626 \h </w:instrText>
             </w:r>
             <w:r>
               <w:rPr>
@@ -1659,7 +1659,7 @@
               <w14:ligatures w14:val="standardContextual"/>
             </w:rPr>
           </w:pPr>
-          <w:hyperlink w:anchor="_Toc243166391" w:history="1">
+          <w:hyperlink w:anchor="_Toc243414627" w:history="1">
             <w:r>
               <w:rPr>
                 <w:rStyle w:val="Hyperlink"/>
@@ -1687,7 +1687,7 @@
                 <w:noProof/>
                 <w:webHidden/>
               </w:rPr>
-              <w:instrText xml:space="preserve"> PAGEREF _Toc243166391 \h </w:instrText>
+              <w:instrText xml:space="preserve"> PAGEREF _Toc243414627 \h </w:instrText>
             </w:r>
             <w:r>
               <w:rPr>
@@ -1733,7 +1733,7 @@
               <w14:ligatures w14:val="standardContextual"/>
             </w:rPr>
           </w:pPr>
-          <w:hyperlink w:anchor="_Toc243166392" w:history="1">
+          <w:hyperlink w:anchor="_Toc243414628" w:history="1">
             <w:r>
               <w:rPr>
                 <w:rStyle w:val="Hyperlink"/>
@@ -1761,7 +1761,7 @@
                 <w:noProof/>
                 <w:webHidden/>
               </w:rPr>
-              <w:instrText xml:space="preserve"> PAGEREF _Toc243166392 \h </w:instrText>
+              <w:instrText xml:space="preserve"> PAGEREF _Toc243414628 \h </w:instrText>
             </w:r>
             <w:r>
               <w:rPr>
@@ -1807,7 +1807,7 @@
               <w14:ligatures w14:val="standardContextual"/>
             </w:rPr>
           </w:pPr>
-          <w:hyperlink w:anchor="_Toc243166393" w:history="1">
+          <w:hyperlink w:anchor="_Toc243414629" w:history="1">
             <w:r>
               <w:rPr>
                 <w:rStyle w:val="Hyperlink"/>
@@ -1835,7 +1835,7 @@
                 <w:noProof/>
                 <w:webHidden/>
               </w:rPr>
-              <w:instrText xml:space="preserve"> PAGEREF _Toc243166393 \h </w:instrText>
+              <w:instrText xml:space="preserve"> PAGEREF _Toc243414629 \h </w:instrText>
             </w:r>
             <w:r>
               <w:rPr>
@@ -1881,7 +1881,7 @@
               <w14:ligatures w14:val="standardContextual"/>
             </w:rPr>
           </w:pPr>
-          <w:hyperlink w:anchor="_Toc243166394" w:history="1">
+          <w:hyperlink w:anchor="_Toc243414630" w:history="1">
             <w:r>
               <w:rPr>
                 <w:rStyle w:val="Hyperlink"/>
@@ -1909,7 +1909,7 @@
                 <w:noProof/>
                 <w:webHidden/>
               </w:rPr>
-              <w:instrText xml:space="preserve"> PAGEREF _Toc243166394 \h </w:instrText>
+              <w:instrText xml:space="preserve"> PAGEREF _Toc243414630 \h </w:instrText>
             </w:r>
             <w:r>
               <w:rPr>
@@ -1929,7 +1929,7 @@
                 <w:noProof/>
                 <w:webHidden/>
               </w:rPr>
-              <w:t>15</w:t>
+              <w:t>14</w:t>
             </w:r>
             <w:r>
               <w:rPr>
@@ -1955,7 +1955,7 @@
               <w14:ligatures w14:val="standardContextual"/>
             </w:rPr>
           </w:pPr>
-          <w:hyperlink w:anchor="_Toc243166395" w:history="1">
+          <w:hyperlink w:anchor="_Toc243414631" w:history="1">
             <w:r>
               <w:rPr>
                 <w:rStyle w:val="Hyperlink"/>
@@ -1990,7 +1990,7 @@
                 <w:noProof/>
                 <w:webHidden/>
               </w:rPr>
-              <w:instrText xml:space="preserve"> PAGEREF _Toc243166395 \h </w:instrText>
+              <w:instrText xml:space="preserve"> PAGEREF _Toc243414631 \h </w:instrText>
             </w:r>
             <w:r>
               <w:rPr>
@@ -2036,7 +2036,7 @@
               <w14:ligatures w14:val="standardContextual"/>
             </w:rPr>
           </w:pPr>
-          <w:hyperlink w:anchor="_Toc243166396" w:history="1">
+          <w:hyperlink w:anchor="_Toc243414632" w:history="1">
             <w:r>
               <w:rPr>
                 <w:rStyle w:val="Hyperlink"/>
@@ -2064,7 +2064,7 @@
                 <w:noProof/>
                 <w:webHidden/>
               </w:rPr>
-              <w:instrText xml:space="preserve"> PAGEREF _Toc243166396 \h </w:instrText>
+              <w:instrText xml:space="preserve"> PAGEREF _Toc243414632 \h </w:instrText>
             </w:r>
             <w:r>
               <w:rPr>
@@ -2110,7 +2110,7 @@
               <w14:ligatures w14:val="standardContextual"/>
             </w:rPr>
           </w:pPr>
-          <w:hyperlink w:anchor="_Toc243166397" w:history="1">
+          <w:hyperlink w:anchor="_Toc243414633" w:history="1">
             <w:r>
               <w:rPr>
                 <w:rStyle w:val="Hyperlink"/>
@@ -2138,7 +2138,7 @@
                 <w:noProof/>
                 <w:webHidden/>
               </w:rPr>
-              <w:instrText xml:space="preserve"> PAGEREF _Toc243166397 \h </w:instrText>
+              <w:instrText xml:space="preserve"> PAGEREF _Toc243414633 \h </w:instrText>
             </w:r>
             <w:r>
               <w:rPr>
@@ -2184,7 +2184,7 @@
               <w14:ligatures w14:val="standardContextual"/>
             </w:rPr>
           </w:pPr>
-          <w:hyperlink w:anchor="_Toc243166398" w:history="1">
+          <w:hyperlink w:anchor="_Toc243414634" w:history="1">
             <w:r>
               <w:rPr>
                 <w:rStyle w:val="Hyperlink"/>
@@ -2212,7 +2212,7 @@
                 <w:noProof/>
                 <w:webHidden/>
               </w:rPr>
-              <w:instrText xml:space="preserve"> PAGEREF _Toc243166398 \h </w:instrText>
+              <w:instrText xml:space="preserve"> PAGEREF _Toc243414634 \h </w:instrText>
             </w:r>
             <w:r>
               <w:rPr>
@@ -2258,7 +2258,7 @@
               <w14:ligatures w14:val="standardContextual"/>
             </w:rPr>
           </w:pPr>
-          <w:hyperlink w:anchor="_Toc243166399" w:history="1">
+          <w:hyperlink w:anchor="_Toc243414635" w:history="1">
             <w:r>
               <w:rPr>
                 <w:rStyle w:val="Hyperlink"/>
@@ -2286,7 +2286,7 @@
                 <w:noProof/>
                 <w:webHidden/>
               </w:rPr>
-              <w:instrText xml:space="preserve"> PAGEREF _Toc243166399 \h </w:instrText>
+              <w:instrText xml:space="preserve"> PAGEREF _Toc243414635 \h </w:instrText>
             </w:r>
             <w:r>
               <w:rPr>
@@ -2306,7 +2306,7 @@
                 <w:noProof/>
                 <w:webHidden/>
               </w:rPr>
-              <w:t>17</w:t>
+              <w:t>18</w:t>
             </w:r>
             <w:r>
               <w:rPr>
@@ -2332,7 +2332,7 @@
               <w14:ligatures w14:val="standardContextual"/>
             </w:rPr>
           </w:pPr>
-          <w:hyperlink w:anchor="_Toc243166400" w:history="1">
+          <w:hyperlink w:anchor="_Toc243414636" w:history="1">
             <w:r>
               <w:rPr>
                 <w:rStyle w:val="Hyperlink"/>
@@ -2360,7 +2360,7 @@
                 <w:noProof/>
                 <w:webHidden/>
               </w:rPr>
-              <w:instrText xml:space="preserve"> PAGEREF _Toc243166400 \h </w:instrText>
+              <w:instrText xml:space="preserve"> PAGEREF _Toc243414636 \h </w:instrText>
             </w:r>
             <w:r>
               <w:rPr>
@@ -2406,23 +2406,14 @@
               <w14:ligatures w14:val="standardContextual"/>
             </w:rPr>
           </w:pPr>
-          <w:hyperlink w:anchor="_Toc243166401" w:history="1">
+          <w:hyperlink w:anchor="_Toc243414637" w:history="1">
             <w:r>
               <w:rPr>
                 <w:rStyle w:val="Hyperlink"/>
                 <w:rFonts w:ascii="Times New Roman" w:hAnsi="Times New Roman"/>
                 <w:noProof/>
-                <w:lang w:val="ru-RU"/>
-              </w:rPr>
-              <w:t xml:space="preserve">8 </w:t>
-            </w:r>
-            <w:r>
-              <w:rPr>
-                <w:rStyle w:val="Hyperlink"/>
-                <w:rFonts w:ascii="Times New Roman" w:hAnsi="Times New Roman"/>
-                <w:noProof/>
-              </w:rPr>
-              <w:t>Candidate – Concept Analysis</w:t>
+              </w:rPr>
+              <w:t>8 Candidate – Concept Analysis</w:t>
             </w:r>
             <w:r>
               <w:rPr>
@@ -2443,7 +2434,7 @@
                 <w:noProof/>
                 <w:webHidden/>
               </w:rPr>
-              <w:instrText xml:space="preserve"> PAGEREF _Toc243166401 \h </w:instrText>
+              <w:instrText xml:space="preserve"> PAGEREF _Toc243414637 \h </w:instrText>
             </w:r>
             <w:r>
               <w:rPr>
@@ -2463,7 +2454,7 @@
                 <w:noProof/>
                 <w:webHidden/>
               </w:rPr>
-              <w:t>20</w:t>
+              <w:t>21</w:t>
             </w:r>
             <w:r>
               <w:rPr>
@@ -2489,7 +2480,7 @@
               <w14:ligatures w14:val="standardContextual"/>
             </w:rPr>
           </w:pPr>
-          <w:hyperlink w:anchor="_Toc243166402" w:history="1">
+          <w:hyperlink w:anchor="_Toc243414638" w:history="1">
             <w:r>
               <w:rPr>
                 <w:rStyle w:val="Hyperlink"/>
@@ -2534,7 +2525,7 @@
                 <w:noProof/>
                 <w:webHidden/>
               </w:rPr>
-              <w:instrText xml:space="preserve"> PAGEREF _Toc243166402 \h </w:instrText>
+              <w:instrText xml:space="preserve"> PAGEREF _Toc243414638 \h </w:instrText>
             </w:r>
             <w:r>
               <w:rPr>
@@ -2580,7 +2571,7 @@
               <w14:ligatures w14:val="standardContextual"/>
             </w:rPr>
           </w:pPr>
-          <w:hyperlink w:anchor="_Toc243166403" w:history="1">
+          <w:hyperlink w:anchor="_Toc243414639" w:history="1">
             <w:r>
               <w:rPr>
                 <w:rStyle w:val="Hyperlink"/>
@@ -2608,7 +2599,7 @@
                 <w:noProof/>
                 <w:webHidden/>
               </w:rPr>
-              <w:instrText xml:space="preserve"> PAGEREF _Toc243166403 \h </w:instrText>
+              <w:instrText xml:space="preserve"> PAGEREF _Toc243414639 \h </w:instrText>
             </w:r>
             <w:r>
               <w:rPr>
@@ -2628,7 +2619,7 @@
                 <w:noProof/>
                 <w:webHidden/>
               </w:rPr>
-              <w:t>21</w:t>
+              <w:t>22</w:t>
             </w:r>
             <w:r>
               <w:rPr>
@@ -2654,7 +2645,7 @@
               <w14:ligatures w14:val="standardContextual"/>
             </w:rPr>
           </w:pPr>
-          <w:hyperlink w:anchor="_Toc243166404" w:history="1">
+          <w:hyperlink w:anchor="_Toc243414640" w:history="1">
             <w:r>
               <w:rPr>
                 <w:rStyle w:val="Hyperlink"/>
@@ -2682,7 +2673,7 @@
                 <w:noProof/>
                 <w:webHidden/>
               </w:rPr>
-              <w:instrText xml:space="preserve"> PAGEREF _Toc243166404 \h </w:instrText>
+              <w:instrText xml:space="preserve"> PAGEREF _Toc243414640 \h </w:instrText>
             </w:r>
             <w:r>
               <w:rPr>
@@ -2702,7 +2693,7 @@
                 <w:noProof/>
                 <w:webHidden/>
               </w:rPr>
-              <w:t>21</w:t>
+              <w:t>22</w:t>
             </w:r>
             <w:r>
               <w:rPr>
@@ -2728,7 +2719,7 @@
               <w14:ligatures w14:val="standardContextual"/>
             </w:rPr>
           </w:pPr>
-          <w:hyperlink w:anchor="_Toc243166405" w:history="1">
+          <w:hyperlink w:anchor="_Toc243414641" w:history="1">
             <w:r>
               <w:rPr>
                 <w:rStyle w:val="Hyperlink"/>
@@ -2756,7 +2747,7 @@
                 <w:noProof/>
                 <w:webHidden/>
               </w:rPr>
-              <w:instrText xml:space="preserve"> PAGEREF _Toc243166405 \h </w:instrText>
+              <w:instrText xml:space="preserve"> PAGEREF _Toc243414641 \h </w:instrText>
             </w:r>
             <w:r>
               <w:rPr>
@@ -2802,7 +2793,7 @@
               <w14:ligatures w14:val="standardContextual"/>
             </w:rPr>
           </w:pPr>
-          <w:hyperlink w:anchor="_Toc243166406" w:history="1">
+          <w:hyperlink w:anchor="_Toc243414642" w:history="1">
             <w:r>
               <w:rPr>
                 <w:rStyle w:val="Hyperlink"/>
@@ -2829,7 +2820,7 @@
                 <w:noProof/>
                 <w:webHidden/>
               </w:rPr>
-              <w:instrText xml:space="preserve"> PAGEREF _Toc243166406 \h </w:instrText>
+              <w:instrText xml:space="preserve"> PAGEREF _Toc243414642 \h </w:instrText>
             </w:r>
             <w:r>
               <w:rPr>
@@ -2875,7 +2866,7 @@
               <w14:ligatures w14:val="standardContextual"/>
             </w:rPr>
           </w:pPr>
-          <w:hyperlink w:anchor="_Toc243166407" w:history="1">
+          <w:hyperlink w:anchor="_Toc243414643" w:history="1">
             <w:r>
               <w:rPr>
                 <w:rStyle w:val="Hyperlink"/>
@@ -2903,7 +2894,7 @@
                 <w:noProof/>
                 <w:webHidden/>
               </w:rPr>
-              <w:instrText xml:space="preserve"> PAGEREF _Toc243166407 \h </w:instrText>
+              <w:instrText xml:space="preserve"> PAGEREF _Toc243414643 \h </w:instrText>
             </w:r>
             <w:r>
               <w:rPr>
@@ -2923,7 +2914,7 @@
                 <w:noProof/>
                 <w:webHidden/>
               </w:rPr>
-              <w:t>22</w:t>
+              <w:t>23</w:t>
             </w:r>
             <w:r>
               <w:rPr>
@@ -2949,7 +2940,7 @@
               <w14:ligatures w14:val="standardContextual"/>
             </w:rPr>
           </w:pPr>
-          <w:hyperlink w:anchor="_Toc243166408" w:history="1">
+          <w:hyperlink w:anchor="_Toc243414644" w:history="1">
             <w:r>
               <w:rPr>
                 <w:rStyle w:val="Hyperlink"/>
@@ -2977,7 +2968,7 @@
                 <w:noProof/>
                 <w:webHidden/>
               </w:rPr>
-              <w:instrText xml:space="preserve"> PAGEREF _Toc243166408 \h </w:instrText>
+              <w:instrText xml:space="preserve"> PAGEREF _Toc243414644 \h </w:instrText>
             </w:r>
             <w:r>
               <w:rPr>
@@ -3023,7 +3014,7 @@
               <w14:ligatures w14:val="standardContextual"/>
             </w:rPr>
           </w:pPr>
-          <w:hyperlink w:anchor="_Toc243166409" w:history="1">
+          <w:hyperlink w:anchor="_Toc243414645" w:history="1">
             <w:r>
               <w:rPr>
                 <w:rStyle w:val="Hyperlink"/>
@@ -3051,7 +3042,7 @@
                 <w:noProof/>
                 <w:webHidden/>
               </w:rPr>
-              <w:instrText xml:space="preserve"> PAGEREF _Toc243166409 \h </w:instrText>
+              <w:instrText xml:space="preserve"> PAGEREF _Toc243414645 \h </w:instrText>
             </w:r>
             <w:r>
               <w:rPr>
@@ -3097,14 +3088,14 @@
               <w14:ligatures w14:val="standardContextual"/>
             </w:rPr>
           </w:pPr>
-          <w:hyperlink w:anchor="_Toc243166410" w:history="1">
+          <w:hyperlink w:anchor="_Toc243414646" w:history="1">
             <w:r>
               <w:rPr>
                 <w:rStyle w:val="Hyperlink"/>
                 <w:rFonts w:ascii="Times New Roman" w:hAnsi="Times New Roman"/>
                 <w:noProof/>
               </w:rPr>
-              <w:t>11.2</w:t>
+              <w:t>11.2 AI Declaration</w:t>
             </w:r>
             <w:r>
               <w:rPr>
@@ -3125,7 +3116,7 @@
                 <w:noProof/>
                 <w:webHidden/>
               </w:rPr>
-              <w:instrText xml:space="preserve"> PAGEREF _Toc243166410 \h </w:instrText>
+              <w:instrText xml:space="preserve"> PAGEREF _Toc243414646 \h </w:instrText>
             </w:r>
             <w:r>
               <w:rPr>
@@ -3145,7 +3136,7 @@
                 <w:noProof/>
                 <w:webHidden/>
               </w:rPr>
-              <w:t>23</w:t>
+              <w:t>24</w:t>
             </w:r>
             <w:r>
               <w:rPr>
@@ -3205,7 +3196,7 @@
           <w:szCs w:val="28"/>
         </w:rPr>
       </w:pPr>
-      <w:bookmarkStart w:id="0" w:name="_Toc243166372"/>
+      <w:bookmarkStart w:id="0" w:name="_Toc243414608"/>
       <w:r>
         <w:rPr>
           <w:rFonts w:ascii="Times New Roman" w:hAnsi="Times New Roman" w:cs="Times New Roman"/>
@@ -3229,7 +3220,7 @@
           <w:szCs w:val="24"/>
         </w:rPr>
       </w:pPr>
-      <w:bookmarkStart w:id="1" w:name="_Toc243166373"/>
+      <w:bookmarkStart w:id="1" w:name="_Toc243414609"/>
       <w:r>
         <w:rPr>
           <w:rFonts w:ascii="Times New Roman" w:hAnsi="Times New Roman" w:cs="Times New Roman"/>
@@ -3248,6 +3239,7 @@
         </w:rPr>
         <w:t xml:space="preserve"> </w:t>
       </w:r>
+      <w:proofErr w:type="spellStart"/>
       <w:r>
         <w:rPr>
           <w:rFonts w:ascii="Times New Roman" w:hAnsi="Times New Roman" w:cs="Times New Roman"/>
@@ -3255,7 +3247,17 @@
           <w:sz w:val="24"/>
           <w:szCs w:val="24"/>
         </w:rPr>
-        <w:t>Organisation and Current Process</w:t>
+        <w:t>Organisation</w:t>
+      </w:r>
+      <w:proofErr w:type="spellEnd"/>
+      <w:r>
+        <w:rPr>
+          <w:rFonts w:ascii="Times New Roman" w:hAnsi="Times New Roman" w:cs="Times New Roman"/>
+          <w:color w:val="auto"/>
+          <w:sz w:val="24"/>
+          <w:szCs w:val="24"/>
+        </w:rPr>
+        <w:t xml:space="preserve"> and Current Process</w:t>
       </w:r>
       <w:bookmarkEnd w:id="1"/>
     </w:p>
@@ -3298,7 +3300,7 @@
           <w:szCs w:val="24"/>
         </w:rPr>
       </w:pPr>
-      <w:bookmarkStart w:id="2" w:name="_Toc243166374"/>
+      <w:bookmarkStart w:id="2" w:name="_Toc243414610"/>
       <w:r>
         <w:rPr>
           <w:rFonts w:ascii="Times New Roman" w:hAnsi="Times New Roman" w:cs="Times New Roman"/>
@@ -3611,7 +3613,7 @@
           <w:szCs w:val="24"/>
         </w:rPr>
       </w:pPr>
-      <w:bookmarkStart w:id="3" w:name="_Toc243166375"/>
+      <w:bookmarkStart w:id="3" w:name="_Toc243414611"/>
       <w:r>
         <w:rPr>
           <w:rFonts w:ascii="Times New Roman" w:hAnsi="Times New Roman" w:cs="Times New Roman"/>
@@ -3888,7 +3890,7 @@
           <w:szCs w:val="28"/>
         </w:rPr>
       </w:pPr>
-      <w:bookmarkStart w:id="4" w:name="_Toc243166376"/>
+      <w:bookmarkStart w:id="4" w:name="_Toc243414612"/>
       <w:r>
         <w:rPr>
           <w:rFonts w:ascii="Times New Roman" w:hAnsi="Times New Roman" w:cs="Times New Roman"/>
@@ -3911,7 +3913,7 @@
           <w:szCs w:val="24"/>
         </w:rPr>
       </w:pPr>
-      <w:bookmarkStart w:id="5" w:name="_Toc243166377"/>
+      <w:bookmarkStart w:id="5" w:name="_Toc243414613"/>
       <w:r>
         <w:rPr>
           <w:rFonts w:ascii="Times New Roman" w:hAnsi="Times New Roman" w:cs="Times New Roman"/>
@@ -3948,7 +3950,7 @@
           <w:szCs w:val="24"/>
         </w:rPr>
       </w:pPr>
-      <w:bookmarkStart w:id="6" w:name="_Toc243166378"/>
+      <w:bookmarkStart w:id="6" w:name="_Toc243414614"/>
       <w:r>
         <w:rPr>
           <w:rFonts w:ascii="Times New Roman" w:hAnsi="Times New Roman" w:cs="Times New Roman"/>
@@ -3971,7 +3973,7 @@
           <w:szCs w:val="24"/>
         </w:rPr>
       </w:pPr>
-      <w:bookmarkStart w:id="7" w:name="_Toc243166379"/>
+      <w:bookmarkStart w:id="7" w:name="_Toc243414615"/>
       <w:r>
         <w:rPr>
           <w:rFonts w:ascii="Times New Roman" w:hAnsi="Times New Roman" w:cs="Times New Roman"/>
@@ -4298,7 +4300,21 @@
               <w:rPr>
                 <w:rFonts w:ascii="Times New Roman" w:hAnsi="Times New Roman" w:cs="Times New Roman"/>
               </w:rPr>
-              <w:t xml:space="preserve">Production batch planning taking into account customer orders, ingredient </w:t>
+              <w:t xml:space="preserve">Production batch planning </w:t>
+            </w:r>
+            <w:proofErr w:type="gramStart"/>
+            <w:r>
+              <w:rPr>
+                <w:rFonts w:ascii="Times New Roman" w:hAnsi="Times New Roman" w:cs="Times New Roman"/>
+              </w:rPr>
+              <w:t>taking into account</w:t>
+            </w:r>
+            <w:proofErr w:type="gramEnd"/>
+            <w:r>
+              <w:rPr>
+                <w:rFonts w:ascii="Times New Roman" w:hAnsi="Times New Roman" w:cs="Times New Roman"/>
+              </w:rPr>
+              <w:t xml:space="preserve"> customer orders, ingredient </w:t>
             </w:r>
             <w:r>
               <w:rPr>
@@ -4504,7 +4520,7 @@
           <w:szCs w:val="24"/>
         </w:rPr>
       </w:pPr>
-      <w:bookmarkStart w:id="8" w:name="_Toc243166380"/>
+      <w:bookmarkStart w:id="8" w:name="_Toc243414616"/>
       <w:r>
         <w:rPr>
           <w:rFonts w:ascii="Times New Roman" w:hAnsi="Times New Roman" w:cs="Times New Roman"/>
@@ -4778,7 +4794,7 @@
           <w:szCs w:val="24"/>
         </w:rPr>
       </w:pPr>
-      <w:bookmarkStart w:id="9" w:name="_Toc243166381"/>
+      <w:bookmarkStart w:id="9" w:name="_Toc243414617"/>
       <w:r>
         <w:rPr>
           <w:rFonts w:ascii="Times New Roman" w:hAnsi="Times New Roman" w:cs="Times New Roman"/>
@@ -5127,7 +5143,7 @@
           <w:szCs w:val="28"/>
         </w:rPr>
       </w:pPr>
-      <w:bookmarkStart w:id="10" w:name="_Toc243166382"/>
+      <w:bookmarkStart w:id="10" w:name="_Toc243414618"/>
       <w:r>
         <w:rPr>
           <w:rFonts w:ascii="Times New Roman" w:hAnsi="Times New Roman" w:cs="Times New Roman"/>
@@ -5373,7 +5389,21 @@
               <w:rPr>
                 <w:rFonts w:ascii="Times New Roman" w:hAnsi="Times New Roman" w:cs="Times New Roman"/>
               </w:rPr>
-              <w:t xml:space="preserve">The recipe may not be the version actually used </w:t>
+              <w:t xml:space="preserve">The recipe may not be the version </w:t>
+            </w:r>
+            <w:proofErr w:type="gramStart"/>
+            <w:r>
+              <w:rPr>
+                <w:rFonts w:ascii="Times New Roman" w:hAnsi="Times New Roman" w:cs="Times New Roman"/>
+              </w:rPr>
+              <w:t>actually used</w:t>
+            </w:r>
+            <w:proofErr w:type="gramEnd"/>
+            <w:r>
+              <w:rPr>
+                <w:rFonts w:ascii="Times New Roman" w:hAnsi="Times New Roman" w:cs="Times New Roman"/>
+              </w:rPr>
+              <w:t xml:space="preserve"> </w:t>
             </w:r>
           </w:p>
         </w:tc>
@@ -5473,7 +5503,21 @@
               <w:rPr>
                 <w:rFonts w:ascii="Times New Roman" w:hAnsi="Times New Roman" w:cs="Times New Roman"/>
               </w:rPr>
-              <w:t>Use appropriate recipe and ingredient information</w:t>
+              <w:t xml:space="preserve">Use appropriate </w:t>
+            </w:r>
+            <w:proofErr w:type="gramStart"/>
+            <w:r>
+              <w:rPr>
+                <w:rFonts w:ascii="Times New Roman" w:hAnsi="Times New Roman" w:cs="Times New Roman"/>
+              </w:rPr>
+              <w:t>recipe</w:t>
+            </w:r>
+            <w:proofErr w:type="gramEnd"/>
+            <w:r>
+              <w:rPr>
+                <w:rFonts w:ascii="Times New Roman" w:hAnsi="Times New Roman" w:cs="Times New Roman"/>
+              </w:rPr>
+              <w:t xml:space="preserve"> and ingredient information</w:t>
             </w:r>
             <w:r>
               <w:rPr>
@@ -6182,7 +6226,6 @@
         <w:spacing w:line="360" w:lineRule="auto"/>
         <w:rPr>
           <w:rFonts w:ascii="Times New Roman" w:hAnsi="Times New Roman" w:cs="Times New Roman"/>
-          <w:lang w:val="ru-RU"/>
         </w:rPr>
       </w:pPr>
       <w:r>
@@ -6203,7 +6246,7 @@
           <w:szCs w:val="24"/>
         </w:rPr>
       </w:pPr>
-      <w:bookmarkStart w:id="11" w:name="_Toc243166383"/>
+      <w:bookmarkStart w:id="11" w:name="_Toc243414619"/>
       <w:r>
         <w:rPr>
           <w:rFonts w:ascii="Times New Roman" w:hAnsi="Times New Roman" w:cs="Times New Roman"/>
@@ -6785,7 +6828,7 @@
           <w:szCs w:val="24"/>
         </w:rPr>
       </w:pPr>
-      <w:bookmarkStart w:id="12" w:name="_Toc243166384"/>
+      <w:bookmarkStart w:id="12" w:name="_Toc243414620"/>
       <w:r>
         <w:rPr>
           <w:rFonts w:ascii="Times New Roman" w:hAnsi="Times New Roman" w:cs="Times New Roman"/>
@@ -6931,7 +6974,7 @@
           <w:szCs w:val="24"/>
         </w:rPr>
       </w:pPr>
-      <w:bookmarkStart w:id="13" w:name="_Toc243166385"/>
+      <w:bookmarkStart w:id="13" w:name="_Toc243414621"/>
       <w:r>
         <w:rPr>
           <w:rFonts w:ascii="Times New Roman" w:hAnsi="Times New Roman" w:cs="Times New Roman"/>
@@ -7796,7 +7839,7 @@
           <w:szCs w:val="28"/>
         </w:rPr>
       </w:pPr>
-      <w:bookmarkStart w:id="14" w:name="_Toc243166386"/>
+      <w:bookmarkStart w:id="14" w:name="_Toc243414622"/>
       <w:r>
         <w:rPr>
           <w:rFonts w:ascii="Times New Roman" w:hAnsi="Times New Roman" w:cs="Times New Roman"/>
@@ -7819,7 +7862,7 @@
           <w:szCs w:val="24"/>
         </w:rPr>
       </w:pPr>
-      <w:bookmarkStart w:id="15" w:name="_Toc243166387"/>
+      <w:bookmarkStart w:id="15" w:name="_Toc243414623"/>
       <w:r>
         <w:rPr>
           <w:rFonts w:ascii="Times New Roman" w:hAnsi="Times New Roman" w:cs="Times New Roman"/>
@@ -7913,12 +7956,14 @@
                 <w:rFonts w:ascii="Times New Roman" w:hAnsi="Times New Roman" w:cs="Times New Roman"/>
               </w:rPr>
             </w:pPr>
+            <w:proofErr w:type="spellStart"/>
             <w:r>
               <w:rPr>
                 <w:rFonts w:ascii="Times New Roman" w:hAnsi="Times New Roman" w:cs="Times New Roman"/>
               </w:rPr>
               <w:t>MoSCoW</w:t>
             </w:r>
+            <w:proofErr w:type="spellEnd"/>
           </w:p>
         </w:tc>
         <w:tc>
@@ -8821,7 +8866,7 @@
           <w:szCs w:val="24"/>
         </w:rPr>
       </w:pPr>
-      <w:bookmarkStart w:id="16" w:name="_Toc243166388"/>
+      <w:bookmarkStart w:id="16" w:name="_Toc243414624"/>
       <w:r>
         <w:rPr>
           <w:rFonts w:ascii="Times New Roman" w:hAnsi="Times New Roman" w:cs="Times New Roman"/>
@@ -9192,7 +9237,21 @@
               <w:rPr>
                 <w:rFonts w:ascii="Times New Roman" w:hAnsi="Times New Roman" w:cs="Times New Roman"/>
               </w:rPr>
-              <w:t>The system shall display only information that the user is authorised to access</w:t>
+              <w:t xml:space="preserve">The system shall display only information that the user is </w:t>
+            </w:r>
+            <w:proofErr w:type="spellStart"/>
+            <w:r>
+              <w:rPr>
+                <w:rFonts w:ascii="Times New Roman" w:hAnsi="Times New Roman" w:cs="Times New Roman"/>
+              </w:rPr>
+              <w:t>authorised</w:t>
+            </w:r>
+            <w:proofErr w:type="spellEnd"/>
+            <w:r>
+              <w:rPr>
+                <w:rFonts w:ascii="Times New Roman" w:hAnsi="Times New Roman" w:cs="Times New Roman"/>
+              </w:rPr>
+              <w:t xml:space="preserve"> to access</w:t>
             </w:r>
           </w:p>
         </w:tc>
@@ -9230,7 +9289,21 @@
               <w:rPr>
                 <w:rFonts w:ascii="Times New Roman" w:hAnsi="Times New Roman" w:cs="Times New Roman"/>
               </w:rPr>
-              <w:t>Verify that a user cannot view information that is not authorised for their role</w:t>
+              <w:t xml:space="preserve">Verify that a user cannot view information that is not </w:t>
+            </w:r>
+            <w:proofErr w:type="spellStart"/>
+            <w:r>
+              <w:rPr>
+                <w:rFonts w:ascii="Times New Roman" w:hAnsi="Times New Roman" w:cs="Times New Roman"/>
+              </w:rPr>
+              <w:t>authorised</w:t>
+            </w:r>
+            <w:proofErr w:type="spellEnd"/>
+            <w:r>
+              <w:rPr>
+                <w:rFonts w:ascii="Times New Roman" w:hAnsi="Times New Roman" w:cs="Times New Roman"/>
+              </w:rPr>
+              <w:t xml:space="preserve"> for their role</w:t>
             </w:r>
           </w:p>
         </w:tc>
@@ -9338,7 +9411,6 @@
         <w:spacing w:line="360" w:lineRule="auto"/>
         <w:rPr>
           <w:rFonts w:ascii="Times New Roman" w:hAnsi="Times New Roman" w:cs="Times New Roman"/>
-          <w:lang w:val="ru-RU"/>
         </w:rPr>
       </w:pPr>
       <w:r>
@@ -9366,7 +9438,6 @@
         <w:spacing w:line="360" w:lineRule="auto"/>
         <w:rPr>
           <w:rFonts w:ascii="Times New Roman" w:hAnsi="Times New Roman" w:cs="Times New Roman"/>
-          <w:lang w:val="ru-RU"/>
         </w:rPr>
       </w:pPr>
     </w:p>
@@ -9381,7 +9452,7 @@
           <w:szCs w:val="28"/>
         </w:rPr>
       </w:pPr>
-      <w:bookmarkStart w:id="17" w:name="_Toc243166389"/>
+      <w:bookmarkStart w:id="17" w:name="_Toc243414625"/>
       <w:r>
         <w:rPr>
           <w:rFonts w:ascii="Times New Roman" w:hAnsi="Times New Roman" w:cs="Times New Roman"/>
@@ -9404,7 +9475,7 @@
           <w:szCs w:val="24"/>
         </w:rPr>
       </w:pPr>
-      <w:bookmarkStart w:id="18" w:name="_Toc243166390"/>
+      <w:bookmarkStart w:id="18" w:name="_Toc243414626"/>
       <w:r>
         <w:rPr>
           <w:rFonts w:ascii="Times New Roman" w:hAnsi="Times New Roman" w:cs="Times New Roman"/>
@@ -9739,7 +9810,7 @@
           <w:szCs w:val="24"/>
         </w:rPr>
       </w:pPr>
-      <w:bookmarkStart w:id="19" w:name="_Toc243166391"/>
+      <w:bookmarkStart w:id="19" w:name="_Toc243414627"/>
       <w:r>
         <w:rPr>
           <w:rFonts w:ascii="Times New Roman" w:hAnsi="Times New Roman" w:cs="Times New Roman"/>
@@ -9856,7 +9927,35 @@
               <w:rPr>
                 <w:rFonts w:ascii="Times New Roman" w:hAnsi="Times New Roman" w:cs="Times New Roman"/>
               </w:rPr>
-              <w:t>It is assumed that the Production Manger is authorised to approve new recipe versions</w:t>
+              <w:t xml:space="preserve">It is assumed that the Production </w:t>
+            </w:r>
+            <w:proofErr w:type="spellStart"/>
+            <w:r>
+              <w:rPr>
+                <w:rFonts w:ascii="Times New Roman" w:hAnsi="Times New Roman" w:cs="Times New Roman"/>
+              </w:rPr>
+              <w:t>Manger</w:t>
+            </w:r>
+            <w:proofErr w:type="spellEnd"/>
+            <w:r>
+              <w:rPr>
+                <w:rFonts w:ascii="Times New Roman" w:hAnsi="Times New Roman" w:cs="Times New Roman"/>
+              </w:rPr>
+              <w:t xml:space="preserve"> is </w:t>
+            </w:r>
+            <w:proofErr w:type="spellStart"/>
+            <w:r>
+              <w:rPr>
+                <w:rFonts w:ascii="Times New Roman" w:hAnsi="Times New Roman" w:cs="Times New Roman"/>
+              </w:rPr>
+              <w:t>authorised</w:t>
+            </w:r>
+            <w:proofErr w:type="spellEnd"/>
+            <w:r>
+              <w:rPr>
+                <w:rFonts w:ascii="Times New Roman" w:hAnsi="Times New Roman" w:cs="Times New Roman"/>
+              </w:rPr>
+              <w:t xml:space="preserve"> to approve new recipe versions</w:t>
             </w:r>
           </w:p>
         </w:tc>
@@ -9921,7 +10020,21 @@
               <w:rPr>
                 <w:rFonts w:ascii="Times New Roman" w:hAnsi="Times New Roman" w:cs="Times New Roman"/>
               </w:rPr>
-              <w:t>the Production Manager is authorised to approve ingredient substitution</w:t>
+              <w:t xml:space="preserve">the Production Manager is </w:t>
+            </w:r>
+            <w:proofErr w:type="spellStart"/>
+            <w:r>
+              <w:rPr>
+                <w:rFonts w:ascii="Times New Roman" w:hAnsi="Times New Roman" w:cs="Times New Roman"/>
+              </w:rPr>
+              <w:t>authorised</w:t>
+            </w:r>
+            <w:proofErr w:type="spellEnd"/>
+            <w:r>
+              <w:rPr>
+                <w:rFonts w:ascii="Times New Roman" w:hAnsi="Times New Roman" w:cs="Times New Roman"/>
+              </w:rPr>
+              <w:t xml:space="preserve"> to approve ingredient substitution</w:t>
             </w:r>
           </w:p>
         </w:tc>
@@ -10016,7 +10129,7 @@
           <w:szCs w:val="24"/>
         </w:rPr>
       </w:pPr>
-      <w:bookmarkStart w:id="20" w:name="_Toc243166392"/>
+      <w:bookmarkStart w:id="20" w:name="_Toc243414628"/>
       <w:r>
         <w:rPr>
           <w:rFonts w:ascii="Times New Roman" w:hAnsi="Times New Roman" w:cs="Times New Roman"/>
@@ -10286,7 +10399,7 @@
           <w:szCs w:val="24"/>
         </w:rPr>
       </w:pPr>
-      <w:bookmarkStart w:id="21" w:name="_Toc243166393"/>
+      <w:bookmarkStart w:id="21" w:name="_Toc243414629"/>
       <w:r>
         <w:rPr>
           <w:rFonts w:ascii="Times New Roman" w:hAnsi="Times New Roman" w:cs="Times New Roman"/>
@@ -10371,7 +10484,15 @@
           </w:tcPr>
           <w:p>
             <w:r>
-              <w:t>This may results in incorrect labeling, cost calculations, expected yield, or allergen information</w:t>
+              <w:t xml:space="preserve">This may </w:t>
+            </w:r>
+            <w:proofErr w:type="gramStart"/>
+            <w:r>
+              <w:t>results</w:t>
+            </w:r>
+            <w:proofErr w:type="gramEnd"/>
+            <w:r>
+              <w:t xml:space="preserve"> in incorrect labeling, cost calculations, expected yield, or allergen information</w:t>
             </w:r>
           </w:p>
         </w:tc>
@@ -10452,7 +10573,7 @@
           <w:szCs w:val="24"/>
         </w:rPr>
       </w:pPr>
-      <w:bookmarkStart w:id="22" w:name="_Toc243166394"/>
+      <w:bookmarkStart w:id="22" w:name="_Toc243414630"/>
       <w:r>
         <w:rPr>
           <w:rFonts w:ascii="Times New Roman" w:hAnsi="Times New Roman" w:cs="Times New Roman"/>
@@ -10578,7 +10699,21 @@
               <w:rPr>
                 <w:rFonts w:ascii="Times New Roman" w:hAnsi="Times New Roman" w:cs="Times New Roman"/>
               </w:rPr>
-              <w:t>Who is authorised to approve a recipe version?</w:t>
+              <w:t xml:space="preserve">Who is </w:t>
+            </w:r>
+            <w:proofErr w:type="spellStart"/>
+            <w:r>
+              <w:rPr>
+                <w:rFonts w:ascii="Times New Roman" w:hAnsi="Times New Roman" w:cs="Times New Roman"/>
+              </w:rPr>
+              <w:t>authorised</w:t>
+            </w:r>
+            <w:proofErr w:type="spellEnd"/>
+            <w:r>
+              <w:rPr>
+                <w:rFonts w:ascii="Times New Roman" w:hAnsi="Times New Roman" w:cs="Times New Roman"/>
+              </w:rPr>
+              <w:t xml:space="preserve"> to approve a recipe version?</w:t>
             </w:r>
           </w:p>
         </w:tc>
@@ -10637,7 +10772,21 @@
               <w:rPr>
                 <w:rFonts w:ascii="Times New Roman" w:hAnsi="Times New Roman" w:cs="Times New Roman"/>
               </w:rPr>
-              <w:t>Who is authorised to approve an ingredient substitution?</w:t>
+              <w:t xml:space="preserve">Who is </w:t>
+            </w:r>
+            <w:proofErr w:type="spellStart"/>
+            <w:r>
+              <w:rPr>
+                <w:rFonts w:ascii="Times New Roman" w:hAnsi="Times New Roman" w:cs="Times New Roman"/>
+              </w:rPr>
+              <w:t>authorised</w:t>
+            </w:r>
+            <w:proofErr w:type="spellEnd"/>
+            <w:r>
+              <w:rPr>
+                <w:rFonts w:ascii="Times New Roman" w:hAnsi="Times New Roman" w:cs="Times New Roman"/>
+              </w:rPr>
+              <w:t xml:space="preserve"> to approve an ingredient substitution?</w:t>
             </w:r>
           </w:p>
         </w:tc>
@@ -10939,7 +11088,21 @@
               <w:rPr>
                 <w:rFonts w:ascii="Times New Roman" w:hAnsi="Times New Roman" w:cs="Times New Roman"/>
               </w:rPr>
-              <w:t>How should packaged units be linked to production batches and customer orders?</w:t>
+              <w:t xml:space="preserve">How should </w:t>
+            </w:r>
+            <w:proofErr w:type="spellStart"/>
+            <w:r>
+              <w:rPr>
+                <w:rFonts w:ascii="Times New Roman" w:hAnsi="Times New Roman" w:cs="Times New Roman"/>
+              </w:rPr>
+              <w:t>packaged</w:t>
+            </w:r>
+            <w:proofErr w:type="spellEnd"/>
+            <w:r>
+              <w:rPr>
+                <w:rFonts w:ascii="Times New Roman" w:hAnsi="Times New Roman" w:cs="Times New Roman"/>
+              </w:rPr>
+              <w:t xml:space="preserve"> units be linked to production batches and customer orders?</w:t>
             </w:r>
           </w:p>
         </w:tc>
@@ -11033,7 +11196,7 @@
           <w:szCs w:val="28"/>
         </w:rPr>
       </w:pPr>
-      <w:bookmarkStart w:id="23" w:name="_Toc243166395"/>
+      <w:bookmarkStart w:id="23" w:name="_Toc243414631"/>
       <w:r>
         <w:rPr>
           <w:color w:val="auto"/>
@@ -11064,7 +11227,7 @@
           <w:szCs w:val="24"/>
         </w:rPr>
       </w:pPr>
-      <w:bookmarkStart w:id="24" w:name="_Toc243166396"/>
+      <w:bookmarkStart w:id="24" w:name="_Toc243414632"/>
       <w:r>
         <w:rPr>
           <w:rFonts w:ascii="Times New Roman" w:hAnsi="Times New Roman" w:cs="Times New Roman"/>
@@ -11101,7 +11264,7 @@
           <w:szCs w:val="24"/>
         </w:rPr>
       </w:pPr>
-      <w:bookmarkStart w:id="25" w:name="_Toc243166397"/>
+      <w:bookmarkStart w:id="25" w:name="_Toc243414633"/>
       <w:r>
         <w:rPr>
           <w:rFonts w:ascii="Times New Roman" w:hAnsi="Times New Roman" w:cs="Times New Roman"/>
@@ -11853,7 +12016,7 @@
           <w:szCs w:val="24"/>
         </w:rPr>
       </w:pPr>
-      <w:bookmarkStart w:id="26" w:name="_Toc243166398"/>
+      <w:bookmarkStart w:id="26" w:name="_Toc243414634"/>
       <w:r>
         <w:rPr>
           <w:rFonts w:ascii="Times New Roman" w:hAnsi="Times New Roman" w:cs="Times New Roman"/>
@@ -11930,7 +12093,7 @@
           <w:szCs w:val="24"/>
         </w:rPr>
       </w:pPr>
-      <w:bookmarkStart w:id="27" w:name="_Toc243166399"/>
+      <w:bookmarkStart w:id="27" w:name="_Toc243414635"/>
       <w:r>
         <w:rPr>
           <w:rFonts w:ascii="Times New Roman" w:hAnsi="Times New Roman" w:cs="Times New Roman"/>
@@ -12268,7 +12431,21 @@
               <w:rPr>
                 <w:rFonts w:ascii="Times New Roman" w:hAnsi="Times New Roman" w:cs="Times New Roman"/>
               </w:rPr>
-              <w:t>A production batch has been planned and an applicable recipe version has been identified</w:t>
+              <w:t xml:space="preserve">A production batch has been </w:t>
+            </w:r>
+            <w:proofErr w:type="gramStart"/>
+            <w:r>
+              <w:rPr>
+                <w:rFonts w:ascii="Times New Roman" w:hAnsi="Times New Roman" w:cs="Times New Roman"/>
+              </w:rPr>
+              <w:t>planned</w:t>
+            </w:r>
+            <w:proofErr w:type="gramEnd"/>
+            <w:r>
+              <w:rPr>
+                <w:rFonts w:ascii="Times New Roman" w:hAnsi="Times New Roman" w:cs="Times New Roman"/>
+              </w:rPr>
+              <w:t xml:space="preserve"> and an applicable recipe version has been identified</w:t>
             </w:r>
           </w:p>
         </w:tc>
@@ -12962,7 +13139,7 @@
           <w:szCs w:val="28"/>
         </w:rPr>
       </w:pPr>
-      <w:bookmarkStart w:id="28" w:name="_Toc243166400"/>
+      <w:bookmarkStart w:id="28" w:name="_Toc243414636"/>
       <w:r>
         <w:rPr>
           <w:rFonts w:ascii="Times New Roman" w:hAnsi="Times New Roman" w:cs="Times New Roman"/>
@@ -13055,12 +13232,14 @@
                 <w:rFonts w:ascii="Times New Roman" w:hAnsi="Times New Roman" w:cs="Times New Roman"/>
               </w:rPr>
             </w:pPr>
+            <w:proofErr w:type="spellStart"/>
             <w:r>
               <w:rPr>
                 <w:rFonts w:ascii="Times New Roman" w:hAnsi="Times New Roman" w:cs="Times New Roman"/>
               </w:rPr>
               <w:t>Behaviour</w:t>
             </w:r>
+            <w:proofErr w:type="spellEnd"/>
           </w:p>
         </w:tc>
       </w:tr>
@@ -13606,7 +13785,6 @@
         <w:spacing w:line="360" w:lineRule="auto"/>
         <w:rPr>
           <w:rFonts w:ascii="Times New Roman" w:hAnsi="Times New Roman" w:cs="Times New Roman"/>
-          <w:lang w:val="ru-RU"/>
         </w:rPr>
       </w:pPr>
       <w:r>
@@ -13663,7 +13841,6 @@
         <w:spacing w:line="360" w:lineRule="auto"/>
         <w:rPr>
           <w:rFonts w:ascii="Times New Roman" w:hAnsi="Times New Roman" w:cs="Times New Roman"/>
-          <w:lang w:val="ru-RU"/>
         </w:rPr>
       </w:pPr>
     </w:p>
@@ -13675,17 +13852,15 @@
           <w:color w:val="auto"/>
           <w:sz w:val="28"/>
           <w:szCs w:val="28"/>
-          <w:lang w:val="ru-RU"/>
         </w:rPr>
       </w:pPr>
-      <w:bookmarkStart w:id="29" w:name="_Toc243166401"/>
+      <w:bookmarkStart w:id="29" w:name="_Toc243414637"/>
       <w:r>
         <w:rPr>
           <w:rFonts w:ascii="Times New Roman" w:hAnsi="Times New Roman" w:cs="Times New Roman"/>
           <w:color w:val="auto"/>
           <w:sz w:val="28"/>
           <w:szCs w:val="28"/>
-          <w:lang w:val="ru-RU"/>
         </w:rPr>
         <w:lastRenderedPageBreak/>
         <w:t xml:space="preserve">8 </w:t>
@@ -13717,7 +13892,7 @@
           <w:szCs w:val="24"/>
         </w:rPr>
       </w:pPr>
-      <w:bookmarkStart w:id="30" w:name="_Toc243166402"/>
+      <w:bookmarkStart w:id="30" w:name="_Toc243414638"/>
       <w:r>
         <w:rPr>
           <w:rFonts w:ascii="Times New Roman" w:hAnsi="Times New Roman" w:cs="Times New Roman"/>
@@ -14173,7 +14348,35 @@
               <w:rPr>
                 <w:rFonts w:ascii="Times New Roman" w:hAnsi="Times New Roman" w:cs="Times New Roman"/>
               </w:rPr>
-              <w:t xml:space="preserve">Supplier management is not a primary focus of the system and the required traceability can be represented through </w:t>
+              <w:t xml:space="preserve">Supplier management is not </w:t>
+            </w:r>
+            <w:proofErr w:type="gramStart"/>
+            <w:r>
+              <w:rPr>
+                <w:rFonts w:ascii="Times New Roman" w:hAnsi="Times New Roman" w:cs="Times New Roman"/>
+              </w:rPr>
+              <w:t>a primary focus</w:t>
+            </w:r>
+            <w:proofErr w:type="gramEnd"/>
+            <w:r>
+              <w:rPr>
+                <w:rFonts w:ascii="Times New Roman" w:hAnsi="Times New Roman" w:cs="Times New Roman"/>
+              </w:rPr>
+              <w:t xml:space="preserve"> of the </w:t>
+            </w:r>
+            <w:proofErr w:type="gramStart"/>
+            <w:r>
+              <w:rPr>
+                <w:rFonts w:ascii="Times New Roman" w:hAnsi="Times New Roman" w:cs="Times New Roman"/>
+              </w:rPr>
+              <w:t>system</w:t>
+            </w:r>
+            <w:proofErr w:type="gramEnd"/>
+            <w:r>
+              <w:rPr>
+                <w:rFonts w:ascii="Times New Roman" w:hAnsi="Times New Roman" w:cs="Times New Roman"/>
+              </w:rPr>
+              <w:t xml:space="preserve"> and the required traceability can be represented through </w:t>
             </w:r>
             <w:r>
               <w:rPr>
@@ -14303,7 +14506,21 @@
               <w:rPr>
                 <w:rFonts w:ascii="Times New Roman" w:hAnsi="Times New Roman" w:cs="Times New Roman"/>
               </w:rPr>
-              <w:t>Orders drive production requirements and have a many – to – many relationship with production batches</w:t>
+              <w:t xml:space="preserve">Orders drive production requirements and have a many – to – many </w:t>
+            </w:r>
+            <w:proofErr w:type="gramStart"/>
+            <w:r>
+              <w:rPr>
+                <w:rFonts w:ascii="Times New Roman" w:hAnsi="Times New Roman" w:cs="Times New Roman"/>
+              </w:rPr>
+              <w:t>relationship</w:t>
+            </w:r>
+            <w:proofErr w:type="gramEnd"/>
+            <w:r>
+              <w:rPr>
+                <w:rFonts w:ascii="Times New Roman" w:hAnsi="Times New Roman" w:cs="Times New Roman"/>
+              </w:rPr>
+              <w:t xml:space="preserve"> with production batches</w:t>
             </w:r>
           </w:p>
         </w:tc>
@@ -14439,7 +14656,7 @@
           <w:szCs w:val="28"/>
         </w:rPr>
       </w:pPr>
-      <w:bookmarkStart w:id="31" w:name="_Toc243166403"/>
+      <w:bookmarkStart w:id="31" w:name="_Toc243414639"/>
       <w:r>
         <w:rPr>
           <w:rFonts w:ascii="Times New Roman" w:hAnsi="Times New Roman" w:cs="Times New Roman"/>
@@ -14463,7 +14680,7 @@
           <w:szCs w:val="24"/>
         </w:rPr>
       </w:pPr>
-      <w:bookmarkStart w:id="32" w:name="_Toc243166404"/>
+      <w:bookmarkStart w:id="32" w:name="_Toc243414640"/>
       <w:r>
         <w:rPr>
           <w:rFonts w:ascii="Times New Roman" w:hAnsi="Times New Roman" w:cs="Times New Roman"/>
@@ -14507,7 +14724,7 @@
           <w:szCs w:val="24"/>
         </w:rPr>
       </w:pPr>
-      <w:bookmarkStart w:id="33" w:name="_Toc243166405"/>
+      <w:bookmarkStart w:id="33" w:name="_Toc243414641"/>
       <w:r>
         <w:rPr>
           <w:rFonts w:ascii="Times New Roman" w:hAnsi="Times New Roman" w:cs="Times New Roman"/>
@@ -14537,56 +14754,224 @@
           <w:rFonts w:ascii="Times New Roman" w:hAnsi="Times New Roman" w:cs="Times New Roman"/>
         </w:rPr>
         <w:br/>
-        <w:t>Recipe “1” – “1..*” Recipe Version</w:t>
+        <w:t>Recipe “1” – “</w:t>
+      </w:r>
+      <w:proofErr w:type="gramStart"/>
+      <w:r>
+        <w:rPr>
+          <w:rFonts w:ascii="Times New Roman" w:hAnsi="Times New Roman" w:cs="Times New Roman"/>
+        </w:rPr>
+        <w:t>1..</w:t>
+      </w:r>
+      <w:proofErr w:type="gramEnd"/>
+      <w:r>
+        <w:rPr>
+          <w:rFonts w:ascii="Times New Roman" w:hAnsi="Times New Roman" w:cs="Times New Roman"/>
+        </w:rPr>
+        <w:t>*” Recipe Version</w:t>
       </w:r>
       <w:r>
         <w:rPr>
           <w:rFonts w:ascii="Times New Roman" w:hAnsi="Times New Roman" w:cs="Times New Roman"/>
         </w:rPr>
         <w:br/>
-        <w:t>Recipe Version “0..*” – “1..*” Ingredient</w:t>
+        <w:t>Recipe Version “</w:t>
+      </w:r>
+      <w:proofErr w:type="gramStart"/>
+      <w:r>
+        <w:rPr>
+          <w:rFonts w:ascii="Times New Roman" w:hAnsi="Times New Roman" w:cs="Times New Roman"/>
+        </w:rPr>
+        <w:t>0..</w:t>
+      </w:r>
+      <w:proofErr w:type="gramEnd"/>
+      <w:r>
+        <w:rPr>
+          <w:rFonts w:ascii="Times New Roman" w:hAnsi="Times New Roman" w:cs="Times New Roman"/>
+        </w:rPr>
+        <w:t>*” – “</w:t>
+      </w:r>
+      <w:proofErr w:type="gramStart"/>
+      <w:r>
+        <w:rPr>
+          <w:rFonts w:ascii="Times New Roman" w:hAnsi="Times New Roman" w:cs="Times New Roman"/>
+        </w:rPr>
+        <w:t>1..</w:t>
+      </w:r>
+      <w:proofErr w:type="gramEnd"/>
+      <w:r>
+        <w:rPr>
+          <w:rFonts w:ascii="Times New Roman" w:hAnsi="Times New Roman" w:cs="Times New Roman"/>
+        </w:rPr>
+        <w:t>*” Ingredient</w:t>
       </w:r>
       <w:r>
         <w:rPr>
           <w:rFonts w:ascii="Times New Roman" w:hAnsi="Times New Roman" w:cs="Times New Roman"/>
         </w:rPr>
         <w:br/>
-        <w:t>Recipe version “1” – “0..*” Production Batch</w:t>
+        <w:t>Recipe version “1” – “</w:t>
+      </w:r>
+      <w:proofErr w:type="gramStart"/>
+      <w:r>
+        <w:rPr>
+          <w:rFonts w:ascii="Times New Roman" w:hAnsi="Times New Roman" w:cs="Times New Roman"/>
+        </w:rPr>
+        <w:t>0..</w:t>
+      </w:r>
+      <w:proofErr w:type="gramEnd"/>
+      <w:r>
+        <w:rPr>
+          <w:rFonts w:ascii="Times New Roman" w:hAnsi="Times New Roman" w:cs="Times New Roman"/>
+        </w:rPr>
+        <w:t>*” Production Batch</w:t>
       </w:r>
       <w:r>
         <w:rPr>
           <w:rFonts w:ascii="Times New Roman" w:hAnsi="Times New Roman" w:cs="Times New Roman"/>
         </w:rPr>
         <w:br/>
-        <w:t>Ingredient “1” – “0..*” Ingredient Batch</w:t>
+        <w:t>Ingredient “1” – “</w:t>
+      </w:r>
+      <w:proofErr w:type="gramStart"/>
+      <w:r>
+        <w:rPr>
+          <w:rFonts w:ascii="Times New Roman" w:hAnsi="Times New Roman" w:cs="Times New Roman"/>
+        </w:rPr>
+        <w:t>0..</w:t>
+      </w:r>
+      <w:proofErr w:type="gramEnd"/>
+      <w:r>
+        <w:rPr>
+          <w:rFonts w:ascii="Times New Roman" w:hAnsi="Times New Roman" w:cs="Times New Roman"/>
+        </w:rPr>
+        <w:t>*” Ingredient Batch</w:t>
       </w:r>
       <w:r>
         <w:rPr>
           <w:rFonts w:ascii="Times New Roman" w:hAnsi="Times New Roman" w:cs="Times New Roman"/>
         </w:rPr>
         <w:br/>
-        <w:t>Production Batch “0..*” – “1..*” Ingredient Batch</w:t>
+        <w:t>Production Batch “</w:t>
+      </w:r>
+      <w:proofErr w:type="gramStart"/>
+      <w:r>
+        <w:rPr>
+          <w:rFonts w:ascii="Times New Roman" w:hAnsi="Times New Roman" w:cs="Times New Roman"/>
+        </w:rPr>
+        <w:t>0..</w:t>
+      </w:r>
+      <w:proofErr w:type="gramEnd"/>
+      <w:r>
+        <w:rPr>
+          <w:rFonts w:ascii="Times New Roman" w:hAnsi="Times New Roman" w:cs="Times New Roman"/>
+        </w:rPr>
+        <w:t>*” – “</w:t>
+      </w:r>
+      <w:proofErr w:type="gramStart"/>
+      <w:r>
+        <w:rPr>
+          <w:rFonts w:ascii="Times New Roman" w:hAnsi="Times New Roman" w:cs="Times New Roman"/>
+        </w:rPr>
+        <w:t>1..</w:t>
+      </w:r>
+      <w:proofErr w:type="gramEnd"/>
+      <w:r>
+        <w:rPr>
+          <w:rFonts w:ascii="Times New Roman" w:hAnsi="Times New Roman" w:cs="Times New Roman"/>
+        </w:rPr>
+        <w:t>*” Ingredient Batch</w:t>
       </w:r>
       <w:r>
         <w:rPr>
           <w:rFonts w:ascii="Times New Roman" w:hAnsi="Times New Roman" w:cs="Times New Roman"/>
         </w:rPr>
         <w:br/>
-        <w:t>Production Batch “0..*” – “0..*” Customer Order</w:t>
+        <w:t>Production Batch “</w:t>
+      </w:r>
+      <w:proofErr w:type="gramStart"/>
+      <w:r>
+        <w:rPr>
+          <w:rFonts w:ascii="Times New Roman" w:hAnsi="Times New Roman" w:cs="Times New Roman"/>
+        </w:rPr>
+        <w:t>0..</w:t>
+      </w:r>
+      <w:proofErr w:type="gramEnd"/>
+      <w:r>
+        <w:rPr>
+          <w:rFonts w:ascii="Times New Roman" w:hAnsi="Times New Roman" w:cs="Times New Roman"/>
+        </w:rPr>
+        <w:t>*” – “</w:t>
+      </w:r>
+      <w:proofErr w:type="gramStart"/>
+      <w:r>
+        <w:rPr>
+          <w:rFonts w:ascii="Times New Roman" w:hAnsi="Times New Roman" w:cs="Times New Roman"/>
+        </w:rPr>
+        <w:t>0..</w:t>
+      </w:r>
+      <w:proofErr w:type="gramEnd"/>
+      <w:r>
+        <w:rPr>
+          <w:rFonts w:ascii="Times New Roman" w:hAnsi="Times New Roman" w:cs="Times New Roman"/>
+        </w:rPr>
+        <w:t>*” Customer Order</w:t>
       </w:r>
       <w:r>
         <w:rPr>
           <w:rFonts w:ascii="Times New Roman" w:hAnsi="Times New Roman" w:cs="Times New Roman"/>
         </w:rPr>
         <w:br/>
-        <w:t>Production Batch “1” – “0..*” Quality Check</w:t>
+        <w:t>Production Batch “1” – “</w:t>
+      </w:r>
+      <w:proofErr w:type="gramStart"/>
+      <w:r>
+        <w:rPr>
+          <w:rFonts w:ascii="Times New Roman" w:hAnsi="Times New Roman" w:cs="Times New Roman"/>
+        </w:rPr>
+        <w:t>0..</w:t>
+      </w:r>
+      <w:proofErr w:type="gramEnd"/>
+      <w:r>
+        <w:rPr>
+          <w:rFonts w:ascii="Times New Roman" w:hAnsi="Times New Roman" w:cs="Times New Roman"/>
+        </w:rPr>
+        <w:t>*” Quality Check</w:t>
       </w:r>
       <w:r>
         <w:rPr>
           <w:rFonts w:ascii="Times New Roman" w:hAnsi="Times New Roman" w:cs="Times New Roman"/>
         </w:rPr>
         <w:br/>
-        <w:t xml:space="preserve">Customer Order “0..*” – “1..*” Product </w:t>
+        <w:t>Customer Order “</w:t>
+      </w:r>
+      <w:proofErr w:type="gramStart"/>
+      <w:r>
+        <w:rPr>
+          <w:rFonts w:ascii="Times New Roman" w:hAnsi="Times New Roman" w:cs="Times New Roman"/>
+        </w:rPr>
+        <w:t>0..</w:t>
+      </w:r>
+      <w:proofErr w:type="gramEnd"/>
+      <w:r>
+        <w:rPr>
+          <w:rFonts w:ascii="Times New Roman" w:hAnsi="Times New Roman" w:cs="Times New Roman"/>
+        </w:rPr>
+        <w:t>*” – “</w:t>
+      </w:r>
+      <w:proofErr w:type="gramStart"/>
+      <w:r>
+        <w:rPr>
+          <w:rFonts w:ascii="Times New Roman" w:hAnsi="Times New Roman" w:cs="Times New Roman"/>
+        </w:rPr>
+        <w:t>1..</w:t>
+      </w:r>
+      <w:proofErr w:type="gramEnd"/>
+      <w:r>
+        <w:rPr>
+          <w:rFonts w:ascii="Times New Roman" w:hAnsi="Times New Roman" w:cs="Times New Roman"/>
+        </w:rPr>
+        <w:t xml:space="preserve">*” Product </w:t>
       </w:r>
     </w:p>
     <w:p>
@@ -14598,7 +14983,7 @@
           <w:szCs w:val="24"/>
         </w:rPr>
       </w:pPr>
-      <w:bookmarkStart w:id="34" w:name="_Toc243166406"/>
+      <w:bookmarkStart w:id="34" w:name="_Toc243414642"/>
       <w:r>
         <w:rPr>
           <w:color w:val="auto"/>
@@ -14683,7 +15068,7 @@
           <w:szCs w:val="28"/>
         </w:rPr>
       </w:pPr>
-      <w:bookmarkStart w:id="35" w:name="_Toc243166407"/>
+      <w:bookmarkStart w:id="35" w:name="_Toc243414643"/>
       <w:r>
         <w:rPr>
           <w:rFonts w:ascii="Times New Roman" w:hAnsi="Times New Roman" w:cs="Times New Roman"/>
@@ -15441,7 +15826,7 @@
           <w:szCs w:val="28"/>
         </w:rPr>
       </w:pPr>
-      <w:bookmarkStart w:id="36" w:name="_Toc243166408"/>
+      <w:bookmarkStart w:id="36" w:name="_Toc243414644"/>
       <w:r>
         <w:rPr>
           <w:rFonts w:ascii="Times New Roman" w:hAnsi="Times New Roman" w:cs="Times New Roman"/>
@@ -15464,7 +15849,7 @@
           <w:szCs w:val="24"/>
         </w:rPr>
       </w:pPr>
-      <w:bookmarkStart w:id="37" w:name="_Toc243166409"/>
+      <w:bookmarkStart w:id="37" w:name="_Toc243414645"/>
       <w:r>
         <w:rPr>
           <w:rFonts w:ascii="Times New Roman" w:hAnsi="Times New Roman" w:cs="Times New Roman"/>
@@ -15487,61 +15872,56 @@
         <w:rPr>
           <w:rFonts w:ascii="Times New Roman" w:hAnsi="Times New Roman" w:cs="Times New Roman"/>
         </w:rPr>
-        <w:t>I analyzed the “Kerry Kitchen Collective” scenario to identify the functions the proposed system must support, the stakeholders and actors involved, existing business rules and uncertainties, as well as key concepts and the relationships between them within this domain. Based on this incomplete scenario, I developed a structured and well – founded analysis of both the requirements and the domain itself.</w:t>
+        <w:t xml:space="preserve">Scenario analysis was performed </w:t>
       </w:r>
-    </w:p>
-    <w:p>
-      <w:pPr>
-        <w:spacing w:line="360" w:lineRule="auto"/>
-        <w:rPr>
-          <w:rFonts w:ascii="Times New Roman" w:hAnsi="Times New Roman" w:cs="Times New Roman"/>
-        </w:rPr>
-      </w:pPr>
+      <w:proofErr w:type="gramStart"/>
       <w:r>
         <w:rPr>
           <w:rFonts w:ascii="Times New Roman" w:hAnsi="Times New Roman" w:cs="Times New Roman"/>
         </w:rPr>
-        <w:t xml:space="preserve">The most </w:t>
+        <w:t>in order to</w:t>
+      </w:r>
+      <w:proofErr w:type="gramEnd"/>
+      <w:r>
+        <w:rPr>
+          <w:rFonts w:ascii="Times New Roman" w:hAnsi="Times New Roman" w:cs="Times New Roman"/>
+        </w:rPr>
+        <w:t xml:space="preserve"> define functions that should be provided by the suggested system, the stakeholders and actors involved, rules and uncertainties in the business area, as well as important concepts and their interrelationships. In view of the limited scenario described, I have performed a well – founded analysis of the requirements and the business area.</w:t>
       </w:r>
       <w:r>
         <w:rPr>
           <w:rFonts w:ascii="Times New Roman" w:hAnsi="Times New Roman" w:cs="Times New Roman"/>
         </w:rPr>
-        <w:t xml:space="preserve">challenging aspect </w:t>
+        <w:br/>
       </w:r>
       <w:r>
         <w:rPr>
           <w:rFonts w:ascii="Times New Roman" w:hAnsi="Times New Roman" w:cs="Times New Roman"/>
         </w:rPr>
-        <w:t>for me was distinguishing between concepts and attributes. I had to evaluate whether an object possessed sufficient autonomy – in terms of its intrinsic meaning and relationships – to be considered an independent domain concept, or whether it served merely as information describing another concept.</w:t>
+        <w:t>The most difficult task for me was to differentiate between concepts and attributes. Namely, it was required to make sure that the object was sufficiently autonomous in its meaning and interrelationships in order to be recognized as an independent business concept, and not to be just data about other concepts.</w:t>
       </w:r>
-    </w:p>
-    <w:p>
-      <w:pPr>
-        <w:spacing w:line="360" w:lineRule="auto"/>
-        <w:rPr>
-          <w:rFonts w:ascii="Times New Roman" w:hAnsi="Times New Roman" w:cs="Times New Roman"/>
-        </w:rPr>
-      </w:pPr>
+      <w:r>
+        <w:rPr>
+          <w:rFonts w:ascii="Times New Roman" w:hAnsi="Times New Roman" w:cs="Times New Roman"/>
+        </w:rPr>
+        <w:br/>
+      </w:r>
       <w:r>
         <w:rPr>
           <w:rFonts w:ascii="Times New Roman" w:hAnsi="Times New Roman" w:cs="Times New Roman"/>
         </w:rPr>
         <w:t>Additionally, there were cases where entities such as “Supplier” and “Customer” were considered as potential candidates, I ultimately decided not to retain them as separate domain concepts.</w:t>
       </w:r>
-    </w:p>
-    <w:p>
-      <w:pPr>
-        <w:spacing w:line="360" w:lineRule="auto"/>
-        <w:rPr>
-          <w:rFonts w:ascii="Times New Roman" w:hAnsi="Times New Roman" w:cs="Times New Roman"/>
-        </w:rPr>
-      </w:pPr>
       <w:r>
         <w:rPr>
           <w:rFonts w:ascii="Times New Roman" w:hAnsi="Times New Roman" w:cs="Times New Roman"/>
         </w:rPr>
-        <w:lastRenderedPageBreak/>
+        <w:br/>
+      </w:r>
+      <w:r>
+        <w:rPr>
+          <w:rFonts w:ascii="Times New Roman" w:hAnsi="Times New Roman" w:cs="Times New Roman"/>
+        </w:rPr>
         <w:t xml:space="preserve">Moving forward, I would need to clarify certain information with the stakeholders regarding recipe approval, substitution approval, required quality checks, yield allocation, when rework is permitted and what information each role should be permitted to access. </w:t>
       </w:r>
     </w:p>
@@ -15555,7 +15935,7 @@
           <w:szCs w:val="24"/>
         </w:rPr>
       </w:pPr>
-      <w:bookmarkStart w:id="38" w:name="_Toc243166410"/>
+      <w:bookmarkStart w:id="38" w:name="_Toc243414646"/>
       <w:r>
         <w:rPr>
           <w:rFonts w:ascii="Times New Roman" w:hAnsi="Times New Roman" w:cs="Times New Roman"/>
@@ -15563,9 +15943,9 @@
           <w:sz w:val="24"/>
           <w:szCs w:val="24"/>
         </w:rPr>
-        <w:t>11.2</w:t>
+        <w:lastRenderedPageBreak/>
+        <w:t xml:space="preserve">11.2 </w:t>
       </w:r>
-      <w:bookmarkEnd w:id="38"/>
       <w:r>
         <w:rPr>
           <w:rFonts w:ascii="Times New Roman" w:hAnsi="Times New Roman" w:cs="Times New Roman"/>
@@ -15573,7 +15953,41 @@
           <w:sz w:val="24"/>
           <w:szCs w:val="24"/>
         </w:rPr>
-        <w:t xml:space="preserve"> </w:t>
+        <w:t>AI Declaration</w:t>
+      </w:r>
+      <w:bookmarkEnd w:id="38"/>
+    </w:p>
+    <w:p>
+      <w:pPr>
+        <w:spacing w:line="360" w:lineRule="auto"/>
+        <w:rPr>
+          <w:rFonts w:ascii="Times New Roman" w:hAnsi="Times New Roman" w:cs="Times New Roman"/>
+        </w:rPr>
+      </w:pPr>
+      <w:r>
+        <w:rPr>
+          <w:rFonts w:ascii="Times New Roman" w:hAnsi="Times New Roman" w:cs="Times New Roman"/>
+        </w:rPr>
+        <w:t>AI was my aide in reviewing and supporting this assignment. The use of AI included reviewing the requirements</w:t>
+      </w:r>
+      <w:r>
+        <w:rPr>
+          <w:rFonts w:ascii="Times New Roman" w:hAnsi="Times New Roman" w:cs="Times New Roman"/>
+        </w:rPr>
+        <w:t>` phrasing, discussing possible interpretations, testing Gherkin scenarios and traceability, as well as improving the dossier`s stricture and language.</w:t>
+      </w:r>
+      <w:r>
+        <w:rPr>
+          <w:rFonts w:ascii="Times New Roman" w:hAnsi="Times New Roman" w:cs="Times New Roman"/>
+        </w:rPr>
+        <w:br/>
+        <w:t xml:space="preserve">AI proposals were evaluated in the context of the provided scenario and course material before either accepting, changing or discarding them. In case of uncertainty within the scenario, I have kept the assumption or questions instead of accepting AI proposal as fact. Some examples of interaction with AI and decisions made are available in the repository file </w:t>
+      </w:r>
+      <w:r>
+        <w:rPr>
+          <w:rFonts w:ascii="Times New Roman" w:hAnsi="Times New Roman" w:cs="Times New Roman"/>
+        </w:rPr>
+        <w:t xml:space="preserve">decisions/ai_use_log.md.  </w:t>
       </w:r>
     </w:p>
     <w:sectPr>
@@ -16482,6 +16896,7 @@
   <w:style w:type="character" w:default="1" w:styleId="DefaultParagraphFont">
     <w:name w:val="Default Paragraph Font"/>
     <w:uiPriority w:val="1"/>
+    <w:semiHidden/>
     <w:unhideWhenUsed/>
   </w:style>
   <w:style w:type="table" w:default="1" w:styleId="TableNormal">

</xml_diff>

<commit_message>
Add user story and refine final analysis
</commit_message>
<xml_diff>
--- a/report/Analysis Dossier.docx
+++ b/report/Analysis Dossier.docx
@@ -115,6 +115,12 @@
           <w:rFonts w:ascii="Times New Roman" w:hAnsi="Times New Roman" w:cs="Times New Roman"/>
         </w:rPr>
         <w:t>Date Submitted:</w:t>
+      </w:r>
+      <w:r>
+        <w:rPr>
+          <w:rFonts w:ascii="Times New Roman" w:hAnsi="Times New Roman" w:cs="Times New Roman"/>
+        </w:rPr>
+        <w:t xml:space="preserve"> 22.10.2026</w:t>
       </w:r>
     </w:p>
     <w:p>
@@ -4300,21 +4306,7 @@
               <w:rPr>
                 <w:rFonts w:ascii="Times New Roman" w:hAnsi="Times New Roman" w:cs="Times New Roman"/>
               </w:rPr>
-              <w:t xml:space="preserve">Production batch planning </w:t>
-            </w:r>
-            <w:proofErr w:type="gramStart"/>
-            <w:r>
-              <w:rPr>
-                <w:rFonts w:ascii="Times New Roman" w:hAnsi="Times New Roman" w:cs="Times New Roman"/>
-              </w:rPr>
-              <w:t>taking into account</w:t>
-            </w:r>
-            <w:proofErr w:type="gramEnd"/>
-            <w:r>
-              <w:rPr>
-                <w:rFonts w:ascii="Times New Roman" w:hAnsi="Times New Roman" w:cs="Times New Roman"/>
-              </w:rPr>
-              <w:t xml:space="preserve"> customer orders, ingredient </w:t>
+              <w:t xml:space="preserve">Production batch planning taking into account customer orders, ingredient </w:t>
             </w:r>
             <w:r>
               <w:rPr>
@@ -5389,21 +5381,7 @@
               <w:rPr>
                 <w:rFonts w:ascii="Times New Roman" w:hAnsi="Times New Roman" w:cs="Times New Roman"/>
               </w:rPr>
-              <w:t xml:space="preserve">The recipe may not be the version </w:t>
-            </w:r>
-            <w:proofErr w:type="gramStart"/>
-            <w:r>
-              <w:rPr>
-                <w:rFonts w:ascii="Times New Roman" w:hAnsi="Times New Roman" w:cs="Times New Roman"/>
-              </w:rPr>
-              <w:t>actually used</w:t>
-            </w:r>
-            <w:proofErr w:type="gramEnd"/>
-            <w:r>
-              <w:rPr>
-                <w:rFonts w:ascii="Times New Roman" w:hAnsi="Times New Roman" w:cs="Times New Roman"/>
-              </w:rPr>
-              <w:t xml:space="preserve"> </w:t>
+              <w:t xml:space="preserve">The recipe may not be the version actually used </w:t>
             </w:r>
           </w:p>
         </w:tc>
@@ -5503,21 +5481,7 @@
               <w:rPr>
                 <w:rFonts w:ascii="Times New Roman" w:hAnsi="Times New Roman" w:cs="Times New Roman"/>
               </w:rPr>
-              <w:t xml:space="preserve">Use appropriate </w:t>
-            </w:r>
-            <w:proofErr w:type="gramStart"/>
-            <w:r>
-              <w:rPr>
-                <w:rFonts w:ascii="Times New Roman" w:hAnsi="Times New Roman" w:cs="Times New Roman"/>
-              </w:rPr>
-              <w:t>recipe</w:t>
-            </w:r>
-            <w:proofErr w:type="gramEnd"/>
-            <w:r>
-              <w:rPr>
-                <w:rFonts w:ascii="Times New Roman" w:hAnsi="Times New Roman" w:cs="Times New Roman"/>
-              </w:rPr>
-              <w:t xml:space="preserve"> and ingredient information</w:t>
+              <w:t>Use appropriate recipe and ingredient information</w:t>
             </w:r>
             <w:r>
               <w:rPr>
@@ -10484,15 +10448,7 @@
           </w:tcPr>
           <w:p>
             <w:r>
-              <w:t xml:space="preserve">This may </w:t>
-            </w:r>
-            <w:proofErr w:type="gramStart"/>
-            <w:r>
-              <w:t>results</w:t>
-            </w:r>
-            <w:proofErr w:type="gramEnd"/>
-            <w:r>
-              <w:t xml:space="preserve"> in incorrect labeling, cost calculations, expected yield, or allergen information</w:t>
+              <w:t>This may results in incorrect labeling, cost calculations, expected yield, or allergen information</w:t>
             </w:r>
           </w:p>
         </w:tc>
@@ -12106,6 +12062,11 @@
       </w:r>
       <w:bookmarkEnd w:id="27"/>
     </w:p>
+    <w:p>
+      <w:r>
+        <w:t>As a Kitchen Worker, I want to record the actual production information for a production batch, so that the completed batch has an accurate production record.</w:t>
+      </w:r>
+    </w:p>
     <w:tbl>
       <w:tblPr>
         <w:tblStyle w:val="TableGrid"/>
@@ -12431,21 +12392,7 @@
               <w:rPr>
                 <w:rFonts w:ascii="Times New Roman" w:hAnsi="Times New Roman" w:cs="Times New Roman"/>
               </w:rPr>
-              <w:t xml:space="preserve">A production batch has been </w:t>
-            </w:r>
-            <w:proofErr w:type="gramStart"/>
-            <w:r>
-              <w:rPr>
-                <w:rFonts w:ascii="Times New Roman" w:hAnsi="Times New Roman" w:cs="Times New Roman"/>
-              </w:rPr>
-              <w:t>planned</w:t>
-            </w:r>
-            <w:proofErr w:type="gramEnd"/>
-            <w:r>
-              <w:rPr>
-                <w:rFonts w:ascii="Times New Roman" w:hAnsi="Times New Roman" w:cs="Times New Roman"/>
-              </w:rPr>
-              <w:t xml:space="preserve"> and an applicable recipe version has been identified</w:t>
+              <w:t>A production batch has been planned and an applicable recipe version has been identified</w:t>
             </w:r>
           </w:p>
         </w:tc>
@@ -12779,6 +12726,7 @@
               <w:rPr>
                 <w:rFonts w:ascii="Times New Roman" w:hAnsi="Times New Roman" w:cs="Times New Roman"/>
               </w:rPr>
+              <w:lastRenderedPageBreak/>
               <w:t>5</w:t>
             </w:r>
           </w:p>
@@ -12863,7 +12811,6 @@
         <w:rPr>
           <w:rFonts w:ascii="Times New Roman" w:hAnsi="Times New Roman" w:cs="Times New Roman"/>
         </w:rPr>
-        <w:lastRenderedPageBreak/>
         <w:t>Alternative / Exception Flows</w:t>
       </w:r>
     </w:p>
@@ -13603,6 +13550,12 @@
           <w:rFonts w:ascii="Times New Roman" w:hAnsi="Times New Roman" w:cs="Times New Roman"/>
         </w:rPr>
         <w:br/>
+      </w:r>
+      <w:r>
+        <w:rPr>
+          <w:rFonts w:ascii="Times New Roman" w:hAnsi="Times New Roman" w:cs="Times New Roman"/>
+        </w:rPr>
+        <w:lastRenderedPageBreak/>
         <w:t>And an applicable recipe version has been identified</w:t>
       </w:r>
       <w:r>
@@ -13624,12 +13577,6 @@
           <w:rFonts w:ascii="Times New Roman" w:hAnsi="Times New Roman" w:cs="Times New Roman"/>
         </w:rPr>
         <w:br/>
-      </w:r>
-      <w:r>
-        <w:rPr>
-          <w:rFonts w:ascii="Times New Roman" w:hAnsi="Times New Roman" w:cs="Times New Roman"/>
-        </w:rPr>
-        <w:lastRenderedPageBreak/>
         <w:t>And the ingredient batches and actual quantities are recorded</w:t>
       </w:r>
       <w:r>
@@ -13862,7 +13809,6 @@
           <w:sz w:val="28"/>
           <w:szCs w:val="28"/>
         </w:rPr>
-        <w:lastRenderedPageBreak/>
         <w:t xml:space="preserve">8 </w:t>
       </w:r>
       <w:r>
@@ -14348,35 +14294,7 @@
               <w:rPr>
                 <w:rFonts w:ascii="Times New Roman" w:hAnsi="Times New Roman" w:cs="Times New Roman"/>
               </w:rPr>
-              <w:t xml:space="preserve">Supplier management is not </w:t>
-            </w:r>
-            <w:proofErr w:type="gramStart"/>
-            <w:r>
-              <w:rPr>
-                <w:rFonts w:ascii="Times New Roman" w:hAnsi="Times New Roman" w:cs="Times New Roman"/>
-              </w:rPr>
-              <w:t>a primary focus</w:t>
-            </w:r>
-            <w:proofErr w:type="gramEnd"/>
-            <w:r>
-              <w:rPr>
-                <w:rFonts w:ascii="Times New Roman" w:hAnsi="Times New Roman" w:cs="Times New Roman"/>
-              </w:rPr>
-              <w:t xml:space="preserve"> of the </w:t>
-            </w:r>
-            <w:proofErr w:type="gramStart"/>
-            <w:r>
-              <w:rPr>
-                <w:rFonts w:ascii="Times New Roman" w:hAnsi="Times New Roman" w:cs="Times New Roman"/>
-              </w:rPr>
-              <w:t>system</w:t>
-            </w:r>
-            <w:proofErr w:type="gramEnd"/>
-            <w:r>
-              <w:rPr>
-                <w:rFonts w:ascii="Times New Roman" w:hAnsi="Times New Roman" w:cs="Times New Roman"/>
-              </w:rPr>
-              <w:t xml:space="preserve"> and the required traceability can be represented through </w:t>
+              <w:t xml:space="preserve">Supplier management is not a primary focus of the system and the required traceability can be represented through </w:t>
             </w:r>
             <w:r>
               <w:rPr>
@@ -14506,21 +14424,7 @@
               <w:rPr>
                 <w:rFonts w:ascii="Times New Roman" w:hAnsi="Times New Roman" w:cs="Times New Roman"/>
               </w:rPr>
-              <w:t xml:space="preserve">Orders drive production requirements and have a many – to – many </w:t>
-            </w:r>
-            <w:proofErr w:type="gramStart"/>
-            <w:r>
-              <w:rPr>
-                <w:rFonts w:ascii="Times New Roman" w:hAnsi="Times New Roman" w:cs="Times New Roman"/>
-              </w:rPr>
-              <w:t>relationship</w:t>
-            </w:r>
-            <w:proofErr w:type="gramEnd"/>
-            <w:r>
-              <w:rPr>
-                <w:rFonts w:ascii="Times New Roman" w:hAnsi="Times New Roman" w:cs="Times New Roman"/>
-              </w:rPr>
-              <w:t xml:space="preserve"> with production batches</w:t>
+              <w:t>Orders drive production requirements and have a many – to – many relationship with production batches</w:t>
             </w:r>
           </w:p>
         </w:tc>
@@ -14754,224 +14658,69 @@
           <w:rFonts w:ascii="Times New Roman" w:hAnsi="Times New Roman" w:cs="Times New Roman"/>
         </w:rPr>
         <w:br/>
-        <w:t>Recipe “1” – “</w:t>
       </w:r>
-      <w:proofErr w:type="gramStart"/>
+      <w:proofErr w:type="spellStart"/>
       <w:r>
         <w:rPr>
           <w:rFonts w:ascii="Times New Roman" w:hAnsi="Times New Roman" w:cs="Times New Roman"/>
         </w:rPr>
-        <w:t>1..</w:t>
+        <w:t>Recipe</w:t>
       </w:r>
-      <w:proofErr w:type="gramEnd"/>
+      <w:proofErr w:type="spellEnd"/>
       <w:r>
         <w:rPr>
           <w:rFonts w:ascii="Times New Roman" w:hAnsi="Times New Roman" w:cs="Times New Roman"/>
         </w:rPr>
-        <w:t>*” Recipe Version</w:t>
+        <w:t xml:space="preserve"> “1” – “1..*” Recipe Version</w:t>
       </w:r>
       <w:r>
         <w:rPr>
           <w:rFonts w:ascii="Times New Roman" w:hAnsi="Times New Roman" w:cs="Times New Roman"/>
         </w:rPr>
         <w:br/>
-        <w:t>Recipe Version “</w:t>
-      </w:r>
-      <w:proofErr w:type="gramStart"/>
-      <w:r>
-        <w:rPr>
-          <w:rFonts w:ascii="Times New Roman" w:hAnsi="Times New Roman" w:cs="Times New Roman"/>
-        </w:rPr>
-        <w:t>0..</w:t>
-      </w:r>
-      <w:proofErr w:type="gramEnd"/>
-      <w:r>
-        <w:rPr>
-          <w:rFonts w:ascii="Times New Roman" w:hAnsi="Times New Roman" w:cs="Times New Roman"/>
-        </w:rPr>
-        <w:t>*” – “</w:t>
-      </w:r>
-      <w:proofErr w:type="gramStart"/>
-      <w:r>
-        <w:rPr>
-          <w:rFonts w:ascii="Times New Roman" w:hAnsi="Times New Roman" w:cs="Times New Roman"/>
-        </w:rPr>
-        <w:t>1..</w:t>
-      </w:r>
-      <w:proofErr w:type="gramEnd"/>
-      <w:r>
-        <w:rPr>
-          <w:rFonts w:ascii="Times New Roman" w:hAnsi="Times New Roman" w:cs="Times New Roman"/>
-        </w:rPr>
-        <w:t>*” Ingredient</w:t>
+        <w:t>Recipe Version “0..*” – “1..*” Ingredient</w:t>
       </w:r>
       <w:r>
         <w:rPr>
           <w:rFonts w:ascii="Times New Roman" w:hAnsi="Times New Roman" w:cs="Times New Roman"/>
         </w:rPr>
         <w:br/>
-        <w:t>Recipe version “1” – “</w:t>
-      </w:r>
-      <w:proofErr w:type="gramStart"/>
-      <w:r>
-        <w:rPr>
-          <w:rFonts w:ascii="Times New Roman" w:hAnsi="Times New Roman" w:cs="Times New Roman"/>
-        </w:rPr>
-        <w:t>0..</w:t>
-      </w:r>
-      <w:proofErr w:type="gramEnd"/>
-      <w:r>
-        <w:rPr>
-          <w:rFonts w:ascii="Times New Roman" w:hAnsi="Times New Roman" w:cs="Times New Roman"/>
-        </w:rPr>
-        <w:t>*” Production Batch</w:t>
+        <w:t>Recipe version “1” – “0..*” Production Batch</w:t>
       </w:r>
       <w:r>
         <w:rPr>
           <w:rFonts w:ascii="Times New Roman" w:hAnsi="Times New Roman" w:cs="Times New Roman"/>
         </w:rPr>
         <w:br/>
-        <w:t>Ingredient “1” – “</w:t>
-      </w:r>
-      <w:proofErr w:type="gramStart"/>
-      <w:r>
-        <w:rPr>
-          <w:rFonts w:ascii="Times New Roman" w:hAnsi="Times New Roman" w:cs="Times New Roman"/>
-        </w:rPr>
-        <w:t>0..</w:t>
-      </w:r>
-      <w:proofErr w:type="gramEnd"/>
-      <w:r>
-        <w:rPr>
-          <w:rFonts w:ascii="Times New Roman" w:hAnsi="Times New Roman" w:cs="Times New Roman"/>
-        </w:rPr>
-        <w:t>*” Ingredient Batch</w:t>
+        <w:t>Ingredient “1” – “0..*” Ingredient Batch</w:t>
       </w:r>
       <w:r>
         <w:rPr>
           <w:rFonts w:ascii="Times New Roman" w:hAnsi="Times New Roman" w:cs="Times New Roman"/>
         </w:rPr>
         <w:br/>
-        <w:t>Production Batch “</w:t>
-      </w:r>
-      <w:proofErr w:type="gramStart"/>
-      <w:r>
-        <w:rPr>
-          <w:rFonts w:ascii="Times New Roman" w:hAnsi="Times New Roman" w:cs="Times New Roman"/>
-        </w:rPr>
-        <w:t>0..</w:t>
-      </w:r>
-      <w:proofErr w:type="gramEnd"/>
-      <w:r>
-        <w:rPr>
-          <w:rFonts w:ascii="Times New Roman" w:hAnsi="Times New Roman" w:cs="Times New Roman"/>
-        </w:rPr>
-        <w:t>*” – “</w:t>
-      </w:r>
-      <w:proofErr w:type="gramStart"/>
-      <w:r>
-        <w:rPr>
-          <w:rFonts w:ascii="Times New Roman" w:hAnsi="Times New Roman" w:cs="Times New Roman"/>
-        </w:rPr>
-        <w:t>1..</w:t>
-      </w:r>
-      <w:proofErr w:type="gramEnd"/>
-      <w:r>
-        <w:rPr>
-          <w:rFonts w:ascii="Times New Roman" w:hAnsi="Times New Roman" w:cs="Times New Roman"/>
-        </w:rPr>
-        <w:t>*” Ingredient Batch</w:t>
+        <w:t>Production Batch “0..*” – “1..*” Ingredient Batch</w:t>
       </w:r>
       <w:r>
         <w:rPr>
           <w:rFonts w:ascii="Times New Roman" w:hAnsi="Times New Roman" w:cs="Times New Roman"/>
         </w:rPr>
         <w:br/>
-        <w:t>Production Batch “</w:t>
-      </w:r>
-      <w:proofErr w:type="gramStart"/>
-      <w:r>
-        <w:rPr>
-          <w:rFonts w:ascii="Times New Roman" w:hAnsi="Times New Roman" w:cs="Times New Roman"/>
-        </w:rPr>
-        <w:t>0..</w:t>
-      </w:r>
-      <w:proofErr w:type="gramEnd"/>
-      <w:r>
-        <w:rPr>
-          <w:rFonts w:ascii="Times New Roman" w:hAnsi="Times New Roman" w:cs="Times New Roman"/>
-        </w:rPr>
-        <w:t>*” – “</w:t>
-      </w:r>
-      <w:proofErr w:type="gramStart"/>
-      <w:r>
-        <w:rPr>
-          <w:rFonts w:ascii="Times New Roman" w:hAnsi="Times New Roman" w:cs="Times New Roman"/>
-        </w:rPr>
-        <w:t>0..</w:t>
-      </w:r>
-      <w:proofErr w:type="gramEnd"/>
-      <w:r>
-        <w:rPr>
-          <w:rFonts w:ascii="Times New Roman" w:hAnsi="Times New Roman" w:cs="Times New Roman"/>
-        </w:rPr>
-        <w:t>*” Customer Order</w:t>
+        <w:t>Production Batch “0..*” – “0..*” Customer Order</w:t>
       </w:r>
       <w:r>
         <w:rPr>
           <w:rFonts w:ascii="Times New Roman" w:hAnsi="Times New Roman" w:cs="Times New Roman"/>
         </w:rPr>
         <w:br/>
-        <w:t>Production Batch “1” – “</w:t>
-      </w:r>
-      <w:proofErr w:type="gramStart"/>
-      <w:r>
-        <w:rPr>
-          <w:rFonts w:ascii="Times New Roman" w:hAnsi="Times New Roman" w:cs="Times New Roman"/>
-        </w:rPr>
-        <w:t>0..</w:t>
-      </w:r>
-      <w:proofErr w:type="gramEnd"/>
-      <w:r>
-        <w:rPr>
-          <w:rFonts w:ascii="Times New Roman" w:hAnsi="Times New Roman" w:cs="Times New Roman"/>
-        </w:rPr>
-        <w:t>*” Quality Check</w:t>
+        <w:t>Production Batch “1” – “0..*” Quality Check</w:t>
       </w:r>
       <w:r>
         <w:rPr>
           <w:rFonts w:ascii="Times New Roman" w:hAnsi="Times New Roman" w:cs="Times New Roman"/>
         </w:rPr>
         <w:br/>
-        <w:t>Customer Order “</w:t>
-      </w:r>
-      <w:proofErr w:type="gramStart"/>
-      <w:r>
-        <w:rPr>
-          <w:rFonts w:ascii="Times New Roman" w:hAnsi="Times New Roman" w:cs="Times New Roman"/>
-        </w:rPr>
-        <w:t>0..</w:t>
-      </w:r>
-      <w:proofErr w:type="gramEnd"/>
-      <w:r>
-        <w:rPr>
-          <w:rFonts w:ascii="Times New Roman" w:hAnsi="Times New Roman" w:cs="Times New Roman"/>
-        </w:rPr>
-        <w:t>*” – “</w:t>
-      </w:r>
-      <w:proofErr w:type="gramStart"/>
-      <w:r>
-        <w:rPr>
-          <w:rFonts w:ascii="Times New Roman" w:hAnsi="Times New Roman" w:cs="Times New Roman"/>
-        </w:rPr>
-        <w:t>1..</w:t>
-      </w:r>
-      <w:proofErr w:type="gramEnd"/>
-      <w:r>
-        <w:rPr>
-          <w:rFonts w:ascii="Times New Roman" w:hAnsi="Times New Roman" w:cs="Times New Roman"/>
-        </w:rPr>
-        <w:t xml:space="preserve">*” Product </w:t>
+        <w:t xml:space="preserve">Customer Order “0..*” – “1..*” Product </w:t>
       </w:r>
     </w:p>
     <w:p>
@@ -15872,21 +15621,7 @@
         <w:rPr>
           <w:rFonts w:ascii="Times New Roman" w:hAnsi="Times New Roman" w:cs="Times New Roman"/>
         </w:rPr>
-        <w:t xml:space="preserve">Scenario analysis was performed </w:t>
-      </w:r>
-      <w:proofErr w:type="gramStart"/>
-      <w:r>
-        <w:rPr>
-          <w:rFonts w:ascii="Times New Roman" w:hAnsi="Times New Roman" w:cs="Times New Roman"/>
-        </w:rPr>
-        <w:t>in order to</w:t>
-      </w:r>
-      <w:proofErr w:type="gramEnd"/>
-      <w:r>
-        <w:rPr>
-          <w:rFonts w:ascii="Times New Roman" w:hAnsi="Times New Roman" w:cs="Times New Roman"/>
-        </w:rPr>
-        <w:t xml:space="preserve"> define functions that should be provided by the suggested system, the stakeholders and actors involved, rules and uncertainties in the business area, as well as important concepts and their interrelationships. In view of the limited scenario described, I have performed a well – founded analysis of the requirements and the business area.</w:t>
+        <w:t>Scenario analysis was performed in order to define functions that should be provided by the suggested system, the stakeholders and actors involved, rules and uncertainties in the business area, as well as important concepts and their interrelationships. In view of the limited scenario described, I have performed a well – founded analysis of the requirements and the business area.</w:t>
       </w:r>
       <w:r>
         <w:rPr>

</xml_diff>